<commit_message>
Date: 29 Sept 2025
</commit_message>
<xml_diff>
--- a/Notes_Selenium_14.docx
+++ b/Notes_Selenium_14.docx
@@ -621,23 +621,13 @@
           <w:lang w:val="en-US"/>
         </w:rPr>
       </w:pPr>
-      <w:proofErr w:type="spellStart"/>
-      <w:r>
-        <w:rPr>
-          <w:sz w:val="24"/>
-          <w:szCs w:val="22"/>
-          <w:lang w:val="en-US"/>
-        </w:rPr>
-        <w:t>Thread.sleep</w:t>
-      </w:r>
-      <w:proofErr w:type="spellEnd"/>
-      <w:r>
-        <w:rPr>
-          <w:sz w:val="24"/>
-          <w:szCs w:val="22"/>
-          <w:lang w:val="en-US"/>
-        </w:rPr>
-        <w:t>()</w:t>
+      <w:r>
+        <w:rPr>
+          <w:sz w:val="24"/>
+          <w:szCs w:val="22"/>
+          <w:lang w:val="en-US"/>
+        </w:rPr>
+        <w:t>Thread.sleep()</w:t>
       </w:r>
     </w:p>
     <w:p>
@@ -2166,25 +2156,7 @@
           <w:szCs w:val="22"/>
           <w:lang w:val="en-US"/>
         </w:rPr>
-        <w:t xml:space="preserve"> Correctness, Completeness, </w:t>
-      </w:r>
-      <w:proofErr w:type="gramStart"/>
-      <w:r>
-        <w:rPr>
-          <w:sz w:val="24"/>
-          <w:szCs w:val="22"/>
-          <w:lang w:val="en-US"/>
-        </w:rPr>
-        <w:t>Security</w:t>
-      </w:r>
-      <w:proofErr w:type="gramEnd"/>
-      <w:r>
-        <w:rPr>
-          <w:sz w:val="24"/>
-          <w:szCs w:val="22"/>
-          <w:lang w:val="en-US"/>
-        </w:rPr>
-        <w:t xml:space="preserve"> &amp; Quality of developed software application.</w:t>
+        <w:t xml:space="preserve"> Correctness, Completeness, Security &amp; Quality of developed software application.</w:t>
       </w:r>
     </w:p>
     <w:p>
@@ -3511,18 +3483,8 @@
           <w:szCs w:val="22"/>
           <w:lang w:val="en-US"/>
         </w:rPr>
-        <w:t xml:space="preserve">Idea </w:t>
-      </w:r>
-      <w:proofErr w:type="spellStart"/>
-      <w:r>
-        <w:rPr>
-          <w:sz w:val="24"/>
-          <w:szCs w:val="22"/>
-          <w:lang w:val="en-US"/>
-        </w:rPr>
-        <w:t>Intellij</w:t>
-      </w:r>
-      <w:proofErr w:type="spellEnd"/>
+        <w:t>Idea Intellij</w:t>
+      </w:r>
     </w:p>
     <w:p>
       <w:pPr>
@@ -3620,7 +3582,6 @@
           <w:lang w:val="en-US"/>
         </w:rPr>
       </w:pPr>
-      <w:proofErr w:type="spellStart"/>
       <w:r>
         <w:rPr>
           <w:sz w:val="24"/>
@@ -3629,7 +3590,6 @@
         </w:rPr>
         <w:t>YourName_SeleniumDemos</w:t>
       </w:r>
-      <w:proofErr w:type="spellEnd"/>
     </w:p>
     <w:p>
       <w:pPr>
@@ -3672,18 +3632,8 @@
           <w:szCs w:val="22"/>
           <w:lang w:val="en-US"/>
         </w:rPr>
-        <w:t xml:space="preserve">Open </w:t>
-      </w:r>
-      <w:proofErr w:type="spellStart"/>
-      <w:r>
-        <w:rPr>
-          <w:sz w:val="24"/>
-          <w:szCs w:val="22"/>
-          <w:lang w:val="en-US"/>
-        </w:rPr>
-        <w:t>selenium.dev</w:t>
-      </w:r>
-      <w:proofErr w:type="spellEnd"/>
+        <w:t>Open selenium.dev</w:t>
+      </w:r>
     </w:p>
     <w:p>
       <w:pPr>
@@ -3953,25 +3903,7 @@
           <w:szCs w:val="22"/>
           <w:lang w:val="en-US"/>
         </w:rPr>
-        <w:t>Give the name for project (</w:t>
-      </w:r>
-      <w:proofErr w:type="spellStart"/>
-      <w:r>
-        <w:rPr>
-          <w:sz w:val="24"/>
-          <w:szCs w:val="22"/>
-          <w:lang w:val="en-US"/>
-        </w:rPr>
-        <w:t>MyAutomationProject</w:t>
-      </w:r>
-      <w:proofErr w:type="spellEnd"/>
-      <w:r>
-        <w:rPr>
-          <w:sz w:val="24"/>
-          <w:szCs w:val="22"/>
-          <w:lang w:val="en-US"/>
-        </w:rPr>
-        <w:t>)</w:t>
+        <w:t>Give the name for project (MyAutomationProject)</w:t>
       </w:r>
     </w:p>
     <w:p>
@@ -4110,25 +4042,7 @@
           <w:szCs w:val="22"/>
           <w:lang w:val="en-US"/>
         </w:rPr>
-        <w:t>Give the name (</w:t>
-      </w:r>
-      <w:proofErr w:type="spellStart"/>
-      <w:r>
-        <w:rPr>
-          <w:sz w:val="24"/>
-          <w:szCs w:val="22"/>
-          <w:lang w:val="en-US"/>
-        </w:rPr>
-        <w:t>com.WebDriverDemos</w:t>
-      </w:r>
-      <w:proofErr w:type="spellEnd"/>
-      <w:r>
-        <w:rPr>
-          <w:sz w:val="24"/>
-          <w:szCs w:val="22"/>
-          <w:lang w:val="en-US"/>
-        </w:rPr>
-        <w:t>)</w:t>
+        <w:t>Give the name (com.WebDriverDemos)</w:t>
       </w:r>
     </w:p>
     <w:p>
@@ -4465,23 +4379,13 @@
           <w:lang w:val="en-US"/>
         </w:rPr>
       </w:pPr>
-      <w:proofErr w:type="gramStart"/>
-      <w:r>
-        <w:rPr>
-          <w:sz w:val="24"/>
-          <w:szCs w:val="22"/>
-          <w:lang w:val="en-US"/>
-        </w:rPr>
-        <w:t>get(</w:t>
-      </w:r>
-      <w:proofErr w:type="gramEnd"/>
-      <w:r>
-        <w:rPr>
-          <w:sz w:val="24"/>
-          <w:szCs w:val="22"/>
-          <w:lang w:val="en-US"/>
-        </w:rPr>
-        <w:t xml:space="preserve">) </w:t>
+      <w:r>
+        <w:rPr>
+          <w:sz w:val="24"/>
+          <w:szCs w:val="22"/>
+          <w:lang w:val="en-US"/>
+        </w:rPr>
+        <w:t xml:space="preserve">get() </w:t>
       </w:r>
       <w:r>
         <w:rPr>
@@ -4513,23 +4417,13 @@
           <w:lang w:val="en-US"/>
         </w:rPr>
       </w:pPr>
-      <w:proofErr w:type="spellStart"/>
-      <w:r>
-        <w:rPr>
-          <w:sz w:val="24"/>
-          <w:szCs w:val="22"/>
-          <w:lang w:val="en-US"/>
-        </w:rPr>
-        <w:t>driver.manage</w:t>
-      </w:r>
-      <w:proofErr w:type="spellEnd"/>
-      <w:r>
-        <w:rPr>
-          <w:sz w:val="24"/>
-          <w:szCs w:val="22"/>
-          <w:lang w:val="en-US"/>
-        </w:rPr>
-        <w:t xml:space="preserve">().window().maximize() </w:t>
+      <w:r>
+        <w:rPr>
+          <w:sz w:val="24"/>
+          <w:szCs w:val="22"/>
+          <w:lang w:val="en-US"/>
+        </w:rPr>
+        <w:t xml:space="preserve">driver.manage().window().maximize() </w:t>
       </w:r>
       <w:r>
         <w:rPr>
@@ -4561,23 +4455,13 @@
           <w:lang w:val="en-US"/>
         </w:rPr>
       </w:pPr>
-      <w:proofErr w:type="gramStart"/>
-      <w:r>
-        <w:rPr>
-          <w:sz w:val="24"/>
-          <w:szCs w:val="22"/>
-          <w:lang w:val="en-US"/>
-        </w:rPr>
-        <w:t>close(</w:t>
-      </w:r>
-      <w:proofErr w:type="gramEnd"/>
-      <w:r>
-        <w:rPr>
-          <w:sz w:val="24"/>
-          <w:szCs w:val="22"/>
-          <w:lang w:val="en-US"/>
-        </w:rPr>
-        <w:t xml:space="preserve">) </w:t>
+      <w:r>
+        <w:rPr>
+          <w:sz w:val="24"/>
+          <w:szCs w:val="22"/>
+          <w:lang w:val="en-US"/>
+        </w:rPr>
+        <w:t xml:space="preserve">close() </w:t>
       </w:r>
       <w:r>
         <w:rPr>
@@ -4609,23 +4493,13 @@
           <w:lang w:val="en-US"/>
         </w:rPr>
       </w:pPr>
-      <w:proofErr w:type="gramStart"/>
-      <w:r>
-        <w:rPr>
-          <w:sz w:val="24"/>
-          <w:szCs w:val="22"/>
-          <w:lang w:val="en-US"/>
-        </w:rPr>
-        <w:t>getTitle(</w:t>
-      </w:r>
-      <w:proofErr w:type="gramEnd"/>
-      <w:r>
-        <w:rPr>
-          <w:sz w:val="24"/>
-          <w:szCs w:val="22"/>
-          <w:lang w:val="en-US"/>
-        </w:rPr>
-        <w:t xml:space="preserve">) </w:t>
+      <w:r>
+        <w:rPr>
+          <w:sz w:val="24"/>
+          <w:szCs w:val="22"/>
+          <w:lang w:val="en-US"/>
+        </w:rPr>
+        <w:t xml:space="preserve">getTitle() </w:t>
       </w:r>
       <w:r>
         <w:rPr>
@@ -4665,23 +4539,13 @@
           <w:lang w:val="en-US"/>
         </w:rPr>
       </w:pPr>
-      <w:proofErr w:type="gramStart"/>
-      <w:r>
-        <w:rPr>
-          <w:sz w:val="24"/>
-          <w:szCs w:val="22"/>
-          <w:lang w:val="en-US"/>
-        </w:rPr>
-        <w:t>getCurrentUrl(</w:t>
-      </w:r>
-      <w:proofErr w:type="gramEnd"/>
-      <w:r>
-        <w:rPr>
-          <w:sz w:val="24"/>
-          <w:szCs w:val="22"/>
-          <w:lang w:val="en-US"/>
-        </w:rPr>
-        <w:t xml:space="preserve">) </w:t>
+      <w:r>
+        <w:rPr>
+          <w:sz w:val="24"/>
+          <w:szCs w:val="22"/>
+          <w:lang w:val="en-US"/>
+        </w:rPr>
+        <w:t xml:space="preserve">getCurrentUrl() </w:t>
       </w:r>
       <w:r>
         <w:rPr>
@@ -4713,23 +4577,13 @@
           <w:lang w:val="en-US"/>
         </w:rPr>
       </w:pPr>
-      <w:proofErr w:type="gramStart"/>
-      <w:r>
-        <w:rPr>
-          <w:sz w:val="24"/>
-          <w:szCs w:val="22"/>
-          <w:lang w:val="en-US"/>
-        </w:rPr>
-        <w:t>getPageSource(</w:t>
-      </w:r>
-      <w:proofErr w:type="gramEnd"/>
-      <w:r>
-        <w:rPr>
-          <w:sz w:val="24"/>
-          <w:szCs w:val="22"/>
-          <w:lang w:val="en-US"/>
-        </w:rPr>
-        <w:t xml:space="preserve">) </w:t>
+      <w:r>
+        <w:rPr>
+          <w:sz w:val="24"/>
+          <w:szCs w:val="22"/>
+          <w:lang w:val="en-US"/>
+        </w:rPr>
+        <w:t xml:space="preserve">getPageSource() </w:t>
       </w:r>
       <w:r>
         <w:rPr>
@@ -4810,25 +4664,6 @@
         <w:t xml:space="preserve"> control on the web page like text box, radio button, link etc. </w:t>
       </w:r>
       <w:r>
-        <w:rPr>
-          <w:sz w:val="24"/>
-          <w:szCs w:val="22"/>
-          <w:lang w:val="en-US"/>
-        </w:rPr>
-        <w:t>(WebElement)</w:t>
-      </w:r>
-    </w:p>
-    <w:p>
-      <w:pPr>
-        <w:rPr>
-          <w:sz w:val="24"/>
-          <w:szCs w:val="22"/>
-          <w:lang w:val="en-US"/>
-        </w:rPr>
-      </w:pPr>
-    </w:p>
-    <w:p>
-      <w:pPr>
         <w:rPr>
           <w:b/>
           <w:bCs/>
@@ -4836,8 +4671,28 @@
           <w:szCs w:val="22"/>
           <w:lang w:val="en-US"/>
         </w:rPr>
-      </w:pPr>
-      <w:r>
+        <w:t xml:space="preserve">Always locates the first occurrence. </w:t>
+      </w:r>
+      <w:r>
+        <w:rPr>
+          <w:sz w:val="24"/>
+          <w:szCs w:val="22"/>
+          <w:lang w:val="en-US"/>
+        </w:rPr>
+        <w:t>(WebElement)</w:t>
+      </w:r>
+    </w:p>
+    <w:p>
+      <w:pPr>
+        <w:rPr>
+          <w:sz w:val="24"/>
+          <w:szCs w:val="22"/>
+          <w:lang w:val="en-US"/>
+        </w:rPr>
+      </w:pPr>
+    </w:p>
+    <w:p>
+      <w:pPr>
         <w:rPr>
           <w:b/>
           <w:bCs/>
@@ -4845,6 +4700,15 @@
           <w:szCs w:val="22"/>
           <w:lang w:val="en-US"/>
         </w:rPr>
+      </w:pPr>
+      <w:r>
+        <w:rPr>
+          <w:b/>
+          <w:bCs/>
+          <w:sz w:val="24"/>
+          <w:szCs w:val="22"/>
+          <w:lang w:val="en-US"/>
+        </w:rPr>
         <w:t>Common Exceptions in WebDriver</w:t>
       </w:r>
     </w:p>
@@ -4966,6 +4830,44 @@
           <w:lang w:val="en-US"/>
         </w:rPr>
         <w:t>The value of locator may be dynamic. (It is changing every time after refreshing)</w:t>
+      </w:r>
+    </w:p>
+    <w:p>
+      <w:pPr>
+        <w:pStyle w:val="ListParagraph"/>
+        <w:numPr>
+          <w:ilvl w:val="0"/>
+          <w:numId w:val="15"/>
+        </w:numPr>
+        <w:rPr>
+          <w:sz w:val="24"/>
+          <w:szCs w:val="22"/>
+          <w:lang w:val="en-US"/>
+        </w:rPr>
+      </w:pPr>
+      <w:r>
+        <w:rPr>
+          <w:sz w:val="24"/>
+          <w:szCs w:val="22"/>
+          <w:lang w:val="en-US"/>
+        </w:rPr>
+        <w:t xml:space="preserve">InvalidSelectorException </w:t>
+      </w:r>
+      <w:r>
+        <w:rPr>
+          <w:sz w:val="24"/>
+          <w:szCs w:val="22"/>
+          <w:lang w:val="en-US"/>
+        </w:rPr>
+        <w:sym w:font="Wingdings" w:char="F0E0"/>
+      </w:r>
+      <w:r>
+        <w:rPr>
+          <w:sz w:val="24"/>
+          <w:szCs w:val="22"/>
+          <w:lang w:val="en-US"/>
+        </w:rPr>
+        <w:t xml:space="preserve"> The value of locator is not in the correct format.</w:t>
       </w:r>
     </w:p>
     <w:p>
@@ -5175,6 +5077,7 @@
           <w:szCs w:val="22"/>
           <w:lang w:val="en-US"/>
         </w:rPr>
+        <w:lastRenderedPageBreak/>
         <w:t>CssSelector</w:t>
       </w:r>
     </w:p>
@@ -5197,7 +5100,6 @@
           <w:szCs w:val="22"/>
           <w:lang w:val="en-US"/>
         </w:rPr>
-        <w:lastRenderedPageBreak/>
         <w:t>XPath</w:t>
       </w:r>
     </w:p>
@@ -5366,23 +5268,13 @@
           <w:lang w:val="en-US"/>
         </w:rPr>
       </w:pPr>
-      <w:proofErr w:type="gramStart"/>
-      <w:r>
-        <w:rPr>
-          <w:sz w:val="24"/>
-          <w:szCs w:val="22"/>
-          <w:lang w:val="en-US"/>
-        </w:rPr>
-        <w:t>sendKeys(</w:t>
-      </w:r>
-      <w:proofErr w:type="gramEnd"/>
-      <w:r>
-        <w:rPr>
-          <w:sz w:val="24"/>
-          <w:szCs w:val="22"/>
-          <w:lang w:val="en-US"/>
-        </w:rPr>
-        <w:t xml:space="preserve">) </w:t>
+      <w:r>
+        <w:rPr>
+          <w:sz w:val="24"/>
+          <w:szCs w:val="22"/>
+          <w:lang w:val="en-US"/>
+        </w:rPr>
+        <w:t xml:space="preserve">sendKeys() </w:t>
       </w:r>
       <w:r>
         <w:rPr>
@@ -5422,23 +5314,13 @@
           <w:lang w:val="en-US"/>
         </w:rPr>
       </w:pPr>
-      <w:proofErr w:type="gramStart"/>
-      <w:r>
-        <w:rPr>
-          <w:sz w:val="24"/>
-          <w:szCs w:val="22"/>
-          <w:lang w:val="en-US"/>
-        </w:rPr>
-        <w:t>click(</w:t>
-      </w:r>
-      <w:proofErr w:type="gramEnd"/>
-      <w:r>
-        <w:rPr>
-          <w:sz w:val="24"/>
-          <w:szCs w:val="22"/>
-          <w:lang w:val="en-US"/>
-        </w:rPr>
-        <w:t xml:space="preserve">) </w:t>
+      <w:r>
+        <w:rPr>
+          <w:sz w:val="24"/>
+          <w:szCs w:val="22"/>
+          <w:lang w:val="en-US"/>
+        </w:rPr>
+        <w:t xml:space="preserve">click() </w:t>
       </w:r>
       <w:r>
         <w:rPr>
@@ -5456,6 +5338,46 @@
         </w:rPr>
         <w:t xml:space="preserve"> Will click on any control.</w:t>
       </w:r>
+    </w:p>
+    <w:p>
+      <w:pPr>
+        <w:pStyle w:val="ListParagraph"/>
+        <w:numPr>
+          <w:ilvl w:val="0"/>
+          <w:numId w:val="18"/>
+        </w:numPr>
+        <w:rPr>
+          <w:sz w:val="24"/>
+          <w:szCs w:val="22"/>
+          <w:lang w:val="en-US"/>
+        </w:rPr>
+      </w:pPr>
+      <w:r>
+        <w:rPr>
+          <w:sz w:val="24"/>
+          <w:szCs w:val="22"/>
+          <w:lang w:val="en-US"/>
+        </w:rPr>
+        <w:t xml:space="preserve">getText() </w:t>
+      </w:r>
+      <w:r>
+        <w:rPr>
+          <w:sz w:val="24"/>
+          <w:szCs w:val="22"/>
+          <w:lang w:val="en-US"/>
+        </w:rPr>
+        <w:sym w:font="Wingdings" w:char="F0E0"/>
+      </w:r>
+      <w:r>
+        <w:rPr>
+          <w:sz w:val="24"/>
+          <w:szCs w:val="22"/>
+          <w:lang w:val="en-US"/>
+        </w:rPr>
+        <w:t xml:space="preserve"> Will return the text on the control. (String)</w:t>
+      </w:r>
+      <w:bookmarkStart w:id="0" w:name="_GoBack"/>
+      <w:bookmarkEnd w:id="0"/>
     </w:p>
     <w:p>
       <w:pPr>
@@ -5575,49 +5497,7 @@
           <w:szCs w:val="22"/>
           <w:lang w:val="en-US"/>
         </w:rPr>
-        <w:t>data-</w:t>
-      </w:r>
-      <w:proofErr w:type="spellStart"/>
-      <w:r>
-        <w:rPr>
-          <w:sz w:val="24"/>
-          <w:szCs w:val="22"/>
-          <w:lang w:val="en-US"/>
-        </w:rPr>
-        <w:t>testid</w:t>
-      </w:r>
-      <w:proofErr w:type="spellEnd"/>
-      <w:r>
-        <w:rPr>
-          <w:sz w:val="24"/>
-          <w:szCs w:val="22"/>
-          <w:lang w:val="en-US"/>
-        </w:rPr>
-        <w:t>="</w:t>
-      </w:r>
-      <w:r>
-        <w:rPr>
-          <w:sz w:val="24"/>
-          <w:szCs w:val="22"/>
-          <w:lang w:val="en-US"/>
-        </w:rPr>
-        <w:t>royal-email</w:t>
-      </w:r>
-      <w:r>
-        <w:rPr>
-          <w:sz w:val="24"/>
-          <w:szCs w:val="22"/>
-          <w:lang w:val="en-US"/>
-        </w:rPr>
-        <w:t>"</w:t>
-      </w:r>
-      <w:r>
-        <w:rPr>
-          <w:sz w:val="24"/>
-          <w:szCs w:val="22"/>
-          <w:lang w:val="en-US"/>
-        </w:rPr>
-        <w:t>]</w:t>
+        <w:t>data-testid="royal-email"]</w:t>
       </w:r>
     </w:p>
     <w:p>
@@ -5822,8 +5702,6 @@
         <w:br/>
         <w:t>tagName[attribute*=”value”]</w:t>
       </w:r>
-      <w:bookmarkStart w:id="0" w:name="_GoBack"/>
-      <w:bookmarkEnd w:id="0"/>
       <w:r>
         <w:rPr>
           <w:sz w:val="24"/>
@@ -5832,6 +5710,53 @@
         </w:rPr>
         <w:br/>
       </w:r>
+    </w:p>
+    <w:p>
+      <w:pPr>
+        <w:rPr>
+          <w:b/>
+          <w:bCs/>
+          <w:sz w:val="24"/>
+          <w:szCs w:val="22"/>
+          <w:lang w:val="en-US"/>
+        </w:rPr>
+      </w:pPr>
+      <w:r>
+        <w:rPr>
+          <w:b/>
+          <w:bCs/>
+          <w:sz w:val="24"/>
+          <w:szCs w:val="22"/>
+          <w:lang w:val="en-US"/>
+        </w:rPr>
+        <w:t>Class Name Locator</w:t>
+      </w:r>
+    </w:p>
+    <w:p>
+      <w:pPr>
+        <w:rPr>
+          <w:sz w:val="24"/>
+          <w:szCs w:val="22"/>
+          <w:lang w:val="en-US"/>
+        </w:rPr>
+      </w:pPr>
+      <w:r>
+        <w:rPr>
+          <w:sz w:val="24"/>
+          <w:szCs w:val="22"/>
+          <w:lang w:val="en-US"/>
+        </w:rPr>
+        <w:t>If a control is having multiple class names (multiple classes are separated by space) pick any one class name from the multiple classes.</w:t>
+      </w:r>
+    </w:p>
+    <w:p>
+      <w:pPr>
+        <w:rPr>
+          <w:sz w:val="24"/>
+          <w:szCs w:val="22"/>
+          <w:lang w:val="en-US"/>
+        </w:rPr>
+      </w:pPr>
     </w:p>
     <w:p>
       <w:pPr>
@@ -8570,7 +8495,7 @@
 </file>
 
 <file path=customXml/itemProps1.xml><?xml version="1.0" encoding="utf-8"?>
-<ds:datastoreItem xmlns:ds="http://schemas.openxmlformats.org/officeDocument/2006/customXml" ds:itemID="{E5B79B5F-8B0C-453B-9968-079FD6E65B7A}">
+<ds:datastoreItem xmlns:ds="http://schemas.openxmlformats.org/officeDocument/2006/customXml" ds:itemID="{F6459AB6-DF92-4F7C-AA99-2C5130875218}">
   <ds:schemaRefs>
     <ds:schemaRef ds:uri="http://schemas.openxmlformats.org/officeDocument/2006/bibliography"/>
   </ds:schemaRefs>

</xml_diff>

<commit_message>
Date: 07 Oct 2025
</commit_message>
<xml_diff>
--- a/Notes_Selenium_14.docx
+++ b/Notes_Selenium_14.docx
@@ -4653,15 +4653,7 @@
           <w:szCs w:val="22"/>
           <w:lang w:val="en-US"/>
         </w:rPr>
-        <w:t xml:space="preserve"> single</w:t>
-      </w:r>
-      <w:r>
-        <w:rPr>
-          <w:sz w:val="24"/>
-          <w:szCs w:val="22"/>
-          <w:lang w:val="en-US"/>
-        </w:rPr>
-        <w:t xml:space="preserve"> control on the web page like text box, radio button, link etc. </w:t>
+        <w:t xml:space="preserve"> </w:t>
       </w:r>
       <w:r>
         <w:rPr>
@@ -4671,6 +4663,24 @@
           <w:szCs w:val="22"/>
           <w:lang w:val="en-US"/>
         </w:rPr>
+        <w:t>single</w:t>
+      </w:r>
+      <w:r>
+        <w:rPr>
+          <w:sz w:val="24"/>
+          <w:szCs w:val="22"/>
+          <w:lang w:val="en-US"/>
+        </w:rPr>
+        <w:t xml:space="preserve"> control on the web page like text box, radio button, link etc. </w:t>
+      </w:r>
+      <w:r>
+        <w:rPr>
+          <w:b/>
+          <w:bCs/>
+          <w:sz w:val="24"/>
+          <w:szCs w:val="22"/>
+          <w:lang w:val="en-US"/>
+        </w:rPr>
         <w:t xml:space="preserve">Always locates the first occurrence. </w:t>
       </w:r>
       <w:r>
@@ -4681,6 +4691,72 @@
         </w:rPr>
         <w:t>(WebElement)</w:t>
       </w:r>
+    </w:p>
+    <w:p>
+      <w:pPr>
+        <w:pStyle w:val="ListParagraph"/>
+        <w:numPr>
+          <w:ilvl w:val="0"/>
+          <w:numId w:val="14"/>
+        </w:numPr>
+        <w:rPr>
+          <w:sz w:val="24"/>
+          <w:szCs w:val="22"/>
+          <w:lang w:val="en-US"/>
+        </w:rPr>
+      </w:pPr>
+      <w:r>
+        <w:rPr>
+          <w:sz w:val="24"/>
+          <w:szCs w:val="22"/>
+          <w:lang w:val="en-US"/>
+        </w:rPr>
+        <w:t xml:space="preserve">findElements() </w:t>
+      </w:r>
+      <w:r>
+        <w:rPr>
+          <w:sz w:val="24"/>
+          <w:szCs w:val="22"/>
+          <w:lang w:val="en-US"/>
+        </w:rPr>
+        <w:sym w:font="Wingdings" w:char="F0E0"/>
+      </w:r>
+      <w:r>
+        <w:rPr>
+          <w:sz w:val="24"/>
+          <w:szCs w:val="22"/>
+          <w:lang w:val="en-US"/>
+        </w:rPr>
+        <w:t xml:space="preserve"> Will locate / find </w:t>
+      </w:r>
+      <w:r>
+        <w:rPr>
+          <w:b/>
+          <w:bCs/>
+          <w:sz w:val="24"/>
+          <w:szCs w:val="22"/>
+          <w:lang w:val="en-US"/>
+        </w:rPr>
+        <w:t>multiple</w:t>
+      </w:r>
+      <w:r>
+        <w:rPr>
+          <w:sz w:val="24"/>
+          <w:szCs w:val="22"/>
+          <w:lang w:val="en-US"/>
+        </w:rPr>
+        <w:t xml:space="preserve"> controls on the web page. </w:t>
+      </w:r>
+      <w:r>
+        <w:rPr>
+          <w:sz w:val="24"/>
+          <w:szCs w:val="22"/>
+          <w:lang w:val="en-US"/>
+        </w:rPr>
+        <w:t>(List&lt;WebElement&gt;)</w:t>
+      </w:r>
+      <w:bookmarkStart w:id="0" w:name="_GoBack"/>
+      <w:bookmarkEnd w:id="0"/>
     </w:p>
     <w:p>
       <w:pPr>
@@ -5033,6 +5109,7 @@
           <w:szCs w:val="22"/>
           <w:lang w:val="en-US"/>
         </w:rPr>
+        <w:lastRenderedPageBreak/>
         <w:t>Id</w:t>
       </w:r>
     </w:p>
@@ -5077,7 +5154,6 @@
           <w:szCs w:val="22"/>
           <w:lang w:val="en-US"/>
         </w:rPr>
-        <w:lastRenderedPageBreak/>
         <w:t>CssSelector</w:t>
       </w:r>
     </w:p>
@@ -5231,11 +5307,17 @@
           <w:szCs w:val="22"/>
           <w:lang w:val="en-US"/>
         </w:rPr>
-        <w:t>WebElement is an interface. Which can store any control on the page like text box, radio button, drop down list, link etc.</w:t>
-      </w:r>
-    </w:p>
-    <w:p>
-      <w:pPr>
+        <w:t>WebElement is an interface. Which can store any</w:t>
+      </w:r>
+      <w:r>
+        <w:rPr>
+          <w:sz w:val="24"/>
+          <w:szCs w:val="22"/>
+          <w:lang w:val="en-US"/>
+        </w:rPr>
+        <w:t xml:space="preserve"> </w:t>
+      </w:r>
+      <w:r>
         <w:rPr>
           <w:b/>
           <w:bCs/>
@@ -5243,8 +5325,19 @@
           <w:szCs w:val="22"/>
           <w:lang w:val="en-US"/>
         </w:rPr>
-      </w:pPr>
-      <w:r>
+        <w:t>single</w:t>
+      </w:r>
+      <w:r>
+        <w:rPr>
+          <w:sz w:val="24"/>
+          <w:szCs w:val="22"/>
+          <w:lang w:val="en-US"/>
+        </w:rPr>
+        <w:t xml:space="preserve"> control on the page like text box, radio button, drop down list, link etc.</w:t>
+      </w:r>
+    </w:p>
+    <w:p>
+      <w:pPr>
         <w:rPr>
           <w:b/>
           <w:bCs/>
@@ -5252,142 +5345,8 @@
           <w:szCs w:val="22"/>
           <w:lang w:val="en-US"/>
         </w:rPr>
-        <w:t>Methods of WebElement</w:t>
-      </w:r>
-    </w:p>
-    <w:p>
-      <w:pPr>
-        <w:pStyle w:val="ListParagraph"/>
-        <w:numPr>
-          <w:ilvl w:val="0"/>
-          <w:numId w:val="18"/>
-        </w:numPr>
-        <w:rPr>
-          <w:sz w:val="24"/>
-          <w:szCs w:val="22"/>
-          <w:lang w:val="en-US"/>
-        </w:rPr>
-      </w:pPr>
-      <w:r>
-        <w:rPr>
-          <w:sz w:val="24"/>
-          <w:szCs w:val="22"/>
-          <w:lang w:val="en-US"/>
-        </w:rPr>
-        <w:t xml:space="preserve">sendKeys() </w:t>
-      </w:r>
-      <w:r>
-        <w:rPr>
-          <w:sz w:val="24"/>
-          <w:szCs w:val="22"/>
-          <w:lang w:val="en-US"/>
-        </w:rPr>
-        <w:sym w:font="Wingdings" w:char="F0E0"/>
-      </w:r>
-      <w:r>
-        <w:rPr>
-          <w:sz w:val="24"/>
-          <w:szCs w:val="22"/>
-          <w:lang w:val="en-US"/>
-        </w:rPr>
-        <w:t xml:space="preserve"> Enters the text in textbox.</w:t>
-      </w:r>
-      <w:r>
-        <w:rPr>
-          <w:sz w:val="24"/>
-          <w:szCs w:val="22"/>
-          <w:lang w:val="en-US"/>
-        </w:rPr>
-        <w:t xml:space="preserve"> Appends the text if already some text is there in text box.</w:t>
-      </w:r>
-    </w:p>
-    <w:p>
-      <w:pPr>
-        <w:pStyle w:val="ListParagraph"/>
-        <w:numPr>
-          <w:ilvl w:val="0"/>
-          <w:numId w:val="18"/>
-        </w:numPr>
-        <w:rPr>
-          <w:sz w:val="24"/>
-          <w:szCs w:val="22"/>
-          <w:lang w:val="en-US"/>
-        </w:rPr>
-      </w:pPr>
-      <w:r>
-        <w:rPr>
-          <w:sz w:val="24"/>
-          <w:szCs w:val="22"/>
-          <w:lang w:val="en-US"/>
-        </w:rPr>
-        <w:t xml:space="preserve">click() </w:t>
-      </w:r>
-      <w:r>
-        <w:rPr>
-          <w:sz w:val="24"/>
-          <w:szCs w:val="22"/>
-          <w:lang w:val="en-US"/>
-        </w:rPr>
-        <w:sym w:font="Wingdings" w:char="F0E0"/>
-      </w:r>
-      <w:r>
-        <w:rPr>
-          <w:sz w:val="24"/>
-          <w:szCs w:val="22"/>
-          <w:lang w:val="en-US"/>
-        </w:rPr>
-        <w:t xml:space="preserve"> Will click on any control.</w:t>
-      </w:r>
-    </w:p>
-    <w:p>
-      <w:pPr>
-        <w:pStyle w:val="ListParagraph"/>
-        <w:numPr>
-          <w:ilvl w:val="0"/>
-          <w:numId w:val="18"/>
-        </w:numPr>
-        <w:rPr>
-          <w:sz w:val="24"/>
-          <w:szCs w:val="22"/>
-          <w:lang w:val="en-US"/>
-        </w:rPr>
-      </w:pPr>
-      <w:r>
-        <w:rPr>
-          <w:sz w:val="24"/>
-          <w:szCs w:val="22"/>
-          <w:lang w:val="en-US"/>
-        </w:rPr>
-        <w:t xml:space="preserve">getText() </w:t>
-      </w:r>
-      <w:r>
-        <w:rPr>
-          <w:sz w:val="24"/>
-          <w:szCs w:val="22"/>
-          <w:lang w:val="en-US"/>
-        </w:rPr>
-        <w:sym w:font="Wingdings" w:char="F0E0"/>
-      </w:r>
-      <w:r>
-        <w:rPr>
-          <w:sz w:val="24"/>
-          <w:szCs w:val="22"/>
-          <w:lang w:val="en-US"/>
-        </w:rPr>
-        <w:t xml:space="preserve"> Will return the text on the control. (String)</w:t>
-      </w:r>
-    </w:p>
-    <w:p>
-      <w:pPr>
-        <w:rPr>
-          <w:sz w:val="24"/>
-          <w:szCs w:val="22"/>
-          <w:lang w:val="en-US"/>
-        </w:rPr>
-      </w:pPr>
-    </w:p>
-    <w:p>
-      <w:pPr>
+      </w:pPr>
+      <w:r>
         <w:rPr>
           <w:b/>
           <w:bCs/>
@@ -5395,8 +5354,142 @@
           <w:szCs w:val="22"/>
           <w:lang w:val="en-US"/>
         </w:rPr>
-      </w:pPr>
-      <w:r>
+        <w:t>Methods of WebElement</w:t>
+      </w:r>
+    </w:p>
+    <w:p>
+      <w:pPr>
+        <w:pStyle w:val="ListParagraph"/>
+        <w:numPr>
+          <w:ilvl w:val="0"/>
+          <w:numId w:val="18"/>
+        </w:numPr>
+        <w:rPr>
+          <w:sz w:val="24"/>
+          <w:szCs w:val="22"/>
+          <w:lang w:val="en-US"/>
+        </w:rPr>
+      </w:pPr>
+      <w:r>
+        <w:rPr>
+          <w:sz w:val="24"/>
+          <w:szCs w:val="22"/>
+          <w:lang w:val="en-US"/>
+        </w:rPr>
+        <w:t xml:space="preserve">sendKeys() </w:t>
+      </w:r>
+      <w:r>
+        <w:rPr>
+          <w:sz w:val="24"/>
+          <w:szCs w:val="22"/>
+          <w:lang w:val="en-US"/>
+        </w:rPr>
+        <w:sym w:font="Wingdings" w:char="F0E0"/>
+      </w:r>
+      <w:r>
+        <w:rPr>
+          <w:sz w:val="24"/>
+          <w:szCs w:val="22"/>
+          <w:lang w:val="en-US"/>
+        </w:rPr>
+        <w:t xml:space="preserve"> Enters the text in textbox.</w:t>
+      </w:r>
+      <w:r>
+        <w:rPr>
+          <w:sz w:val="24"/>
+          <w:szCs w:val="22"/>
+          <w:lang w:val="en-US"/>
+        </w:rPr>
+        <w:t xml:space="preserve"> Appends the text if already some text is there in text box.</w:t>
+      </w:r>
+    </w:p>
+    <w:p>
+      <w:pPr>
+        <w:pStyle w:val="ListParagraph"/>
+        <w:numPr>
+          <w:ilvl w:val="0"/>
+          <w:numId w:val="18"/>
+        </w:numPr>
+        <w:rPr>
+          <w:sz w:val="24"/>
+          <w:szCs w:val="22"/>
+          <w:lang w:val="en-US"/>
+        </w:rPr>
+      </w:pPr>
+      <w:r>
+        <w:rPr>
+          <w:sz w:val="24"/>
+          <w:szCs w:val="22"/>
+          <w:lang w:val="en-US"/>
+        </w:rPr>
+        <w:t xml:space="preserve">click() </w:t>
+      </w:r>
+      <w:r>
+        <w:rPr>
+          <w:sz w:val="24"/>
+          <w:szCs w:val="22"/>
+          <w:lang w:val="en-US"/>
+        </w:rPr>
+        <w:sym w:font="Wingdings" w:char="F0E0"/>
+      </w:r>
+      <w:r>
+        <w:rPr>
+          <w:sz w:val="24"/>
+          <w:szCs w:val="22"/>
+          <w:lang w:val="en-US"/>
+        </w:rPr>
+        <w:t xml:space="preserve"> Will click on any control.</w:t>
+      </w:r>
+    </w:p>
+    <w:p>
+      <w:pPr>
+        <w:pStyle w:val="ListParagraph"/>
+        <w:numPr>
+          <w:ilvl w:val="0"/>
+          <w:numId w:val="18"/>
+        </w:numPr>
+        <w:rPr>
+          <w:sz w:val="24"/>
+          <w:szCs w:val="22"/>
+          <w:lang w:val="en-US"/>
+        </w:rPr>
+      </w:pPr>
+      <w:r>
+        <w:rPr>
+          <w:sz w:val="24"/>
+          <w:szCs w:val="22"/>
+          <w:lang w:val="en-US"/>
+        </w:rPr>
+        <w:t xml:space="preserve">getText() </w:t>
+      </w:r>
+      <w:r>
+        <w:rPr>
+          <w:sz w:val="24"/>
+          <w:szCs w:val="22"/>
+          <w:lang w:val="en-US"/>
+        </w:rPr>
+        <w:sym w:font="Wingdings" w:char="F0E0"/>
+      </w:r>
+      <w:r>
+        <w:rPr>
+          <w:sz w:val="24"/>
+          <w:szCs w:val="22"/>
+          <w:lang w:val="en-US"/>
+        </w:rPr>
+        <w:t xml:space="preserve"> Will return the text on the control. (String)</w:t>
+      </w:r>
+    </w:p>
+    <w:p>
+      <w:pPr>
+        <w:rPr>
+          <w:sz w:val="24"/>
+          <w:szCs w:val="22"/>
+          <w:lang w:val="en-US"/>
+        </w:rPr>
+      </w:pPr>
+    </w:p>
+    <w:p>
+      <w:pPr>
         <w:rPr>
           <w:b/>
           <w:bCs/>
@@ -5404,6 +5497,15 @@
           <w:szCs w:val="22"/>
           <w:lang w:val="en-US"/>
         </w:rPr>
+      </w:pPr>
+      <w:r>
+        <w:rPr>
+          <w:b/>
+          <w:bCs/>
+          <w:sz w:val="24"/>
+          <w:szCs w:val="22"/>
+          <w:lang w:val="en-US"/>
+        </w:rPr>
         <w:t>CssSelector Locator</w:t>
       </w:r>
     </w:p>
@@ -5770,7 +5872,6 @@
           <w:szCs w:val="22"/>
           <w:lang w:val="en-US"/>
         </w:rPr>
-        <w:lastRenderedPageBreak/>
         <w:t xml:space="preserve">Pattankodoli Bus stand </w:t>
       </w:r>
       <w:r>
@@ -6055,8 +6156,6 @@
         </w:rPr>
         <w:t>Referring direct to the control</w:t>
       </w:r>
-      <w:bookmarkStart w:id="0" w:name="_GoBack"/>
-      <w:bookmarkEnd w:id="0"/>
     </w:p>
     <w:p>
       <w:pPr>
@@ -8887,7 +8986,7 @@
 </file>
 
 <file path=customXml/itemProps1.xml><?xml version="1.0" encoding="utf-8"?>
-<ds:datastoreItem xmlns:ds="http://schemas.openxmlformats.org/officeDocument/2006/customXml" ds:itemID="{B0AA6767-1A32-4CEB-9058-092228A3F22C}">
+<ds:datastoreItem xmlns:ds="http://schemas.openxmlformats.org/officeDocument/2006/customXml" ds:itemID="{B3A6CEA3-9E87-479E-85E8-728F5CEE683E}">
   <ds:schemaRefs>
     <ds:schemaRef ds:uri="http://schemas.openxmlformats.org/officeDocument/2006/bibliography"/>
   </ds:schemaRefs>

</xml_diff>

<commit_message>
Date: 24 Nov 2025
</commit_message>
<xml_diff>
--- a/Notes_Selenium_14.docx
+++ b/Notes_Selenium_14.docx
@@ -621,23 +621,13 @@
           <w:lang w:val="en-US"/>
         </w:rPr>
       </w:pPr>
-      <w:proofErr w:type="spellStart"/>
-      <w:r>
-        <w:rPr>
-          <w:sz w:val="24"/>
-          <w:szCs w:val="22"/>
-          <w:lang w:val="en-US"/>
-        </w:rPr>
-        <w:t>Thread.sleep</w:t>
-      </w:r>
-      <w:proofErr w:type="spellEnd"/>
-      <w:r>
-        <w:rPr>
-          <w:sz w:val="24"/>
-          <w:szCs w:val="22"/>
-          <w:lang w:val="en-US"/>
-        </w:rPr>
-        <w:t>()</w:t>
+      <w:r>
+        <w:rPr>
+          <w:sz w:val="24"/>
+          <w:szCs w:val="22"/>
+          <w:lang w:val="en-US"/>
+        </w:rPr>
+        <w:t>Thread.sleep()</w:t>
       </w:r>
     </w:p>
     <w:p>
@@ -2166,25 +2156,7 @@
           <w:szCs w:val="22"/>
           <w:lang w:val="en-US"/>
         </w:rPr>
-        <w:t xml:space="preserve"> Correctness, Completeness, </w:t>
-      </w:r>
-      <w:proofErr w:type="gramStart"/>
-      <w:r>
-        <w:rPr>
-          <w:sz w:val="24"/>
-          <w:szCs w:val="22"/>
-          <w:lang w:val="en-US"/>
-        </w:rPr>
-        <w:t>Security</w:t>
-      </w:r>
-      <w:proofErr w:type="gramEnd"/>
-      <w:r>
-        <w:rPr>
-          <w:sz w:val="24"/>
-          <w:szCs w:val="22"/>
-          <w:lang w:val="en-US"/>
-        </w:rPr>
-        <w:t xml:space="preserve"> &amp; Quality of developed software application.</w:t>
+        <w:t xml:space="preserve"> Correctness, Completeness, Security &amp; Quality of developed software application.</w:t>
       </w:r>
     </w:p>
     <w:p>
@@ -3511,18 +3483,8 @@
           <w:szCs w:val="22"/>
           <w:lang w:val="en-US"/>
         </w:rPr>
-        <w:t xml:space="preserve">Idea </w:t>
-      </w:r>
-      <w:proofErr w:type="spellStart"/>
-      <w:r>
-        <w:rPr>
-          <w:sz w:val="24"/>
-          <w:szCs w:val="22"/>
-          <w:lang w:val="en-US"/>
-        </w:rPr>
-        <w:t>Intellij</w:t>
-      </w:r>
-      <w:proofErr w:type="spellEnd"/>
+        <w:t>Idea Intellij</w:t>
+      </w:r>
     </w:p>
     <w:p>
       <w:pPr>
@@ -3620,7 +3582,6 @@
           <w:lang w:val="en-US"/>
         </w:rPr>
       </w:pPr>
-      <w:proofErr w:type="spellStart"/>
       <w:r>
         <w:rPr>
           <w:sz w:val="24"/>
@@ -3629,7 +3590,6 @@
         </w:rPr>
         <w:t>YourName_SeleniumDemos</w:t>
       </w:r>
-      <w:proofErr w:type="spellEnd"/>
     </w:p>
     <w:p>
       <w:pPr>
@@ -3672,18 +3632,8 @@
           <w:szCs w:val="22"/>
           <w:lang w:val="en-US"/>
         </w:rPr>
-        <w:t xml:space="preserve">Open </w:t>
-      </w:r>
-      <w:proofErr w:type="spellStart"/>
-      <w:r>
-        <w:rPr>
-          <w:sz w:val="24"/>
-          <w:szCs w:val="22"/>
-          <w:lang w:val="en-US"/>
-        </w:rPr>
-        <w:t>selenium.dev</w:t>
-      </w:r>
-      <w:proofErr w:type="spellEnd"/>
+        <w:t>Open selenium.dev</w:t>
+      </w:r>
     </w:p>
     <w:p>
       <w:pPr>
@@ -3953,25 +3903,7 @@
           <w:szCs w:val="22"/>
           <w:lang w:val="en-US"/>
         </w:rPr>
-        <w:t>Give the name for project (</w:t>
-      </w:r>
-      <w:proofErr w:type="spellStart"/>
-      <w:r>
-        <w:rPr>
-          <w:sz w:val="24"/>
-          <w:szCs w:val="22"/>
-          <w:lang w:val="en-US"/>
-        </w:rPr>
-        <w:t>MyAutomationProject</w:t>
-      </w:r>
-      <w:proofErr w:type="spellEnd"/>
-      <w:r>
-        <w:rPr>
-          <w:sz w:val="24"/>
-          <w:szCs w:val="22"/>
-          <w:lang w:val="en-US"/>
-        </w:rPr>
-        <w:t>)</w:t>
+        <w:t>Give the name for project (MyAutomationProject)</w:t>
       </w:r>
     </w:p>
     <w:p>
@@ -4110,25 +4042,7 @@
           <w:szCs w:val="22"/>
           <w:lang w:val="en-US"/>
         </w:rPr>
-        <w:t>Give the name (</w:t>
-      </w:r>
-      <w:proofErr w:type="spellStart"/>
-      <w:r>
-        <w:rPr>
-          <w:sz w:val="24"/>
-          <w:szCs w:val="22"/>
-          <w:lang w:val="en-US"/>
-        </w:rPr>
-        <w:t>com.WebDriverDemos</w:t>
-      </w:r>
-      <w:proofErr w:type="spellEnd"/>
-      <w:r>
-        <w:rPr>
-          <w:sz w:val="24"/>
-          <w:szCs w:val="22"/>
-          <w:lang w:val="en-US"/>
-        </w:rPr>
-        <w:t>)</w:t>
+        <w:t>Give the name (com.WebDriverDemos)</w:t>
       </w:r>
     </w:p>
     <w:p>
@@ -4465,23 +4379,13 @@
           <w:lang w:val="en-US"/>
         </w:rPr>
       </w:pPr>
-      <w:proofErr w:type="gramStart"/>
-      <w:r>
-        <w:rPr>
-          <w:sz w:val="24"/>
-          <w:szCs w:val="22"/>
-          <w:lang w:val="en-US"/>
-        </w:rPr>
-        <w:t>get(</w:t>
-      </w:r>
-      <w:proofErr w:type="gramEnd"/>
-      <w:r>
-        <w:rPr>
-          <w:sz w:val="24"/>
-          <w:szCs w:val="22"/>
-          <w:lang w:val="en-US"/>
-        </w:rPr>
-        <w:t xml:space="preserve">) </w:t>
+      <w:r>
+        <w:rPr>
+          <w:sz w:val="24"/>
+          <w:szCs w:val="22"/>
+          <w:lang w:val="en-US"/>
+        </w:rPr>
+        <w:t xml:space="preserve">get() </w:t>
       </w:r>
       <w:r>
         <w:rPr>
@@ -4513,23 +4417,13 @@
           <w:lang w:val="en-US"/>
         </w:rPr>
       </w:pPr>
-      <w:proofErr w:type="spellStart"/>
-      <w:r>
-        <w:rPr>
-          <w:sz w:val="24"/>
-          <w:szCs w:val="22"/>
-          <w:lang w:val="en-US"/>
-        </w:rPr>
-        <w:t>driver.manage</w:t>
-      </w:r>
-      <w:proofErr w:type="spellEnd"/>
-      <w:r>
-        <w:rPr>
-          <w:sz w:val="24"/>
-          <w:szCs w:val="22"/>
-          <w:lang w:val="en-US"/>
-        </w:rPr>
-        <w:t xml:space="preserve">().window().maximize() </w:t>
+      <w:r>
+        <w:rPr>
+          <w:sz w:val="24"/>
+          <w:szCs w:val="22"/>
+          <w:lang w:val="en-US"/>
+        </w:rPr>
+        <w:t xml:space="preserve">driver.manage().window().maximize() </w:t>
       </w:r>
       <w:r>
         <w:rPr>
@@ -4561,23 +4455,13 @@
           <w:lang w:val="en-US"/>
         </w:rPr>
       </w:pPr>
-      <w:proofErr w:type="gramStart"/>
-      <w:r>
-        <w:rPr>
-          <w:sz w:val="24"/>
-          <w:szCs w:val="22"/>
-          <w:lang w:val="en-US"/>
-        </w:rPr>
-        <w:t>close(</w:t>
-      </w:r>
-      <w:proofErr w:type="gramEnd"/>
-      <w:r>
-        <w:rPr>
-          <w:sz w:val="24"/>
-          <w:szCs w:val="22"/>
-          <w:lang w:val="en-US"/>
-        </w:rPr>
-        <w:t xml:space="preserve">) </w:t>
+      <w:r>
+        <w:rPr>
+          <w:sz w:val="24"/>
+          <w:szCs w:val="22"/>
+          <w:lang w:val="en-US"/>
+        </w:rPr>
+        <w:t xml:space="preserve">close() </w:t>
       </w:r>
       <w:r>
         <w:rPr>
@@ -4609,23 +4493,13 @@
           <w:lang w:val="en-US"/>
         </w:rPr>
       </w:pPr>
-      <w:proofErr w:type="gramStart"/>
-      <w:r>
-        <w:rPr>
-          <w:sz w:val="24"/>
-          <w:szCs w:val="22"/>
-          <w:lang w:val="en-US"/>
-        </w:rPr>
-        <w:t>getTitle(</w:t>
-      </w:r>
-      <w:proofErr w:type="gramEnd"/>
-      <w:r>
-        <w:rPr>
-          <w:sz w:val="24"/>
-          <w:szCs w:val="22"/>
-          <w:lang w:val="en-US"/>
-        </w:rPr>
-        <w:t xml:space="preserve">) </w:t>
+      <w:r>
+        <w:rPr>
+          <w:sz w:val="24"/>
+          <w:szCs w:val="22"/>
+          <w:lang w:val="en-US"/>
+        </w:rPr>
+        <w:t xml:space="preserve">getTitle() </w:t>
       </w:r>
       <w:r>
         <w:rPr>
@@ -4665,23 +4539,13 @@
           <w:lang w:val="en-US"/>
         </w:rPr>
       </w:pPr>
-      <w:proofErr w:type="gramStart"/>
-      <w:r>
-        <w:rPr>
-          <w:sz w:val="24"/>
-          <w:szCs w:val="22"/>
-          <w:lang w:val="en-US"/>
-        </w:rPr>
-        <w:t>getCurrentUrl(</w:t>
-      </w:r>
-      <w:proofErr w:type="gramEnd"/>
-      <w:r>
-        <w:rPr>
-          <w:sz w:val="24"/>
-          <w:szCs w:val="22"/>
-          <w:lang w:val="en-US"/>
-        </w:rPr>
-        <w:t xml:space="preserve">) </w:t>
+      <w:r>
+        <w:rPr>
+          <w:sz w:val="24"/>
+          <w:szCs w:val="22"/>
+          <w:lang w:val="en-US"/>
+        </w:rPr>
+        <w:t xml:space="preserve">getCurrentUrl() </w:t>
       </w:r>
       <w:r>
         <w:rPr>
@@ -4713,23 +4577,13 @@
           <w:lang w:val="en-US"/>
         </w:rPr>
       </w:pPr>
-      <w:proofErr w:type="gramStart"/>
-      <w:r>
-        <w:rPr>
-          <w:sz w:val="24"/>
-          <w:szCs w:val="22"/>
-          <w:lang w:val="en-US"/>
-        </w:rPr>
-        <w:t>getPageSource(</w:t>
-      </w:r>
-      <w:proofErr w:type="gramEnd"/>
-      <w:r>
-        <w:rPr>
-          <w:sz w:val="24"/>
-          <w:szCs w:val="22"/>
-          <w:lang w:val="en-US"/>
-        </w:rPr>
-        <w:t xml:space="preserve">) </w:t>
+      <w:r>
+        <w:rPr>
+          <w:sz w:val="24"/>
+          <w:szCs w:val="22"/>
+          <w:lang w:val="en-US"/>
+        </w:rPr>
+        <w:t xml:space="preserve">getPageSource() </w:t>
       </w:r>
       <w:r>
         <w:rPr>
@@ -4761,23 +4615,13 @@
           <w:lang w:val="en-US"/>
         </w:rPr>
       </w:pPr>
-      <w:proofErr w:type="gramStart"/>
-      <w:r>
-        <w:rPr>
-          <w:sz w:val="24"/>
-          <w:szCs w:val="22"/>
-          <w:lang w:val="en-US"/>
-        </w:rPr>
-        <w:t>findElement(</w:t>
-      </w:r>
-      <w:proofErr w:type="gramEnd"/>
-      <w:r>
-        <w:rPr>
-          <w:sz w:val="24"/>
-          <w:szCs w:val="22"/>
-          <w:lang w:val="en-US"/>
-        </w:rPr>
-        <w:t xml:space="preserve">) </w:t>
+      <w:r>
+        <w:rPr>
+          <w:sz w:val="24"/>
+          <w:szCs w:val="22"/>
+          <w:lang w:val="en-US"/>
+        </w:rPr>
+        <w:t xml:space="preserve">findElement() </w:t>
       </w:r>
       <w:r>
         <w:rPr>
@@ -4861,23 +4705,13 @@
           <w:lang w:val="en-US"/>
         </w:rPr>
       </w:pPr>
-      <w:proofErr w:type="gramStart"/>
-      <w:r>
-        <w:rPr>
-          <w:sz w:val="24"/>
-          <w:szCs w:val="22"/>
-          <w:lang w:val="en-US"/>
-        </w:rPr>
-        <w:t>findElements(</w:t>
-      </w:r>
-      <w:proofErr w:type="gramEnd"/>
-      <w:r>
-        <w:rPr>
-          <w:sz w:val="24"/>
-          <w:szCs w:val="22"/>
-          <w:lang w:val="en-US"/>
-        </w:rPr>
-        <w:t xml:space="preserve">) </w:t>
+      <w:r>
+        <w:rPr>
+          <w:sz w:val="24"/>
+          <w:szCs w:val="22"/>
+          <w:lang w:val="en-US"/>
+        </w:rPr>
+        <w:t xml:space="preserve">findElements() </w:t>
       </w:r>
       <w:r>
         <w:rPr>
@@ -4935,23 +4769,13 @@
           <w:lang w:val="en-US"/>
         </w:rPr>
       </w:pPr>
-      <w:proofErr w:type="gramStart"/>
-      <w:r>
-        <w:rPr>
-          <w:sz w:val="24"/>
-          <w:szCs w:val="22"/>
-          <w:lang w:val="en-US"/>
-        </w:rPr>
-        <w:t>getWindowHandles(</w:t>
-      </w:r>
-      <w:proofErr w:type="gramEnd"/>
-      <w:r>
-        <w:rPr>
-          <w:sz w:val="24"/>
-          <w:szCs w:val="22"/>
-          <w:lang w:val="en-US"/>
-        </w:rPr>
-        <w:t xml:space="preserve">) </w:t>
+      <w:r>
+        <w:rPr>
+          <w:sz w:val="24"/>
+          <w:szCs w:val="22"/>
+          <w:lang w:val="en-US"/>
+        </w:rPr>
+        <w:t xml:space="preserve">getWindowHandles() </w:t>
       </w:r>
       <w:r>
         <w:rPr>
@@ -4991,23 +4815,13 @@
           <w:lang w:val="en-US"/>
         </w:rPr>
       </w:pPr>
-      <w:proofErr w:type="gramStart"/>
-      <w:r>
-        <w:rPr>
-          <w:sz w:val="24"/>
-          <w:szCs w:val="22"/>
-          <w:lang w:val="en-US"/>
-        </w:rPr>
-        <w:t>quit(</w:t>
-      </w:r>
-      <w:proofErr w:type="gramEnd"/>
-      <w:r>
-        <w:rPr>
-          <w:sz w:val="24"/>
-          <w:szCs w:val="22"/>
-          <w:lang w:val="en-US"/>
-        </w:rPr>
-        <w:t xml:space="preserve">) </w:t>
+      <w:r>
+        <w:rPr>
+          <w:sz w:val="24"/>
+          <w:szCs w:val="22"/>
+          <w:lang w:val="en-US"/>
+        </w:rPr>
+        <w:t xml:space="preserve">quit() </w:t>
       </w:r>
       <w:r>
         <w:rPr>
@@ -5227,8 +5041,6 @@
         </w:rPr>
         <w:t xml:space="preserve"> </w:t>
       </w:r>
-      <w:bookmarkStart w:id="0" w:name="_GoBack"/>
-      <w:bookmarkEnd w:id="0"/>
     </w:p>
     <w:p>
       <w:pPr>
@@ -5305,23 +5117,13 @@
         </w:rPr>
         <w:t xml:space="preserve"> </w:t>
       </w:r>
-      <w:proofErr w:type="spellStart"/>
-      <w:r>
-        <w:rPr>
-          <w:sz w:val="24"/>
-          <w:szCs w:val="22"/>
-          <w:lang w:val="en-US"/>
-        </w:rPr>
-        <w:t>driver.get</w:t>
-      </w:r>
-      <w:proofErr w:type="spellEnd"/>
-      <w:r>
-        <w:rPr>
-          <w:sz w:val="24"/>
-          <w:szCs w:val="22"/>
-          <w:lang w:val="en-US"/>
-        </w:rPr>
-        <w:t>() implicitly waits for 30 seconds, but if any one of the page is not getting loaded within these 30 seconds then you will get TimeoutException.</w:t>
+      <w:r>
+        <w:rPr>
+          <w:sz w:val="24"/>
+          <w:szCs w:val="22"/>
+          <w:lang w:val="en-US"/>
+        </w:rPr>
+        <w:t>driver.get() implicitly waits for 30 seconds, but if any one of the page is not getting loaded within these 30 seconds then you will get TimeoutException.</w:t>
       </w:r>
     </w:p>
     <w:p>
@@ -5824,23 +5626,13 @@
           <w:lang w:val="en-US"/>
         </w:rPr>
       </w:pPr>
-      <w:proofErr w:type="gramStart"/>
-      <w:r>
-        <w:rPr>
-          <w:sz w:val="24"/>
-          <w:szCs w:val="22"/>
-          <w:lang w:val="en-US"/>
-        </w:rPr>
-        <w:t>sendKeys(</w:t>
-      </w:r>
-      <w:proofErr w:type="gramEnd"/>
-      <w:r>
-        <w:rPr>
-          <w:sz w:val="24"/>
-          <w:szCs w:val="22"/>
-          <w:lang w:val="en-US"/>
-        </w:rPr>
-        <w:t xml:space="preserve">) </w:t>
+      <w:r>
+        <w:rPr>
+          <w:sz w:val="24"/>
+          <w:szCs w:val="22"/>
+          <w:lang w:val="en-US"/>
+        </w:rPr>
+        <w:t xml:space="preserve">sendKeys() </w:t>
       </w:r>
       <w:r>
         <w:rPr>
@@ -5880,23 +5672,13 @@
           <w:lang w:val="en-US"/>
         </w:rPr>
       </w:pPr>
-      <w:proofErr w:type="gramStart"/>
-      <w:r>
-        <w:rPr>
-          <w:sz w:val="24"/>
-          <w:szCs w:val="22"/>
-          <w:lang w:val="en-US"/>
-        </w:rPr>
-        <w:t>click(</w:t>
-      </w:r>
-      <w:proofErr w:type="gramEnd"/>
-      <w:r>
-        <w:rPr>
-          <w:sz w:val="24"/>
-          <w:szCs w:val="22"/>
-          <w:lang w:val="en-US"/>
-        </w:rPr>
-        <w:t xml:space="preserve">) </w:t>
+      <w:r>
+        <w:rPr>
+          <w:sz w:val="24"/>
+          <w:szCs w:val="22"/>
+          <w:lang w:val="en-US"/>
+        </w:rPr>
+        <w:t xml:space="preserve">click() </w:t>
       </w:r>
       <w:r>
         <w:rPr>
@@ -5928,23 +5710,13 @@
           <w:lang w:val="en-US"/>
         </w:rPr>
       </w:pPr>
-      <w:proofErr w:type="gramStart"/>
-      <w:r>
-        <w:rPr>
-          <w:sz w:val="24"/>
-          <w:szCs w:val="22"/>
-          <w:lang w:val="en-US"/>
-        </w:rPr>
-        <w:t>getText(</w:t>
-      </w:r>
-      <w:proofErr w:type="gramEnd"/>
-      <w:r>
-        <w:rPr>
-          <w:sz w:val="24"/>
-          <w:szCs w:val="22"/>
-          <w:lang w:val="en-US"/>
-        </w:rPr>
-        <w:t xml:space="preserve">) </w:t>
+      <w:r>
+        <w:rPr>
+          <w:sz w:val="24"/>
+          <w:szCs w:val="22"/>
+          <w:lang w:val="en-US"/>
+        </w:rPr>
+        <w:t xml:space="preserve">getText() </w:t>
       </w:r>
       <w:r>
         <w:rPr>
@@ -5976,23 +5748,13 @@
           <w:lang w:val="en-US"/>
         </w:rPr>
       </w:pPr>
-      <w:proofErr w:type="gramStart"/>
-      <w:r>
-        <w:rPr>
-          <w:sz w:val="24"/>
-          <w:szCs w:val="22"/>
-          <w:lang w:val="en-US"/>
-        </w:rPr>
-        <w:t>isSelected(</w:t>
-      </w:r>
-      <w:proofErr w:type="gramEnd"/>
-      <w:r>
-        <w:rPr>
-          <w:sz w:val="24"/>
-          <w:szCs w:val="22"/>
-          <w:lang w:val="en-US"/>
-        </w:rPr>
-        <w:t xml:space="preserve">) </w:t>
+      <w:r>
+        <w:rPr>
+          <w:sz w:val="24"/>
+          <w:szCs w:val="22"/>
+          <w:lang w:val="en-US"/>
+        </w:rPr>
+        <w:t xml:space="preserve">isSelected() </w:t>
       </w:r>
       <w:r>
         <w:rPr>
@@ -6070,23 +5832,13 @@
           <w:lang w:val="en-US"/>
         </w:rPr>
       </w:pPr>
-      <w:proofErr w:type="gramStart"/>
-      <w:r>
-        <w:rPr>
-          <w:sz w:val="24"/>
-          <w:szCs w:val="22"/>
-          <w:lang w:val="en-US"/>
-        </w:rPr>
-        <w:t>isDisplayed(</w:t>
-      </w:r>
-      <w:proofErr w:type="gramEnd"/>
-      <w:r>
-        <w:rPr>
-          <w:sz w:val="24"/>
-          <w:szCs w:val="22"/>
-          <w:lang w:val="en-US"/>
-        </w:rPr>
-        <w:t xml:space="preserve">) </w:t>
+      <w:r>
+        <w:rPr>
+          <w:sz w:val="24"/>
+          <w:szCs w:val="22"/>
+          <w:lang w:val="en-US"/>
+        </w:rPr>
+        <w:t xml:space="preserve">isDisplayed() </w:t>
       </w:r>
       <w:r>
         <w:rPr>
@@ -6262,25 +6014,7 @@
           <w:szCs w:val="22"/>
           <w:lang w:val="en-US"/>
         </w:rPr>
-        <w:t>data-</w:t>
-      </w:r>
-      <w:proofErr w:type="spellStart"/>
-      <w:r>
-        <w:rPr>
-          <w:sz w:val="24"/>
-          <w:szCs w:val="22"/>
-          <w:lang w:val="en-US"/>
-        </w:rPr>
-        <w:t>testid</w:t>
-      </w:r>
-      <w:proofErr w:type="spellEnd"/>
-      <w:r>
-        <w:rPr>
-          <w:sz w:val="24"/>
-          <w:szCs w:val="22"/>
-          <w:lang w:val="en-US"/>
-        </w:rPr>
-        <w:t>="royal-email"]</w:t>
+        <w:t>data-testid="royal-email"]</w:t>
       </w:r>
     </w:p>
     <w:p>
@@ -7103,23 +6837,13 @@
           <w:lang w:val="en-US"/>
         </w:rPr>
       </w:pPr>
-      <w:proofErr w:type="gramStart"/>
-      <w:r>
-        <w:rPr>
-          <w:sz w:val="24"/>
-          <w:szCs w:val="22"/>
-          <w:lang w:val="en-US"/>
-        </w:rPr>
-        <w:t>getOptions(</w:t>
-      </w:r>
-      <w:proofErr w:type="gramEnd"/>
-      <w:r>
-        <w:rPr>
-          <w:sz w:val="24"/>
-          <w:szCs w:val="22"/>
-          <w:lang w:val="en-US"/>
-        </w:rPr>
-        <w:t xml:space="preserve">) </w:t>
+      <w:r>
+        <w:rPr>
+          <w:sz w:val="24"/>
+          <w:szCs w:val="22"/>
+          <w:lang w:val="en-US"/>
+        </w:rPr>
+        <w:t xml:space="preserve">getOptions() </w:t>
       </w:r>
       <w:r>
         <w:rPr>
@@ -7151,23 +6875,13 @@
           <w:lang w:val="en-US"/>
         </w:rPr>
       </w:pPr>
-      <w:proofErr w:type="gramStart"/>
-      <w:r>
-        <w:rPr>
-          <w:sz w:val="24"/>
-          <w:szCs w:val="22"/>
-          <w:lang w:val="en-US"/>
-        </w:rPr>
-        <w:t>selectByVisibleText(</w:t>
-      </w:r>
-      <w:proofErr w:type="gramEnd"/>
-      <w:r>
-        <w:rPr>
-          <w:sz w:val="24"/>
-          <w:szCs w:val="22"/>
-          <w:lang w:val="en-US"/>
-        </w:rPr>
-        <w:t xml:space="preserve">) </w:t>
+      <w:r>
+        <w:rPr>
+          <w:sz w:val="24"/>
+          <w:szCs w:val="22"/>
+          <w:lang w:val="en-US"/>
+        </w:rPr>
+        <w:t xml:space="preserve">selectByVisibleText() </w:t>
       </w:r>
       <w:r>
         <w:rPr>
@@ -7237,23 +6951,13 @@
           <w:lang w:val="en-US"/>
         </w:rPr>
       </w:pPr>
-      <w:proofErr w:type="gramStart"/>
-      <w:r>
-        <w:rPr>
-          <w:sz w:val="24"/>
-          <w:szCs w:val="22"/>
-          <w:lang w:val="en-US"/>
-        </w:rPr>
-        <w:t>selectByValue(</w:t>
-      </w:r>
-      <w:proofErr w:type="gramEnd"/>
-      <w:r>
-        <w:rPr>
-          <w:sz w:val="24"/>
-          <w:szCs w:val="22"/>
-          <w:lang w:val="en-US"/>
-        </w:rPr>
-        <w:t xml:space="preserve">) </w:t>
+      <w:r>
+        <w:rPr>
+          <w:sz w:val="24"/>
+          <w:szCs w:val="22"/>
+          <w:lang w:val="en-US"/>
+        </w:rPr>
+        <w:t xml:space="preserve">selectByValue() </w:t>
       </w:r>
       <w:r>
         <w:rPr>
@@ -7293,23 +6997,13 @@
           <w:lang w:val="en-US"/>
         </w:rPr>
       </w:pPr>
-      <w:proofErr w:type="gramStart"/>
-      <w:r>
-        <w:rPr>
-          <w:sz w:val="24"/>
-          <w:szCs w:val="22"/>
-          <w:lang w:val="en-US"/>
-        </w:rPr>
-        <w:t>selectByIndex(</w:t>
-      </w:r>
-      <w:proofErr w:type="gramEnd"/>
-      <w:r>
-        <w:rPr>
-          <w:sz w:val="24"/>
-          <w:szCs w:val="22"/>
-          <w:lang w:val="en-US"/>
-        </w:rPr>
-        <w:t xml:space="preserve">) </w:t>
+      <w:r>
+        <w:rPr>
+          <w:sz w:val="24"/>
+          <w:szCs w:val="22"/>
+          <w:lang w:val="en-US"/>
+        </w:rPr>
+        <w:t xml:space="preserve">selectByIndex() </w:t>
       </w:r>
       <w:r>
         <w:rPr>
@@ -7325,25 +7019,7 @@
           <w:szCs w:val="22"/>
           <w:lang w:val="en-US"/>
         </w:rPr>
-        <w:t xml:space="preserve"> Selects the option by using its zero based index no. index no is +</w:t>
-      </w:r>
-      <w:proofErr w:type="spellStart"/>
-      <w:r>
-        <w:rPr>
-          <w:sz w:val="24"/>
-          <w:szCs w:val="22"/>
-          <w:lang w:val="en-US"/>
-        </w:rPr>
-        <w:t>ve</w:t>
-      </w:r>
-      <w:proofErr w:type="spellEnd"/>
-      <w:r>
-        <w:rPr>
-          <w:sz w:val="24"/>
-          <w:szCs w:val="22"/>
-          <w:lang w:val="en-US"/>
-        </w:rPr>
-        <w:t xml:space="preserve"> integer number.</w:t>
+        <w:t xml:space="preserve"> Selects the option by using its zero based index no. index no is +ve integer number.</w:t>
       </w:r>
     </w:p>
     <w:p>
@@ -7359,23 +7035,13 @@
           <w:lang w:val="en-US"/>
         </w:rPr>
       </w:pPr>
-      <w:proofErr w:type="gramStart"/>
-      <w:r>
-        <w:rPr>
-          <w:sz w:val="24"/>
-          <w:szCs w:val="22"/>
-          <w:lang w:val="en-US"/>
-        </w:rPr>
-        <w:t>getAllSelectedOptions(</w:t>
-      </w:r>
-      <w:proofErr w:type="gramEnd"/>
-      <w:r>
-        <w:rPr>
-          <w:sz w:val="24"/>
-          <w:szCs w:val="22"/>
-          <w:lang w:val="en-US"/>
-        </w:rPr>
-        <w:t xml:space="preserve">) </w:t>
+      <w:r>
+        <w:rPr>
+          <w:sz w:val="24"/>
+          <w:szCs w:val="22"/>
+          <w:lang w:val="en-US"/>
+        </w:rPr>
+        <w:t xml:space="preserve">getAllSelectedOptions() </w:t>
       </w:r>
       <w:r>
         <w:rPr>
@@ -7407,23 +7073,13 @@
           <w:lang w:val="en-US"/>
         </w:rPr>
       </w:pPr>
-      <w:proofErr w:type="gramStart"/>
-      <w:r>
-        <w:rPr>
-          <w:sz w:val="24"/>
-          <w:szCs w:val="22"/>
-          <w:lang w:val="en-US"/>
-        </w:rPr>
-        <w:t>isMultiple(</w:t>
-      </w:r>
-      <w:proofErr w:type="gramEnd"/>
-      <w:r>
-        <w:rPr>
-          <w:sz w:val="24"/>
-          <w:szCs w:val="22"/>
-          <w:lang w:val="en-US"/>
-        </w:rPr>
-        <w:t xml:space="preserve">) </w:t>
+      <w:r>
+        <w:rPr>
+          <w:sz w:val="24"/>
+          <w:szCs w:val="22"/>
+          <w:lang w:val="en-US"/>
+        </w:rPr>
+        <w:t xml:space="preserve">isMultiple() </w:t>
       </w:r>
       <w:r>
         <w:rPr>
@@ -7638,33 +7294,13 @@
           <w:lang w:val="en-US"/>
         </w:rPr>
       </w:pPr>
-      <w:proofErr w:type="spellStart"/>
-      <w:proofErr w:type="gramStart"/>
-      <w:r>
-        <w:rPr>
-          <w:sz w:val="24"/>
-          <w:szCs w:val="22"/>
-          <w:lang w:val="en-US"/>
-        </w:rPr>
-        <w:t>Thread.sleep</w:t>
-      </w:r>
-      <w:proofErr w:type="spellEnd"/>
-      <w:r>
-        <w:rPr>
-          <w:sz w:val="24"/>
-          <w:szCs w:val="22"/>
-          <w:lang w:val="en-US"/>
-        </w:rPr>
-        <w:t>(</w:t>
-      </w:r>
-      <w:proofErr w:type="gramEnd"/>
-      <w:r>
-        <w:rPr>
-          <w:sz w:val="24"/>
-          <w:szCs w:val="22"/>
-          <w:lang w:val="en-US"/>
-        </w:rPr>
-        <w:t>)</w:t>
+      <w:r>
+        <w:rPr>
+          <w:sz w:val="24"/>
+          <w:szCs w:val="22"/>
+          <w:lang w:val="en-US"/>
+        </w:rPr>
+        <w:t>Thread.sleep()</w:t>
       </w:r>
       <w:r>
         <w:rPr>
@@ -8031,24 +7667,7 @@
           <w:lang w:val="en-US"/>
         </w:rPr>
         <w:br/>
-      </w:r>
-      <w:proofErr w:type="spellStart"/>
-      <w:r>
-        <w:rPr>
-          <w:sz w:val="24"/>
-          <w:szCs w:val="22"/>
-          <w:lang w:val="en-US"/>
-        </w:rPr>
-        <w:t>i</w:t>
-      </w:r>
-      <w:proofErr w:type="spellEnd"/>
-      <w:r>
-        <w:rPr>
-          <w:sz w:val="24"/>
-          <w:szCs w:val="22"/>
-          <w:lang w:val="en-US"/>
-        </w:rPr>
-        <w:t xml:space="preserve"> – ignoring </w:t>
+        <w:t xml:space="preserve">i – ignoring </w:t>
       </w:r>
       <w:r>
         <w:rPr>
@@ -8164,33 +7783,15 @@
           <w:szCs w:val="22"/>
           <w:lang w:val="en-US"/>
         </w:rPr>
-        <w:t>Display all table header (&lt;</w:t>
-      </w:r>
-      <w:proofErr w:type="spellStart"/>
-      <w:r>
-        <w:rPr>
-          <w:sz w:val="24"/>
-          <w:szCs w:val="22"/>
-          <w:lang w:val="en-US"/>
-        </w:rPr>
-        <w:t>t</w:t>
-      </w:r>
-      <w:r>
-        <w:rPr>
-          <w:sz w:val="24"/>
-          <w:szCs w:val="22"/>
-          <w:lang w:val="en-US"/>
-        </w:rPr>
-        <w:t>h</w:t>
-      </w:r>
-      <w:proofErr w:type="spellEnd"/>
-      <w:r>
-        <w:rPr>
-          <w:sz w:val="24"/>
-          <w:szCs w:val="22"/>
-          <w:lang w:val="en-US"/>
-        </w:rPr>
-        <w:t>&gt;)</w:t>
+        <w:t>Display all table header (&lt;t</w:t>
+      </w:r>
+      <w:r>
+        <w:rPr>
+          <w:sz w:val="24"/>
+          <w:szCs w:val="22"/>
+          <w:lang w:val="en-US"/>
+        </w:rPr>
+        <w:t>h&gt;)</w:t>
       </w:r>
     </w:p>
     <w:p>
@@ -8212,25 +7813,7 @@
           <w:szCs w:val="22"/>
           <w:lang w:val="en-US"/>
         </w:rPr>
-        <w:t>Display total number of rows (&lt;</w:t>
-      </w:r>
-      <w:proofErr w:type="spellStart"/>
-      <w:r>
-        <w:rPr>
-          <w:sz w:val="24"/>
-          <w:szCs w:val="22"/>
-          <w:lang w:val="en-US"/>
-        </w:rPr>
-        <w:t>tr</w:t>
-      </w:r>
-      <w:proofErr w:type="spellEnd"/>
-      <w:r>
-        <w:rPr>
-          <w:sz w:val="24"/>
-          <w:szCs w:val="22"/>
-          <w:lang w:val="en-US"/>
-        </w:rPr>
-        <w:t>&gt;)</w:t>
+        <w:t>Display total number of rows (&lt;tr&gt;)</w:t>
       </w:r>
     </w:p>
     <w:p>
@@ -8381,25 +7964,7 @@
           <w:szCs w:val="22"/>
           <w:lang w:val="en-US"/>
         </w:rPr>
-        <w:t>Entering some data in the text boxes (</w:t>
-      </w:r>
-      <w:proofErr w:type="gramStart"/>
-      <w:r>
-        <w:rPr>
-          <w:sz w:val="24"/>
-          <w:szCs w:val="22"/>
-          <w:lang w:val="en-US"/>
-        </w:rPr>
-        <w:t>sendKeys(</w:t>
-      </w:r>
-      <w:proofErr w:type="gramEnd"/>
-      <w:r>
-        <w:rPr>
-          <w:sz w:val="24"/>
-          <w:szCs w:val="22"/>
-          <w:lang w:val="en-US"/>
-        </w:rPr>
-        <w:t>)).</w:t>
+        <w:t>Entering some data in the text boxes (sendKeys()).</w:t>
       </w:r>
     </w:p>
     <w:p>
@@ -8727,23 +8292,13 @@
           <w:lang w:val="en-US"/>
         </w:rPr>
       </w:pPr>
-      <w:proofErr w:type="spellStart"/>
-      <w:r>
-        <w:rPr>
-          <w:sz w:val="24"/>
-          <w:szCs w:val="22"/>
-          <w:lang w:val="en-US"/>
-        </w:rPr>
-        <w:t>driver.switchTo</w:t>
-      </w:r>
-      <w:proofErr w:type="spellEnd"/>
-      <w:r>
-        <w:rPr>
-          <w:sz w:val="24"/>
-          <w:szCs w:val="22"/>
-          <w:lang w:val="en-US"/>
-        </w:rPr>
-        <w:t xml:space="preserve">().alert() </w:t>
+      <w:r>
+        <w:rPr>
+          <w:sz w:val="24"/>
+          <w:szCs w:val="22"/>
+          <w:lang w:val="en-US"/>
+        </w:rPr>
+        <w:t xml:space="preserve">driver.switchTo().alert() </w:t>
       </w:r>
       <w:r>
         <w:rPr>
@@ -8775,23 +8330,13 @@
           <w:lang w:val="en-US"/>
         </w:rPr>
       </w:pPr>
-      <w:proofErr w:type="gramStart"/>
-      <w:r>
-        <w:rPr>
-          <w:sz w:val="24"/>
-          <w:szCs w:val="22"/>
-          <w:lang w:val="en-US"/>
-        </w:rPr>
-        <w:t>getText(</w:t>
-      </w:r>
-      <w:proofErr w:type="gramEnd"/>
-      <w:r>
-        <w:rPr>
-          <w:sz w:val="24"/>
-          <w:szCs w:val="22"/>
-          <w:lang w:val="en-US"/>
-        </w:rPr>
-        <w:t xml:space="preserve">) </w:t>
+      <w:r>
+        <w:rPr>
+          <w:sz w:val="24"/>
+          <w:szCs w:val="22"/>
+          <w:lang w:val="en-US"/>
+        </w:rPr>
+        <w:t xml:space="preserve">getText() </w:t>
       </w:r>
       <w:r>
         <w:rPr>
@@ -9127,23 +8672,13 @@
           <w:lang w:val="en-US"/>
         </w:rPr>
       </w:pPr>
-      <w:proofErr w:type="gramStart"/>
-      <w:r>
-        <w:rPr>
-          <w:sz w:val="24"/>
-          <w:szCs w:val="22"/>
-          <w:lang w:val="en-US"/>
-        </w:rPr>
-        <w:t>moveToElement(</w:t>
-      </w:r>
-      <w:proofErr w:type="gramEnd"/>
-      <w:r>
-        <w:rPr>
-          <w:sz w:val="24"/>
-          <w:szCs w:val="22"/>
-          <w:lang w:val="en-US"/>
-        </w:rPr>
-        <w:t xml:space="preserve">) </w:t>
+      <w:r>
+        <w:rPr>
+          <w:sz w:val="24"/>
+          <w:szCs w:val="22"/>
+          <w:lang w:val="en-US"/>
+        </w:rPr>
+        <w:t xml:space="preserve">moveToElement() </w:t>
       </w:r>
       <w:r>
         <w:rPr>
@@ -9175,23 +8710,13 @@
           <w:lang w:val="en-US"/>
         </w:rPr>
       </w:pPr>
-      <w:proofErr w:type="gramStart"/>
-      <w:r>
-        <w:rPr>
-          <w:sz w:val="24"/>
-          <w:szCs w:val="22"/>
-          <w:lang w:val="en-US"/>
-        </w:rPr>
-        <w:t>perform(</w:t>
-      </w:r>
-      <w:proofErr w:type="gramEnd"/>
-      <w:r>
-        <w:rPr>
-          <w:sz w:val="24"/>
-          <w:szCs w:val="22"/>
-          <w:lang w:val="en-US"/>
-        </w:rPr>
-        <w:t xml:space="preserve">) </w:t>
+      <w:r>
+        <w:rPr>
+          <w:sz w:val="24"/>
+          <w:szCs w:val="22"/>
+          <w:lang w:val="en-US"/>
+        </w:rPr>
+        <w:t xml:space="preserve">perform() </w:t>
       </w:r>
       <w:r>
         <w:rPr>
@@ -9223,23 +8748,13 @@
           <w:lang w:val="en-US"/>
         </w:rPr>
       </w:pPr>
-      <w:proofErr w:type="gramStart"/>
-      <w:r>
-        <w:rPr>
-          <w:sz w:val="24"/>
-          <w:szCs w:val="22"/>
-          <w:lang w:val="en-US"/>
-        </w:rPr>
-        <w:t>contextClick(</w:t>
-      </w:r>
-      <w:proofErr w:type="gramEnd"/>
-      <w:r>
-        <w:rPr>
-          <w:sz w:val="24"/>
-          <w:szCs w:val="22"/>
-          <w:lang w:val="en-US"/>
-        </w:rPr>
-        <w:t xml:space="preserve">) </w:t>
+      <w:r>
+        <w:rPr>
+          <w:sz w:val="24"/>
+          <w:szCs w:val="22"/>
+          <w:lang w:val="en-US"/>
+        </w:rPr>
+        <w:t xml:space="preserve">contextClick() </w:t>
       </w:r>
       <w:r>
         <w:rPr>
@@ -9271,23 +8786,13 @@
           <w:lang w:val="en-US"/>
         </w:rPr>
       </w:pPr>
-      <w:proofErr w:type="gramStart"/>
-      <w:r>
-        <w:rPr>
-          <w:sz w:val="24"/>
-          <w:szCs w:val="22"/>
-          <w:lang w:val="en-US"/>
-        </w:rPr>
-        <w:t>doubleClick(</w:t>
-      </w:r>
-      <w:proofErr w:type="gramEnd"/>
-      <w:r>
-        <w:rPr>
-          <w:sz w:val="24"/>
-          <w:szCs w:val="22"/>
-          <w:lang w:val="en-US"/>
-        </w:rPr>
-        <w:t xml:space="preserve">) </w:t>
+      <w:r>
+        <w:rPr>
+          <w:sz w:val="24"/>
+          <w:szCs w:val="22"/>
+          <w:lang w:val="en-US"/>
+        </w:rPr>
+        <w:t xml:space="preserve">doubleClick() </w:t>
       </w:r>
       <w:r>
         <w:rPr>
@@ -9305,6 +8810,964 @@
         </w:rPr>
         <w:t xml:space="preserve"> To double click on the control.</w:t>
       </w:r>
+    </w:p>
+    <w:p>
+      <w:pPr>
+        <w:rPr>
+          <w:sz w:val="24"/>
+          <w:szCs w:val="22"/>
+          <w:lang w:val="en-US"/>
+        </w:rPr>
+      </w:pPr>
+      <w:r>
+        <w:rPr>
+          <w:sz w:val="24"/>
+          <w:szCs w:val="22"/>
+          <w:lang w:val="en-US"/>
+        </w:rPr>
+        <w:br w:type="page"/>
+      </w:r>
+    </w:p>
+    <w:p>
+      <w:pPr>
+        <w:rPr>
+          <w:b/>
+          <w:bCs/>
+          <w:sz w:val="24"/>
+          <w:szCs w:val="22"/>
+          <w:lang w:val="en-US"/>
+        </w:rPr>
+      </w:pPr>
+      <w:r>
+        <w:rPr>
+          <w:b/>
+          <w:bCs/>
+          <w:sz w:val="24"/>
+          <w:szCs w:val="22"/>
+          <w:lang w:val="en-US"/>
+        </w:rPr>
+        <w:lastRenderedPageBreak/>
+        <w:t>TestNG</w:t>
+      </w:r>
+      <w:r>
+        <w:rPr>
+          <w:b/>
+          <w:bCs/>
+          <w:sz w:val="24"/>
+          <w:szCs w:val="22"/>
+          <w:lang w:val="en-US"/>
+        </w:rPr>
+        <w:t xml:space="preserve"> (Test Next Generation)</w:t>
+      </w:r>
+    </w:p>
+    <w:p>
+      <w:pPr>
+        <w:rPr>
+          <w:sz w:val="24"/>
+          <w:szCs w:val="22"/>
+          <w:lang w:val="en-US"/>
+        </w:rPr>
+      </w:pPr>
+      <w:r>
+        <w:rPr>
+          <w:sz w:val="24"/>
+          <w:szCs w:val="22"/>
+          <w:lang w:val="en-US"/>
+        </w:rPr>
+        <w:t>It is testing framework which will make automation testing more easy.</w:t>
+      </w:r>
+    </w:p>
+    <w:p>
+      <w:pPr>
+        <w:rPr>
+          <w:sz w:val="24"/>
+          <w:szCs w:val="22"/>
+          <w:lang w:val="en-US"/>
+        </w:rPr>
+      </w:pPr>
+      <w:r>
+        <w:rPr>
+          <w:b/>
+          <w:bCs/>
+          <w:sz w:val="24"/>
+          <w:szCs w:val="22"/>
+          <w:lang w:val="en-US"/>
+        </w:rPr>
+        <w:t xml:space="preserve">Framework: </w:t>
+      </w:r>
+      <w:r>
+        <w:rPr>
+          <w:sz w:val="24"/>
+          <w:szCs w:val="22"/>
+          <w:lang w:val="en-US"/>
+        </w:rPr>
+        <w:t>Is set of rules, guidelines and best practices for automation testing.</w:t>
+      </w:r>
+    </w:p>
+    <w:p>
+      <w:pPr>
+        <w:rPr>
+          <w:sz w:val="24"/>
+          <w:szCs w:val="22"/>
+          <w:lang w:val="en-US"/>
+        </w:rPr>
+      </w:pPr>
+    </w:p>
+    <w:p>
+      <w:pPr>
+        <w:rPr>
+          <w:b/>
+          <w:bCs/>
+          <w:sz w:val="24"/>
+          <w:szCs w:val="22"/>
+          <w:lang w:val="en-US"/>
+        </w:rPr>
+      </w:pPr>
+      <w:r>
+        <w:rPr>
+          <w:b/>
+          <w:bCs/>
+          <w:sz w:val="24"/>
+          <w:szCs w:val="22"/>
+          <w:lang w:val="en-US"/>
+        </w:rPr>
+        <w:t>Advantages:</w:t>
+      </w:r>
+    </w:p>
+    <w:p>
+      <w:pPr>
+        <w:pStyle w:val="ListParagraph"/>
+        <w:numPr>
+          <w:ilvl w:val="0"/>
+          <w:numId w:val="32"/>
+        </w:numPr>
+        <w:rPr>
+          <w:sz w:val="24"/>
+          <w:szCs w:val="22"/>
+          <w:lang w:val="en-US"/>
+        </w:rPr>
+      </w:pPr>
+      <w:r>
+        <w:rPr>
+          <w:sz w:val="24"/>
+          <w:szCs w:val="22"/>
+          <w:lang w:val="en-US"/>
+        </w:rPr>
+        <w:t>Allows to create multiple tests in single class.</w:t>
+      </w:r>
+    </w:p>
+    <w:p>
+      <w:pPr>
+        <w:pStyle w:val="ListParagraph"/>
+        <w:numPr>
+          <w:ilvl w:val="0"/>
+          <w:numId w:val="32"/>
+        </w:numPr>
+        <w:rPr>
+          <w:sz w:val="24"/>
+          <w:szCs w:val="22"/>
+          <w:lang w:val="en-US"/>
+        </w:rPr>
+      </w:pPr>
+      <w:r>
+        <w:rPr>
+          <w:sz w:val="24"/>
+          <w:szCs w:val="22"/>
+          <w:lang w:val="en-US"/>
+        </w:rPr>
+        <w:t>Allows to execute single / multiple tests</w:t>
+      </w:r>
+    </w:p>
+    <w:p>
+      <w:pPr>
+        <w:pStyle w:val="ListParagraph"/>
+        <w:numPr>
+          <w:ilvl w:val="0"/>
+          <w:numId w:val="32"/>
+        </w:numPr>
+        <w:rPr>
+          <w:sz w:val="24"/>
+          <w:szCs w:val="22"/>
+          <w:lang w:val="en-US"/>
+        </w:rPr>
+      </w:pPr>
+      <w:r>
+        <w:rPr>
+          <w:sz w:val="24"/>
+          <w:szCs w:val="22"/>
+          <w:lang w:val="en-US"/>
+        </w:rPr>
+        <w:t>Allows to set the priority to tests.</w:t>
+      </w:r>
+    </w:p>
+    <w:p>
+      <w:pPr>
+        <w:pStyle w:val="ListParagraph"/>
+        <w:numPr>
+          <w:ilvl w:val="0"/>
+          <w:numId w:val="32"/>
+        </w:numPr>
+        <w:rPr>
+          <w:sz w:val="24"/>
+          <w:szCs w:val="22"/>
+          <w:lang w:val="en-US"/>
+        </w:rPr>
+      </w:pPr>
+      <w:r>
+        <w:rPr>
+          <w:sz w:val="24"/>
+          <w:szCs w:val="22"/>
+          <w:lang w:val="en-US"/>
+        </w:rPr>
+        <w:t>Uses annotations</w:t>
+      </w:r>
+    </w:p>
+    <w:p>
+      <w:pPr>
+        <w:pStyle w:val="ListParagraph"/>
+        <w:numPr>
+          <w:ilvl w:val="1"/>
+          <w:numId w:val="32"/>
+        </w:numPr>
+        <w:rPr>
+          <w:sz w:val="24"/>
+          <w:szCs w:val="22"/>
+          <w:lang w:val="en-US"/>
+        </w:rPr>
+      </w:pPr>
+      <w:r>
+        <w:rPr>
+          <w:sz w:val="24"/>
+          <w:szCs w:val="22"/>
+          <w:lang w:val="en-US"/>
+        </w:rPr>
+        <w:t>@Test</w:t>
+      </w:r>
+    </w:p>
+    <w:p>
+      <w:pPr>
+        <w:pStyle w:val="ListParagraph"/>
+        <w:numPr>
+          <w:ilvl w:val="1"/>
+          <w:numId w:val="32"/>
+        </w:numPr>
+        <w:rPr>
+          <w:sz w:val="24"/>
+          <w:szCs w:val="22"/>
+          <w:lang w:val="en-US"/>
+        </w:rPr>
+      </w:pPr>
+      <w:r>
+        <w:rPr>
+          <w:sz w:val="24"/>
+          <w:szCs w:val="22"/>
+          <w:lang w:val="en-US"/>
+        </w:rPr>
+        <w:t>@BeforeTest</w:t>
+      </w:r>
+    </w:p>
+    <w:p>
+      <w:pPr>
+        <w:pStyle w:val="ListParagraph"/>
+        <w:numPr>
+          <w:ilvl w:val="1"/>
+          <w:numId w:val="32"/>
+        </w:numPr>
+        <w:rPr>
+          <w:sz w:val="24"/>
+          <w:szCs w:val="22"/>
+          <w:lang w:val="en-US"/>
+        </w:rPr>
+      </w:pPr>
+      <w:r>
+        <w:rPr>
+          <w:sz w:val="24"/>
+          <w:szCs w:val="22"/>
+          <w:lang w:val="en-US"/>
+        </w:rPr>
+        <w:t>@AfterTest</w:t>
+      </w:r>
+    </w:p>
+    <w:p>
+      <w:pPr>
+        <w:pStyle w:val="ListParagraph"/>
+        <w:numPr>
+          <w:ilvl w:val="1"/>
+          <w:numId w:val="32"/>
+        </w:numPr>
+        <w:rPr>
+          <w:sz w:val="24"/>
+          <w:szCs w:val="22"/>
+          <w:lang w:val="en-US"/>
+        </w:rPr>
+      </w:pPr>
+      <w:r>
+        <w:rPr>
+          <w:sz w:val="24"/>
+          <w:szCs w:val="22"/>
+          <w:lang w:val="en-US"/>
+        </w:rPr>
+        <w:t>@BeforeMethod</w:t>
+      </w:r>
+    </w:p>
+    <w:p>
+      <w:pPr>
+        <w:pStyle w:val="ListParagraph"/>
+        <w:numPr>
+          <w:ilvl w:val="1"/>
+          <w:numId w:val="32"/>
+        </w:numPr>
+        <w:rPr>
+          <w:sz w:val="24"/>
+          <w:szCs w:val="22"/>
+          <w:lang w:val="en-US"/>
+        </w:rPr>
+      </w:pPr>
+      <w:r>
+        <w:rPr>
+          <w:sz w:val="24"/>
+          <w:szCs w:val="22"/>
+          <w:lang w:val="en-US"/>
+        </w:rPr>
+        <w:t>@AfterMethod</w:t>
+      </w:r>
+    </w:p>
+    <w:p>
+      <w:pPr>
+        <w:pStyle w:val="ListParagraph"/>
+        <w:numPr>
+          <w:ilvl w:val="1"/>
+          <w:numId w:val="32"/>
+        </w:numPr>
+        <w:rPr>
+          <w:sz w:val="24"/>
+          <w:szCs w:val="22"/>
+          <w:lang w:val="en-US"/>
+        </w:rPr>
+      </w:pPr>
+      <w:r>
+        <w:rPr>
+          <w:sz w:val="24"/>
+          <w:szCs w:val="22"/>
+          <w:lang w:val="en-US"/>
+        </w:rPr>
+        <w:t>@DataProvider</w:t>
+      </w:r>
+    </w:p>
+    <w:p>
+      <w:pPr>
+        <w:pStyle w:val="ListParagraph"/>
+        <w:numPr>
+          <w:ilvl w:val="1"/>
+          <w:numId w:val="32"/>
+        </w:numPr>
+        <w:rPr>
+          <w:sz w:val="24"/>
+          <w:szCs w:val="22"/>
+          <w:lang w:val="en-US"/>
+        </w:rPr>
+      </w:pPr>
+      <w:r>
+        <w:rPr>
+          <w:sz w:val="24"/>
+          <w:szCs w:val="22"/>
+          <w:lang w:val="en-US"/>
+        </w:rPr>
+        <w:t>@Parameters</w:t>
+      </w:r>
+    </w:p>
+    <w:p>
+      <w:pPr>
+        <w:pStyle w:val="ListParagraph"/>
+        <w:numPr>
+          <w:ilvl w:val="0"/>
+          <w:numId w:val="32"/>
+        </w:numPr>
+        <w:rPr>
+          <w:sz w:val="24"/>
+          <w:szCs w:val="22"/>
+          <w:lang w:val="en-US"/>
+        </w:rPr>
+      </w:pPr>
+      <w:r>
+        <w:rPr>
+          <w:sz w:val="24"/>
+          <w:szCs w:val="22"/>
+          <w:lang w:val="en-US"/>
+        </w:rPr>
+        <w:t>Allows to create automated report</w:t>
+      </w:r>
+    </w:p>
+    <w:p>
+      <w:pPr>
+        <w:pStyle w:val="ListParagraph"/>
+        <w:numPr>
+          <w:ilvl w:val="1"/>
+          <w:numId w:val="32"/>
+        </w:numPr>
+        <w:rPr>
+          <w:sz w:val="24"/>
+          <w:szCs w:val="22"/>
+          <w:lang w:val="en-US"/>
+        </w:rPr>
+      </w:pPr>
+      <w:r>
+        <w:rPr>
+          <w:sz w:val="24"/>
+          <w:szCs w:val="22"/>
+          <w:lang w:val="en-US"/>
+        </w:rPr>
+        <w:t>Normal Report</w:t>
+      </w:r>
+    </w:p>
+    <w:p>
+      <w:pPr>
+        <w:pStyle w:val="ListParagraph"/>
+        <w:numPr>
+          <w:ilvl w:val="1"/>
+          <w:numId w:val="32"/>
+        </w:numPr>
+        <w:rPr>
+          <w:sz w:val="24"/>
+          <w:szCs w:val="22"/>
+          <w:lang w:val="en-US"/>
+        </w:rPr>
+      </w:pPr>
+      <w:r>
+        <w:rPr>
+          <w:sz w:val="24"/>
+          <w:szCs w:val="22"/>
+          <w:lang w:val="en-US"/>
+        </w:rPr>
+        <w:t>HTML Report</w:t>
+      </w:r>
+    </w:p>
+    <w:p>
+      <w:pPr>
+        <w:pStyle w:val="ListParagraph"/>
+        <w:numPr>
+          <w:ilvl w:val="0"/>
+          <w:numId w:val="32"/>
+        </w:numPr>
+        <w:rPr>
+          <w:sz w:val="24"/>
+          <w:szCs w:val="22"/>
+          <w:lang w:val="en-US"/>
+        </w:rPr>
+      </w:pPr>
+      <w:r>
+        <w:rPr>
+          <w:sz w:val="24"/>
+          <w:szCs w:val="22"/>
+          <w:lang w:val="en-US"/>
+        </w:rPr>
+        <w:t>Allows to create and execute groups of test cases</w:t>
+      </w:r>
+    </w:p>
+    <w:p>
+      <w:pPr>
+        <w:pStyle w:val="ListParagraph"/>
+        <w:numPr>
+          <w:ilvl w:val="0"/>
+          <w:numId w:val="32"/>
+        </w:numPr>
+        <w:rPr>
+          <w:sz w:val="24"/>
+          <w:szCs w:val="22"/>
+          <w:lang w:val="en-US"/>
+        </w:rPr>
+      </w:pPr>
+      <w:r>
+        <w:rPr>
+          <w:sz w:val="24"/>
+          <w:szCs w:val="22"/>
+          <w:lang w:val="en-US"/>
+        </w:rPr>
+        <w:t>Allows Data Driven Testing</w:t>
+      </w:r>
+    </w:p>
+    <w:p>
+      <w:pPr>
+        <w:pStyle w:val="ListParagraph"/>
+        <w:numPr>
+          <w:ilvl w:val="0"/>
+          <w:numId w:val="32"/>
+        </w:numPr>
+        <w:rPr>
+          <w:sz w:val="24"/>
+          <w:szCs w:val="22"/>
+          <w:lang w:val="en-US"/>
+        </w:rPr>
+      </w:pPr>
+      <w:r>
+        <w:rPr>
+          <w:sz w:val="24"/>
+          <w:szCs w:val="22"/>
+          <w:lang w:val="en-US"/>
+        </w:rPr>
+        <w:t>Allows to implement variety kind of frameworks</w:t>
+      </w:r>
+    </w:p>
+    <w:p>
+      <w:pPr>
+        <w:pStyle w:val="ListParagraph"/>
+        <w:numPr>
+          <w:ilvl w:val="1"/>
+          <w:numId w:val="32"/>
+        </w:numPr>
+        <w:rPr>
+          <w:sz w:val="24"/>
+          <w:szCs w:val="22"/>
+          <w:lang w:val="en-US"/>
+        </w:rPr>
+      </w:pPr>
+      <w:r>
+        <w:rPr>
+          <w:sz w:val="24"/>
+          <w:szCs w:val="22"/>
+          <w:lang w:val="en-US"/>
+        </w:rPr>
+        <w:t>Linear Framework</w:t>
+      </w:r>
+    </w:p>
+    <w:p>
+      <w:pPr>
+        <w:pStyle w:val="ListParagraph"/>
+        <w:numPr>
+          <w:ilvl w:val="1"/>
+          <w:numId w:val="32"/>
+        </w:numPr>
+        <w:rPr>
+          <w:sz w:val="24"/>
+          <w:szCs w:val="22"/>
+          <w:lang w:val="en-US"/>
+        </w:rPr>
+      </w:pPr>
+      <w:r>
+        <w:rPr>
+          <w:sz w:val="24"/>
+          <w:szCs w:val="22"/>
+          <w:lang w:val="en-US"/>
+        </w:rPr>
+        <w:t>Modular Framework</w:t>
+      </w:r>
+    </w:p>
+    <w:p>
+      <w:pPr>
+        <w:pStyle w:val="ListParagraph"/>
+        <w:numPr>
+          <w:ilvl w:val="1"/>
+          <w:numId w:val="32"/>
+        </w:numPr>
+        <w:rPr>
+          <w:sz w:val="24"/>
+          <w:szCs w:val="22"/>
+          <w:lang w:val="en-US"/>
+        </w:rPr>
+      </w:pPr>
+      <w:r>
+        <w:rPr>
+          <w:sz w:val="24"/>
+          <w:szCs w:val="22"/>
+          <w:lang w:val="en-US"/>
+        </w:rPr>
+        <w:t>Keyword Driven Framework</w:t>
+      </w:r>
+    </w:p>
+    <w:p>
+      <w:pPr>
+        <w:pStyle w:val="ListParagraph"/>
+        <w:numPr>
+          <w:ilvl w:val="1"/>
+          <w:numId w:val="32"/>
+        </w:numPr>
+        <w:rPr>
+          <w:sz w:val="24"/>
+          <w:szCs w:val="22"/>
+          <w:lang w:val="en-US"/>
+        </w:rPr>
+      </w:pPr>
+      <w:r>
+        <w:rPr>
+          <w:sz w:val="24"/>
+          <w:szCs w:val="22"/>
+          <w:lang w:val="en-US"/>
+        </w:rPr>
+        <w:t>Data Driven Framework</w:t>
+      </w:r>
+    </w:p>
+    <w:p>
+      <w:pPr>
+        <w:pStyle w:val="ListParagraph"/>
+        <w:numPr>
+          <w:ilvl w:val="1"/>
+          <w:numId w:val="32"/>
+        </w:numPr>
+        <w:rPr>
+          <w:sz w:val="24"/>
+          <w:szCs w:val="22"/>
+          <w:lang w:val="en-US"/>
+        </w:rPr>
+      </w:pPr>
+      <w:r>
+        <w:rPr>
+          <w:sz w:val="24"/>
+          <w:szCs w:val="22"/>
+          <w:lang w:val="en-US"/>
+        </w:rPr>
+        <w:t>Page Object Model (POM)</w:t>
+      </w:r>
+    </w:p>
+    <w:p>
+      <w:pPr>
+        <w:pStyle w:val="ListParagraph"/>
+        <w:numPr>
+          <w:ilvl w:val="1"/>
+          <w:numId w:val="32"/>
+        </w:numPr>
+        <w:rPr>
+          <w:sz w:val="24"/>
+          <w:szCs w:val="22"/>
+          <w:lang w:val="en-US"/>
+        </w:rPr>
+      </w:pPr>
+      <w:r>
+        <w:rPr>
+          <w:sz w:val="24"/>
+          <w:szCs w:val="22"/>
+          <w:lang w:val="en-US"/>
+        </w:rPr>
+        <w:t>Hybrid Framework</w:t>
+      </w:r>
+    </w:p>
+    <w:p>
+      <w:pPr>
+        <w:rPr>
+          <w:sz w:val="24"/>
+          <w:szCs w:val="22"/>
+          <w:lang w:val="en-US"/>
+        </w:rPr>
+      </w:pPr>
+    </w:p>
+    <w:p>
+      <w:pPr>
+        <w:rPr>
+          <w:b/>
+          <w:bCs/>
+          <w:sz w:val="24"/>
+          <w:szCs w:val="22"/>
+          <w:lang w:val="en-US"/>
+        </w:rPr>
+      </w:pPr>
+      <w:r>
+        <w:rPr>
+          <w:b/>
+          <w:bCs/>
+          <w:sz w:val="24"/>
+          <w:szCs w:val="22"/>
+          <w:lang w:val="en-US"/>
+        </w:rPr>
+        <w:t>Annotations</w:t>
+      </w:r>
+    </w:p>
+    <w:p>
+      <w:pPr>
+        <w:pStyle w:val="ListParagraph"/>
+        <w:numPr>
+          <w:ilvl w:val="0"/>
+          <w:numId w:val="33"/>
+        </w:numPr>
+        <w:rPr>
+          <w:sz w:val="24"/>
+          <w:szCs w:val="22"/>
+          <w:lang w:val="en-US"/>
+        </w:rPr>
+      </w:pPr>
+      <w:r>
+        <w:rPr>
+          <w:b/>
+          <w:bCs/>
+          <w:sz w:val="24"/>
+          <w:szCs w:val="22"/>
+          <w:lang w:val="en-US"/>
+        </w:rPr>
+        <w:t>@Test</w:t>
+      </w:r>
+      <w:r>
+        <w:rPr>
+          <w:sz w:val="24"/>
+          <w:szCs w:val="22"/>
+          <w:lang w:val="en-US"/>
+        </w:rPr>
+        <w:t xml:space="preserve"> </w:t>
+      </w:r>
+      <w:r>
+        <w:rPr>
+          <w:sz w:val="24"/>
+          <w:szCs w:val="22"/>
+          <w:lang w:val="en-US"/>
+        </w:rPr>
+        <w:sym w:font="Wingdings" w:char="F0E0"/>
+      </w:r>
+      <w:r>
+        <w:rPr>
+          <w:sz w:val="24"/>
+          <w:szCs w:val="22"/>
+          <w:lang w:val="en-US"/>
+        </w:rPr>
+        <w:t xml:space="preserve"> This is the method that will be treated as Test Case</w:t>
+      </w:r>
+    </w:p>
+    <w:p>
+      <w:pPr>
+        <w:pStyle w:val="ListParagraph"/>
+        <w:numPr>
+          <w:ilvl w:val="0"/>
+          <w:numId w:val="33"/>
+        </w:numPr>
+        <w:rPr>
+          <w:sz w:val="24"/>
+          <w:szCs w:val="22"/>
+          <w:lang w:val="en-US"/>
+        </w:rPr>
+      </w:pPr>
+      <w:r>
+        <w:rPr>
+          <w:b/>
+          <w:bCs/>
+          <w:sz w:val="24"/>
+          <w:szCs w:val="22"/>
+          <w:lang w:val="en-US"/>
+        </w:rPr>
+        <w:t xml:space="preserve">@BeforeTest </w:t>
+      </w:r>
+      <w:r>
+        <w:rPr>
+          <w:sz w:val="24"/>
+          <w:szCs w:val="22"/>
+          <w:lang w:val="en-US"/>
+        </w:rPr>
+        <w:sym w:font="Wingdings" w:char="F0E0"/>
+      </w:r>
+      <w:r>
+        <w:rPr>
+          <w:sz w:val="24"/>
+          <w:szCs w:val="22"/>
+          <w:lang w:val="en-US"/>
+        </w:rPr>
+        <w:t xml:space="preserve"> This is the method that will get executed </w:t>
+      </w:r>
+      <w:r>
+        <w:rPr>
+          <w:b/>
+          <w:bCs/>
+          <w:sz w:val="24"/>
+          <w:szCs w:val="22"/>
+          <w:lang w:val="en-US"/>
+        </w:rPr>
+        <w:t>Only once B</w:t>
+      </w:r>
+      <w:r>
+        <w:rPr>
+          <w:b/>
+          <w:bCs/>
+          <w:sz w:val="24"/>
+          <w:szCs w:val="22"/>
+          <w:lang w:val="en-US"/>
+        </w:rPr>
+        <w:t>efore executing 1</w:t>
+      </w:r>
+      <w:r>
+        <w:rPr>
+          <w:b/>
+          <w:bCs/>
+          <w:sz w:val="24"/>
+          <w:szCs w:val="22"/>
+          <w:vertAlign w:val="superscript"/>
+          <w:lang w:val="en-US"/>
+        </w:rPr>
+        <w:t>st</w:t>
+      </w:r>
+      <w:r>
+        <w:rPr>
+          <w:b/>
+          <w:bCs/>
+          <w:sz w:val="24"/>
+          <w:szCs w:val="22"/>
+          <w:lang w:val="en-US"/>
+        </w:rPr>
+        <w:t xml:space="preserve"> test case</w:t>
+      </w:r>
+    </w:p>
+    <w:p>
+      <w:pPr>
+        <w:pStyle w:val="ListParagraph"/>
+        <w:numPr>
+          <w:ilvl w:val="0"/>
+          <w:numId w:val="33"/>
+        </w:numPr>
+        <w:rPr>
+          <w:sz w:val="24"/>
+          <w:szCs w:val="22"/>
+          <w:lang w:val="en-US"/>
+        </w:rPr>
+      </w:pPr>
+      <w:r>
+        <w:rPr>
+          <w:b/>
+          <w:bCs/>
+          <w:sz w:val="24"/>
+          <w:szCs w:val="22"/>
+          <w:lang w:val="en-US"/>
+        </w:rPr>
+        <w:t xml:space="preserve">@AfterTest </w:t>
+      </w:r>
+      <w:r>
+        <w:rPr>
+          <w:b/>
+          <w:bCs/>
+          <w:sz w:val="24"/>
+          <w:szCs w:val="22"/>
+          <w:lang w:val="en-US"/>
+        </w:rPr>
+        <w:sym w:font="Wingdings" w:char="F0E0"/>
+      </w:r>
+      <w:r>
+        <w:rPr>
+          <w:sz w:val="24"/>
+          <w:szCs w:val="22"/>
+          <w:lang w:val="en-US"/>
+        </w:rPr>
+        <w:t xml:space="preserve"> This is the method that will get executed </w:t>
+      </w:r>
+      <w:r>
+        <w:rPr>
+          <w:b/>
+          <w:bCs/>
+          <w:sz w:val="24"/>
+          <w:szCs w:val="22"/>
+          <w:lang w:val="en-US"/>
+        </w:rPr>
+        <w:t>Only once After executing last test case.</w:t>
+      </w:r>
+    </w:p>
+    <w:p>
+      <w:pPr>
+        <w:rPr>
+          <w:sz w:val="24"/>
+          <w:szCs w:val="22"/>
+          <w:lang w:val="en-US"/>
+        </w:rPr>
+      </w:pPr>
+    </w:p>
+    <w:p>
+      <w:pPr>
+        <w:rPr>
+          <w:sz w:val="24"/>
+          <w:szCs w:val="22"/>
+          <w:lang w:val="en-US"/>
+        </w:rPr>
+      </w:pPr>
+      <w:r>
+        <w:rPr>
+          <w:sz w:val="24"/>
+          <w:szCs w:val="22"/>
+          <w:lang w:val="en-US"/>
+        </w:rPr>
+        <w:t>BeforeTest</w:t>
+      </w:r>
+    </w:p>
+    <w:p>
+      <w:pPr>
+        <w:rPr>
+          <w:sz w:val="24"/>
+          <w:szCs w:val="22"/>
+          <w:lang w:val="en-US"/>
+        </w:rPr>
+      </w:pPr>
+      <w:r>
+        <w:rPr>
+          <w:sz w:val="24"/>
+          <w:szCs w:val="22"/>
+          <w:lang w:val="en-US"/>
+        </w:rPr>
+        <w:tab/>
+        <w:t>Test 1</w:t>
+      </w:r>
+    </w:p>
+    <w:p>
+      <w:pPr>
+        <w:rPr>
+          <w:sz w:val="24"/>
+          <w:szCs w:val="22"/>
+          <w:lang w:val="en-US"/>
+        </w:rPr>
+      </w:pPr>
+      <w:r>
+        <w:rPr>
+          <w:sz w:val="24"/>
+          <w:szCs w:val="22"/>
+          <w:lang w:val="en-US"/>
+        </w:rPr>
+        <w:lastRenderedPageBreak/>
+        <w:tab/>
+        <w:t>Test 2</w:t>
+      </w:r>
+    </w:p>
+    <w:p>
+      <w:pPr>
+        <w:rPr>
+          <w:sz w:val="24"/>
+          <w:szCs w:val="22"/>
+          <w:lang w:val="en-US"/>
+        </w:rPr>
+      </w:pPr>
+      <w:r>
+        <w:rPr>
+          <w:sz w:val="24"/>
+          <w:szCs w:val="22"/>
+          <w:lang w:val="en-US"/>
+        </w:rPr>
+        <w:tab/>
+        <w:t>Test 3</w:t>
+      </w:r>
+    </w:p>
+    <w:p>
+      <w:pPr>
+        <w:rPr>
+          <w:sz w:val="24"/>
+          <w:szCs w:val="22"/>
+          <w:lang w:val="en-US"/>
+        </w:rPr>
+      </w:pPr>
+      <w:r>
+        <w:rPr>
+          <w:sz w:val="24"/>
+          <w:szCs w:val="22"/>
+          <w:lang w:val="en-US"/>
+        </w:rPr>
+        <w:tab/>
+        <w:t>Test 4</w:t>
+      </w:r>
+    </w:p>
+    <w:p>
+      <w:pPr>
+        <w:rPr>
+          <w:sz w:val="24"/>
+          <w:szCs w:val="22"/>
+          <w:lang w:val="en-US"/>
+        </w:rPr>
+      </w:pPr>
+      <w:r>
+        <w:rPr>
+          <w:sz w:val="24"/>
+          <w:szCs w:val="22"/>
+          <w:lang w:val="en-US"/>
+        </w:rPr>
+        <w:t>AfterTest</w:t>
+      </w:r>
+      <w:bookmarkStart w:id="0" w:name="_GoBack"/>
+      <w:bookmarkEnd w:id="0"/>
     </w:p>
     <w:sectPr>
       <w:pgSz w:w="11906" w:h="16838"/>
@@ -10216,6 +10679,95 @@
     </w:lvl>
   </w:abstractNum>
   <w:abstractNum w:abstractNumId="9">
+    <w:nsid w:val="208412D1"/>
+    <w:multiLevelType w:val="hybridMultilevel"/>
+    <w:tmpl w:val="95DE081C"/>
+    <w:lvl w:ilvl="0" w:tplc="4009000F">
+      <w:start w:val="1"/>
+      <w:numFmt w:val="decimal"/>
+      <w:lvlText w:val="%1."/>
+      <w:lvlJc w:val="left"/>
+      <w:pPr>
+        <w:ind w:left="720" w:hanging="360"/>
+      </w:pPr>
+      <w:rPr>
+        <w:rFonts w:hint="default"/>
+      </w:rPr>
+    </w:lvl>
+    <w:lvl w:ilvl="1" w:tplc="40090019">
+      <w:start w:val="1"/>
+      <w:numFmt w:val="lowerLetter"/>
+      <w:lvlText w:val="%2."/>
+      <w:lvlJc w:val="left"/>
+      <w:pPr>
+        <w:ind w:left="1440" w:hanging="360"/>
+      </w:pPr>
+    </w:lvl>
+    <w:lvl w:ilvl="2" w:tplc="4009001B" w:tentative="1">
+      <w:start w:val="1"/>
+      <w:numFmt w:val="lowerRoman"/>
+      <w:lvlText w:val="%3."/>
+      <w:lvlJc w:val="right"/>
+      <w:pPr>
+        <w:ind w:left="2160" w:hanging="180"/>
+      </w:pPr>
+    </w:lvl>
+    <w:lvl w:ilvl="3" w:tplc="4009000F" w:tentative="1">
+      <w:start w:val="1"/>
+      <w:numFmt w:val="decimal"/>
+      <w:lvlText w:val="%4."/>
+      <w:lvlJc w:val="left"/>
+      <w:pPr>
+        <w:ind w:left="2880" w:hanging="360"/>
+      </w:pPr>
+    </w:lvl>
+    <w:lvl w:ilvl="4" w:tplc="40090019" w:tentative="1">
+      <w:start w:val="1"/>
+      <w:numFmt w:val="lowerLetter"/>
+      <w:lvlText w:val="%5."/>
+      <w:lvlJc w:val="left"/>
+      <w:pPr>
+        <w:ind w:left="3600" w:hanging="360"/>
+      </w:pPr>
+    </w:lvl>
+    <w:lvl w:ilvl="5" w:tplc="4009001B" w:tentative="1">
+      <w:start w:val="1"/>
+      <w:numFmt w:val="lowerRoman"/>
+      <w:lvlText w:val="%6."/>
+      <w:lvlJc w:val="right"/>
+      <w:pPr>
+        <w:ind w:left="4320" w:hanging="180"/>
+      </w:pPr>
+    </w:lvl>
+    <w:lvl w:ilvl="6" w:tplc="4009000F" w:tentative="1">
+      <w:start w:val="1"/>
+      <w:numFmt w:val="decimal"/>
+      <w:lvlText w:val="%7."/>
+      <w:lvlJc w:val="left"/>
+      <w:pPr>
+        <w:ind w:left="5040" w:hanging="360"/>
+      </w:pPr>
+    </w:lvl>
+    <w:lvl w:ilvl="7" w:tplc="40090019" w:tentative="1">
+      <w:start w:val="1"/>
+      <w:numFmt w:val="lowerLetter"/>
+      <w:lvlText w:val="%8."/>
+      <w:lvlJc w:val="left"/>
+      <w:pPr>
+        <w:ind w:left="5760" w:hanging="360"/>
+      </w:pPr>
+    </w:lvl>
+    <w:lvl w:ilvl="8" w:tplc="4009001B" w:tentative="1">
+      <w:start w:val="1"/>
+      <w:numFmt w:val="lowerRoman"/>
+      <w:lvlText w:val="%9."/>
+      <w:lvlJc w:val="right"/>
+      <w:pPr>
+        <w:ind w:left="6480" w:hanging="180"/>
+      </w:pPr>
+    </w:lvl>
+  </w:abstractNum>
+  <w:abstractNum w:abstractNumId="10">
     <w:nsid w:val="21197407"/>
     <w:multiLevelType w:val="hybridMultilevel"/>
     <w:tmpl w:val="6D30545C"/>
@@ -10304,7 +10856,7 @@
       </w:pPr>
     </w:lvl>
   </w:abstractNum>
-  <w:abstractNum w:abstractNumId="10">
+  <w:abstractNum w:abstractNumId="11">
     <w:nsid w:val="21E921C4"/>
     <w:multiLevelType w:val="hybridMultilevel"/>
     <w:tmpl w:val="824AB5DC"/>
@@ -10393,7 +10945,7 @@
       </w:pPr>
     </w:lvl>
   </w:abstractNum>
-  <w:abstractNum w:abstractNumId="11">
+  <w:abstractNum w:abstractNumId="12">
     <w:nsid w:val="231E6D1F"/>
     <w:multiLevelType w:val="hybridMultilevel"/>
     <w:tmpl w:val="DAC42EF8"/>
@@ -10482,7 +11034,7 @@
       </w:pPr>
     </w:lvl>
   </w:abstractNum>
-  <w:abstractNum w:abstractNumId="12">
+  <w:abstractNum w:abstractNumId="13">
     <w:nsid w:val="24CA0387"/>
     <w:multiLevelType w:val="hybridMultilevel"/>
     <w:tmpl w:val="E81AAACE"/>
@@ -10595,7 +11147,7 @@
       </w:rPr>
     </w:lvl>
   </w:abstractNum>
-  <w:abstractNum w:abstractNumId="13">
+  <w:abstractNum w:abstractNumId="14">
     <w:nsid w:val="32FE0416"/>
     <w:multiLevelType w:val="hybridMultilevel"/>
     <w:tmpl w:val="16BC674C"/>
@@ -10684,7 +11236,7 @@
       </w:pPr>
     </w:lvl>
   </w:abstractNum>
-  <w:abstractNum w:abstractNumId="14">
+  <w:abstractNum w:abstractNumId="15">
     <w:nsid w:val="37062EB4"/>
     <w:multiLevelType w:val="hybridMultilevel"/>
     <w:tmpl w:val="8528B142"/>
@@ -10773,7 +11325,7 @@
       </w:pPr>
     </w:lvl>
   </w:abstractNum>
-  <w:abstractNum w:abstractNumId="15">
+  <w:abstractNum w:abstractNumId="16">
     <w:nsid w:val="3B892462"/>
     <w:multiLevelType w:val="hybridMultilevel"/>
     <w:tmpl w:val="CB1C6C4E"/>
@@ -10862,7 +11414,96 @@
       </w:pPr>
     </w:lvl>
   </w:abstractNum>
-  <w:abstractNum w:abstractNumId="16">
+  <w:abstractNum w:abstractNumId="17">
+    <w:nsid w:val="40361D0B"/>
+    <w:multiLevelType w:val="hybridMultilevel"/>
+    <w:tmpl w:val="4A54C56E"/>
+    <w:lvl w:ilvl="0" w:tplc="4009000F">
+      <w:start w:val="1"/>
+      <w:numFmt w:val="decimal"/>
+      <w:lvlText w:val="%1."/>
+      <w:lvlJc w:val="left"/>
+      <w:pPr>
+        <w:ind w:left="720" w:hanging="360"/>
+      </w:pPr>
+      <w:rPr>
+        <w:rFonts w:hint="default"/>
+      </w:rPr>
+    </w:lvl>
+    <w:lvl w:ilvl="1" w:tplc="40090019" w:tentative="1">
+      <w:start w:val="1"/>
+      <w:numFmt w:val="lowerLetter"/>
+      <w:lvlText w:val="%2."/>
+      <w:lvlJc w:val="left"/>
+      <w:pPr>
+        <w:ind w:left="1440" w:hanging="360"/>
+      </w:pPr>
+    </w:lvl>
+    <w:lvl w:ilvl="2" w:tplc="4009001B" w:tentative="1">
+      <w:start w:val="1"/>
+      <w:numFmt w:val="lowerRoman"/>
+      <w:lvlText w:val="%3."/>
+      <w:lvlJc w:val="right"/>
+      <w:pPr>
+        <w:ind w:left="2160" w:hanging="180"/>
+      </w:pPr>
+    </w:lvl>
+    <w:lvl w:ilvl="3" w:tplc="4009000F" w:tentative="1">
+      <w:start w:val="1"/>
+      <w:numFmt w:val="decimal"/>
+      <w:lvlText w:val="%4."/>
+      <w:lvlJc w:val="left"/>
+      <w:pPr>
+        <w:ind w:left="2880" w:hanging="360"/>
+      </w:pPr>
+    </w:lvl>
+    <w:lvl w:ilvl="4" w:tplc="40090019" w:tentative="1">
+      <w:start w:val="1"/>
+      <w:numFmt w:val="lowerLetter"/>
+      <w:lvlText w:val="%5."/>
+      <w:lvlJc w:val="left"/>
+      <w:pPr>
+        <w:ind w:left="3600" w:hanging="360"/>
+      </w:pPr>
+    </w:lvl>
+    <w:lvl w:ilvl="5" w:tplc="4009001B" w:tentative="1">
+      <w:start w:val="1"/>
+      <w:numFmt w:val="lowerRoman"/>
+      <w:lvlText w:val="%6."/>
+      <w:lvlJc w:val="right"/>
+      <w:pPr>
+        <w:ind w:left="4320" w:hanging="180"/>
+      </w:pPr>
+    </w:lvl>
+    <w:lvl w:ilvl="6" w:tplc="4009000F" w:tentative="1">
+      <w:start w:val="1"/>
+      <w:numFmt w:val="decimal"/>
+      <w:lvlText w:val="%7."/>
+      <w:lvlJc w:val="left"/>
+      <w:pPr>
+        <w:ind w:left="5040" w:hanging="360"/>
+      </w:pPr>
+    </w:lvl>
+    <w:lvl w:ilvl="7" w:tplc="40090019" w:tentative="1">
+      <w:start w:val="1"/>
+      <w:numFmt w:val="lowerLetter"/>
+      <w:lvlText w:val="%8."/>
+      <w:lvlJc w:val="left"/>
+      <w:pPr>
+        <w:ind w:left="5760" w:hanging="360"/>
+      </w:pPr>
+    </w:lvl>
+    <w:lvl w:ilvl="8" w:tplc="4009001B" w:tentative="1">
+      <w:start w:val="1"/>
+      <w:numFmt w:val="lowerRoman"/>
+      <w:lvlText w:val="%9."/>
+      <w:lvlJc w:val="right"/>
+      <w:pPr>
+        <w:ind w:left="6480" w:hanging="180"/>
+      </w:pPr>
+    </w:lvl>
+  </w:abstractNum>
+  <w:abstractNum w:abstractNumId="18">
     <w:nsid w:val="4B45536D"/>
     <w:multiLevelType w:val="hybridMultilevel"/>
     <w:tmpl w:val="0B3449C8"/>
@@ -10951,7 +11592,7 @@
       </w:pPr>
     </w:lvl>
   </w:abstractNum>
-  <w:abstractNum w:abstractNumId="17">
+  <w:abstractNum w:abstractNumId="19">
     <w:nsid w:val="4D236C02"/>
     <w:multiLevelType w:val="hybridMultilevel"/>
     <w:tmpl w:val="CBFADF28"/>
@@ -11064,7 +11705,7 @@
       </w:rPr>
     </w:lvl>
   </w:abstractNum>
-  <w:abstractNum w:abstractNumId="18">
+  <w:abstractNum w:abstractNumId="20">
     <w:nsid w:val="4FC02C6C"/>
     <w:multiLevelType w:val="hybridMultilevel"/>
     <w:tmpl w:val="05D2B08E"/>
@@ -11153,7 +11794,7 @@
       </w:pPr>
     </w:lvl>
   </w:abstractNum>
-  <w:abstractNum w:abstractNumId="19">
+  <w:abstractNum w:abstractNumId="21">
     <w:nsid w:val="52B52268"/>
     <w:multiLevelType w:val="hybridMultilevel"/>
     <w:tmpl w:val="331AF78C"/>
@@ -11266,7 +11907,7 @@
       </w:rPr>
     </w:lvl>
   </w:abstractNum>
-  <w:abstractNum w:abstractNumId="20">
+  <w:abstractNum w:abstractNumId="22">
     <w:nsid w:val="55D92B24"/>
     <w:multiLevelType w:val="hybridMultilevel"/>
     <w:tmpl w:val="9BCED27C"/>
@@ -11379,7 +12020,7 @@
       </w:rPr>
     </w:lvl>
   </w:abstractNum>
-  <w:abstractNum w:abstractNumId="21">
+  <w:abstractNum w:abstractNumId="23">
     <w:nsid w:val="57564656"/>
     <w:multiLevelType w:val="hybridMultilevel"/>
     <w:tmpl w:val="3E1C27F6"/>
@@ -11492,7 +12133,7 @@
       </w:rPr>
     </w:lvl>
   </w:abstractNum>
-  <w:abstractNum w:abstractNumId="22">
+  <w:abstractNum w:abstractNumId="24">
     <w:nsid w:val="61A962B8"/>
     <w:multiLevelType w:val="hybridMultilevel"/>
     <w:tmpl w:val="5EDC7138"/>
@@ -11581,7 +12222,7 @@
       </w:pPr>
     </w:lvl>
   </w:abstractNum>
-  <w:abstractNum w:abstractNumId="23">
+  <w:abstractNum w:abstractNumId="25">
     <w:nsid w:val="69867F0D"/>
     <w:multiLevelType w:val="hybridMultilevel"/>
     <w:tmpl w:val="EAF8E468"/>
@@ -11670,7 +12311,7 @@
       </w:pPr>
     </w:lvl>
   </w:abstractNum>
-  <w:abstractNum w:abstractNumId="24">
+  <w:abstractNum w:abstractNumId="26">
     <w:nsid w:val="6E5A4342"/>
     <w:multiLevelType w:val="hybridMultilevel"/>
     <w:tmpl w:val="414440E6"/>
@@ -11759,7 +12400,7 @@
       </w:pPr>
     </w:lvl>
   </w:abstractNum>
-  <w:abstractNum w:abstractNumId="25">
+  <w:abstractNum w:abstractNumId="27">
     <w:nsid w:val="6F0A1BD2"/>
     <w:multiLevelType w:val="hybridMultilevel"/>
     <w:tmpl w:val="EF7884CC"/>
@@ -11872,7 +12513,7 @@
       </w:rPr>
     </w:lvl>
   </w:abstractNum>
-  <w:abstractNum w:abstractNumId="26">
+  <w:abstractNum w:abstractNumId="28">
     <w:nsid w:val="729D49A6"/>
     <w:multiLevelType w:val="hybridMultilevel"/>
     <w:tmpl w:val="212E6380"/>
@@ -11961,7 +12602,7 @@
       </w:pPr>
     </w:lvl>
   </w:abstractNum>
-  <w:abstractNum w:abstractNumId="27">
+  <w:abstractNum w:abstractNumId="29">
     <w:nsid w:val="72E5107C"/>
     <w:multiLevelType w:val="hybridMultilevel"/>
     <w:tmpl w:val="30BE3018"/>
@@ -12050,7 +12691,7 @@
       </w:pPr>
     </w:lvl>
   </w:abstractNum>
-  <w:abstractNum w:abstractNumId="28">
+  <w:abstractNum w:abstractNumId="30">
     <w:nsid w:val="7C1B7A62"/>
     <w:multiLevelType w:val="hybridMultilevel"/>
     <w:tmpl w:val="A1EEB68C"/>
@@ -12163,7 +12804,7 @@
       </w:rPr>
     </w:lvl>
   </w:abstractNum>
-  <w:abstractNum w:abstractNumId="29">
+  <w:abstractNum w:abstractNumId="31">
     <w:nsid w:val="7E0C5E33"/>
     <w:multiLevelType w:val="hybridMultilevel"/>
     <w:tmpl w:val="17A20342"/>
@@ -12252,7 +12893,7 @@
       </w:pPr>
     </w:lvl>
   </w:abstractNum>
-  <w:abstractNum w:abstractNumId="30">
+  <w:abstractNum w:abstractNumId="32">
     <w:nsid w:val="7EEF6783"/>
     <w:multiLevelType w:val="hybridMultilevel"/>
     <w:tmpl w:val="2292AFAC"/>
@@ -12348,25 +12989,25 @@
     <w:abstractNumId w:val="6"/>
   </w:num>
   <w:num w:numId="3">
-    <w:abstractNumId w:val="28"/>
+    <w:abstractNumId w:val="30"/>
   </w:num>
   <w:num w:numId="4">
-    <w:abstractNumId w:val="20"/>
+    <w:abstractNumId w:val="22"/>
   </w:num>
   <w:num w:numId="5">
-    <w:abstractNumId w:val="14"/>
+    <w:abstractNumId w:val="15"/>
   </w:num>
   <w:num w:numId="6">
     <w:abstractNumId w:val="7"/>
   </w:num>
   <w:num w:numId="7">
-    <w:abstractNumId w:val="17"/>
+    <w:abstractNumId w:val="19"/>
   </w:num>
   <w:num w:numId="8">
-    <w:abstractNumId w:val="21"/>
+    <w:abstractNumId w:val="23"/>
   </w:num>
   <w:num w:numId="9">
-    <w:abstractNumId w:val="11"/>
+    <w:abstractNumId w:val="12"/>
   </w:num>
   <w:num w:numId="10">
     <w:abstractNumId w:val="4"/>
@@ -12375,64 +13016,70 @@
     <w:abstractNumId w:val="5"/>
   </w:num>
   <w:num w:numId="12">
-    <w:abstractNumId w:val="9"/>
+    <w:abstractNumId w:val="10"/>
   </w:num>
   <w:num w:numId="13">
     <w:abstractNumId w:val="2"/>
   </w:num>
   <w:num w:numId="14">
-    <w:abstractNumId w:val="16"/>
+    <w:abstractNumId w:val="18"/>
   </w:num>
   <w:num w:numId="15">
-    <w:abstractNumId w:val="30"/>
+    <w:abstractNumId w:val="32"/>
   </w:num>
   <w:num w:numId="16">
-    <w:abstractNumId w:val="12"/>
+    <w:abstractNumId w:val="13"/>
   </w:num>
   <w:num w:numId="17">
-    <w:abstractNumId w:val="25"/>
+    <w:abstractNumId w:val="27"/>
   </w:num>
   <w:num w:numId="18">
     <w:abstractNumId w:val="1"/>
   </w:num>
   <w:num w:numId="19">
-    <w:abstractNumId w:val="29"/>
+    <w:abstractNumId w:val="31"/>
   </w:num>
   <w:num w:numId="20">
-    <w:abstractNumId w:val="22"/>
+    <w:abstractNumId w:val="24"/>
   </w:num>
   <w:num w:numId="21">
-    <w:abstractNumId w:val="19"/>
+    <w:abstractNumId w:val="21"/>
   </w:num>
   <w:num w:numId="22">
     <w:abstractNumId w:val="3"/>
   </w:num>
   <w:num w:numId="23">
+    <w:abstractNumId w:val="28"/>
+  </w:num>
+  <w:num w:numId="24">
+    <w:abstractNumId w:val="20"/>
+  </w:num>
+  <w:num w:numId="25">
     <w:abstractNumId w:val="26"/>
   </w:num>
-  <w:num w:numId="24">
-    <w:abstractNumId w:val="18"/>
-  </w:num>
-  <w:num w:numId="25">
-    <w:abstractNumId w:val="24"/>
-  </w:num>
   <w:num w:numId="26">
-    <w:abstractNumId w:val="13"/>
+    <w:abstractNumId w:val="14"/>
   </w:num>
   <w:num w:numId="27">
-    <w:abstractNumId w:val="10"/>
+    <w:abstractNumId w:val="11"/>
   </w:num>
   <w:num w:numId="28">
-    <w:abstractNumId w:val="27"/>
+    <w:abstractNumId w:val="29"/>
   </w:num>
   <w:num w:numId="29">
-    <w:abstractNumId w:val="15"/>
+    <w:abstractNumId w:val="16"/>
   </w:num>
   <w:num w:numId="30">
-    <w:abstractNumId w:val="23"/>
+    <w:abstractNumId w:val="25"/>
   </w:num>
   <w:num w:numId="31">
     <w:abstractNumId w:val="0"/>
+  </w:num>
+  <w:num w:numId="32">
+    <w:abstractNumId w:val="9"/>
+  </w:num>
+  <w:num w:numId="33">
+    <w:abstractNumId w:val="17"/>
   </w:num>
 </w:numbering>
 </file>
@@ -13162,7 +13809,7 @@
 </file>
 
 <file path=customXml/itemProps1.xml><?xml version="1.0" encoding="utf-8"?>
-<ds:datastoreItem xmlns:ds="http://schemas.openxmlformats.org/officeDocument/2006/customXml" ds:itemID="{AB5D5F81-2F7B-4D60-BC3C-51D7BF5F0C98}">
+<ds:datastoreItem xmlns:ds="http://schemas.openxmlformats.org/officeDocument/2006/customXml" ds:itemID="{0A230F20-B167-470A-9681-8945DDBF6594}">
   <ds:schemaRefs>
     <ds:schemaRef ds:uri="http://schemas.openxmlformats.org/officeDocument/2006/bibliography"/>
   </ds:schemaRefs>

</xml_diff>

<commit_message>
Date: 01 Dec 2025
</commit_message>
<xml_diff>
--- a/Notes_Selenium_14.docx
+++ b/Notes_Selenium_14.docx
@@ -10330,6 +10330,102 @@
         </w:rPr>
         <w:t>It is a mechanism that will mark any test case as Pass or Fail in report.</w:t>
       </w:r>
+    </w:p>
+    <w:p>
+      <w:pPr>
+        <w:rPr>
+          <w:sz w:val="24"/>
+          <w:szCs w:val="22"/>
+          <w:lang w:val="en-US"/>
+        </w:rPr>
+      </w:pPr>
+    </w:p>
+    <w:p>
+      <w:pPr>
+        <w:rPr>
+          <w:b/>
+          <w:bCs/>
+          <w:sz w:val="24"/>
+          <w:szCs w:val="22"/>
+          <w:lang w:val="en-US"/>
+        </w:rPr>
+      </w:pPr>
+      <w:r>
+        <w:rPr>
+          <w:b/>
+          <w:bCs/>
+          <w:sz w:val="24"/>
+          <w:szCs w:val="22"/>
+          <w:lang w:val="en-US"/>
+        </w:rPr>
+        <w:t>While creating XML file for executing tests please note…</w:t>
+      </w:r>
+    </w:p>
+    <w:p>
+      <w:pPr>
+        <w:pStyle w:val="ListParagraph"/>
+        <w:numPr>
+          <w:ilvl w:val="0"/>
+          <w:numId w:val="36"/>
+        </w:numPr>
+        <w:rPr>
+          <w:sz w:val="24"/>
+          <w:szCs w:val="22"/>
+          <w:lang w:val="en-US"/>
+        </w:rPr>
+      </w:pPr>
+      <w:r>
+        <w:rPr>
+          <w:sz w:val="24"/>
+          <w:szCs w:val="22"/>
+          <w:lang w:val="en-US"/>
+        </w:rPr>
+        <w:t>All the tags are pre-defined.</w:t>
+      </w:r>
+    </w:p>
+    <w:p>
+      <w:pPr>
+        <w:pStyle w:val="ListParagraph"/>
+        <w:numPr>
+          <w:ilvl w:val="0"/>
+          <w:numId w:val="36"/>
+        </w:numPr>
+        <w:rPr>
+          <w:sz w:val="24"/>
+          <w:szCs w:val="22"/>
+          <w:lang w:val="en-US"/>
+        </w:rPr>
+      </w:pPr>
+      <w:r>
+        <w:rPr>
+          <w:sz w:val="24"/>
+          <w:szCs w:val="22"/>
+          <w:lang w:val="en-US"/>
+        </w:rPr>
+        <w:t>You cannot change the sequence of tags.</w:t>
+      </w:r>
+    </w:p>
+    <w:p>
+      <w:pPr>
+        <w:pStyle w:val="ListParagraph"/>
+        <w:numPr>
+          <w:ilvl w:val="0"/>
+          <w:numId w:val="36"/>
+        </w:numPr>
+        <w:rPr>
+          <w:sz w:val="24"/>
+          <w:szCs w:val="22"/>
+          <w:lang w:val="en-US"/>
+        </w:rPr>
+      </w:pPr>
+      <w:r>
+        <w:rPr>
+          <w:sz w:val="24"/>
+          <w:szCs w:val="22"/>
+          <w:lang w:val="en-US"/>
+        </w:rPr>
+        <w:t xml:space="preserve">All the tags and attributes are case sensitive. </w:t>
+      </w:r>
       <w:bookmarkStart w:id="0" w:name="_GoBack"/>
       <w:bookmarkEnd w:id="0"/>
     </w:p>
@@ -11890,6 +11986,95 @@
     </w:lvl>
   </w:abstractNum>
   <w:abstractNum w:abstractNumId="16">
+    <w:nsid w:val="3A7611DD"/>
+    <w:multiLevelType w:val="hybridMultilevel"/>
+    <w:tmpl w:val="69D469B0"/>
+    <w:lvl w:ilvl="0" w:tplc="4009000F">
+      <w:start w:val="1"/>
+      <w:numFmt w:val="decimal"/>
+      <w:lvlText w:val="%1."/>
+      <w:lvlJc w:val="left"/>
+      <w:pPr>
+        <w:ind w:left="720" w:hanging="360"/>
+      </w:pPr>
+      <w:rPr>
+        <w:rFonts w:hint="default"/>
+      </w:rPr>
+    </w:lvl>
+    <w:lvl w:ilvl="1" w:tplc="40090019" w:tentative="1">
+      <w:start w:val="1"/>
+      <w:numFmt w:val="lowerLetter"/>
+      <w:lvlText w:val="%2."/>
+      <w:lvlJc w:val="left"/>
+      <w:pPr>
+        <w:ind w:left="1440" w:hanging="360"/>
+      </w:pPr>
+    </w:lvl>
+    <w:lvl w:ilvl="2" w:tplc="4009001B" w:tentative="1">
+      <w:start w:val="1"/>
+      <w:numFmt w:val="lowerRoman"/>
+      <w:lvlText w:val="%3."/>
+      <w:lvlJc w:val="right"/>
+      <w:pPr>
+        <w:ind w:left="2160" w:hanging="180"/>
+      </w:pPr>
+    </w:lvl>
+    <w:lvl w:ilvl="3" w:tplc="4009000F" w:tentative="1">
+      <w:start w:val="1"/>
+      <w:numFmt w:val="decimal"/>
+      <w:lvlText w:val="%4."/>
+      <w:lvlJc w:val="left"/>
+      <w:pPr>
+        <w:ind w:left="2880" w:hanging="360"/>
+      </w:pPr>
+    </w:lvl>
+    <w:lvl w:ilvl="4" w:tplc="40090019" w:tentative="1">
+      <w:start w:val="1"/>
+      <w:numFmt w:val="lowerLetter"/>
+      <w:lvlText w:val="%5."/>
+      <w:lvlJc w:val="left"/>
+      <w:pPr>
+        <w:ind w:left="3600" w:hanging="360"/>
+      </w:pPr>
+    </w:lvl>
+    <w:lvl w:ilvl="5" w:tplc="4009001B" w:tentative="1">
+      <w:start w:val="1"/>
+      <w:numFmt w:val="lowerRoman"/>
+      <w:lvlText w:val="%6."/>
+      <w:lvlJc w:val="right"/>
+      <w:pPr>
+        <w:ind w:left="4320" w:hanging="180"/>
+      </w:pPr>
+    </w:lvl>
+    <w:lvl w:ilvl="6" w:tplc="4009000F" w:tentative="1">
+      <w:start w:val="1"/>
+      <w:numFmt w:val="decimal"/>
+      <w:lvlText w:val="%7."/>
+      <w:lvlJc w:val="left"/>
+      <w:pPr>
+        <w:ind w:left="5040" w:hanging="360"/>
+      </w:pPr>
+    </w:lvl>
+    <w:lvl w:ilvl="7" w:tplc="40090019" w:tentative="1">
+      <w:start w:val="1"/>
+      <w:numFmt w:val="lowerLetter"/>
+      <w:lvlText w:val="%8."/>
+      <w:lvlJc w:val="left"/>
+      <w:pPr>
+        <w:ind w:left="5760" w:hanging="360"/>
+      </w:pPr>
+    </w:lvl>
+    <w:lvl w:ilvl="8" w:tplc="4009001B" w:tentative="1">
+      <w:start w:val="1"/>
+      <w:numFmt w:val="lowerRoman"/>
+      <w:lvlText w:val="%9."/>
+      <w:lvlJc w:val="right"/>
+      <w:pPr>
+        <w:ind w:left="6480" w:hanging="180"/>
+      </w:pPr>
+    </w:lvl>
+  </w:abstractNum>
+  <w:abstractNum w:abstractNumId="17">
     <w:nsid w:val="3B892462"/>
     <w:multiLevelType w:val="hybridMultilevel"/>
     <w:tmpl w:val="CB1C6C4E"/>
@@ -11978,7 +12163,7 @@
       </w:pPr>
     </w:lvl>
   </w:abstractNum>
-  <w:abstractNum w:abstractNumId="17">
+  <w:abstractNum w:abstractNumId="18">
     <w:nsid w:val="40361D0B"/>
     <w:multiLevelType w:val="hybridMultilevel"/>
     <w:tmpl w:val="4A54C56E"/>
@@ -12067,7 +12252,7 @@
       </w:pPr>
     </w:lvl>
   </w:abstractNum>
-  <w:abstractNum w:abstractNumId="18">
+  <w:abstractNum w:abstractNumId="19">
     <w:nsid w:val="40C03745"/>
     <w:multiLevelType w:val="hybridMultilevel"/>
     <w:tmpl w:val="401AA9E2"/>
@@ -12180,7 +12365,7 @@
       </w:rPr>
     </w:lvl>
   </w:abstractNum>
-  <w:abstractNum w:abstractNumId="19">
+  <w:abstractNum w:abstractNumId="20">
     <w:nsid w:val="4B45536D"/>
     <w:multiLevelType w:val="hybridMultilevel"/>
     <w:tmpl w:val="0B3449C8"/>
@@ -12269,7 +12454,7 @@
       </w:pPr>
     </w:lvl>
   </w:abstractNum>
-  <w:abstractNum w:abstractNumId="20">
+  <w:abstractNum w:abstractNumId="21">
     <w:nsid w:val="4D236C02"/>
     <w:multiLevelType w:val="hybridMultilevel"/>
     <w:tmpl w:val="CBFADF28"/>
@@ -12382,7 +12567,7 @@
       </w:rPr>
     </w:lvl>
   </w:abstractNum>
-  <w:abstractNum w:abstractNumId="21">
+  <w:abstractNum w:abstractNumId="22">
     <w:nsid w:val="4FC02C6C"/>
     <w:multiLevelType w:val="hybridMultilevel"/>
     <w:tmpl w:val="05D2B08E"/>
@@ -12471,7 +12656,7 @@
       </w:pPr>
     </w:lvl>
   </w:abstractNum>
-  <w:abstractNum w:abstractNumId="22">
+  <w:abstractNum w:abstractNumId="23">
     <w:nsid w:val="52B52268"/>
     <w:multiLevelType w:val="hybridMultilevel"/>
     <w:tmpl w:val="331AF78C"/>
@@ -12584,7 +12769,7 @@
       </w:rPr>
     </w:lvl>
   </w:abstractNum>
-  <w:abstractNum w:abstractNumId="23">
+  <w:abstractNum w:abstractNumId="24">
     <w:nsid w:val="55D92B24"/>
     <w:multiLevelType w:val="hybridMultilevel"/>
     <w:tmpl w:val="9BCED27C"/>
@@ -12697,7 +12882,7 @@
       </w:rPr>
     </w:lvl>
   </w:abstractNum>
-  <w:abstractNum w:abstractNumId="24">
+  <w:abstractNum w:abstractNumId="25">
     <w:nsid w:val="57564656"/>
     <w:multiLevelType w:val="hybridMultilevel"/>
     <w:tmpl w:val="3E1C27F6"/>
@@ -12810,7 +12995,7 @@
       </w:rPr>
     </w:lvl>
   </w:abstractNum>
-  <w:abstractNum w:abstractNumId="25">
+  <w:abstractNum w:abstractNumId="26">
     <w:nsid w:val="61A962B8"/>
     <w:multiLevelType w:val="hybridMultilevel"/>
     <w:tmpl w:val="5EDC7138"/>
@@ -12899,7 +13084,7 @@
       </w:pPr>
     </w:lvl>
   </w:abstractNum>
-  <w:abstractNum w:abstractNumId="26">
+  <w:abstractNum w:abstractNumId="27">
     <w:nsid w:val="69867F0D"/>
     <w:multiLevelType w:val="hybridMultilevel"/>
     <w:tmpl w:val="EAF8E468"/>
@@ -12988,7 +13173,7 @@
       </w:pPr>
     </w:lvl>
   </w:abstractNum>
-  <w:abstractNum w:abstractNumId="27">
+  <w:abstractNum w:abstractNumId="28">
     <w:nsid w:val="6E5A4342"/>
     <w:multiLevelType w:val="hybridMultilevel"/>
     <w:tmpl w:val="414440E6"/>
@@ -13077,7 +13262,7 @@
       </w:pPr>
     </w:lvl>
   </w:abstractNum>
-  <w:abstractNum w:abstractNumId="28">
+  <w:abstractNum w:abstractNumId="29">
     <w:nsid w:val="6F0A1BD2"/>
     <w:multiLevelType w:val="hybridMultilevel"/>
     <w:tmpl w:val="EF7884CC"/>
@@ -13190,7 +13375,7 @@
       </w:rPr>
     </w:lvl>
   </w:abstractNum>
-  <w:abstractNum w:abstractNumId="29">
+  <w:abstractNum w:abstractNumId="30">
     <w:nsid w:val="6FC368C3"/>
     <w:multiLevelType w:val="hybridMultilevel"/>
     <w:tmpl w:val="F892BAB0"/>
@@ -13279,7 +13464,7 @@
       </w:pPr>
     </w:lvl>
   </w:abstractNum>
-  <w:abstractNum w:abstractNumId="30">
+  <w:abstractNum w:abstractNumId="31">
     <w:nsid w:val="729D49A6"/>
     <w:multiLevelType w:val="hybridMultilevel"/>
     <w:tmpl w:val="212E6380"/>
@@ -13368,7 +13553,7 @@
       </w:pPr>
     </w:lvl>
   </w:abstractNum>
-  <w:abstractNum w:abstractNumId="31">
+  <w:abstractNum w:abstractNumId="32">
     <w:nsid w:val="72E5107C"/>
     <w:multiLevelType w:val="hybridMultilevel"/>
     <w:tmpl w:val="30BE3018"/>
@@ -13457,7 +13642,7 @@
       </w:pPr>
     </w:lvl>
   </w:abstractNum>
-  <w:abstractNum w:abstractNumId="32">
+  <w:abstractNum w:abstractNumId="33">
     <w:nsid w:val="7C1B7A62"/>
     <w:multiLevelType w:val="hybridMultilevel"/>
     <w:tmpl w:val="A1EEB68C"/>
@@ -13570,7 +13755,7 @@
       </w:rPr>
     </w:lvl>
   </w:abstractNum>
-  <w:abstractNum w:abstractNumId="33">
+  <w:abstractNum w:abstractNumId="34">
     <w:nsid w:val="7E0C5E33"/>
     <w:multiLevelType w:val="hybridMultilevel"/>
     <w:tmpl w:val="17A20342"/>
@@ -13659,7 +13844,7 @@
       </w:pPr>
     </w:lvl>
   </w:abstractNum>
-  <w:abstractNum w:abstractNumId="34">
+  <w:abstractNum w:abstractNumId="35">
     <w:nsid w:val="7EEF6783"/>
     <w:multiLevelType w:val="hybridMultilevel"/>
     <w:tmpl w:val="2292AFAC"/>
@@ -13755,10 +13940,10 @@
     <w:abstractNumId w:val="6"/>
   </w:num>
   <w:num w:numId="3">
-    <w:abstractNumId w:val="32"/>
+    <w:abstractNumId w:val="33"/>
   </w:num>
   <w:num w:numId="4">
-    <w:abstractNumId w:val="23"/>
+    <w:abstractNumId w:val="24"/>
   </w:num>
   <w:num w:numId="5">
     <w:abstractNumId w:val="15"/>
@@ -13767,10 +13952,10 @@
     <w:abstractNumId w:val="7"/>
   </w:num>
   <w:num w:numId="7">
-    <w:abstractNumId w:val="20"/>
+    <w:abstractNumId w:val="21"/>
   </w:num>
   <w:num w:numId="8">
-    <w:abstractNumId w:val="24"/>
+    <w:abstractNumId w:val="25"/>
   </w:num>
   <w:num w:numId="9">
     <w:abstractNumId w:val="12"/>
@@ -13788,40 +13973,40 @@
     <w:abstractNumId w:val="2"/>
   </w:num>
   <w:num w:numId="14">
-    <w:abstractNumId w:val="19"/>
+    <w:abstractNumId w:val="20"/>
   </w:num>
   <w:num w:numId="15">
-    <w:abstractNumId w:val="34"/>
+    <w:abstractNumId w:val="35"/>
   </w:num>
   <w:num w:numId="16">
     <w:abstractNumId w:val="13"/>
   </w:num>
   <w:num w:numId="17">
-    <w:abstractNumId w:val="28"/>
+    <w:abstractNumId w:val="29"/>
   </w:num>
   <w:num w:numId="18">
     <w:abstractNumId w:val="1"/>
   </w:num>
   <w:num w:numId="19">
-    <w:abstractNumId w:val="33"/>
+    <w:abstractNumId w:val="34"/>
   </w:num>
   <w:num w:numId="20">
-    <w:abstractNumId w:val="25"/>
+    <w:abstractNumId w:val="26"/>
   </w:num>
   <w:num w:numId="21">
-    <w:abstractNumId w:val="22"/>
+    <w:abstractNumId w:val="23"/>
   </w:num>
   <w:num w:numId="22">
     <w:abstractNumId w:val="3"/>
   </w:num>
   <w:num w:numId="23">
-    <w:abstractNumId w:val="30"/>
+    <w:abstractNumId w:val="31"/>
   </w:num>
   <w:num w:numId="24">
-    <w:abstractNumId w:val="21"/>
+    <w:abstractNumId w:val="22"/>
   </w:num>
   <w:num w:numId="25">
-    <w:abstractNumId w:val="27"/>
+    <w:abstractNumId w:val="28"/>
   </w:num>
   <w:num w:numId="26">
     <w:abstractNumId w:val="14"/>
@@ -13830,13 +14015,13 @@
     <w:abstractNumId w:val="11"/>
   </w:num>
   <w:num w:numId="28">
-    <w:abstractNumId w:val="31"/>
+    <w:abstractNumId w:val="32"/>
   </w:num>
   <w:num w:numId="29">
-    <w:abstractNumId w:val="16"/>
+    <w:abstractNumId w:val="17"/>
   </w:num>
   <w:num w:numId="30">
-    <w:abstractNumId w:val="26"/>
+    <w:abstractNumId w:val="27"/>
   </w:num>
   <w:num w:numId="31">
     <w:abstractNumId w:val="0"/>
@@ -13845,13 +14030,16 @@
     <w:abstractNumId w:val="9"/>
   </w:num>
   <w:num w:numId="33">
-    <w:abstractNumId w:val="17"/>
+    <w:abstractNumId w:val="18"/>
   </w:num>
   <w:num w:numId="34">
-    <w:abstractNumId w:val="29"/>
+    <w:abstractNumId w:val="30"/>
   </w:num>
   <w:num w:numId="35">
-    <w:abstractNumId w:val="18"/>
+    <w:abstractNumId w:val="19"/>
+  </w:num>
+  <w:num w:numId="36">
+    <w:abstractNumId w:val="16"/>
   </w:num>
 </w:numbering>
 </file>
@@ -14581,7 +14769,7 @@
 </file>
 
 <file path=customXml/itemProps1.xml><?xml version="1.0" encoding="utf-8"?>
-<ds:datastoreItem xmlns:ds="http://schemas.openxmlformats.org/officeDocument/2006/customXml" ds:itemID="{A0A7575D-E775-4808-A4A2-F76210F3B57A}">
+<ds:datastoreItem xmlns:ds="http://schemas.openxmlformats.org/officeDocument/2006/customXml" ds:itemID="{0D5FEA11-F788-471B-807F-0B39F230E5C1}">
   <ds:schemaRefs>
     <ds:schemaRef ds:uri="http://schemas.openxmlformats.org/officeDocument/2006/bibliography"/>
   </ds:schemaRefs>

</xml_diff>

<commit_message>
Date: 03 Dec 2025
</commit_message>
<xml_diff>
--- a/Notes_Selenium_14.docx
+++ b/Notes_Selenium_14.docx
@@ -621,13 +621,23 @@
           <w:lang w:val="en-US"/>
         </w:rPr>
       </w:pPr>
-      <w:r>
-        <w:rPr>
-          <w:sz w:val="24"/>
-          <w:szCs w:val="22"/>
-          <w:lang w:val="en-US"/>
-        </w:rPr>
-        <w:t>Thread.sleep()</w:t>
+      <w:proofErr w:type="spellStart"/>
+      <w:r>
+        <w:rPr>
+          <w:sz w:val="24"/>
+          <w:szCs w:val="22"/>
+          <w:lang w:val="en-US"/>
+        </w:rPr>
+        <w:t>Thread.sleep</w:t>
+      </w:r>
+      <w:proofErr w:type="spellEnd"/>
+      <w:r>
+        <w:rPr>
+          <w:sz w:val="24"/>
+          <w:szCs w:val="22"/>
+          <w:lang w:val="en-US"/>
+        </w:rPr>
+        <w:t>()</w:t>
       </w:r>
     </w:p>
     <w:p>
@@ -2156,7 +2166,25 @@
           <w:szCs w:val="22"/>
           <w:lang w:val="en-US"/>
         </w:rPr>
-        <w:t xml:space="preserve"> Correctness, Completeness, Security &amp; Quality of developed software application.</w:t>
+        <w:t xml:space="preserve"> Correctness, Completeness, </w:t>
+      </w:r>
+      <w:proofErr w:type="gramStart"/>
+      <w:r>
+        <w:rPr>
+          <w:sz w:val="24"/>
+          <w:szCs w:val="22"/>
+          <w:lang w:val="en-US"/>
+        </w:rPr>
+        <w:t>Security</w:t>
+      </w:r>
+      <w:proofErr w:type="gramEnd"/>
+      <w:r>
+        <w:rPr>
+          <w:sz w:val="24"/>
+          <w:szCs w:val="22"/>
+          <w:lang w:val="en-US"/>
+        </w:rPr>
+        <w:t xml:space="preserve"> &amp; Quality of developed software application.</w:t>
       </w:r>
     </w:p>
     <w:p>
@@ -3483,8 +3511,18 @@
           <w:szCs w:val="22"/>
           <w:lang w:val="en-US"/>
         </w:rPr>
-        <w:t>Idea Intellij</w:t>
-      </w:r>
+        <w:t xml:space="preserve">Idea </w:t>
+      </w:r>
+      <w:proofErr w:type="spellStart"/>
+      <w:r>
+        <w:rPr>
+          <w:sz w:val="24"/>
+          <w:szCs w:val="22"/>
+          <w:lang w:val="en-US"/>
+        </w:rPr>
+        <w:t>Intellij</w:t>
+      </w:r>
+      <w:proofErr w:type="spellEnd"/>
     </w:p>
     <w:p>
       <w:pPr>
@@ -3582,6 +3620,7 @@
           <w:lang w:val="en-US"/>
         </w:rPr>
       </w:pPr>
+      <w:proofErr w:type="spellStart"/>
       <w:r>
         <w:rPr>
           <w:sz w:val="24"/>
@@ -3590,6 +3629,7 @@
         </w:rPr>
         <w:t>YourName_SeleniumDemos</w:t>
       </w:r>
+      <w:proofErr w:type="spellEnd"/>
     </w:p>
     <w:p>
       <w:pPr>
@@ -3632,8 +3672,18 @@
           <w:szCs w:val="22"/>
           <w:lang w:val="en-US"/>
         </w:rPr>
-        <w:t>Open selenium.dev</w:t>
-      </w:r>
+        <w:t xml:space="preserve">Open </w:t>
+      </w:r>
+      <w:proofErr w:type="spellStart"/>
+      <w:r>
+        <w:rPr>
+          <w:sz w:val="24"/>
+          <w:szCs w:val="22"/>
+          <w:lang w:val="en-US"/>
+        </w:rPr>
+        <w:t>selenium.dev</w:t>
+      </w:r>
+      <w:proofErr w:type="spellEnd"/>
     </w:p>
     <w:p>
       <w:pPr>
@@ -3903,7 +3953,25 @@
           <w:szCs w:val="22"/>
           <w:lang w:val="en-US"/>
         </w:rPr>
-        <w:t>Give the name for project (MyAutomationProject)</w:t>
+        <w:t>Give the name for project (</w:t>
+      </w:r>
+      <w:proofErr w:type="spellStart"/>
+      <w:r>
+        <w:rPr>
+          <w:sz w:val="24"/>
+          <w:szCs w:val="22"/>
+          <w:lang w:val="en-US"/>
+        </w:rPr>
+        <w:t>MyAutomationProject</w:t>
+      </w:r>
+      <w:proofErr w:type="spellEnd"/>
+      <w:r>
+        <w:rPr>
+          <w:sz w:val="24"/>
+          <w:szCs w:val="22"/>
+          <w:lang w:val="en-US"/>
+        </w:rPr>
+        <w:t>)</w:t>
       </w:r>
     </w:p>
     <w:p>
@@ -4042,7 +4110,25 @@
           <w:szCs w:val="22"/>
           <w:lang w:val="en-US"/>
         </w:rPr>
-        <w:t>Give the name (com.WebDriverDemos)</w:t>
+        <w:t>Give the name (</w:t>
+      </w:r>
+      <w:proofErr w:type="spellStart"/>
+      <w:r>
+        <w:rPr>
+          <w:sz w:val="24"/>
+          <w:szCs w:val="22"/>
+          <w:lang w:val="en-US"/>
+        </w:rPr>
+        <w:t>com.WebDriverDemos</w:t>
+      </w:r>
+      <w:proofErr w:type="spellEnd"/>
+      <w:r>
+        <w:rPr>
+          <w:sz w:val="24"/>
+          <w:szCs w:val="22"/>
+          <w:lang w:val="en-US"/>
+        </w:rPr>
+        <w:t>)</w:t>
       </w:r>
     </w:p>
     <w:p>
@@ -4379,13 +4465,23 @@
           <w:lang w:val="en-US"/>
         </w:rPr>
       </w:pPr>
-      <w:r>
-        <w:rPr>
-          <w:sz w:val="24"/>
-          <w:szCs w:val="22"/>
-          <w:lang w:val="en-US"/>
-        </w:rPr>
-        <w:t xml:space="preserve">get() </w:t>
+      <w:proofErr w:type="gramStart"/>
+      <w:r>
+        <w:rPr>
+          <w:sz w:val="24"/>
+          <w:szCs w:val="22"/>
+          <w:lang w:val="en-US"/>
+        </w:rPr>
+        <w:t>get(</w:t>
+      </w:r>
+      <w:proofErr w:type="gramEnd"/>
+      <w:r>
+        <w:rPr>
+          <w:sz w:val="24"/>
+          <w:szCs w:val="22"/>
+          <w:lang w:val="en-US"/>
+        </w:rPr>
+        <w:t xml:space="preserve">) </w:t>
       </w:r>
       <w:r>
         <w:rPr>
@@ -4417,13 +4513,23 @@
           <w:lang w:val="en-US"/>
         </w:rPr>
       </w:pPr>
-      <w:r>
-        <w:rPr>
-          <w:sz w:val="24"/>
-          <w:szCs w:val="22"/>
-          <w:lang w:val="en-US"/>
-        </w:rPr>
-        <w:t xml:space="preserve">driver.manage().window().maximize() </w:t>
+      <w:proofErr w:type="spellStart"/>
+      <w:r>
+        <w:rPr>
+          <w:sz w:val="24"/>
+          <w:szCs w:val="22"/>
+          <w:lang w:val="en-US"/>
+        </w:rPr>
+        <w:t>driver.manage</w:t>
+      </w:r>
+      <w:proofErr w:type="spellEnd"/>
+      <w:r>
+        <w:rPr>
+          <w:sz w:val="24"/>
+          <w:szCs w:val="22"/>
+          <w:lang w:val="en-US"/>
+        </w:rPr>
+        <w:t xml:space="preserve">().window().maximize() </w:t>
       </w:r>
       <w:r>
         <w:rPr>
@@ -4455,13 +4561,23 @@
           <w:lang w:val="en-US"/>
         </w:rPr>
       </w:pPr>
-      <w:r>
-        <w:rPr>
-          <w:sz w:val="24"/>
-          <w:szCs w:val="22"/>
-          <w:lang w:val="en-US"/>
-        </w:rPr>
-        <w:t xml:space="preserve">close() </w:t>
+      <w:proofErr w:type="gramStart"/>
+      <w:r>
+        <w:rPr>
+          <w:sz w:val="24"/>
+          <w:szCs w:val="22"/>
+          <w:lang w:val="en-US"/>
+        </w:rPr>
+        <w:t>close(</w:t>
+      </w:r>
+      <w:proofErr w:type="gramEnd"/>
+      <w:r>
+        <w:rPr>
+          <w:sz w:val="24"/>
+          <w:szCs w:val="22"/>
+          <w:lang w:val="en-US"/>
+        </w:rPr>
+        <w:t xml:space="preserve">) </w:t>
       </w:r>
       <w:r>
         <w:rPr>
@@ -4493,13 +4609,23 @@
           <w:lang w:val="en-US"/>
         </w:rPr>
       </w:pPr>
-      <w:r>
-        <w:rPr>
-          <w:sz w:val="24"/>
-          <w:szCs w:val="22"/>
-          <w:lang w:val="en-US"/>
-        </w:rPr>
-        <w:t xml:space="preserve">getTitle() </w:t>
+      <w:proofErr w:type="gramStart"/>
+      <w:r>
+        <w:rPr>
+          <w:sz w:val="24"/>
+          <w:szCs w:val="22"/>
+          <w:lang w:val="en-US"/>
+        </w:rPr>
+        <w:t>getTitle(</w:t>
+      </w:r>
+      <w:proofErr w:type="gramEnd"/>
+      <w:r>
+        <w:rPr>
+          <w:sz w:val="24"/>
+          <w:szCs w:val="22"/>
+          <w:lang w:val="en-US"/>
+        </w:rPr>
+        <w:t xml:space="preserve">) </w:t>
       </w:r>
       <w:r>
         <w:rPr>
@@ -4539,13 +4665,23 @@
           <w:lang w:val="en-US"/>
         </w:rPr>
       </w:pPr>
-      <w:r>
-        <w:rPr>
-          <w:sz w:val="24"/>
-          <w:szCs w:val="22"/>
-          <w:lang w:val="en-US"/>
-        </w:rPr>
-        <w:t xml:space="preserve">getCurrentUrl() </w:t>
+      <w:proofErr w:type="gramStart"/>
+      <w:r>
+        <w:rPr>
+          <w:sz w:val="24"/>
+          <w:szCs w:val="22"/>
+          <w:lang w:val="en-US"/>
+        </w:rPr>
+        <w:t>getCurrentUrl(</w:t>
+      </w:r>
+      <w:proofErr w:type="gramEnd"/>
+      <w:r>
+        <w:rPr>
+          <w:sz w:val="24"/>
+          <w:szCs w:val="22"/>
+          <w:lang w:val="en-US"/>
+        </w:rPr>
+        <w:t xml:space="preserve">) </w:t>
       </w:r>
       <w:r>
         <w:rPr>
@@ -4577,13 +4713,23 @@
           <w:lang w:val="en-US"/>
         </w:rPr>
       </w:pPr>
-      <w:r>
-        <w:rPr>
-          <w:sz w:val="24"/>
-          <w:szCs w:val="22"/>
-          <w:lang w:val="en-US"/>
-        </w:rPr>
-        <w:t xml:space="preserve">getPageSource() </w:t>
+      <w:proofErr w:type="gramStart"/>
+      <w:r>
+        <w:rPr>
+          <w:sz w:val="24"/>
+          <w:szCs w:val="22"/>
+          <w:lang w:val="en-US"/>
+        </w:rPr>
+        <w:t>getPageSource(</w:t>
+      </w:r>
+      <w:proofErr w:type="gramEnd"/>
+      <w:r>
+        <w:rPr>
+          <w:sz w:val="24"/>
+          <w:szCs w:val="22"/>
+          <w:lang w:val="en-US"/>
+        </w:rPr>
+        <w:t xml:space="preserve">) </w:t>
       </w:r>
       <w:r>
         <w:rPr>
@@ -4615,13 +4761,23 @@
           <w:lang w:val="en-US"/>
         </w:rPr>
       </w:pPr>
-      <w:r>
-        <w:rPr>
-          <w:sz w:val="24"/>
-          <w:szCs w:val="22"/>
-          <w:lang w:val="en-US"/>
-        </w:rPr>
-        <w:t xml:space="preserve">findElement() </w:t>
+      <w:proofErr w:type="gramStart"/>
+      <w:r>
+        <w:rPr>
+          <w:sz w:val="24"/>
+          <w:szCs w:val="22"/>
+          <w:lang w:val="en-US"/>
+        </w:rPr>
+        <w:t>findElement(</w:t>
+      </w:r>
+      <w:proofErr w:type="gramEnd"/>
+      <w:r>
+        <w:rPr>
+          <w:sz w:val="24"/>
+          <w:szCs w:val="22"/>
+          <w:lang w:val="en-US"/>
+        </w:rPr>
+        <w:t xml:space="preserve">) </w:t>
       </w:r>
       <w:r>
         <w:rPr>
@@ -4705,13 +4861,23 @@
           <w:lang w:val="en-US"/>
         </w:rPr>
       </w:pPr>
-      <w:r>
-        <w:rPr>
-          <w:sz w:val="24"/>
-          <w:szCs w:val="22"/>
-          <w:lang w:val="en-US"/>
-        </w:rPr>
-        <w:t xml:space="preserve">findElements() </w:t>
+      <w:proofErr w:type="gramStart"/>
+      <w:r>
+        <w:rPr>
+          <w:sz w:val="24"/>
+          <w:szCs w:val="22"/>
+          <w:lang w:val="en-US"/>
+        </w:rPr>
+        <w:t>findElements(</w:t>
+      </w:r>
+      <w:proofErr w:type="gramEnd"/>
+      <w:r>
+        <w:rPr>
+          <w:sz w:val="24"/>
+          <w:szCs w:val="22"/>
+          <w:lang w:val="en-US"/>
+        </w:rPr>
+        <w:t xml:space="preserve">) </w:t>
       </w:r>
       <w:r>
         <w:rPr>
@@ -4769,13 +4935,23 @@
           <w:lang w:val="en-US"/>
         </w:rPr>
       </w:pPr>
-      <w:r>
-        <w:rPr>
-          <w:sz w:val="24"/>
-          <w:szCs w:val="22"/>
-          <w:lang w:val="en-US"/>
-        </w:rPr>
-        <w:t xml:space="preserve">getWindowHandles() </w:t>
+      <w:proofErr w:type="gramStart"/>
+      <w:r>
+        <w:rPr>
+          <w:sz w:val="24"/>
+          <w:szCs w:val="22"/>
+          <w:lang w:val="en-US"/>
+        </w:rPr>
+        <w:t>getWindowHandles(</w:t>
+      </w:r>
+      <w:proofErr w:type="gramEnd"/>
+      <w:r>
+        <w:rPr>
+          <w:sz w:val="24"/>
+          <w:szCs w:val="22"/>
+          <w:lang w:val="en-US"/>
+        </w:rPr>
+        <w:t xml:space="preserve">) </w:t>
       </w:r>
       <w:r>
         <w:rPr>
@@ -4815,13 +4991,23 @@
           <w:lang w:val="en-US"/>
         </w:rPr>
       </w:pPr>
-      <w:r>
-        <w:rPr>
-          <w:sz w:val="24"/>
-          <w:szCs w:val="22"/>
-          <w:lang w:val="en-US"/>
-        </w:rPr>
-        <w:t xml:space="preserve">quit() </w:t>
+      <w:proofErr w:type="gramStart"/>
+      <w:r>
+        <w:rPr>
+          <w:sz w:val="24"/>
+          <w:szCs w:val="22"/>
+          <w:lang w:val="en-US"/>
+        </w:rPr>
+        <w:t>quit(</w:t>
+      </w:r>
+      <w:proofErr w:type="gramEnd"/>
+      <w:r>
+        <w:rPr>
+          <w:sz w:val="24"/>
+          <w:szCs w:val="22"/>
+          <w:lang w:val="en-US"/>
+        </w:rPr>
+        <w:t xml:space="preserve">) </w:t>
       </w:r>
       <w:r>
         <w:rPr>
@@ -5117,13 +5303,23 @@
         </w:rPr>
         <w:t xml:space="preserve"> </w:t>
       </w:r>
-      <w:r>
-        <w:rPr>
-          <w:sz w:val="24"/>
-          <w:szCs w:val="22"/>
-          <w:lang w:val="en-US"/>
-        </w:rPr>
-        <w:t>driver.get() implicitly waits for 30 seconds, but if any one of the page is not getting loaded within these 30 seconds then you will get TimeoutException.</w:t>
+      <w:proofErr w:type="spellStart"/>
+      <w:r>
+        <w:rPr>
+          <w:sz w:val="24"/>
+          <w:szCs w:val="22"/>
+          <w:lang w:val="en-US"/>
+        </w:rPr>
+        <w:t>driver.get</w:t>
+      </w:r>
+      <w:proofErr w:type="spellEnd"/>
+      <w:r>
+        <w:rPr>
+          <w:sz w:val="24"/>
+          <w:szCs w:val="22"/>
+          <w:lang w:val="en-US"/>
+        </w:rPr>
+        <w:t>() implicitly waits for 30 seconds, but if any one of the page is not getting loaded within these 30 seconds then you will get TimeoutException.</w:t>
       </w:r>
     </w:p>
     <w:p>
@@ -5626,13 +5822,23 @@
           <w:lang w:val="en-US"/>
         </w:rPr>
       </w:pPr>
-      <w:r>
-        <w:rPr>
-          <w:sz w:val="24"/>
-          <w:szCs w:val="22"/>
-          <w:lang w:val="en-US"/>
-        </w:rPr>
-        <w:t xml:space="preserve">sendKeys() </w:t>
+      <w:proofErr w:type="gramStart"/>
+      <w:r>
+        <w:rPr>
+          <w:sz w:val="24"/>
+          <w:szCs w:val="22"/>
+          <w:lang w:val="en-US"/>
+        </w:rPr>
+        <w:t>sendKeys(</w:t>
+      </w:r>
+      <w:proofErr w:type="gramEnd"/>
+      <w:r>
+        <w:rPr>
+          <w:sz w:val="24"/>
+          <w:szCs w:val="22"/>
+          <w:lang w:val="en-US"/>
+        </w:rPr>
+        <w:t xml:space="preserve">) </w:t>
       </w:r>
       <w:r>
         <w:rPr>
@@ -5672,13 +5878,23 @@
           <w:lang w:val="en-US"/>
         </w:rPr>
       </w:pPr>
-      <w:r>
-        <w:rPr>
-          <w:sz w:val="24"/>
-          <w:szCs w:val="22"/>
-          <w:lang w:val="en-US"/>
-        </w:rPr>
-        <w:t xml:space="preserve">click() </w:t>
+      <w:proofErr w:type="gramStart"/>
+      <w:r>
+        <w:rPr>
+          <w:sz w:val="24"/>
+          <w:szCs w:val="22"/>
+          <w:lang w:val="en-US"/>
+        </w:rPr>
+        <w:t>click(</w:t>
+      </w:r>
+      <w:proofErr w:type="gramEnd"/>
+      <w:r>
+        <w:rPr>
+          <w:sz w:val="24"/>
+          <w:szCs w:val="22"/>
+          <w:lang w:val="en-US"/>
+        </w:rPr>
+        <w:t xml:space="preserve">) </w:t>
       </w:r>
       <w:r>
         <w:rPr>
@@ -5710,13 +5926,23 @@
           <w:lang w:val="en-US"/>
         </w:rPr>
       </w:pPr>
-      <w:r>
-        <w:rPr>
-          <w:sz w:val="24"/>
-          <w:szCs w:val="22"/>
-          <w:lang w:val="en-US"/>
-        </w:rPr>
-        <w:t xml:space="preserve">getText() </w:t>
+      <w:proofErr w:type="gramStart"/>
+      <w:r>
+        <w:rPr>
+          <w:sz w:val="24"/>
+          <w:szCs w:val="22"/>
+          <w:lang w:val="en-US"/>
+        </w:rPr>
+        <w:t>getText(</w:t>
+      </w:r>
+      <w:proofErr w:type="gramEnd"/>
+      <w:r>
+        <w:rPr>
+          <w:sz w:val="24"/>
+          <w:szCs w:val="22"/>
+          <w:lang w:val="en-US"/>
+        </w:rPr>
+        <w:t xml:space="preserve">) </w:t>
       </w:r>
       <w:r>
         <w:rPr>
@@ -5748,13 +5974,23 @@
           <w:lang w:val="en-US"/>
         </w:rPr>
       </w:pPr>
-      <w:r>
-        <w:rPr>
-          <w:sz w:val="24"/>
-          <w:szCs w:val="22"/>
-          <w:lang w:val="en-US"/>
-        </w:rPr>
-        <w:t xml:space="preserve">isSelected() </w:t>
+      <w:proofErr w:type="gramStart"/>
+      <w:r>
+        <w:rPr>
+          <w:sz w:val="24"/>
+          <w:szCs w:val="22"/>
+          <w:lang w:val="en-US"/>
+        </w:rPr>
+        <w:t>isSelected(</w:t>
+      </w:r>
+      <w:proofErr w:type="gramEnd"/>
+      <w:r>
+        <w:rPr>
+          <w:sz w:val="24"/>
+          <w:szCs w:val="22"/>
+          <w:lang w:val="en-US"/>
+        </w:rPr>
+        <w:t xml:space="preserve">) </w:t>
       </w:r>
       <w:r>
         <w:rPr>
@@ -5832,13 +6068,23 @@
           <w:lang w:val="en-US"/>
         </w:rPr>
       </w:pPr>
-      <w:r>
-        <w:rPr>
-          <w:sz w:val="24"/>
-          <w:szCs w:val="22"/>
-          <w:lang w:val="en-US"/>
-        </w:rPr>
-        <w:t xml:space="preserve">isDisplayed() </w:t>
+      <w:proofErr w:type="gramStart"/>
+      <w:r>
+        <w:rPr>
+          <w:sz w:val="24"/>
+          <w:szCs w:val="22"/>
+          <w:lang w:val="en-US"/>
+        </w:rPr>
+        <w:t>isDisplayed(</w:t>
+      </w:r>
+      <w:proofErr w:type="gramEnd"/>
+      <w:r>
+        <w:rPr>
+          <w:sz w:val="24"/>
+          <w:szCs w:val="22"/>
+          <w:lang w:val="en-US"/>
+        </w:rPr>
+        <w:t xml:space="preserve">) </w:t>
       </w:r>
       <w:r>
         <w:rPr>
@@ -6014,7 +6260,25 @@
           <w:szCs w:val="22"/>
           <w:lang w:val="en-US"/>
         </w:rPr>
-        <w:t>data-testid="royal-email"]</w:t>
+        <w:t>data-</w:t>
+      </w:r>
+      <w:proofErr w:type="spellStart"/>
+      <w:r>
+        <w:rPr>
+          <w:sz w:val="24"/>
+          <w:szCs w:val="22"/>
+          <w:lang w:val="en-US"/>
+        </w:rPr>
+        <w:t>testid</w:t>
+      </w:r>
+      <w:proofErr w:type="spellEnd"/>
+      <w:r>
+        <w:rPr>
+          <w:sz w:val="24"/>
+          <w:szCs w:val="22"/>
+          <w:lang w:val="en-US"/>
+        </w:rPr>
+        <w:t>="royal-email"]</w:t>
       </w:r>
     </w:p>
     <w:p>
@@ -6837,13 +7101,23 @@
           <w:lang w:val="en-US"/>
         </w:rPr>
       </w:pPr>
-      <w:r>
-        <w:rPr>
-          <w:sz w:val="24"/>
-          <w:szCs w:val="22"/>
-          <w:lang w:val="en-US"/>
-        </w:rPr>
-        <w:t xml:space="preserve">getOptions() </w:t>
+      <w:proofErr w:type="gramStart"/>
+      <w:r>
+        <w:rPr>
+          <w:sz w:val="24"/>
+          <w:szCs w:val="22"/>
+          <w:lang w:val="en-US"/>
+        </w:rPr>
+        <w:t>getOptions(</w:t>
+      </w:r>
+      <w:proofErr w:type="gramEnd"/>
+      <w:r>
+        <w:rPr>
+          <w:sz w:val="24"/>
+          <w:szCs w:val="22"/>
+          <w:lang w:val="en-US"/>
+        </w:rPr>
+        <w:t xml:space="preserve">) </w:t>
       </w:r>
       <w:r>
         <w:rPr>
@@ -6875,13 +7149,23 @@
           <w:lang w:val="en-US"/>
         </w:rPr>
       </w:pPr>
-      <w:r>
-        <w:rPr>
-          <w:sz w:val="24"/>
-          <w:szCs w:val="22"/>
-          <w:lang w:val="en-US"/>
-        </w:rPr>
-        <w:t xml:space="preserve">selectByVisibleText() </w:t>
+      <w:proofErr w:type="gramStart"/>
+      <w:r>
+        <w:rPr>
+          <w:sz w:val="24"/>
+          <w:szCs w:val="22"/>
+          <w:lang w:val="en-US"/>
+        </w:rPr>
+        <w:t>selectByVisibleText(</w:t>
+      </w:r>
+      <w:proofErr w:type="gramEnd"/>
+      <w:r>
+        <w:rPr>
+          <w:sz w:val="24"/>
+          <w:szCs w:val="22"/>
+          <w:lang w:val="en-US"/>
+        </w:rPr>
+        <w:t xml:space="preserve">) </w:t>
       </w:r>
       <w:r>
         <w:rPr>
@@ -6951,13 +7235,23 @@
           <w:lang w:val="en-US"/>
         </w:rPr>
       </w:pPr>
-      <w:r>
-        <w:rPr>
-          <w:sz w:val="24"/>
-          <w:szCs w:val="22"/>
-          <w:lang w:val="en-US"/>
-        </w:rPr>
-        <w:t xml:space="preserve">selectByValue() </w:t>
+      <w:proofErr w:type="gramStart"/>
+      <w:r>
+        <w:rPr>
+          <w:sz w:val="24"/>
+          <w:szCs w:val="22"/>
+          <w:lang w:val="en-US"/>
+        </w:rPr>
+        <w:t>selectByValue(</w:t>
+      </w:r>
+      <w:proofErr w:type="gramEnd"/>
+      <w:r>
+        <w:rPr>
+          <w:sz w:val="24"/>
+          <w:szCs w:val="22"/>
+          <w:lang w:val="en-US"/>
+        </w:rPr>
+        <w:t xml:space="preserve">) </w:t>
       </w:r>
       <w:r>
         <w:rPr>
@@ -6997,13 +7291,23 @@
           <w:lang w:val="en-US"/>
         </w:rPr>
       </w:pPr>
-      <w:r>
-        <w:rPr>
-          <w:sz w:val="24"/>
-          <w:szCs w:val="22"/>
-          <w:lang w:val="en-US"/>
-        </w:rPr>
-        <w:t xml:space="preserve">selectByIndex() </w:t>
+      <w:proofErr w:type="gramStart"/>
+      <w:r>
+        <w:rPr>
+          <w:sz w:val="24"/>
+          <w:szCs w:val="22"/>
+          <w:lang w:val="en-US"/>
+        </w:rPr>
+        <w:t>selectByIndex(</w:t>
+      </w:r>
+      <w:proofErr w:type="gramEnd"/>
+      <w:r>
+        <w:rPr>
+          <w:sz w:val="24"/>
+          <w:szCs w:val="22"/>
+          <w:lang w:val="en-US"/>
+        </w:rPr>
+        <w:t xml:space="preserve">) </w:t>
       </w:r>
       <w:r>
         <w:rPr>
@@ -7019,7 +7323,25 @@
           <w:szCs w:val="22"/>
           <w:lang w:val="en-US"/>
         </w:rPr>
-        <w:t xml:space="preserve"> Selects the option by using its zero based index no. index no is +ve integer number.</w:t>
+        <w:t xml:space="preserve"> Selects the option by using its zero based index no. index no is +</w:t>
+      </w:r>
+      <w:proofErr w:type="spellStart"/>
+      <w:r>
+        <w:rPr>
+          <w:sz w:val="24"/>
+          <w:szCs w:val="22"/>
+          <w:lang w:val="en-US"/>
+        </w:rPr>
+        <w:t>ve</w:t>
+      </w:r>
+      <w:proofErr w:type="spellEnd"/>
+      <w:r>
+        <w:rPr>
+          <w:sz w:val="24"/>
+          <w:szCs w:val="22"/>
+          <w:lang w:val="en-US"/>
+        </w:rPr>
+        <w:t xml:space="preserve"> integer number.</w:t>
       </w:r>
     </w:p>
     <w:p>
@@ -7035,13 +7357,23 @@
           <w:lang w:val="en-US"/>
         </w:rPr>
       </w:pPr>
-      <w:r>
-        <w:rPr>
-          <w:sz w:val="24"/>
-          <w:szCs w:val="22"/>
-          <w:lang w:val="en-US"/>
-        </w:rPr>
-        <w:t xml:space="preserve">getAllSelectedOptions() </w:t>
+      <w:proofErr w:type="gramStart"/>
+      <w:r>
+        <w:rPr>
+          <w:sz w:val="24"/>
+          <w:szCs w:val="22"/>
+          <w:lang w:val="en-US"/>
+        </w:rPr>
+        <w:t>getAllSelectedOptions(</w:t>
+      </w:r>
+      <w:proofErr w:type="gramEnd"/>
+      <w:r>
+        <w:rPr>
+          <w:sz w:val="24"/>
+          <w:szCs w:val="22"/>
+          <w:lang w:val="en-US"/>
+        </w:rPr>
+        <w:t xml:space="preserve">) </w:t>
       </w:r>
       <w:r>
         <w:rPr>
@@ -7073,13 +7405,23 @@
           <w:lang w:val="en-US"/>
         </w:rPr>
       </w:pPr>
-      <w:r>
-        <w:rPr>
-          <w:sz w:val="24"/>
-          <w:szCs w:val="22"/>
-          <w:lang w:val="en-US"/>
-        </w:rPr>
-        <w:t xml:space="preserve">isMultiple() </w:t>
+      <w:proofErr w:type="gramStart"/>
+      <w:r>
+        <w:rPr>
+          <w:sz w:val="24"/>
+          <w:szCs w:val="22"/>
+          <w:lang w:val="en-US"/>
+        </w:rPr>
+        <w:t>isMultiple(</w:t>
+      </w:r>
+      <w:proofErr w:type="gramEnd"/>
+      <w:r>
+        <w:rPr>
+          <w:sz w:val="24"/>
+          <w:szCs w:val="22"/>
+          <w:lang w:val="en-US"/>
+        </w:rPr>
+        <w:t xml:space="preserve">) </w:t>
       </w:r>
       <w:r>
         <w:rPr>
@@ -7294,13 +7636,33 @@
           <w:lang w:val="en-US"/>
         </w:rPr>
       </w:pPr>
-      <w:r>
-        <w:rPr>
-          <w:sz w:val="24"/>
-          <w:szCs w:val="22"/>
-          <w:lang w:val="en-US"/>
-        </w:rPr>
-        <w:t>Thread.sleep()</w:t>
+      <w:proofErr w:type="spellStart"/>
+      <w:proofErr w:type="gramStart"/>
+      <w:r>
+        <w:rPr>
+          <w:sz w:val="24"/>
+          <w:szCs w:val="22"/>
+          <w:lang w:val="en-US"/>
+        </w:rPr>
+        <w:t>Thread.sleep</w:t>
+      </w:r>
+      <w:proofErr w:type="spellEnd"/>
+      <w:r>
+        <w:rPr>
+          <w:sz w:val="24"/>
+          <w:szCs w:val="22"/>
+          <w:lang w:val="en-US"/>
+        </w:rPr>
+        <w:t>(</w:t>
+      </w:r>
+      <w:proofErr w:type="gramEnd"/>
+      <w:r>
+        <w:rPr>
+          <w:sz w:val="24"/>
+          <w:szCs w:val="22"/>
+          <w:lang w:val="en-US"/>
+        </w:rPr>
+        <w:t>)</w:t>
       </w:r>
       <w:r>
         <w:rPr>
@@ -7667,7 +8029,24 @@
           <w:lang w:val="en-US"/>
         </w:rPr>
         <w:br/>
-        <w:t xml:space="preserve">i – ignoring </w:t>
+      </w:r>
+      <w:proofErr w:type="spellStart"/>
+      <w:r>
+        <w:rPr>
+          <w:sz w:val="24"/>
+          <w:szCs w:val="22"/>
+          <w:lang w:val="en-US"/>
+        </w:rPr>
+        <w:t>i</w:t>
+      </w:r>
+      <w:proofErr w:type="spellEnd"/>
+      <w:r>
+        <w:rPr>
+          <w:sz w:val="24"/>
+          <w:szCs w:val="22"/>
+          <w:lang w:val="en-US"/>
+        </w:rPr>
+        <w:t xml:space="preserve"> – ignoring </w:t>
       </w:r>
       <w:r>
         <w:rPr>
@@ -7783,15 +8162,33 @@
           <w:szCs w:val="22"/>
           <w:lang w:val="en-US"/>
         </w:rPr>
-        <w:t>Display all table header (&lt;t</w:t>
-      </w:r>
-      <w:r>
-        <w:rPr>
-          <w:sz w:val="24"/>
-          <w:szCs w:val="22"/>
-          <w:lang w:val="en-US"/>
-        </w:rPr>
-        <w:t>h&gt;)</w:t>
+        <w:t>Display all table header (&lt;</w:t>
+      </w:r>
+      <w:proofErr w:type="spellStart"/>
+      <w:r>
+        <w:rPr>
+          <w:sz w:val="24"/>
+          <w:szCs w:val="22"/>
+          <w:lang w:val="en-US"/>
+        </w:rPr>
+        <w:t>t</w:t>
+      </w:r>
+      <w:r>
+        <w:rPr>
+          <w:sz w:val="24"/>
+          <w:szCs w:val="22"/>
+          <w:lang w:val="en-US"/>
+        </w:rPr>
+        <w:t>h</w:t>
+      </w:r>
+      <w:proofErr w:type="spellEnd"/>
+      <w:r>
+        <w:rPr>
+          <w:sz w:val="24"/>
+          <w:szCs w:val="22"/>
+          <w:lang w:val="en-US"/>
+        </w:rPr>
+        <w:t>&gt;)</w:t>
       </w:r>
     </w:p>
     <w:p>
@@ -7813,7 +8210,25 @@
           <w:szCs w:val="22"/>
           <w:lang w:val="en-US"/>
         </w:rPr>
-        <w:t>Display total number of rows (&lt;tr&gt;)</w:t>
+        <w:t>Display total number of rows (&lt;</w:t>
+      </w:r>
+      <w:proofErr w:type="spellStart"/>
+      <w:r>
+        <w:rPr>
+          <w:sz w:val="24"/>
+          <w:szCs w:val="22"/>
+          <w:lang w:val="en-US"/>
+        </w:rPr>
+        <w:t>tr</w:t>
+      </w:r>
+      <w:proofErr w:type="spellEnd"/>
+      <w:r>
+        <w:rPr>
+          <w:sz w:val="24"/>
+          <w:szCs w:val="22"/>
+          <w:lang w:val="en-US"/>
+        </w:rPr>
+        <w:t>&gt;)</w:t>
       </w:r>
     </w:p>
     <w:p>
@@ -7964,7 +8379,25 @@
           <w:szCs w:val="22"/>
           <w:lang w:val="en-US"/>
         </w:rPr>
-        <w:t>Entering some data in the text boxes (sendKeys()).</w:t>
+        <w:t>Entering some data in the text boxes (</w:t>
+      </w:r>
+      <w:proofErr w:type="gramStart"/>
+      <w:r>
+        <w:rPr>
+          <w:sz w:val="24"/>
+          <w:szCs w:val="22"/>
+          <w:lang w:val="en-US"/>
+        </w:rPr>
+        <w:t>sendKeys(</w:t>
+      </w:r>
+      <w:proofErr w:type="gramEnd"/>
+      <w:r>
+        <w:rPr>
+          <w:sz w:val="24"/>
+          <w:szCs w:val="22"/>
+          <w:lang w:val="en-US"/>
+        </w:rPr>
+        <w:t>)).</w:t>
       </w:r>
     </w:p>
     <w:p>
@@ -8292,13 +8725,23 @@
           <w:lang w:val="en-US"/>
         </w:rPr>
       </w:pPr>
-      <w:r>
-        <w:rPr>
-          <w:sz w:val="24"/>
-          <w:szCs w:val="22"/>
-          <w:lang w:val="en-US"/>
-        </w:rPr>
-        <w:t xml:space="preserve">driver.switchTo().alert() </w:t>
+      <w:proofErr w:type="spellStart"/>
+      <w:r>
+        <w:rPr>
+          <w:sz w:val="24"/>
+          <w:szCs w:val="22"/>
+          <w:lang w:val="en-US"/>
+        </w:rPr>
+        <w:t>driver.switchTo</w:t>
+      </w:r>
+      <w:proofErr w:type="spellEnd"/>
+      <w:r>
+        <w:rPr>
+          <w:sz w:val="24"/>
+          <w:szCs w:val="22"/>
+          <w:lang w:val="en-US"/>
+        </w:rPr>
+        <w:t xml:space="preserve">().alert() </w:t>
       </w:r>
       <w:r>
         <w:rPr>
@@ -8330,13 +8773,23 @@
           <w:lang w:val="en-US"/>
         </w:rPr>
       </w:pPr>
-      <w:r>
-        <w:rPr>
-          <w:sz w:val="24"/>
-          <w:szCs w:val="22"/>
-          <w:lang w:val="en-US"/>
-        </w:rPr>
-        <w:t xml:space="preserve">getText() </w:t>
+      <w:proofErr w:type="gramStart"/>
+      <w:r>
+        <w:rPr>
+          <w:sz w:val="24"/>
+          <w:szCs w:val="22"/>
+          <w:lang w:val="en-US"/>
+        </w:rPr>
+        <w:t>getText(</w:t>
+      </w:r>
+      <w:proofErr w:type="gramEnd"/>
+      <w:r>
+        <w:rPr>
+          <w:sz w:val="24"/>
+          <w:szCs w:val="22"/>
+          <w:lang w:val="en-US"/>
+        </w:rPr>
+        <w:t xml:space="preserve">) </w:t>
       </w:r>
       <w:r>
         <w:rPr>
@@ -8672,13 +9125,23 @@
           <w:lang w:val="en-US"/>
         </w:rPr>
       </w:pPr>
-      <w:r>
-        <w:rPr>
-          <w:sz w:val="24"/>
-          <w:szCs w:val="22"/>
-          <w:lang w:val="en-US"/>
-        </w:rPr>
-        <w:t xml:space="preserve">moveToElement() </w:t>
+      <w:proofErr w:type="gramStart"/>
+      <w:r>
+        <w:rPr>
+          <w:sz w:val="24"/>
+          <w:szCs w:val="22"/>
+          <w:lang w:val="en-US"/>
+        </w:rPr>
+        <w:t>moveToElement(</w:t>
+      </w:r>
+      <w:proofErr w:type="gramEnd"/>
+      <w:r>
+        <w:rPr>
+          <w:sz w:val="24"/>
+          <w:szCs w:val="22"/>
+          <w:lang w:val="en-US"/>
+        </w:rPr>
+        <w:t xml:space="preserve">) </w:t>
       </w:r>
       <w:r>
         <w:rPr>
@@ -8710,13 +9173,23 @@
           <w:lang w:val="en-US"/>
         </w:rPr>
       </w:pPr>
-      <w:r>
-        <w:rPr>
-          <w:sz w:val="24"/>
-          <w:szCs w:val="22"/>
-          <w:lang w:val="en-US"/>
-        </w:rPr>
-        <w:t xml:space="preserve">perform() </w:t>
+      <w:proofErr w:type="gramStart"/>
+      <w:r>
+        <w:rPr>
+          <w:sz w:val="24"/>
+          <w:szCs w:val="22"/>
+          <w:lang w:val="en-US"/>
+        </w:rPr>
+        <w:t>perform(</w:t>
+      </w:r>
+      <w:proofErr w:type="gramEnd"/>
+      <w:r>
+        <w:rPr>
+          <w:sz w:val="24"/>
+          <w:szCs w:val="22"/>
+          <w:lang w:val="en-US"/>
+        </w:rPr>
+        <w:t xml:space="preserve">) </w:t>
       </w:r>
       <w:r>
         <w:rPr>
@@ -8748,13 +9221,23 @@
           <w:lang w:val="en-US"/>
         </w:rPr>
       </w:pPr>
-      <w:r>
-        <w:rPr>
-          <w:sz w:val="24"/>
-          <w:szCs w:val="22"/>
-          <w:lang w:val="en-US"/>
-        </w:rPr>
-        <w:t xml:space="preserve">contextClick() </w:t>
+      <w:proofErr w:type="gramStart"/>
+      <w:r>
+        <w:rPr>
+          <w:sz w:val="24"/>
+          <w:szCs w:val="22"/>
+          <w:lang w:val="en-US"/>
+        </w:rPr>
+        <w:t>contextClick(</w:t>
+      </w:r>
+      <w:proofErr w:type="gramEnd"/>
+      <w:r>
+        <w:rPr>
+          <w:sz w:val="24"/>
+          <w:szCs w:val="22"/>
+          <w:lang w:val="en-US"/>
+        </w:rPr>
+        <w:t xml:space="preserve">) </w:t>
       </w:r>
       <w:r>
         <w:rPr>
@@ -8786,13 +9269,23 @@
           <w:lang w:val="en-US"/>
         </w:rPr>
       </w:pPr>
-      <w:r>
-        <w:rPr>
-          <w:sz w:val="24"/>
-          <w:szCs w:val="22"/>
-          <w:lang w:val="en-US"/>
-        </w:rPr>
-        <w:t xml:space="preserve">doubleClick() </w:t>
+      <w:proofErr w:type="gramStart"/>
+      <w:r>
+        <w:rPr>
+          <w:sz w:val="24"/>
+          <w:szCs w:val="22"/>
+          <w:lang w:val="en-US"/>
+        </w:rPr>
+        <w:t>doubleClick(</w:t>
+      </w:r>
+      <w:proofErr w:type="gramEnd"/>
+      <w:r>
+        <w:rPr>
+          <w:sz w:val="24"/>
+          <w:szCs w:val="22"/>
+          <w:lang w:val="en-US"/>
+        </w:rPr>
+        <w:t xml:space="preserve">) </w:t>
       </w:r>
       <w:r>
         <w:rPr>
@@ -8874,7 +9367,25 @@
           <w:szCs w:val="22"/>
           <w:lang w:val="en-US"/>
         </w:rPr>
-        <w:t>It is testing framework which will make automation testing more easy.</w:t>
+        <w:t xml:space="preserve">It is testing framework which will make automation testing more </w:t>
+      </w:r>
+      <w:proofErr w:type="gramStart"/>
+      <w:r>
+        <w:rPr>
+          <w:sz w:val="24"/>
+          <w:szCs w:val="22"/>
+          <w:lang w:val="en-US"/>
+        </w:rPr>
+        <w:t>easy</w:t>
+      </w:r>
+      <w:proofErr w:type="gramEnd"/>
+      <w:r>
+        <w:rPr>
+          <w:sz w:val="24"/>
+          <w:szCs w:val="22"/>
+          <w:lang w:val="en-US"/>
+        </w:rPr>
+        <w:t>.</w:t>
       </w:r>
     </w:p>
     <w:p>
@@ -9662,6 +10173,7 @@
         </w:rPr>
         <w:t xml:space="preserve"> This is the method that will get executed </w:t>
       </w:r>
+      <w:proofErr w:type="gramStart"/>
       <w:r>
         <w:rPr>
           <w:b/>
@@ -9670,22 +10182,9 @@
           <w:szCs w:val="22"/>
           <w:lang w:val="en-US"/>
         </w:rPr>
-        <w:t>Only once After executing last test case.</w:t>
-      </w:r>
-    </w:p>
-    <w:p>
-      <w:pPr>
-        <w:pStyle w:val="ListParagraph"/>
-        <w:numPr>
-          <w:ilvl w:val="0"/>
-          <w:numId w:val="33"/>
-        </w:numPr>
-        <w:rPr>
-          <w:sz w:val="24"/>
-          <w:szCs w:val="22"/>
-          <w:lang w:val="en-US"/>
-        </w:rPr>
-      </w:pPr>
+        <w:t>Only</w:t>
+      </w:r>
+      <w:proofErr w:type="gramEnd"/>
       <w:r>
         <w:rPr>
           <w:b/>
@@ -9694,24 +10193,22 @@
           <w:szCs w:val="22"/>
           <w:lang w:val="en-US"/>
         </w:rPr>
-        <w:t xml:space="preserve">@BeforeMethod </w:t>
-      </w:r>
-      <w:r>
-        <w:rPr>
-          <w:sz w:val="24"/>
-          <w:szCs w:val="22"/>
-          <w:lang w:val="en-US"/>
-        </w:rPr>
-        <w:sym w:font="Wingdings" w:char="F0E0"/>
-      </w:r>
-      <w:r>
-        <w:rPr>
-          <w:sz w:val="24"/>
-          <w:szCs w:val="22"/>
-          <w:lang w:val="en-US"/>
-        </w:rPr>
-        <w:t xml:space="preserve"> This is the method that will get executed </w:t>
-      </w:r>
+        <w:t xml:space="preserve"> once After executing last test case.</w:t>
+      </w:r>
+    </w:p>
+    <w:p>
+      <w:pPr>
+        <w:pStyle w:val="ListParagraph"/>
+        <w:numPr>
+          <w:ilvl w:val="0"/>
+          <w:numId w:val="33"/>
+        </w:numPr>
+        <w:rPr>
+          <w:sz w:val="24"/>
+          <w:szCs w:val="22"/>
+          <w:lang w:val="en-US"/>
+        </w:rPr>
+      </w:pPr>
       <w:r>
         <w:rPr>
           <w:b/>
@@ -9720,22 +10217,24 @@
           <w:szCs w:val="22"/>
           <w:lang w:val="en-US"/>
         </w:rPr>
-        <w:t>Before every Test case</w:t>
-      </w:r>
-    </w:p>
-    <w:p>
-      <w:pPr>
-        <w:pStyle w:val="ListParagraph"/>
-        <w:numPr>
-          <w:ilvl w:val="0"/>
-          <w:numId w:val="33"/>
-        </w:numPr>
-        <w:rPr>
-          <w:sz w:val="24"/>
-          <w:szCs w:val="22"/>
-          <w:lang w:val="en-US"/>
-        </w:rPr>
-      </w:pPr>
+        <w:t xml:space="preserve">@BeforeMethod </w:t>
+      </w:r>
+      <w:r>
+        <w:rPr>
+          <w:sz w:val="24"/>
+          <w:szCs w:val="22"/>
+          <w:lang w:val="en-US"/>
+        </w:rPr>
+        <w:sym w:font="Wingdings" w:char="F0E0"/>
+      </w:r>
+      <w:r>
+        <w:rPr>
+          <w:sz w:val="24"/>
+          <w:szCs w:val="22"/>
+          <w:lang w:val="en-US"/>
+        </w:rPr>
+        <w:t xml:space="preserve"> This is the method that will get executed </w:t>
+      </w:r>
       <w:r>
         <w:rPr>
           <w:b/>
@@ -9744,8 +10243,22 @@
           <w:szCs w:val="22"/>
           <w:lang w:val="en-US"/>
         </w:rPr>
-        <w:t xml:space="preserve">@AfterMethod </w:t>
-      </w:r>
+        <w:t>Before every Test case</w:t>
+      </w:r>
+    </w:p>
+    <w:p>
+      <w:pPr>
+        <w:pStyle w:val="ListParagraph"/>
+        <w:numPr>
+          <w:ilvl w:val="0"/>
+          <w:numId w:val="33"/>
+        </w:numPr>
+        <w:rPr>
+          <w:sz w:val="24"/>
+          <w:szCs w:val="22"/>
+          <w:lang w:val="en-US"/>
+        </w:rPr>
+      </w:pPr>
       <w:r>
         <w:rPr>
           <w:b/>
@@ -9754,7 +10267,7 @@
           <w:szCs w:val="22"/>
           <w:lang w:val="en-US"/>
         </w:rPr>
-        <w:sym w:font="Wingdings" w:char="F0E0"/>
+        <w:t xml:space="preserve">@AfterMethod </w:t>
       </w:r>
       <w:r>
         <w:rPr>
@@ -9764,15 +10277,7 @@
           <w:szCs w:val="22"/>
           <w:lang w:val="en-US"/>
         </w:rPr>
-        <w:t xml:space="preserve"> </w:t>
-      </w:r>
-      <w:r>
-        <w:rPr>
-          <w:sz w:val="24"/>
-          <w:szCs w:val="22"/>
-          <w:lang w:val="en-US"/>
-        </w:rPr>
-        <w:t xml:space="preserve">This is the method that will get executed </w:t>
+        <w:sym w:font="Wingdings" w:char="F0E0"/>
       </w:r>
       <w:r>
         <w:rPr>
@@ -9782,22 +10287,16 @@
           <w:szCs w:val="22"/>
           <w:lang w:val="en-US"/>
         </w:rPr>
-        <w:t>After Every Test Case.</w:t>
-      </w:r>
-    </w:p>
-    <w:p>
-      <w:pPr>
-        <w:pStyle w:val="ListParagraph"/>
-        <w:numPr>
-          <w:ilvl w:val="0"/>
-          <w:numId w:val="33"/>
-        </w:numPr>
-        <w:rPr>
-          <w:sz w:val="24"/>
-          <w:szCs w:val="22"/>
-          <w:lang w:val="en-US"/>
-        </w:rPr>
-      </w:pPr>
+        <w:t xml:space="preserve"> </w:t>
+      </w:r>
+      <w:r>
+        <w:rPr>
+          <w:sz w:val="24"/>
+          <w:szCs w:val="22"/>
+          <w:lang w:val="en-US"/>
+        </w:rPr>
+        <w:t xml:space="preserve">This is the method that will get executed </w:t>
+      </w:r>
       <w:r>
         <w:rPr>
           <w:b/>
@@ -9806,36 +10305,23 @@
           <w:szCs w:val="22"/>
           <w:lang w:val="en-US"/>
         </w:rPr>
-        <w:t xml:space="preserve">@DataProvider </w:t>
-      </w:r>
-      <w:r>
-        <w:rPr>
-          <w:sz w:val="24"/>
-          <w:szCs w:val="22"/>
-          <w:lang w:val="en-US"/>
-        </w:rPr>
-        <w:sym w:font="Wingdings" w:char="F0E0"/>
-      </w:r>
-      <w:r>
-        <w:rPr>
-          <w:sz w:val="24"/>
-          <w:szCs w:val="22"/>
-          <w:lang w:val="en-US"/>
-        </w:rPr>
-        <w:t xml:space="preserve"> This is the method that sends the data to the test case, so that single test case will get executed for multiple times.</w:t>
-      </w:r>
-    </w:p>
-    <w:p>
-      <w:pPr>
-        <w:rPr>
-          <w:sz w:val="24"/>
-          <w:szCs w:val="22"/>
-          <w:lang w:val="en-US"/>
-        </w:rPr>
-      </w:pPr>
-    </w:p>
-    <w:p>
-      <w:pPr>
+        <w:t>After Every Test Case.</w:t>
+      </w:r>
+    </w:p>
+    <w:p>
+      <w:pPr>
+        <w:pStyle w:val="ListParagraph"/>
+        <w:numPr>
+          <w:ilvl w:val="0"/>
+          <w:numId w:val="33"/>
+        </w:numPr>
+        <w:rPr>
+          <w:sz w:val="24"/>
+          <w:szCs w:val="22"/>
+          <w:lang w:val="en-US"/>
+        </w:rPr>
+      </w:pPr>
+      <w:r>
         <w:rPr>
           <w:b/>
           <w:bCs/>
@@ -9843,8 +10329,36 @@
           <w:szCs w:val="22"/>
           <w:lang w:val="en-US"/>
         </w:rPr>
-      </w:pPr>
-      <w:r>
+        <w:t xml:space="preserve">@DataProvider </w:t>
+      </w:r>
+      <w:r>
+        <w:rPr>
+          <w:sz w:val="24"/>
+          <w:szCs w:val="22"/>
+          <w:lang w:val="en-US"/>
+        </w:rPr>
+        <w:sym w:font="Wingdings" w:char="F0E0"/>
+      </w:r>
+      <w:r>
+        <w:rPr>
+          <w:sz w:val="24"/>
+          <w:szCs w:val="22"/>
+          <w:lang w:val="en-US"/>
+        </w:rPr>
+        <w:t xml:space="preserve"> This is the method that sends the data to the test case, so that single test case will get executed for multiple times.</w:t>
+      </w:r>
+    </w:p>
+    <w:p>
+      <w:pPr>
+        <w:rPr>
+          <w:sz w:val="24"/>
+          <w:szCs w:val="22"/>
+          <w:lang w:val="en-US"/>
+        </w:rPr>
+      </w:pPr>
+    </w:p>
+    <w:p>
+      <w:pPr>
         <w:rPr>
           <w:b/>
           <w:bCs/>
@@ -9852,6 +10366,15 @@
           <w:szCs w:val="22"/>
           <w:lang w:val="en-US"/>
         </w:rPr>
+      </w:pPr>
+      <w:r>
+        <w:rPr>
+          <w:b/>
+          <w:bCs/>
+          <w:sz w:val="24"/>
+          <w:szCs w:val="22"/>
+          <w:lang w:val="en-US"/>
+        </w:rPr>
         <w:t>Points to be noted about configuration methods</w:t>
       </w:r>
     </w:p>
@@ -10426,8 +10949,84 @@
         </w:rPr>
         <w:t xml:space="preserve">All the tags and attributes are case sensitive. </w:t>
       </w:r>
+    </w:p>
+    <w:p>
+      <w:pPr>
+        <w:rPr>
+          <w:sz w:val="24"/>
+          <w:szCs w:val="22"/>
+          <w:lang w:val="en-US"/>
+        </w:rPr>
+      </w:pPr>
+      <w:r>
+        <w:rPr>
+          <w:noProof/>
+          <w:lang w:eastAsia="en-IN"/>
+        </w:rPr>
+        <w:lastRenderedPageBreak/>
+        <w:drawing>
+          <wp:inline distT="0" distB="0" distL="0" distR="0" wp14:anchorId="0B0400DB" wp14:editId="5A244133">
+            <wp:extent cx="6101691" cy="3381555"/>
+            <wp:effectExtent l="0" t="0" r="0" b="0"/>
+            <wp:docPr id="2" name="Picture 2"/>
+            <wp:cNvGraphicFramePr>
+              <a:graphicFrameLocks xmlns:a="http://schemas.openxmlformats.org/drawingml/2006/main" noChangeAspect="1"/>
+            </wp:cNvGraphicFramePr>
+            <a:graphic xmlns:a="http://schemas.openxmlformats.org/drawingml/2006/main">
+              <a:graphicData uri="http://schemas.openxmlformats.org/drawingml/2006/picture">
+                <pic:pic xmlns:pic="http://schemas.openxmlformats.org/drawingml/2006/picture">
+                  <pic:nvPicPr>
+                    <pic:cNvPr id="1" name=""/>
+                    <pic:cNvPicPr/>
+                  </pic:nvPicPr>
+                  <pic:blipFill rotWithShape="1">
+                    <a:blip r:embed="rId8"/>
+                    <a:srcRect l="22881" t="21683" r="8942" b="11119"/>
+                    <a:stretch/>
+                  </pic:blipFill>
+                  <pic:spPr bwMode="auto">
+                    <a:xfrm>
+                      <a:off x="0" y="0"/>
+                      <a:ext cx="6119430" cy="3391386"/>
+                    </a:xfrm>
+                    <a:prstGeom prst="rect">
+                      <a:avLst/>
+                    </a:prstGeom>
+                    <a:ln>
+                      <a:noFill/>
+                    </a:ln>
+                    <a:extLst>
+                      <a:ext uri="{53640926-AAD7-44D8-BBD7-CCE9431645EC}">
+                        <a14:shadowObscured xmlns:a14="http://schemas.microsoft.com/office/drawing/2010/main"/>
+                      </a:ext>
+                    </a:extLst>
+                  </pic:spPr>
+                </pic:pic>
+              </a:graphicData>
+            </a:graphic>
+          </wp:inline>
+        </w:drawing>
+      </w:r>
       <w:bookmarkStart w:id="0" w:name="_GoBack"/>
       <w:bookmarkEnd w:id="0"/>
+    </w:p>
+    <w:p>
+      <w:pPr>
+        <w:rPr>
+          <w:sz w:val="24"/>
+          <w:szCs w:val="22"/>
+          <w:lang w:val="en-US"/>
+        </w:rPr>
+      </w:pPr>
+    </w:p>
+    <w:p>
+      <w:pPr>
+        <w:rPr>
+          <w:sz w:val="24"/>
+          <w:szCs w:val="22"/>
+          <w:lang w:val="en-US"/>
+        </w:rPr>
+      </w:pPr>
     </w:p>
     <w:sectPr>
       <w:pgSz w:w="11906" w:h="16838"/>
@@ -14769,7 +15368,7 @@
 </file>
 
 <file path=customXml/itemProps1.xml><?xml version="1.0" encoding="utf-8"?>
-<ds:datastoreItem xmlns:ds="http://schemas.openxmlformats.org/officeDocument/2006/customXml" ds:itemID="{0D5FEA11-F788-471B-807F-0B39F230E5C1}">
+<ds:datastoreItem xmlns:ds="http://schemas.openxmlformats.org/officeDocument/2006/customXml" ds:itemID="{8A2D9AFF-3107-4C57-AC7A-46F1F7B66648}">
   <ds:schemaRefs>
     <ds:schemaRef ds:uri="http://schemas.openxmlformats.org/officeDocument/2006/bibliography"/>
   </ds:schemaRefs>

</xml_diff>

<commit_message>
Date: 19 Dec 2025
</commit_message>
<xml_diff>
--- a/Notes_Selenium_14.docx
+++ b/Notes_Selenium_14.docx
@@ -5054,6 +5054,44 @@
           <w:lang w:val="en-US"/>
         </w:rPr>
         <w:t>Common Exceptions in WebDriver</w:t>
+      </w:r>
+    </w:p>
+    <w:p>
+      <w:pPr>
+        <w:pStyle w:val="ListParagraph"/>
+        <w:numPr>
+          <w:ilvl w:val="0"/>
+          <w:numId w:val="15"/>
+        </w:numPr>
+        <w:rPr>
+          <w:sz w:val="24"/>
+          <w:szCs w:val="22"/>
+          <w:lang w:val="en-US"/>
+        </w:rPr>
+      </w:pPr>
+      <w:r>
+        <w:rPr>
+          <w:sz w:val="24"/>
+          <w:szCs w:val="22"/>
+          <w:lang w:val="en-US"/>
+        </w:rPr>
+        <w:t xml:space="preserve">SessionNotCreatedException </w:t>
+      </w:r>
+      <w:r>
+        <w:rPr>
+          <w:sz w:val="24"/>
+          <w:szCs w:val="22"/>
+          <w:lang w:val="en-US"/>
+        </w:rPr>
+        <w:sym w:font="Wingdings" w:char="F0E0"/>
+      </w:r>
+      <w:r>
+        <w:rPr>
+          <w:sz w:val="24"/>
+          <w:szCs w:val="22"/>
+          <w:lang w:val="en-US"/>
+        </w:rPr>
+        <w:t xml:space="preserve"> The selenium and browser versions are not compatible with each other.</w:t>
       </w:r>
     </w:p>
     <w:p>
@@ -11007,26 +11045,415 @@
           </wp:inline>
         </w:drawing>
       </w:r>
+    </w:p>
+    <w:p>
+      <w:pPr>
+        <w:rPr>
+          <w:sz w:val="24"/>
+          <w:szCs w:val="22"/>
+          <w:lang w:val="en-US"/>
+        </w:rPr>
+      </w:pPr>
+    </w:p>
+    <w:p>
+      <w:pPr>
+        <w:rPr>
+          <w:sz w:val="24"/>
+          <w:szCs w:val="22"/>
+          <w:lang w:val="en-US"/>
+        </w:rPr>
+      </w:pPr>
+      <w:r>
+        <w:rPr>
+          <w:sz w:val="24"/>
+          <w:szCs w:val="22"/>
+          <w:lang w:val="en-US"/>
+        </w:rPr>
+        <w:br w:type="page"/>
+      </w:r>
+    </w:p>
+    <w:p>
+      <w:pPr>
+        <w:ind w:left="720"/>
+        <w:rPr>
+          <w:b/>
+          <w:bCs/>
+          <w:sz w:val="24"/>
+          <w:szCs w:val="22"/>
+          <w:lang w:val="en-US"/>
+        </w:rPr>
+      </w:pPr>
+      <w:r>
+        <w:rPr>
+          <w:b/>
+          <w:bCs/>
+          <w:sz w:val="24"/>
+          <w:szCs w:val="22"/>
+          <w:lang w:val="en-US"/>
+        </w:rPr>
+        <w:lastRenderedPageBreak/>
+        <w:t>Maven</w:t>
+      </w:r>
+    </w:p>
+    <w:p>
+      <w:pPr>
+        <w:pStyle w:val="ListParagraph"/>
+        <w:numPr>
+          <w:ilvl w:val="0"/>
+          <w:numId w:val="37"/>
+        </w:numPr>
+        <w:rPr>
+          <w:sz w:val="24"/>
+          <w:szCs w:val="22"/>
+          <w:lang w:val="en-US"/>
+        </w:rPr>
+      </w:pPr>
+      <w:r>
+        <w:rPr>
+          <w:sz w:val="24"/>
+          <w:szCs w:val="22"/>
+          <w:lang w:val="en-US"/>
+        </w:rPr>
+        <w:t xml:space="preserve">Build management tool. </w:t>
+      </w:r>
+    </w:p>
+    <w:p>
+      <w:pPr>
+        <w:pStyle w:val="ListParagraph"/>
+        <w:numPr>
+          <w:ilvl w:val="0"/>
+          <w:numId w:val="37"/>
+        </w:numPr>
+        <w:rPr>
+          <w:sz w:val="24"/>
+          <w:szCs w:val="22"/>
+          <w:lang w:val="en-US"/>
+        </w:rPr>
+      </w:pPr>
+      <w:r>
+        <w:rPr>
+          <w:sz w:val="24"/>
+          <w:szCs w:val="22"/>
+          <w:lang w:val="en-US"/>
+        </w:rPr>
+        <w:t>Created by Apache</w:t>
+      </w:r>
+    </w:p>
+    <w:p>
+      <w:pPr>
+        <w:pStyle w:val="ListParagraph"/>
+        <w:numPr>
+          <w:ilvl w:val="0"/>
+          <w:numId w:val="37"/>
+        </w:numPr>
+        <w:rPr>
+          <w:sz w:val="24"/>
+          <w:szCs w:val="22"/>
+          <w:lang w:val="en-US"/>
+        </w:rPr>
+      </w:pPr>
+      <w:r>
+        <w:rPr>
+          <w:sz w:val="24"/>
+          <w:szCs w:val="22"/>
+          <w:lang w:val="en-US"/>
+        </w:rPr>
+        <w:t>Can be used by both developer and tester</w:t>
+      </w:r>
+    </w:p>
+    <w:p>
+      <w:pPr>
+        <w:pStyle w:val="ListParagraph"/>
+        <w:numPr>
+          <w:ilvl w:val="0"/>
+          <w:numId w:val="37"/>
+        </w:numPr>
+        <w:rPr>
+          <w:sz w:val="24"/>
+          <w:szCs w:val="22"/>
+          <w:lang w:val="en-US"/>
+        </w:rPr>
+      </w:pPr>
+      <w:r>
+        <w:rPr>
+          <w:sz w:val="24"/>
+          <w:szCs w:val="22"/>
+          <w:lang w:val="en-US"/>
+        </w:rPr>
+        <w:t>A single project can be shared by both developer and tester</w:t>
+      </w:r>
+    </w:p>
+    <w:p>
+      <w:pPr>
+        <w:pStyle w:val="ListParagraph"/>
+        <w:numPr>
+          <w:ilvl w:val="0"/>
+          <w:numId w:val="37"/>
+        </w:numPr>
+        <w:rPr>
+          <w:sz w:val="24"/>
+          <w:szCs w:val="22"/>
+          <w:lang w:val="en-US"/>
+        </w:rPr>
+      </w:pPr>
+      <w:r>
+        <w:rPr>
+          <w:sz w:val="24"/>
+          <w:szCs w:val="22"/>
+          <w:lang w:val="en-US"/>
+        </w:rPr>
+        <w:t>Easy configuration via pom.xml (Project Object Model)</w:t>
+      </w:r>
+    </w:p>
+    <w:p>
+      <w:pPr>
+        <w:pStyle w:val="ListParagraph"/>
+        <w:numPr>
+          <w:ilvl w:val="0"/>
+          <w:numId w:val="37"/>
+        </w:numPr>
+        <w:rPr>
+          <w:sz w:val="24"/>
+          <w:szCs w:val="22"/>
+          <w:lang w:val="en-US"/>
+        </w:rPr>
+      </w:pPr>
+      <w:r>
+        <w:rPr>
+          <w:sz w:val="24"/>
+          <w:szCs w:val="22"/>
+          <w:lang w:val="en-US"/>
+        </w:rPr>
+        <w:t>Uses dependency</w:t>
+      </w:r>
+    </w:p>
+    <w:p>
+      <w:pPr>
+        <w:rPr>
+          <w:sz w:val="24"/>
+          <w:szCs w:val="22"/>
+          <w:lang w:val="en-US"/>
+        </w:rPr>
+      </w:pPr>
+    </w:p>
+    <w:p>
+      <w:pPr>
+        <w:rPr>
+          <w:sz w:val="24"/>
+          <w:szCs w:val="22"/>
+          <w:lang w:val="en-US"/>
+        </w:rPr>
+      </w:pPr>
+    </w:p>
+    <w:p>
+      <w:pPr>
+        <w:rPr>
+          <w:b/>
+          <w:bCs/>
+          <w:sz w:val="24"/>
+          <w:szCs w:val="22"/>
+          <w:lang w:val="en-US"/>
+        </w:rPr>
+      </w:pPr>
+      <w:r>
+        <w:rPr>
+          <w:b/>
+          <w:bCs/>
+          <w:sz w:val="24"/>
+          <w:szCs w:val="22"/>
+          <w:lang w:val="en-US"/>
+        </w:rPr>
+        <w:t>Creating a Maven Project</w:t>
+      </w:r>
+      <w:r>
+        <w:rPr>
+          <w:b/>
+          <w:bCs/>
+          <w:sz w:val="24"/>
+          <w:szCs w:val="22"/>
+          <w:lang w:val="en-US"/>
+        </w:rPr>
+        <w:t xml:space="preserve"> (Without </w:t>
+      </w:r>
+      <w:proofErr w:type="spellStart"/>
+      <w:r>
+        <w:rPr>
+          <w:b/>
+          <w:bCs/>
+          <w:sz w:val="24"/>
+          <w:szCs w:val="22"/>
+          <w:lang w:val="en-US"/>
+        </w:rPr>
+        <w:t>ArcheType</w:t>
+      </w:r>
+      <w:proofErr w:type="spellEnd"/>
+      <w:r>
+        <w:rPr>
+          <w:b/>
+          <w:bCs/>
+          <w:sz w:val="24"/>
+          <w:szCs w:val="22"/>
+          <w:lang w:val="en-US"/>
+        </w:rPr>
+        <w:t>)</w:t>
+      </w:r>
+    </w:p>
+    <w:p>
+      <w:pPr>
+        <w:pStyle w:val="ListParagraph"/>
+        <w:numPr>
+          <w:ilvl w:val="0"/>
+          <w:numId w:val="38"/>
+        </w:numPr>
+        <w:rPr>
+          <w:sz w:val="24"/>
+          <w:szCs w:val="22"/>
+          <w:lang w:val="en-US"/>
+        </w:rPr>
+      </w:pPr>
+      <w:r>
+        <w:rPr>
+          <w:sz w:val="24"/>
+          <w:szCs w:val="22"/>
+          <w:lang w:val="en-US"/>
+        </w:rPr>
+        <w:t xml:space="preserve">File </w:t>
+      </w:r>
+      <w:r>
+        <w:rPr>
+          <w:sz w:val="24"/>
+          <w:szCs w:val="22"/>
+          <w:lang w:val="en-US"/>
+        </w:rPr>
+        <w:sym w:font="Wingdings" w:char="F0E0"/>
+      </w:r>
+      <w:r>
+        <w:rPr>
+          <w:sz w:val="24"/>
+          <w:szCs w:val="22"/>
+          <w:lang w:val="en-US"/>
+        </w:rPr>
+        <w:t xml:space="preserve"> New </w:t>
+      </w:r>
+      <w:r>
+        <w:rPr>
+          <w:sz w:val="24"/>
+          <w:szCs w:val="22"/>
+          <w:lang w:val="en-US"/>
+        </w:rPr>
+        <w:sym w:font="Wingdings" w:char="F0E0"/>
+      </w:r>
+      <w:r>
+        <w:rPr>
+          <w:sz w:val="24"/>
+          <w:szCs w:val="22"/>
+          <w:lang w:val="en-US"/>
+        </w:rPr>
+        <w:t xml:space="preserve"> Maven Project</w:t>
+      </w:r>
+    </w:p>
+    <w:p>
+      <w:pPr>
+        <w:pStyle w:val="ListParagraph"/>
+        <w:numPr>
+          <w:ilvl w:val="0"/>
+          <w:numId w:val="38"/>
+        </w:numPr>
+        <w:rPr>
+          <w:sz w:val="24"/>
+          <w:szCs w:val="22"/>
+          <w:lang w:val="en-US"/>
+        </w:rPr>
+      </w:pPr>
+      <w:r>
+        <w:rPr>
+          <w:sz w:val="24"/>
+          <w:szCs w:val="22"/>
+          <w:lang w:val="en-US"/>
+        </w:rPr>
+        <w:t>Select 1</w:t>
+      </w:r>
+      <w:r>
+        <w:rPr>
+          <w:sz w:val="24"/>
+          <w:szCs w:val="22"/>
+          <w:vertAlign w:val="superscript"/>
+          <w:lang w:val="en-US"/>
+        </w:rPr>
+        <w:t>st</w:t>
+      </w:r>
+      <w:r>
+        <w:rPr>
+          <w:sz w:val="24"/>
+          <w:szCs w:val="22"/>
+          <w:lang w:val="en-US"/>
+        </w:rPr>
+        <w:t xml:space="preserve"> checkbox</w:t>
+      </w:r>
+    </w:p>
+    <w:p>
+      <w:pPr>
+        <w:pStyle w:val="ListParagraph"/>
+        <w:numPr>
+          <w:ilvl w:val="0"/>
+          <w:numId w:val="38"/>
+        </w:numPr>
+        <w:rPr>
+          <w:sz w:val="24"/>
+          <w:szCs w:val="22"/>
+          <w:lang w:val="en-US"/>
+        </w:rPr>
+      </w:pPr>
+      <w:r>
+        <w:rPr>
+          <w:sz w:val="24"/>
+          <w:szCs w:val="22"/>
+          <w:lang w:val="en-US"/>
+        </w:rPr>
+        <w:t>Enter Group Id &amp; Artifact Id</w:t>
+      </w:r>
+    </w:p>
+    <w:p>
+      <w:pPr>
+        <w:pStyle w:val="ListParagraph"/>
+        <w:numPr>
+          <w:ilvl w:val="0"/>
+          <w:numId w:val="38"/>
+        </w:numPr>
+        <w:rPr>
+          <w:sz w:val="24"/>
+          <w:szCs w:val="22"/>
+          <w:lang w:val="en-US"/>
+        </w:rPr>
+      </w:pPr>
+      <w:r>
+        <w:rPr>
+          <w:sz w:val="24"/>
+          <w:szCs w:val="22"/>
+          <w:lang w:val="en-US"/>
+        </w:rPr>
+        <w:t>Click on Finish</w:t>
+      </w:r>
+    </w:p>
+    <w:p>
+      <w:pPr>
+        <w:rPr>
+          <w:sz w:val="24"/>
+          <w:szCs w:val="22"/>
+          <w:lang w:val="en-US"/>
+        </w:rPr>
+      </w:pPr>
+    </w:p>
+    <w:p>
+      <w:pPr>
+        <w:rPr>
+          <w:sz w:val="24"/>
+          <w:szCs w:val="22"/>
+          <w:lang w:val="en-US"/>
+        </w:rPr>
+      </w:pPr>
       <w:bookmarkStart w:id="0" w:name="_GoBack"/>
       <w:bookmarkEnd w:id="0"/>
-    </w:p>
-    <w:p>
-      <w:pPr>
-        <w:rPr>
-          <w:sz w:val="24"/>
-          <w:szCs w:val="22"/>
-          <w:lang w:val="en-US"/>
-        </w:rPr>
-      </w:pPr>
-    </w:p>
-    <w:p>
-      <w:pPr>
-        <w:rPr>
-          <w:sz w:val="24"/>
-          <w:szCs w:val="22"/>
-          <w:lang w:val="en-US"/>
-        </w:rPr>
-      </w:pPr>
     </w:p>
     <w:sectPr>
       <w:pgSz w:w="11906" w:h="16838"/>
@@ -11397,6 +11824,119 @@
     </w:lvl>
   </w:abstractNum>
   <w:abstractNum w:abstractNumId="4">
+    <w:nsid w:val="0EF5769E"/>
+    <w:multiLevelType w:val="hybridMultilevel"/>
+    <w:tmpl w:val="974EFF12"/>
+    <w:lvl w:ilvl="0" w:tplc="40090001">
+      <w:start w:val="1"/>
+      <w:numFmt w:val="bullet"/>
+      <w:lvlText w:val=""/>
+      <w:lvlJc w:val="left"/>
+      <w:pPr>
+        <w:ind w:left="1440" w:hanging="360"/>
+      </w:pPr>
+      <w:rPr>
+        <w:rFonts w:ascii="Symbol" w:hAnsi="Symbol" w:hint="default"/>
+      </w:rPr>
+    </w:lvl>
+    <w:lvl w:ilvl="1" w:tplc="40090003" w:tentative="1">
+      <w:start w:val="1"/>
+      <w:numFmt w:val="bullet"/>
+      <w:lvlText w:val="o"/>
+      <w:lvlJc w:val="left"/>
+      <w:pPr>
+        <w:ind w:left="2160" w:hanging="360"/>
+      </w:pPr>
+      <w:rPr>
+        <w:rFonts w:ascii="Courier New" w:hAnsi="Courier New" w:cs="Courier New" w:hint="default"/>
+      </w:rPr>
+    </w:lvl>
+    <w:lvl w:ilvl="2" w:tplc="40090005" w:tentative="1">
+      <w:start w:val="1"/>
+      <w:numFmt w:val="bullet"/>
+      <w:lvlText w:val=""/>
+      <w:lvlJc w:val="left"/>
+      <w:pPr>
+        <w:ind w:left="2880" w:hanging="360"/>
+      </w:pPr>
+      <w:rPr>
+        <w:rFonts w:ascii="Wingdings" w:hAnsi="Wingdings" w:hint="default"/>
+      </w:rPr>
+    </w:lvl>
+    <w:lvl w:ilvl="3" w:tplc="40090001" w:tentative="1">
+      <w:start w:val="1"/>
+      <w:numFmt w:val="bullet"/>
+      <w:lvlText w:val=""/>
+      <w:lvlJc w:val="left"/>
+      <w:pPr>
+        <w:ind w:left="3600" w:hanging="360"/>
+      </w:pPr>
+      <w:rPr>
+        <w:rFonts w:ascii="Symbol" w:hAnsi="Symbol" w:hint="default"/>
+      </w:rPr>
+    </w:lvl>
+    <w:lvl w:ilvl="4" w:tplc="40090003" w:tentative="1">
+      <w:start w:val="1"/>
+      <w:numFmt w:val="bullet"/>
+      <w:lvlText w:val="o"/>
+      <w:lvlJc w:val="left"/>
+      <w:pPr>
+        <w:ind w:left="4320" w:hanging="360"/>
+      </w:pPr>
+      <w:rPr>
+        <w:rFonts w:ascii="Courier New" w:hAnsi="Courier New" w:cs="Courier New" w:hint="default"/>
+      </w:rPr>
+    </w:lvl>
+    <w:lvl w:ilvl="5" w:tplc="40090005" w:tentative="1">
+      <w:start w:val="1"/>
+      <w:numFmt w:val="bullet"/>
+      <w:lvlText w:val=""/>
+      <w:lvlJc w:val="left"/>
+      <w:pPr>
+        <w:ind w:left="5040" w:hanging="360"/>
+      </w:pPr>
+      <w:rPr>
+        <w:rFonts w:ascii="Wingdings" w:hAnsi="Wingdings" w:hint="default"/>
+      </w:rPr>
+    </w:lvl>
+    <w:lvl w:ilvl="6" w:tplc="40090001" w:tentative="1">
+      <w:start w:val="1"/>
+      <w:numFmt w:val="bullet"/>
+      <w:lvlText w:val=""/>
+      <w:lvlJc w:val="left"/>
+      <w:pPr>
+        <w:ind w:left="5760" w:hanging="360"/>
+      </w:pPr>
+      <w:rPr>
+        <w:rFonts w:ascii="Symbol" w:hAnsi="Symbol" w:hint="default"/>
+      </w:rPr>
+    </w:lvl>
+    <w:lvl w:ilvl="7" w:tplc="40090003" w:tentative="1">
+      <w:start w:val="1"/>
+      <w:numFmt w:val="bullet"/>
+      <w:lvlText w:val="o"/>
+      <w:lvlJc w:val="left"/>
+      <w:pPr>
+        <w:ind w:left="6480" w:hanging="360"/>
+      </w:pPr>
+      <w:rPr>
+        <w:rFonts w:ascii="Courier New" w:hAnsi="Courier New" w:cs="Courier New" w:hint="default"/>
+      </w:rPr>
+    </w:lvl>
+    <w:lvl w:ilvl="8" w:tplc="40090005" w:tentative="1">
+      <w:start w:val="1"/>
+      <w:numFmt w:val="bullet"/>
+      <w:lvlText w:val=""/>
+      <w:lvlJc w:val="left"/>
+      <w:pPr>
+        <w:ind w:left="7200" w:hanging="360"/>
+      </w:pPr>
+      <w:rPr>
+        <w:rFonts w:ascii="Wingdings" w:hAnsi="Wingdings" w:hint="default"/>
+      </w:rPr>
+    </w:lvl>
+  </w:abstractNum>
+  <w:abstractNum w:abstractNumId="5">
     <w:nsid w:val="1453593C"/>
     <w:multiLevelType w:val="hybridMultilevel"/>
     <w:tmpl w:val="EC725C48"/>
@@ -11485,7 +12025,96 @@
       </w:pPr>
     </w:lvl>
   </w:abstractNum>
-  <w:abstractNum w:abstractNumId="5">
+  <w:abstractNum w:abstractNumId="6">
+    <w:nsid w:val="148A2AB8"/>
+    <w:multiLevelType w:val="hybridMultilevel"/>
+    <w:tmpl w:val="9C18DFE6"/>
+    <w:lvl w:ilvl="0" w:tplc="4009000F">
+      <w:start w:val="1"/>
+      <w:numFmt w:val="decimal"/>
+      <w:lvlText w:val="%1."/>
+      <w:lvlJc w:val="left"/>
+      <w:pPr>
+        <w:ind w:left="720" w:hanging="360"/>
+      </w:pPr>
+      <w:rPr>
+        <w:rFonts w:hint="default"/>
+      </w:rPr>
+    </w:lvl>
+    <w:lvl w:ilvl="1" w:tplc="40090019" w:tentative="1">
+      <w:start w:val="1"/>
+      <w:numFmt w:val="lowerLetter"/>
+      <w:lvlText w:val="%2."/>
+      <w:lvlJc w:val="left"/>
+      <w:pPr>
+        <w:ind w:left="1440" w:hanging="360"/>
+      </w:pPr>
+    </w:lvl>
+    <w:lvl w:ilvl="2" w:tplc="4009001B" w:tentative="1">
+      <w:start w:val="1"/>
+      <w:numFmt w:val="lowerRoman"/>
+      <w:lvlText w:val="%3."/>
+      <w:lvlJc w:val="right"/>
+      <w:pPr>
+        <w:ind w:left="2160" w:hanging="180"/>
+      </w:pPr>
+    </w:lvl>
+    <w:lvl w:ilvl="3" w:tplc="4009000F" w:tentative="1">
+      <w:start w:val="1"/>
+      <w:numFmt w:val="decimal"/>
+      <w:lvlText w:val="%4."/>
+      <w:lvlJc w:val="left"/>
+      <w:pPr>
+        <w:ind w:left="2880" w:hanging="360"/>
+      </w:pPr>
+    </w:lvl>
+    <w:lvl w:ilvl="4" w:tplc="40090019" w:tentative="1">
+      <w:start w:val="1"/>
+      <w:numFmt w:val="lowerLetter"/>
+      <w:lvlText w:val="%5."/>
+      <w:lvlJc w:val="left"/>
+      <w:pPr>
+        <w:ind w:left="3600" w:hanging="360"/>
+      </w:pPr>
+    </w:lvl>
+    <w:lvl w:ilvl="5" w:tplc="4009001B" w:tentative="1">
+      <w:start w:val="1"/>
+      <w:numFmt w:val="lowerRoman"/>
+      <w:lvlText w:val="%6."/>
+      <w:lvlJc w:val="right"/>
+      <w:pPr>
+        <w:ind w:left="4320" w:hanging="180"/>
+      </w:pPr>
+    </w:lvl>
+    <w:lvl w:ilvl="6" w:tplc="4009000F" w:tentative="1">
+      <w:start w:val="1"/>
+      <w:numFmt w:val="decimal"/>
+      <w:lvlText w:val="%7."/>
+      <w:lvlJc w:val="left"/>
+      <w:pPr>
+        <w:ind w:left="5040" w:hanging="360"/>
+      </w:pPr>
+    </w:lvl>
+    <w:lvl w:ilvl="7" w:tplc="40090019" w:tentative="1">
+      <w:start w:val="1"/>
+      <w:numFmt w:val="lowerLetter"/>
+      <w:lvlText w:val="%8."/>
+      <w:lvlJc w:val="left"/>
+      <w:pPr>
+        <w:ind w:left="5760" w:hanging="360"/>
+      </w:pPr>
+    </w:lvl>
+    <w:lvl w:ilvl="8" w:tplc="4009001B" w:tentative="1">
+      <w:start w:val="1"/>
+      <w:numFmt w:val="lowerRoman"/>
+      <w:lvlText w:val="%9."/>
+      <w:lvlJc w:val="right"/>
+      <w:pPr>
+        <w:ind w:left="6480" w:hanging="180"/>
+      </w:pPr>
+    </w:lvl>
+  </w:abstractNum>
+  <w:abstractNum w:abstractNumId="7">
     <w:nsid w:val="1B900A26"/>
     <w:multiLevelType w:val="hybridMultilevel"/>
     <w:tmpl w:val="18980896"/>
@@ -11598,7 +12227,7 @@
       </w:rPr>
     </w:lvl>
   </w:abstractNum>
-  <w:abstractNum w:abstractNumId="6">
+  <w:abstractNum w:abstractNumId="8">
     <w:nsid w:val="1D003CBD"/>
     <w:multiLevelType w:val="hybridMultilevel"/>
     <w:tmpl w:val="99D4C676"/>
@@ -11711,7 +12340,7 @@
       </w:rPr>
     </w:lvl>
   </w:abstractNum>
-  <w:abstractNum w:abstractNumId="7">
+  <w:abstractNum w:abstractNumId="9">
     <w:nsid w:val="1EFE2129"/>
     <w:multiLevelType w:val="hybridMultilevel"/>
     <w:tmpl w:val="CD76CB1E"/>
@@ -11824,7 +12453,7 @@
       </w:rPr>
     </w:lvl>
   </w:abstractNum>
-  <w:abstractNum w:abstractNumId="8">
+  <w:abstractNum w:abstractNumId="10">
     <w:nsid w:val="201E61D6"/>
     <w:multiLevelType w:val="hybridMultilevel"/>
     <w:tmpl w:val="28B4F59E"/>
@@ -11937,7 +12566,7 @@
       </w:rPr>
     </w:lvl>
   </w:abstractNum>
-  <w:abstractNum w:abstractNumId="9">
+  <w:abstractNum w:abstractNumId="11">
     <w:nsid w:val="208412D1"/>
     <w:multiLevelType w:val="hybridMultilevel"/>
     <w:tmpl w:val="95DE081C"/>
@@ -12026,7 +12655,7 @@
       </w:pPr>
     </w:lvl>
   </w:abstractNum>
-  <w:abstractNum w:abstractNumId="10">
+  <w:abstractNum w:abstractNumId="12">
     <w:nsid w:val="21197407"/>
     <w:multiLevelType w:val="hybridMultilevel"/>
     <w:tmpl w:val="6D30545C"/>
@@ -12115,7 +12744,7 @@
       </w:pPr>
     </w:lvl>
   </w:abstractNum>
-  <w:abstractNum w:abstractNumId="11">
+  <w:abstractNum w:abstractNumId="13">
     <w:nsid w:val="21E921C4"/>
     <w:multiLevelType w:val="hybridMultilevel"/>
     <w:tmpl w:val="824AB5DC"/>
@@ -12204,7 +12833,7 @@
       </w:pPr>
     </w:lvl>
   </w:abstractNum>
-  <w:abstractNum w:abstractNumId="12">
+  <w:abstractNum w:abstractNumId="14">
     <w:nsid w:val="231E6D1F"/>
     <w:multiLevelType w:val="hybridMultilevel"/>
     <w:tmpl w:val="DAC42EF8"/>
@@ -12293,7 +12922,7 @@
       </w:pPr>
     </w:lvl>
   </w:abstractNum>
-  <w:abstractNum w:abstractNumId="13">
+  <w:abstractNum w:abstractNumId="15">
     <w:nsid w:val="24CA0387"/>
     <w:multiLevelType w:val="hybridMultilevel"/>
     <w:tmpl w:val="E81AAACE"/>
@@ -12406,7 +13035,7 @@
       </w:rPr>
     </w:lvl>
   </w:abstractNum>
-  <w:abstractNum w:abstractNumId="14">
+  <w:abstractNum w:abstractNumId="16">
     <w:nsid w:val="32FE0416"/>
     <w:multiLevelType w:val="hybridMultilevel"/>
     <w:tmpl w:val="16BC674C"/>
@@ -12495,7 +13124,7 @@
       </w:pPr>
     </w:lvl>
   </w:abstractNum>
-  <w:abstractNum w:abstractNumId="15">
+  <w:abstractNum w:abstractNumId="17">
     <w:nsid w:val="37062EB4"/>
     <w:multiLevelType w:val="hybridMultilevel"/>
     <w:tmpl w:val="8528B142"/>
@@ -12584,7 +13213,7 @@
       </w:pPr>
     </w:lvl>
   </w:abstractNum>
-  <w:abstractNum w:abstractNumId="16">
+  <w:abstractNum w:abstractNumId="18">
     <w:nsid w:val="3A7611DD"/>
     <w:multiLevelType w:val="hybridMultilevel"/>
     <w:tmpl w:val="69D469B0"/>
@@ -12673,7 +13302,7 @@
       </w:pPr>
     </w:lvl>
   </w:abstractNum>
-  <w:abstractNum w:abstractNumId="17">
+  <w:abstractNum w:abstractNumId="19">
     <w:nsid w:val="3B892462"/>
     <w:multiLevelType w:val="hybridMultilevel"/>
     <w:tmpl w:val="CB1C6C4E"/>
@@ -12762,7 +13391,7 @@
       </w:pPr>
     </w:lvl>
   </w:abstractNum>
-  <w:abstractNum w:abstractNumId="18">
+  <w:abstractNum w:abstractNumId="20">
     <w:nsid w:val="40361D0B"/>
     <w:multiLevelType w:val="hybridMultilevel"/>
     <w:tmpl w:val="4A54C56E"/>
@@ -12851,7 +13480,7 @@
       </w:pPr>
     </w:lvl>
   </w:abstractNum>
-  <w:abstractNum w:abstractNumId="19">
+  <w:abstractNum w:abstractNumId="21">
     <w:nsid w:val="40C03745"/>
     <w:multiLevelType w:val="hybridMultilevel"/>
     <w:tmpl w:val="401AA9E2"/>
@@ -12964,7 +13593,7 @@
       </w:rPr>
     </w:lvl>
   </w:abstractNum>
-  <w:abstractNum w:abstractNumId="20">
+  <w:abstractNum w:abstractNumId="22">
     <w:nsid w:val="4B45536D"/>
     <w:multiLevelType w:val="hybridMultilevel"/>
     <w:tmpl w:val="0B3449C8"/>
@@ -13053,7 +13682,7 @@
       </w:pPr>
     </w:lvl>
   </w:abstractNum>
-  <w:abstractNum w:abstractNumId="21">
+  <w:abstractNum w:abstractNumId="23">
     <w:nsid w:val="4D236C02"/>
     <w:multiLevelType w:val="hybridMultilevel"/>
     <w:tmpl w:val="CBFADF28"/>
@@ -13166,7 +13795,7 @@
       </w:rPr>
     </w:lvl>
   </w:abstractNum>
-  <w:abstractNum w:abstractNumId="22">
+  <w:abstractNum w:abstractNumId="24">
     <w:nsid w:val="4FC02C6C"/>
     <w:multiLevelType w:val="hybridMultilevel"/>
     <w:tmpl w:val="05D2B08E"/>
@@ -13255,7 +13884,7 @@
       </w:pPr>
     </w:lvl>
   </w:abstractNum>
-  <w:abstractNum w:abstractNumId="23">
+  <w:abstractNum w:abstractNumId="25">
     <w:nsid w:val="52B52268"/>
     <w:multiLevelType w:val="hybridMultilevel"/>
     <w:tmpl w:val="331AF78C"/>
@@ -13368,7 +13997,7 @@
       </w:rPr>
     </w:lvl>
   </w:abstractNum>
-  <w:abstractNum w:abstractNumId="24">
+  <w:abstractNum w:abstractNumId="26">
     <w:nsid w:val="55D92B24"/>
     <w:multiLevelType w:val="hybridMultilevel"/>
     <w:tmpl w:val="9BCED27C"/>
@@ -13481,7 +14110,7 @@
       </w:rPr>
     </w:lvl>
   </w:abstractNum>
-  <w:abstractNum w:abstractNumId="25">
+  <w:abstractNum w:abstractNumId="27">
     <w:nsid w:val="57564656"/>
     <w:multiLevelType w:val="hybridMultilevel"/>
     <w:tmpl w:val="3E1C27F6"/>
@@ -13594,7 +14223,7 @@
       </w:rPr>
     </w:lvl>
   </w:abstractNum>
-  <w:abstractNum w:abstractNumId="26">
+  <w:abstractNum w:abstractNumId="28">
     <w:nsid w:val="61A962B8"/>
     <w:multiLevelType w:val="hybridMultilevel"/>
     <w:tmpl w:val="5EDC7138"/>
@@ -13683,7 +14312,7 @@
       </w:pPr>
     </w:lvl>
   </w:abstractNum>
-  <w:abstractNum w:abstractNumId="27">
+  <w:abstractNum w:abstractNumId="29">
     <w:nsid w:val="69867F0D"/>
     <w:multiLevelType w:val="hybridMultilevel"/>
     <w:tmpl w:val="EAF8E468"/>
@@ -13772,7 +14401,7 @@
       </w:pPr>
     </w:lvl>
   </w:abstractNum>
-  <w:abstractNum w:abstractNumId="28">
+  <w:abstractNum w:abstractNumId="30">
     <w:nsid w:val="6E5A4342"/>
     <w:multiLevelType w:val="hybridMultilevel"/>
     <w:tmpl w:val="414440E6"/>
@@ -13861,7 +14490,7 @@
       </w:pPr>
     </w:lvl>
   </w:abstractNum>
-  <w:abstractNum w:abstractNumId="29">
+  <w:abstractNum w:abstractNumId="31">
     <w:nsid w:val="6F0A1BD2"/>
     <w:multiLevelType w:val="hybridMultilevel"/>
     <w:tmpl w:val="EF7884CC"/>
@@ -13974,7 +14603,7 @@
       </w:rPr>
     </w:lvl>
   </w:abstractNum>
-  <w:abstractNum w:abstractNumId="30">
+  <w:abstractNum w:abstractNumId="32">
     <w:nsid w:val="6FC368C3"/>
     <w:multiLevelType w:val="hybridMultilevel"/>
     <w:tmpl w:val="F892BAB0"/>
@@ -14063,7 +14692,7 @@
       </w:pPr>
     </w:lvl>
   </w:abstractNum>
-  <w:abstractNum w:abstractNumId="31">
+  <w:abstractNum w:abstractNumId="33">
     <w:nsid w:val="729D49A6"/>
     <w:multiLevelType w:val="hybridMultilevel"/>
     <w:tmpl w:val="212E6380"/>
@@ -14152,7 +14781,7 @@
       </w:pPr>
     </w:lvl>
   </w:abstractNum>
-  <w:abstractNum w:abstractNumId="32">
+  <w:abstractNum w:abstractNumId="34">
     <w:nsid w:val="72E5107C"/>
     <w:multiLevelType w:val="hybridMultilevel"/>
     <w:tmpl w:val="30BE3018"/>
@@ -14241,7 +14870,7 @@
       </w:pPr>
     </w:lvl>
   </w:abstractNum>
-  <w:abstractNum w:abstractNumId="33">
+  <w:abstractNum w:abstractNumId="35">
     <w:nsid w:val="7C1B7A62"/>
     <w:multiLevelType w:val="hybridMultilevel"/>
     <w:tmpl w:val="A1EEB68C"/>
@@ -14354,7 +14983,7 @@
       </w:rPr>
     </w:lvl>
   </w:abstractNum>
-  <w:abstractNum w:abstractNumId="34">
+  <w:abstractNum w:abstractNumId="36">
     <w:nsid w:val="7E0C5E33"/>
     <w:multiLevelType w:val="hybridMultilevel"/>
     <w:tmpl w:val="17A20342"/>
@@ -14443,7 +15072,7 @@
       </w:pPr>
     </w:lvl>
   </w:abstractNum>
-  <w:abstractNum w:abstractNumId="35">
+  <w:abstractNum w:abstractNumId="37">
     <w:nsid w:val="7EEF6783"/>
     <w:multiLevelType w:val="hybridMultilevel"/>
     <w:tmpl w:val="2292AFAC"/>
@@ -14533,112 +15162,118 @@
     </w:lvl>
   </w:abstractNum>
   <w:num w:numId="1">
+    <w:abstractNumId w:val="10"/>
+  </w:num>
+  <w:num w:numId="2">
     <w:abstractNumId w:val="8"/>
   </w:num>
-  <w:num w:numId="2">
-    <w:abstractNumId w:val="6"/>
-  </w:num>
   <w:num w:numId="3">
-    <w:abstractNumId w:val="33"/>
+    <w:abstractNumId w:val="35"/>
   </w:num>
   <w:num w:numId="4">
-    <w:abstractNumId w:val="24"/>
+    <w:abstractNumId w:val="26"/>
   </w:num>
   <w:num w:numId="5">
-    <w:abstractNumId w:val="15"/>
+    <w:abstractNumId w:val="17"/>
   </w:num>
   <w:num w:numId="6">
+    <w:abstractNumId w:val="9"/>
+  </w:num>
+  <w:num w:numId="7">
+    <w:abstractNumId w:val="23"/>
+  </w:num>
+  <w:num w:numId="8">
+    <w:abstractNumId w:val="27"/>
+  </w:num>
+  <w:num w:numId="9">
+    <w:abstractNumId w:val="14"/>
+  </w:num>
+  <w:num w:numId="10">
+    <w:abstractNumId w:val="5"/>
+  </w:num>
+  <w:num w:numId="11">
     <w:abstractNumId w:val="7"/>
   </w:num>
-  <w:num w:numId="7">
-    <w:abstractNumId w:val="21"/>
-  </w:num>
-  <w:num w:numId="8">
-    <w:abstractNumId w:val="25"/>
-  </w:num>
-  <w:num w:numId="9">
+  <w:num w:numId="12">
     <w:abstractNumId w:val="12"/>
-  </w:num>
-  <w:num w:numId="10">
-    <w:abstractNumId w:val="4"/>
-  </w:num>
-  <w:num w:numId="11">
-    <w:abstractNumId w:val="5"/>
-  </w:num>
-  <w:num w:numId="12">
-    <w:abstractNumId w:val="10"/>
   </w:num>
   <w:num w:numId="13">
     <w:abstractNumId w:val="2"/>
   </w:num>
   <w:num w:numId="14">
-    <w:abstractNumId w:val="20"/>
+    <w:abstractNumId w:val="22"/>
   </w:num>
   <w:num w:numId="15">
-    <w:abstractNumId w:val="35"/>
+    <w:abstractNumId w:val="37"/>
   </w:num>
   <w:num w:numId="16">
-    <w:abstractNumId w:val="13"/>
+    <w:abstractNumId w:val="15"/>
   </w:num>
   <w:num w:numId="17">
-    <w:abstractNumId w:val="29"/>
+    <w:abstractNumId w:val="31"/>
   </w:num>
   <w:num w:numId="18">
     <w:abstractNumId w:val="1"/>
   </w:num>
   <w:num w:numId="19">
-    <w:abstractNumId w:val="34"/>
+    <w:abstractNumId w:val="36"/>
   </w:num>
   <w:num w:numId="20">
-    <w:abstractNumId w:val="26"/>
+    <w:abstractNumId w:val="28"/>
   </w:num>
   <w:num w:numId="21">
-    <w:abstractNumId w:val="23"/>
+    <w:abstractNumId w:val="25"/>
   </w:num>
   <w:num w:numId="22">
     <w:abstractNumId w:val="3"/>
   </w:num>
   <w:num w:numId="23">
-    <w:abstractNumId w:val="31"/>
+    <w:abstractNumId w:val="33"/>
   </w:num>
   <w:num w:numId="24">
-    <w:abstractNumId w:val="22"/>
+    <w:abstractNumId w:val="24"/>
   </w:num>
   <w:num w:numId="25">
-    <w:abstractNumId w:val="28"/>
+    <w:abstractNumId w:val="30"/>
   </w:num>
   <w:num w:numId="26">
-    <w:abstractNumId w:val="14"/>
+    <w:abstractNumId w:val="16"/>
   </w:num>
   <w:num w:numId="27">
-    <w:abstractNumId w:val="11"/>
+    <w:abstractNumId w:val="13"/>
   </w:num>
   <w:num w:numId="28">
-    <w:abstractNumId w:val="32"/>
+    <w:abstractNumId w:val="34"/>
   </w:num>
   <w:num w:numId="29">
-    <w:abstractNumId w:val="17"/>
+    <w:abstractNumId w:val="19"/>
   </w:num>
   <w:num w:numId="30">
-    <w:abstractNumId w:val="27"/>
+    <w:abstractNumId w:val="29"/>
   </w:num>
   <w:num w:numId="31">
     <w:abstractNumId w:val="0"/>
   </w:num>
   <w:num w:numId="32">
-    <w:abstractNumId w:val="9"/>
+    <w:abstractNumId w:val="11"/>
   </w:num>
   <w:num w:numId="33">
+    <w:abstractNumId w:val="20"/>
+  </w:num>
+  <w:num w:numId="34">
+    <w:abstractNumId w:val="32"/>
+  </w:num>
+  <w:num w:numId="35">
+    <w:abstractNumId w:val="21"/>
+  </w:num>
+  <w:num w:numId="36">
     <w:abstractNumId w:val="18"/>
   </w:num>
-  <w:num w:numId="34">
-    <w:abstractNumId w:val="30"/>
+  <w:num w:numId="37">
+    <w:abstractNumId w:val="4"/>
   </w:num>
-  <w:num w:numId="35">
-    <w:abstractNumId w:val="19"/>
-  </w:num>
-  <w:num w:numId="36">
-    <w:abstractNumId w:val="16"/>
+  <w:num w:numId="38">
+    <w:abstractNumId w:val="6"/>
   </w:num>
 </w:numbering>
 </file>
@@ -15368,7 +16003,7 @@
 </file>
 
 <file path=customXml/itemProps1.xml><?xml version="1.0" encoding="utf-8"?>
-<ds:datastoreItem xmlns:ds="http://schemas.openxmlformats.org/officeDocument/2006/customXml" ds:itemID="{8A2D9AFF-3107-4C57-AC7A-46F1F7B66648}">
+<ds:datastoreItem xmlns:ds="http://schemas.openxmlformats.org/officeDocument/2006/customXml" ds:itemID="{37006711-EE3A-4975-BB3D-23A0D12791D0}">
   <ds:schemaRefs>
     <ds:schemaRef ds:uri="http://schemas.openxmlformats.org/officeDocument/2006/bibliography"/>
   </ds:schemaRefs>

</xml_diff>

<commit_message>
Date: 24 Dec 2025
</commit_message>
<xml_diff>
--- a/Notes_Selenium_14.docx
+++ b/Notes_Selenium_14.docx
@@ -3511,18 +3511,8 @@
           <w:szCs w:val="22"/>
           <w:lang w:val="en-US"/>
         </w:rPr>
-        <w:t xml:space="preserve">Idea </w:t>
-      </w:r>
-      <w:proofErr w:type="spellStart"/>
-      <w:r>
-        <w:rPr>
-          <w:sz w:val="24"/>
-          <w:szCs w:val="22"/>
-          <w:lang w:val="en-US"/>
-        </w:rPr>
-        <w:t>Intellij</w:t>
-      </w:r>
-      <w:proofErr w:type="spellEnd"/>
+        <w:t>Idea Intellij</w:t>
+      </w:r>
     </w:p>
     <w:p>
       <w:pPr>
@@ -11447,6 +11437,223 @@
     <w:p>
       <w:pPr>
         <w:rPr>
+          <w:b/>
+          <w:bCs/>
+          <w:sz w:val="24"/>
+          <w:szCs w:val="22"/>
+          <w:lang w:val="en-US"/>
+        </w:rPr>
+      </w:pPr>
+      <w:r>
+        <w:rPr>
+          <w:b/>
+          <w:bCs/>
+          <w:sz w:val="24"/>
+          <w:szCs w:val="22"/>
+          <w:lang w:val="en-US"/>
+        </w:rPr>
+        <w:t>Creating Maven Project (With Archetype)</w:t>
+      </w:r>
+    </w:p>
+    <w:p>
+      <w:pPr>
+        <w:pStyle w:val="ListParagraph"/>
+        <w:numPr>
+          <w:ilvl w:val="0"/>
+          <w:numId w:val="40"/>
+        </w:numPr>
+        <w:rPr>
+          <w:sz w:val="24"/>
+          <w:szCs w:val="22"/>
+          <w:lang w:val="en-US"/>
+        </w:rPr>
+      </w:pPr>
+      <w:r>
+        <w:rPr>
+          <w:sz w:val="24"/>
+          <w:szCs w:val="22"/>
+          <w:lang w:val="en-US"/>
+        </w:rPr>
+        <w:t xml:space="preserve">File </w:t>
+      </w:r>
+      <w:r>
+        <w:rPr>
+          <w:sz w:val="24"/>
+          <w:szCs w:val="22"/>
+          <w:lang w:val="en-US"/>
+        </w:rPr>
+        <w:sym w:font="Wingdings" w:char="F0E0"/>
+      </w:r>
+      <w:r>
+        <w:rPr>
+          <w:sz w:val="24"/>
+          <w:szCs w:val="22"/>
+          <w:lang w:val="en-US"/>
+        </w:rPr>
+        <w:t xml:space="preserve"> New </w:t>
+      </w:r>
+      <w:r>
+        <w:rPr>
+          <w:sz w:val="24"/>
+          <w:szCs w:val="22"/>
+          <w:lang w:val="en-US"/>
+        </w:rPr>
+        <w:sym w:font="Wingdings" w:char="F0E0"/>
+      </w:r>
+      <w:r>
+        <w:rPr>
+          <w:sz w:val="24"/>
+          <w:szCs w:val="22"/>
+          <w:lang w:val="en-US"/>
+        </w:rPr>
+        <w:t xml:space="preserve"> Maven Project</w:t>
+      </w:r>
+    </w:p>
+    <w:p>
+      <w:pPr>
+        <w:pStyle w:val="ListParagraph"/>
+        <w:numPr>
+          <w:ilvl w:val="0"/>
+          <w:numId w:val="40"/>
+        </w:numPr>
+        <w:rPr>
+          <w:sz w:val="24"/>
+          <w:szCs w:val="22"/>
+          <w:lang w:val="en-US"/>
+        </w:rPr>
+      </w:pPr>
+      <w:r>
+        <w:rPr>
+          <w:sz w:val="24"/>
+          <w:szCs w:val="22"/>
+          <w:lang w:val="en-US"/>
+        </w:rPr>
+        <w:t>Select 3</w:t>
+      </w:r>
+      <w:r>
+        <w:rPr>
+          <w:sz w:val="24"/>
+          <w:szCs w:val="22"/>
+          <w:vertAlign w:val="superscript"/>
+          <w:lang w:val="en-US"/>
+        </w:rPr>
+        <w:t>rd</w:t>
+      </w:r>
+      <w:r>
+        <w:rPr>
+          <w:sz w:val="24"/>
+          <w:szCs w:val="22"/>
+          <w:lang w:val="en-US"/>
+        </w:rPr>
+        <w:t xml:space="preserve"> Checkbox (Add project to Working set)</w:t>
+      </w:r>
+    </w:p>
+    <w:p>
+      <w:pPr>
+        <w:pStyle w:val="ListParagraph"/>
+        <w:numPr>
+          <w:ilvl w:val="0"/>
+          <w:numId w:val="40"/>
+        </w:numPr>
+        <w:rPr>
+          <w:sz w:val="24"/>
+          <w:szCs w:val="22"/>
+          <w:lang w:val="en-US"/>
+        </w:rPr>
+      </w:pPr>
+      <w:r>
+        <w:rPr>
+          <w:sz w:val="24"/>
+          <w:szCs w:val="22"/>
+          <w:lang w:val="en-US"/>
+        </w:rPr>
+        <w:t>Click on Next</w:t>
+      </w:r>
+    </w:p>
+    <w:p>
+      <w:pPr>
+        <w:pStyle w:val="ListParagraph"/>
+        <w:numPr>
+          <w:ilvl w:val="0"/>
+          <w:numId w:val="40"/>
+        </w:numPr>
+        <w:rPr>
+          <w:sz w:val="24"/>
+          <w:szCs w:val="22"/>
+          <w:lang w:val="en-US"/>
+        </w:rPr>
+      </w:pPr>
+      <w:r>
+        <w:rPr>
+          <w:sz w:val="24"/>
+          <w:szCs w:val="22"/>
+          <w:lang w:val="en-US"/>
+        </w:rPr>
+        <w:t>Search the archetype as Maven-archetype-</w:t>
+      </w:r>
+      <w:proofErr w:type="spellStart"/>
+      <w:r>
+        <w:rPr>
+          <w:sz w:val="24"/>
+          <w:szCs w:val="22"/>
+          <w:lang w:val="en-US"/>
+        </w:rPr>
+        <w:t>quickstart</w:t>
+      </w:r>
+      <w:proofErr w:type="spellEnd"/>
+    </w:p>
+    <w:p>
+      <w:pPr>
+        <w:pStyle w:val="ListParagraph"/>
+        <w:numPr>
+          <w:ilvl w:val="0"/>
+          <w:numId w:val="40"/>
+        </w:numPr>
+        <w:rPr>
+          <w:sz w:val="24"/>
+          <w:szCs w:val="22"/>
+          <w:lang w:val="en-US"/>
+        </w:rPr>
+      </w:pPr>
+      <w:r>
+        <w:rPr>
+          <w:sz w:val="24"/>
+          <w:szCs w:val="22"/>
+          <w:lang w:val="en-US"/>
+        </w:rPr>
+        <w:t xml:space="preserve">Select the version </w:t>
+      </w:r>
+    </w:p>
+    <w:p>
+      <w:pPr>
+        <w:pStyle w:val="ListParagraph"/>
+        <w:numPr>
+          <w:ilvl w:val="0"/>
+          <w:numId w:val="40"/>
+        </w:numPr>
+        <w:rPr>
+          <w:sz w:val="24"/>
+          <w:szCs w:val="22"/>
+          <w:lang w:val="en-US"/>
+        </w:rPr>
+      </w:pPr>
+      <w:r>
+        <w:rPr>
+          <w:sz w:val="24"/>
+          <w:szCs w:val="22"/>
+          <w:lang w:val="en-US"/>
+        </w:rPr>
+        <w:t>Click on Next</w:t>
+      </w:r>
+    </w:p>
+    <w:p>
+      <w:pPr>
+        <w:pStyle w:val="ListParagraph"/>
+        <w:numPr>
+          <w:ilvl w:val="0"/>
+          <w:numId w:val="40"/>
+        </w:numPr>
+        <w:rPr>
           <w:sz w:val="24"/>
           <w:szCs w:val="22"/>
           <w:lang w:val="en-US"/>
@@ -11454,6 +11661,24 @@
       </w:pPr>
       <w:bookmarkStart w:id="0" w:name="_GoBack"/>
       <w:bookmarkEnd w:id="0"/>
+    </w:p>
+    <w:p>
+      <w:pPr>
+        <w:rPr>
+          <w:sz w:val="24"/>
+          <w:szCs w:val="22"/>
+          <w:lang w:val="en-US"/>
+        </w:rPr>
+      </w:pPr>
+    </w:p>
+    <w:p>
+      <w:pPr>
+        <w:rPr>
+          <w:sz w:val="24"/>
+          <w:szCs w:val="22"/>
+          <w:lang w:val="en-US"/>
+        </w:rPr>
+      </w:pPr>
     </w:p>
     <w:sectPr>
       <w:pgSz w:w="11906" w:h="16838"/>
@@ -11937,6 +12162,95 @@
     </w:lvl>
   </w:abstractNum>
   <w:abstractNum w:abstractNumId="5">
+    <w:nsid w:val="12642FA6"/>
+    <w:multiLevelType w:val="hybridMultilevel"/>
+    <w:tmpl w:val="9B860802"/>
+    <w:lvl w:ilvl="0" w:tplc="4009000F">
+      <w:start w:val="1"/>
+      <w:numFmt w:val="decimal"/>
+      <w:lvlText w:val="%1."/>
+      <w:lvlJc w:val="left"/>
+      <w:pPr>
+        <w:ind w:left="720" w:hanging="360"/>
+      </w:pPr>
+      <w:rPr>
+        <w:rFonts w:hint="default"/>
+      </w:rPr>
+    </w:lvl>
+    <w:lvl w:ilvl="1" w:tplc="40090019" w:tentative="1">
+      <w:start w:val="1"/>
+      <w:numFmt w:val="lowerLetter"/>
+      <w:lvlText w:val="%2."/>
+      <w:lvlJc w:val="left"/>
+      <w:pPr>
+        <w:ind w:left="1440" w:hanging="360"/>
+      </w:pPr>
+    </w:lvl>
+    <w:lvl w:ilvl="2" w:tplc="4009001B" w:tentative="1">
+      <w:start w:val="1"/>
+      <w:numFmt w:val="lowerRoman"/>
+      <w:lvlText w:val="%3."/>
+      <w:lvlJc w:val="right"/>
+      <w:pPr>
+        <w:ind w:left="2160" w:hanging="180"/>
+      </w:pPr>
+    </w:lvl>
+    <w:lvl w:ilvl="3" w:tplc="4009000F" w:tentative="1">
+      <w:start w:val="1"/>
+      <w:numFmt w:val="decimal"/>
+      <w:lvlText w:val="%4."/>
+      <w:lvlJc w:val="left"/>
+      <w:pPr>
+        <w:ind w:left="2880" w:hanging="360"/>
+      </w:pPr>
+    </w:lvl>
+    <w:lvl w:ilvl="4" w:tplc="40090019" w:tentative="1">
+      <w:start w:val="1"/>
+      <w:numFmt w:val="lowerLetter"/>
+      <w:lvlText w:val="%5."/>
+      <w:lvlJc w:val="left"/>
+      <w:pPr>
+        <w:ind w:left="3600" w:hanging="360"/>
+      </w:pPr>
+    </w:lvl>
+    <w:lvl w:ilvl="5" w:tplc="4009001B" w:tentative="1">
+      <w:start w:val="1"/>
+      <w:numFmt w:val="lowerRoman"/>
+      <w:lvlText w:val="%6."/>
+      <w:lvlJc w:val="right"/>
+      <w:pPr>
+        <w:ind w:left="4320" w:hanging="180"/>
+      </w:pPr>
+    </w:lvl>
+    <w:lvl w:ilvl="6" w:tplc="4009000F" w:tentative="1">
+      <w:start w:val="1"/>
+      <w:numFmt w:val="decimal"/>
+      <w:lvlText w:val="%7."/>
+      <w:lvlJc w:val="left"/>
+      <w:pPr>
+        <w:ind w:left="5040" w:hanging="360"/>
+      </w:pPr>
+    </w:lvl>
+    <w:lvl w:ilvl="7" w:tplc="40090019" w:tentative="1">
+      <w:start w:val="1"/>
+      <w:numFmt w:val="lowerLetter"/>
+      <w:lvlText w:val="%8."/>
+      <w:lvlJc w:val="left"/>
+      <w:pPr>
+        <w:ind w:left="5760" w:hanging="360"/>
+      </w:pPr>
+    </w:lvl>
+    <w:lvl w:ilvl="8" w:tplc="4009001B" w:tentative="1">
+      <w:start w:val="1"/>
+      <w:numFmt w:val="lowerRoman"/>
+      <w:lvlText w:val="%9."/>
+      <w:lvlJc w:val="right"/>
+      <w:pPr>
+        <w:ind w:left="6480" w:hanging="180"/>
+      </w:pPr>
+    </w:lvl>
+  </w:abstractNum>
+  <w:abstractNum w:abstractNumId="6">
     <w:nsid w:val="1453593C"/>
     <w:multiLevelType w:val="hybridMultilevel"/>
     <w:tmpl w:val="EC725C48"/>
@@ -12025,7 +12339,7 @@
       </w:pPr>
     </w:lvl>
   </w:abstractNum>
-  <w:abstractNum w:abstractNumId="6">
+  <w:abstractNum w:abstractNumId="7">
     <w:nsid w:val="148A2AB8"/>
     <w:multiLevelType w:val="hybridMultilevel"/>
     <w:tmpl w:val="9C18DFE6"/>
@@ -12114,7 +12428,7 @@
       </w:pPr>
     </w:lvl>
   </w:abstractNum>
-  <w:abstractNum w:abstractNumId="7">
+  <w:abstractNum w:abstractNumId="8">
     <w:nsid w:val="1B900A26"/>
     <w:multiLevelType w:val="hybridMultilevel"/>
     <w:tmpl w:val="18980896"/>
@@ -12227,7 +12541,7 @@
       </w:rPr>
     </w:lvl>
   </w:abstractNum>
-  <w:abstractNum w:abstractNumId="8">
+  <w:abstractNum w:abstractNumId="9">
     <w:nsid w:val="1D003CBD"/>
     <w:multiLevelType w:val="hybridMultilevel"/>
     <w:tmpl w:val="99D4C676"/>
@@ -12340,7 +12654,7 @@
       </w:rPr>
     </w:lvl>
   </w:abstractNum>
-  <w:abstractNum w:abstractNumId="9">
+  <w:abstractNum w:abstractNumId="10">
     <w:nsid w:val="1EFE2129"/>
     <w:multiLevelType w:val="hybridMultilevel"/>
     <w:tmpl w:val="CD76CB1E"/>
@@ -12453,7 +12767,7 @@
       </w:rPr>
     </w:lvl>
   </w:abstractNum>
-  <w:abstractNum w:abstractNumId="10">
+  <w:abstractNum w:abstractNumId="11">
     <w:nsid w:val="201E61D6"/>
     <w:multiLevelType w:val="hybridMultilevel"/>
     <w:tmpl w:val="28B4F59E"/>
@@ -12566,7 +12880,7 @@
       </w:rPr>
     </w:lvl>
   </w:abstractNum>
-  <w:abstractNum w:abstractNumId="11">
+  <w:abstractNum w:abstractNumId="12">
     <w:nsid w:val="208412D1"/>
     <w:multiLevelType w:val="hybridMultilevel"/>
     <w:tmpl w:val="95DE081C"/>
@@ -12655,7 +12969,7 @@
       </w:pPr>
     </w:lvl>
   </w:abstractNum>
-  <w:abstractNum w:abstractNumId="12">
+  <w:abstractNum w:abstractNumId="13">
     <w:nsid w:val="21197407"/>
     <w:multiLevelType w:val="hybridMultilevel"/>
     <w:tmpl w:val="6D30545C"/>
@@ -12744,7 +13058,7 @@
       </w:pPr>
     </w:lvl>
   </w:abstractNum>
-  <w:abstractNum w:abstractNumId="13">
+  <w:abstractNum w:abstractNumId="14">
     <w:nsid w:val="21E921C4"/>
     <w:multiLevelType w:val="hybridMultilevel"/>
     <w:tmpl w:val="824AB5DC"/>
@@ -12833,7 +13147,7 @@
       </w:pPr>
     </w:lvl>
   </w:abstractNum>
-  <w:abstractNum w:abstractNumId="14">
+  <w:abstractNum w:abstractNumId="15">
     <w:nsid w:val="231E6D1F"/>
     <w:multiLevelType w:val="hybridMultilevel"/>
     <w:tmpl w:val="DAC42EF8"/>
@@ -12922,7 +13236,7 @@
       </w:pPr>
     </w:lvl>
   </w:abstractNum>
-  <w:abstractNum w:abstractNumId="15">
+  <w:abstractNum w:abstractNumId="16">
     <w:nsid w:val="24CA0387"/>
     <w:multiLevelType w:val="hybridMultilevel"/>
     <w:tmpl w:val="E81AAACE"/>
@@ -13035,7 +13349,7 @@
       </w:rPr>
     </w:lvl>
   </w:abstractNum>
-  <w:abstractNum w:abstractNumId="16">
+  <w:abstractNum w:abstractNumId="17">
     <w:nsid w:val="32FE0416"/>
     <w:multiLevelType w:val="hybridMultilevel"/>
     <w:tmpl w:val="16BC674C"/>
@@ -13124,7 +13438,7 @@
       </w:pPr>
     </w:lvl>
   </w:abstractNum>
-  <w:abstractNum w:abstractNumId="17">
+  <w:abstractNum w:abstractNumId="18">
     <w:nsid w:val="37062EB4"/>
     <w:multiLevelType w:val="hybridMultilevel"/>
     <w:tmpl w:val="8528B142"/>
@@ -13213,7 +13527,7 @@
       </w:pPr>
     </w:lvl>
   </w:abstractNum>
-  <w:abstractNum w:abstractNumId="18">
+  <w:abstractNum w:abstractNumId="19">
     <w:nsid w:val="3A7611DD"/>
     <w:multiLevelType w:val="hybridMultilevel"/>
     <w:tmpl w:val="69D469B0"/>
@@ -13302,7 +13616,7 @@
       </w:pPr>
     </w:lvl>
   </w:abstractNum>
-  <w:abstractNum w:abstractNumId="19">
+  <w:abstractNum w:abstractNumId="20">
     <w:nsid w:val="3B892462"/>
     <w:multiLevelType w:val="hybridMultilevel"/>
     <w:tmpl w:val="CB1C6C4E"/>
@@ -13391,7 +13705,7 @@
       </w:pPr>
     </w:lvl>
   </w:abstractNum>
-  <w:abstractNum w:abstractNumId="20">
+  <w:abstractNum w:abstractNumId="21">
     <w:nsid w:val="40361D0B"/>
     <w:multiLevelType w:val="hybridMultilevel"/>
     <w:tmpl w:val="4A54C56E"/>
@@ -13480,7 +13794,7 @@
       </w:pPr>
     </w:lvl>
   </w:abstractNum>
-  <w:abstractNum w:abstractNumId="21">
+  <w:abstractNum w:abstractNumId="22">
     <w:nsid w:val="40C03745"/>
     <w:multiLevelType w:val="hybridMultilevel"/>
     <w:tmpl w:val="401AA9E2"/>
@@ -13593,7 +13907,7 @@
       </w:rPr>
     </w:lvl>
   </w:abstractNum>
-  <w:abstractNum w:abstractNumId="22">
+  <w:abstractNum w:abstractNumId="23">
     <w:nsid w:val="4B45536D"/>
     <w:multiLevelType w:val="hybridMultilevel"/>
     <w:tmpl w:val="0B3449C8"/>
@@ -13682,7 +13996,7 @@
       </w:pPr>
     </w:lvl>
   </w:abstractNum>
-  <w:abstractNum w:abstractNumId="23">
+  <w:abstractNum w:abstractNumId="24">
     <w:nsid w:val="4D236C02"/>
     <w:multiLevelType w:val="hybridMultilevel"/>
     <w:tmpl w:val="CBFADF28"/>
@@ -13795,7 +14109,7 @@
       </w:rPr>
     </w:lvl>
   </w:abstractNum>
-  <w:abstractNum w:abstractNumId="24">
+  <w:abstractNum w:abstractNumId="25">
     <w:nsid w:val="4FC02C6C"/>
     <w:multiLevelType w:val="hybridMultilevel"/>
     <w:tmpl w:val="05D2B08E"/>
@@ -13884,7 +14198,7 @@
       </w:pPr>
     </w:lvl>
   </w:abstractNum>
-  <w:abstractNum w:abstractNumId="25">
+  <w:abstractNum w:abstractNumId="26">
     <w:nsid w:val="52B52268"/>
     <w:multiLevelType w:val="hybridMultilevel"/>
     <w:tmpl w:val="331AF78C"/>
@@ -13997,7 +14311,7 @@
       </w:rPr>
     </w:lvl>
   </w:abstractNum>
-  <w:abstractNum w:abstractNumId="26">
+  <w:abstractNum w:abstractNumId="27">
     <w:nsid w:val="55D92B24"/>
     <w:multiLevelType w:val="hybridMultilevel"/>
     <w:tmpl w:val="9BCED27C"/>
@@ -14110,7 +14424,7 @@
       </w:rPr>
     </w:lvl>
   </w:abstractNum>
-  <w:abstractNum w:abstractNumId="27">
+  <w:abstractNum w:abstractNumId="28">
     <w:nsid w:val="57564656"/>
     <w:multiLevelType w:val="hybridMultilevel"/>
     <w:tmpl w:val="3E1C27F6"/>
@@ -14223,7 +14537,7 @@
       </w:rPr>
     </w:lvl>
   </w:abstractNum>
-  <w:abstractNum w:abstractNumId="28">
+  <w:abstractNum w:abstractNumId="29">
     <w:nsid w:val="61A962B8"/>
     <w:multiLevelType w:val="hybridMultilevel"/>
     <w:tmpl w:val="5EDC7138"/>
@@ -14312,7 +14626,7 @@
       </w:pPr>
     </w:lvl>
   </w:abstractNum>
-  <w:abstractNum w:abstractNumId="29">
+  <w:abstractNum w:abstractNumId="30">
     <w:nsid w:val="69867F0D"/>
     <w:multiLevelType w:val="hybridMultilevel"/>
     <w:tmpl w:val="EAF8E468"/>
@@ -14401,7 +14715,7 @@
       </w:pPr>
     </w:lvl>
   </w:abstractNum>
-  <w:abstractNum w:abstractNumId="30">
+  <w:abstractNum w:abstractNumId="31">
     <w:nsid w:val="6E5A4342"/>
     <w:multiLevelType w:val="hybridMultilevel"/>
     <w:tmpl w:val="414440E6"/>
@@ -14490,7 +14804,7 @@
       </w:pPr>
     </w:lvl>
   </w:abstractNum>
-  <w:abstractNum w:abstractNumId="31">
+  <w:abstractNum w:abstractNumId="32">
     <w:nsid w:val="6F0A1BD2"/>
     <w:multiLevelType w:val="hybridMultilevel"/>
     <w:tmpl w:val="EF7884CC"/>
@@ -14603,7 +14917,7 @@
       </w:rPr>
     </w:lvl>
   </w:abstractNum>
-  <w:abstractNum w:abstractNumId="32">
+  <w:abstractNum w:abstractNumId="33">
     <w:nsid w:val="6FC368C3"/>
     <w:multiLevelType w:val="hybridMultilevel"/>
     <w:tmpl w:val="F892BAB0"/>
@@ -14692,7 +15006,7 @@
       </w:pPr>
     </w:lvl>
   </w:abstractNum>
-  <w:abstractNum w:abstractNumId="33">
+  <w:abstractNum w:abstractNumId="34">
     <w:nsid w:val="729D49A6"/>
     <w:multiLevelType w:val="hybridMultilevel"/>
     <w:tmpl w:val="212E6380"/>
@@ -14781,7 +15095,7 @@
       </w:pPr>
     </w:lvl>
   </w:abstractNum>
-  <w:abstractNum w:abstractNumId="34">
+  <w:abstractNum w:abstractNumId="35">
     <w:nsid w:val="72E5107C"/>
     <w:multiLevelType w:val="hybridMultilevel"/>
     <w:tmpl w:val="30BE3018"/>
@@ -14870,7 +15184,96 @@
       </w:pPr>
     </w:lvl>
   </w:abstractNum>
-  <w:abstractNum w:abstractNumId="35">
+  <w:abstractNum w:abstractNumId="36">
+    <w:nsid w:val="7B1473D2"/>
+    <w:multiLevelType w:val="hybridMultilevel"/>
+    <w:tmpl w:val="78F6F478"/>
+    <w:lvl w:ilvl="0" w:tplc="4009000F">
+      <w:start w:val="1"/>
+      <w:numFmt w:val="decimal"/>
+      <w:lvlText w:val="%1."/>
+      <w:lvlJc w:val="left"/>
+      <w:pPr>
+        <w:ind w:left="720" w:hanging="360"/>
+      </w:pPr>
+      <w:rPr>
+        <w:rFonts w:hint="default"/>
+      </w:rPr>
+    </w:lvl>
+    <w:lvl w:ilvl="1" w:tplc="40090019" w:tentative="1">
+      <w:start w:val="1"/>
+      <w:numFmt w:val="lowerLetter"/>
+      <w:lvlText w:val="%2."/>
+      <w:lvlJc w:val="left"/>
+      <w:pPr>
+        <w:ind w:left="1440" w:hanging="360"/>
+      </w:pPr>
+    </w:lvl>
+    <w:lvl w:ilvl="2" w:tplc="4009001B" w:tentative="1">
+      <w:start w:val="1"/>
+      <w:numFmt w:val="lowerRoman"/>
+      <w:lvlText w:val="%3."/>
+      <w:lvlJc w:val="right"/>
+      <w:pPr>
+        <w:ind w:left="2160" w:hanging="180"/>
+      </w:pPr>
+    </w:lvl>
+    <w:lvl w:ilvl="3" w:tplc="4009000F" w:tentative="1">
+      <w:start w:val="1"/>
+      <w:numFmt w:val="decimal"/>
+      <w:lvlText w:val="%4."/>
+      <w:lvlJc w:val="left"/>
+      <w:pPr>
+        <w:ind w:left="2880" w:hanging="360"/>
+      </w:pPr>
+    </w:lvl>
+    <w:lvl w:ilvl="4" w:tplc="40090019" w:tentative="1">
+      <w:start w:val="1"/>
+      <w:numFmt w:val="lowerLetter"/>
+      <w:lvlText w:val="%5."/>
+      <w:lvlJc w:val="left"/>
+      <w:pPr>
+        <w:ind w:left="3600" w:hanging="360"/>
+      </w:pPr>
+    </w:lvl>
+    <w:lvl w:ilvl="5" w:tplc="4009001B" w:tentative="1">
+      <w:start w:val="1"/>
+      <w:numFmt w:val="lowerRoman"/>
+      <w:lvlText w:val="%6."/>
+      <w:lvlJc w:val="right"/>
+      <w:pPr>
+        <w:ind w:left="4320" w:hanging="180"/>
+      </w:pPr>
+    </w:lvl>
+    <w:lvl w:ilvl="6" w:tplc="4009000F" w:tentative="1">
+      <w:start w:val="1"/>
+      <w:numFmt w:val="decimal"/>
+      <w:lvlText w:val="%7."/>
+      <w:lvlJc w:val="left"/>
+      <w:pPr>
+        <w:ind w:left="5040" w:hanging="360"/>
+      </w:pPr>
+    </w:lvl>
+    <w:lvl w:ilvl="7" w:tplc="40090019" w:tentative="1">
+      <w:start w:val="1"/>
+      <w:numFmt w:val="lowerLetter"/>
+      <w:lvlText w:val="%8."/>
+      <w:lvlJc w:val="left"/>
+      <w:pPr>
+        <w:ind w:left="5760" w:hanging="360"/>
+      </w:pPr>
+    </w:lvl>
+    <w:lvl w:ilvl="8" w:tplc="4009001B" w:tentative="1">
+      <w:start w:val="1"/>
+      <w:numFmt w:val="lowerRoman"/>
+      <w:lvlText w:val="%9."/>
+      <w:lvlJc w:val="right"/>
+      <w:pPr>
+        <w:ind w:left="6480" w:hanging="180"/>
+      </w:pPr>
+    </w:lvl>
+  </w:abstractNum>
+  <w:abstractNum w:abstractNumId="37">
     <w:nsid w:val="7C1B7A62"/>
     <w:multiLevelType w:val="hybridMultilevel"/>
     <w:tmpl w:val="A1EEB68C"/>
@@ -14983,7 +15386,7 @@
       </w:rPr>
     </w:lvl>
   </w:abstractNum>
-  <w:abstractNum w:abstractNumId="36">
+  <w:abstractNum w:abstractNumId="38">
     <w:nsid w:val="7E0C5E33"/>
     <w:multiLevelType w:val="hybridMultilevel"/>
     <w:tmpl w:val="17A20342"/>
@@ -15072,7 +15475,7 @@
       </w:pPr>
     </w:lvl>
   </w:abstractNum>
-  <w:abstractNum w:abstractNumId="37">
+  <w:abstractNum w:abstractNumId="39">
     <w:nsid w:val="7EEF6783"/>
     <w:multiLevelType w:val="hybridMultilevel"/>
     <w:tmpl w:val="2292AFAC"/>
@@ -15162,118 +15565,124 @@
     </w:lvl>
   </w:abstractNum>
   <w:num w:numId="1">
+    <w:abstractNumId w:val="11"/>
+  </w:num>
+  <w:num w:numId="2">
+    <w:abstractNumId w:val="9"/>
+  </w:num>
+  <w:num w:numId="3">
+    <w:abstractNumId w:val="37"/>
+  </w:num>
+  <w:num w:numId="4">
+    <w:abstractNumId w:val="27"/>
+  </w:num>
+  <w:num w:numId="5">
+    <w:abstractNumId w:val="18"/>
+  </w:num>
+  <w:num w:numId="6">
     <w:abstractNumId w:val="10"/>
   </w:num>
-  <w:num w:numId="2">
+  <w:num w:numId="7">
+    <w:abstractNumId w:val="24"/>
+  </w:num>
+  <w:num w:numId="8">
+    <w:abstractNumId w:val="28"/>
+  </w:num>
+  <w:num w:numId="9">
+    <w:abstractNumId w:val="15"/>
+  </w:num>
+  <w:num w:numId="10">
+    <w:abstractNumId w:val="6"/>
+  </w:num>
+  <w:num w:numId="11">
     <w:abstractNumId w:val="8"/>
   </w:num>
-  <w:num w:numId="3">
-    <w:abstractNumId w:val="35"/>
-  </w:num>
-  <w:num w:numId="4">
-    <w:abstractNumId w:val="26"/>
-  </w:num>
-  <w:num w:numId="5">
-    <w:abstractNumId w:val="17"/>
-  </w:num>
-  <w:num w:numId="6">
-    <w:abstractNumId w:val="9"/>
-  </w:num>
-  <w:num w:numId="7">
-    <w:abstractNumId w:val="23"/>
-  </w:num>
-  <w:num w:numId="8">
-    <w:abstractNumId w:val="27"/>
-  </w:num>
-  <w:num w:numId="9">
-    <w:abstractNumId w:val="14"/>
-  </w:num>
-  <w:num w:numId="10">
-    <w:abstractNumId w:val="5"/>
-  </w:num>
-  <w:num w:numId="11">
-    <w:abstractNumId w:val="7"/>
-  </w:num>
   <w:num w:numId="12">
-    <w:abstractNumId w:val="12"/>
+    <w:abstractNumId w:val="13"/>
   </w:num>
   <w:num w:numId="13">
     <w:abstractNumId w:val="2"/>
   </w:num>
   <w:num w:numId="14">
-    <w:abstractNumId w:val="22"/>
+    <w:abstractNumId w:val="23"/>
   </w:num>
   <w:num w:numId="15">
-    <w:abstractNumId w:val="37"/>
+    <w:abstractNumId w:val="39"/>
   </w:num>
   <w:num w:numId="16">
-    <w:abstractNumId w:val="15"/>
+    <w:abstractNumId w:val="16"/>
   </w:num>
   <w:num w:numId="17">
-    <w:abstractNumId w:val="31"/>
+    <w:abstractNumId w:val="32"/>
   </w:num>
   <w:num w:numId="18">
     <w:abstractNumId w:val="1"/>
   </w:num>
   <w:num w:numId="19">
-    <w:abstractNumId w:val="36"/>
+    <w:abstractNumId w:val="38"/>
   </w:num>
   <w:num w:numId="20">
-    <w:abstractNumId w:val="28"/>
+    <w:abstractNumId w:val="29"/>
   </w:num>
   <w:num w:numId="21">
-    <w:abstractNumId w:val="25"/>
+    <w:abstractNumId w:val="26"/>
   </w:num>
   <w:num w:numId="22">
     <w:abstractNumId w:val="3"/>
   </w:num>
   <w:num w:numId="23">
-    <w:abstractNumId w:val="33"/>
+    <w:abstractNumId w:val="34"/>
   </w:num>
   <w:num w:numId="24">
-    <w:abstractNumId w:val="24"/>
+    <w:abstractNumId w:val="25"/>
   </w:num>
   <w:num w:numId="25">
-    <w:abstractNumId w:val="30"/>
+    <w:abstractNumId w:val="31"/>
   </w:num>
   <w:num w:numId="26">
-    <w:abstractNumId w:val="16"/>
+    <w:abstractNumId w:val="17"/>
   </w:num>
   <w:num w:numId="27">
-    <w:abstractNumId w:val="13"/>
+    <w:abstractNumId w:val="14"/>
   </w:num>
   <w:num w:numId="28">
-    <w:abstractNumId w:val="34"/>
+    <w:abstractNumId w:val="35"/>
   </w:num>
   <w:num w:numId="29">
-    <w:abstractNumId w:val="19"/>
+    <w:abstractNumId w:val="20"/>
   </w:num>
   <w:num w:numId="30">
-    <w:abstractNumId w:val="29"/>
+    <w:abstractNumId w:val="30"/>
   </w:num>
   <w:num w:numId="31">
     <w:abstractNumId w:val="0"/>
   </w:num>
   <w:num w:numId="32">
-    <w:abstractNumId w:val="11"/>
+    <w:abstractNumId w:val="12"/>
   </w:num>
   <w:num w:numId="33">
-    <w:abstractNumId w:val="20"/>
+    <w:abstractNumId w:val="21"/>
   </w:num>
   <w:num w:numId="34">
-    <w:abstractNumId w:val="32"/>
+    <w:abstractNumId w:val="33"/>
   </w:num>
   <w:num w:numId="35">
-    <w:abstractNumId w:val="21"/>
+    <w:abstractNumId w:val="22"/>
   </w:num>
   <w:num w:numId="36">
-    <w:abstractNumId w:val="18"/>
+    <w:abstractNumId w:val="19"/>
   </w:num>
   <w:num w:numId="37">
     <w:abstractNumId w:val="4"/>
   </w:num>
   <w:num w:numId="38">
-    <w:abstractNumId w:val="6"/>
+    <w:abstractNumId w:val="7"/>
+  </w:num>
+  <w:num w:numId="39">
+    <w:abstractNumId w:val="5"/>
+  </w:num>
+  <w:num w:numId="40">
+    <w:abstractNumId w:val="36"/>
   </w:num>
 </w:numbering>
 </file>
@@ -16003,7 +16412,7 @@
 </file>
 
 <file path=customXml/itemProps1.xml><?xml version="1.0" encoding="utf-8"?>
-<ds:datastoreItem xmlns:ds="http://schemas.openxmlformats.org/officeDocument/2006/customXml" ds:itemID="{37006711-EE3A-4975-BB3D-23A0D12791D0}">
+<ds:datastoreItem xmlns:ds="http://schemas.openxmlformats.org/officeDocument/2006/customXml" ds:itemID="{8C2E6312-982C-4857-BE9C-57E958E0ECCA}">
   <ds:schemaRefs>
     <ds:schemaRef ds:uri="http://schemas.openxmlformats.org/officeDocument/2006/bibliography"/>
   </ds:schemaRefs>

</xml_diff>

<commit_message>
Date: 07 Jan 2026
</commit_message>
<xml_diff>
--- a/Notes_Selenium_14.docx
+++ b/Notes_Selenium_14.docx
@@ -11659,26 +11659,1864 @@
           <w:lang w:val="en-US"/>
         </w:rPr>
       </w:pPr>
+    </w:p>
+    <w:p>
+      <w:pPr>
+        <w:rPr>
+          <w:sz w:val="24"/>
+          <w:szCs w:val="22"/>
+          <w:lang w:val="en-US"/>
+        </w:rPr>
+      </w:pPr>
+    </w:p>
+    <w:p>
+      <w:pPr>
+        <w:rPr>
+          <w:sz w:val="24"/>
+          <w:szCs w:val="22"/>
+          <w:lang w:val="en-US"/>
+        </w:rPr>
+      </w:pPr>
+      <w:r>
+        <w:rPr>
+          <w:noProof/>
+          <w:lang w:eastAsia="en-IN"/>
+        </w:rPr>
+        <w:drawing>
+          <wp:inline distT="0" distB="0" distL="0" distR="0" wp14:anchorId="7D9545BF" wp14:editId="43BD5815">
+            <wp:extent cx="3924090" cy="2156604"/>
+            <wp:effectExtent l="0" t="0" r="635" b="0"/>
+            <wp:docPr id="3" name="Picture 3"/>
+            <wp:cNvGraphicFramePr>
+              <a:graphicFrameLocks xmlns:a="http://schemas.openxmlformats.org/drawingml/2006/main" noChangeAspect="1"/>
+            </wp:cNvGraphicFramePr>
+            <a:graphic xmlns:a="http://schemas.openxmlformats.org/drawingml/2006/main">
+              <a:graphicData uri="http://schemas.openxmlformats.org/drawingml/2006/picture">
+                <pic:pic xmlns:pic="http://schemas.openxmlformats.org/drawingml/2006/picture">
+                  <pic:nvPicPr>
+                    <pic:cNvPr id="1" name=""/>
+                    <pic:cNvPicPr/>
+                  </pic:nvPicPr>
+                  <pic:blipFill rotWithShape="1">
+                    <a:blip r:embed="rId9"/>
+                    <a:srcRect l="22280" t="23021" r="9243" b="10047"/>
+                    <a:stretch/>
+                  </pic:blipFill>
+                  <pic:spPr bwMode="auto">
+                    <a:xfrm>
+                      <a:off x="0" y="0"/>
+                      <a:ext cx="3924791" cy="2156989"/>
+                    </a:xfrm>
+                    <a:prstGeom prst="rect">
+                      <a:avLst/>
+                    </a:prstGeom>
+                    <a:ln>
+                      <a:noFill/>
+                    </a:ln>
+                    <a:extLst>
+                      <a:ext uri="{53640926-AAD7-44D8-BBD7-CCE9431645EC}">
+                        <a14:shadowObscured xmlns:a14="http://schemas.microsoft.com/office/drawing/2010/main"/>
+                      </a:ext>
+                    </a:extLst>
+                  </pic:spPr>
+                </pic:pic>
+              </a:graphicData>
+            </a:graphic>
+          </wp:inline>
+        </w:drawing>
+      </w:r>
+    </w:p>
+    <w:p>
+      <w:pPr>
+        <w:rPr>
+          <w:sz w:val="24"/>
+          <w:szCs w:val="22"/>
+          <w:lang w:val="en-US"/>
+        </w:rPr>
+      </w:pPr>
+    </w:p>
+    <w:p>
+      <w:pPr>
+        <w:rPr>
+          <w:b/>
+          <w:bCs/>
+          <w:sz w:val="24"/>
+          <w:szCs w:val="22"/>
+          <w:lang w:val="en-US"/>
+        </w:rPr>
+      </w:pPr>
+    </w:p>
+    <w:p>
+      <w:pPr>
+        <w:rPr>
+          <w:b/>
+          <w:bCs/>
+          <w:sz w:val="24"/>
+          <w:szCs w:val="22"/>
+          <w:lang w:val="en-US"/>
+        </w:rPr>
+      </w:pPr>
+      <w:r>
+        <w:rPr>
+          <w:b/>
+          <w:bCs/>
+          <w:sz w:val="24"/>
+          <w:szCs w:val="22"/>
+          <w:lang w:val="en-US"/>
+        </w:rPr>
+        <w:lastRenderedPageBreak/>
+        <w:t>Maven Execution</w:t>
+      </w:r>
+    </w:p>
+    <w:p>
+      <w:pPr>
+        <w:pStyle w:val="ListParagraph"/>
+        <w:numPr>
+          <w:ilvl w:val="0"/>
+          <w:numId w:val="41"/>
+        </w:numPr>
+        <w:rPr>
+          <w:sz w:val="24"/>
+          <w:szCs w:val="22"/>
+          <w:lang w:val="en-US"/>
+        </w:rPr>
+      </w:pPr>
+      <w:r>
+        <w:rPr>
+          <w:sz w:val="24"/>
+          <w:szCs w:val="22"/>
+          <w:lang w:val="en-US"/>
+        </w:rPr>
+        <w:t xml:space="preserve">Java 11 </w:t>
+      </w:r>
+    </w:p>
+    <w:p>
+      <w:pPr>
+        <w:pStyle w:val="ListParagraph"/>
+        <w:numPr>
+          <w:ilvl w:val="1"/>
+          <w:numId w:val="41"/>
+        </w:numPr>
+        <w:rPr>
+          <w:sz w:val="24"/>
+          <w:szCs w:val="22"/>
+          <w:lang w:val="en-US"/>
+        </w:rPr>
+      </w:pPr>
+      <w:r>
+        <w:rPr>
+          <w:sz w:val="24"/>
+          <w:szCs w:val="22"/>
+          <w:lang w:val="en-US"/>
+        </w:rPr>
+        <w:t>Environment variables needs to be set</w:t>
+      </w:r>
+    </w:p>
+    <w:p>
+      <w:pPr>
+        <w:pStyle w:val="ListParagraph"/>
+        <w:numPr>
+          <w:ilvl w:val="0"/>
+          <w:numId w:val="41"/>
+        </w:numPr>
+        <w:rPr>
+          <w:sz w:val="24"/>
+          <w:szCs w:val="22"/>
+          <w:lang w:val="en-US"/>
+        </w:rPr>
+      </w:pPr>
+      <w:r>
+        <w:rPr>
+          <w:sz w:val="24"/>
+          <w:szCs w:val="22"/>
+          <w:lang w:val="en-US"/>
+        </w:rPr>
+        <w:t>Plug-ins</w:t>
+      </w:r>
+    </w:p>
+    <w:p>
+      <w:pPr>
+        <w:pStyle w:val="ListParagraph"/>
+        <w:numPr>
+          <w:ilvl w:val="1"/>
+          <w:numId w:val="41"/>
+        </w:numPr>
+        <w:rPr>
+          <w:sz w:val="24"/>
+          <w:szCs w:val="22"/>
+          <w:lang w:val="en-US"/>
+        </w:rPr>
+      </w:pPr>
+      <w:r>
+        <w:rPr>
+          <w:sz w:val="24"/>
+          <w:szCs w:val="22"/>
+          <w:lang w:val="en-US"/>
+        </w:rPr>
+        <w:t>Maven Compiler Plugin</w:t>
+      </w:r>
+    </w:p>
+    <w:p>
+      <w:pPr>
+        <w:pStyle w:val="ListParagraph"/>
+        <w:numPr>
+          <w:ilvl w:val="1"/>
+          <w:numId w:val="41"/>
+        </w:numPr>
+        <w:rPr>
+          <w:sz w:val="24"/>
+          <w:szCs w:val="22"/>
+          <w:lang w:val="en-US"/>
+        </w:rPr>
+      </w:pPr>
+      <w:r>
+        <w:rPr>
+          <w:sz w:val="24"/>
+          <w:szCs w:val="22"/>
+          <w:lang w:val="en-US"/>
+        </w:rPr>
+        <w:t>Maven Surefire Plugin</w:t>
+      </w:r>
+    </w:p>
+    <w:p>
+      <w:pPr>
+        <w:rPr>
+          <w:sz w:val="24"/>
+          <w:szCs w:val="22"/>
+          <w:lang w:val="en-US"/>
+        </w:rPr>
+      </w:pPr>
+      <w:r>
+        <w:rPr>
+          <w:sz w:val="24"/>
+          <w:szCs w:val="22"/>
+          <w:lang w:val="en-US"/>
+        </w:rPr>
+        <w:br w:type="page"/>
+      </w:r>
+    </w:p>
+    <w:p>
+      <w:pPr>
+        <w:rPr>
+          <w:b/>
+          <w:bCs/>
+          <w:sz w:val="24"/>
+          <w:szCs w:val="22"/>
+          <w:lang w:val="en-US"/>
+        </w:rPr>
+      </w:pPr>
+      <w:r>
+        <w:rPr>
+          <w:b/>
+          <w:bCs/>
+          <w:sz w:val="24"/>
+          <w:szCs w:val="22"/>
+          <w:lang w:val="en-US"/>
+        </w:rPr>
+        <w:lastRenderedPageBreak/>
+        <w:t xml:space="preserve">TDD Approach </w:t>
+      </w:r>
+    </w:p>
+    <w:p>
+      <w:pPr>
+        <w:rPr>
+          <w:b/>
+          <w:bCs/>
+          <w:sz w:val="24"/>
+          <w:szCs w:val="22"/>
+          <w:lang w:val="en-US"/>
+        </w:rPr>
+      </w:pPr>
+      <w:r>
+        <w:rPr>
+          <w:b/>
+          <w:bCs/>
+          <w:sz w:val="24"/>
+          <w:szCs w:val="22"/>
+          <w:lang w:val="en-US"/>
+        </w:rPr>
+        <w:t>BDD Approach</w:t>
+      </w:r>
+    </w:p>
+    <w:p>
+      <w:pPr>
+        <w:pStyle w:val="ListParagraph"/>
+        <w:numPr>
+          <w:ilvl w:val="0"/>
+          <w:numId w:val="42"/>
+        </w:numPr>
+        <w:rPr>
+          <w:sz w:val="24"/>
+          <w:szCs w:val="22"/>
+          <w:lang w:val="en-US"/>
+        </w:rPr>
+      </w:pPr>
+      <w:r>
+        <w:rPr>
+          <w:sz w:val="24"/>
+          <w:szCs w:val="22"/>
+          <w:lang w:val="en-US"/>
+        </w:rPr>
+        <w:t xml:space="preserve">BA, QA team, </w:t>
+      </w:r>
+      <w:proofErr w:type="spellStart"/>
+      <w:r>
+        <w:rPr>
+          <w:sz w:val="24"/>
+          <w:szCs w:val="22"/>
+          <w:lang w:val="en-US"/>
+        </w:rPr>
+        <w:t>Dev</w:t>
+      </w:r>
+      <w:proofErr w:type="spellEnd"/>
+      <w:r>
+        <w:rPr>
+          <w:sz w:val="24"/>
+          <w:szCs w:val="22"/>
+          <w:lang w:val="en-US"/>
+        </w:rPr>
+        <w:t xml:space="preserve"> team will gather the requirements from client.</w:t>
+      </w:r>
+    </w:p>
+    <w:p>
+      <w:pPr>
+        <w:pStyle w:val="ListParagraph"/>
+        <w:numPr>
+          <w:ilvl w:val="0"/>
+          <w:numId w:val="42"/>
+        </w:numPr>
+        <w:rPr>
+          <w:sz w:val="24"/>
+          <w:szCs w:val="22"/>
+          <w:lang w:val="en-US"/>
+        </w:rPr>
+      </w:pPr>
+      <w:r>
+        <w:rPr>
+          <w:sz w:val="24"/>
+          <w:szCs w:val="22"/>
+          <w:lang w:val="en-US"/>
+        </w:rPr>
+        <w:t>Finalized requirements will be shared with QA team.</w:t>
+      </w:r>
+    </w:p>
+    <w:p>
+      <w:pPr>
+        <w:pStyle w:val="ListParagraph"/>
+        <w:numPr>
+          <w:ilvl w:val="0"/>
+          <w:numId w:val="42"/>
+        </w:numPr>
+        <w:rPr>
+          <w:sz w:val="24"/>
+          <w:szCs w:val="22"/>
+          <w:lang w:val="en-US"/>
+        </w:rPr>
+      </w:pPr>
+      <w:r>
+        <w:rPr>
+          <w:sz w:val="24"/>
+          <w:szCs w:val="22"/>
+          <w:lang w:val="en-US"/>
+        </w:rPr>
+        <w:t xml:space="preserve">QA team will create </w:t>
+      </w:r>
+      <w:r>
+        <w:rPr>
+          <w:b/>
+          <w:bCs/>
+          <w:sz w:val="24"/>
+          <w:szCs w:val="22"/>
+          <w:lang w:val="en-US"/>
+        </w:rPr>
+        <w:t>Feature File (1</w:t>
+      </w:r>
+      <w:r>
+        <w:rPr>
+          <w:b/>
+          <w:bCs/>
+          <w:sz w:val="24"/>
+          <w:szCs w:val="22"/>
+          <w:vertAlign w:val="superscript"/>
+          <w:lang w:val="en-US"/>
+        </w:rPr>
+        <w:t>st</w:t>
+      </w:r>
+      <w:r>
+        <w:rPr>
+          <w:b/>
+          <w:bCs/>
+          <w:sz w:val="24"/>
+          <w:szCs w:val="22"/>
+          <w:lang w:val="en-US"/>
+        </w:rPr>
+        <w:t xml:space="preserve"> Component of BDD)</w:t>
+      </w:r>
+    </w:p>
+    <w:p>
+      <w:pPr>
+        <w:pStyle w:val="ListParagraph"/>
+        <w:numPr>
+          <w:ilvl w:val="1"/>
+          <w:numId w:val="42"/>
+        </w:numPr>
+        <w:rPr>
+          <w:sz w:val="24"/>
+          <w:szCs w:val="22"/>
+          <w:lang w:val="en-US"/>
+        </w:rPr>
+      </w:pPr>
+      <w:r>
+        <w:rPr>
+          <w:sz w:val="24"/>
+          <w:szCs w:val="22"/>
+          <w:lang w:val="en-US"/>
+        </w:rPr>
+        <w:t>Feature file is collection of Test Scenarios</w:t>
+      </w:r>
+    </w:p>
+    <w:p>
+      <w:pPr>
+        <w:pStyle w:val="ListParagraph"/>
+        <w:numPr>
+          <w:ilvl w:val="0"/>
+          <w:numId w:val="42"/>
+        </w:numPr>
+        <w:rPr>
+          <w:sz w:val="24"/>
+          <w:szCs w:val="22"/>
+          <w:lang w:val="en-US"/>
+        </w:rPr>
+      </w:pPr>
+      <w:r>
+        <w:rPr>
+          <w:sz w:val="24"/>
+          <w:szCs w:val="22"/>
+          <w:lang w:val="en-US"/>
+        </w:rPr>
+        <w:t>This feature file will be shared with</w:t>
+      </w:r>
+    </w:p>
+    <w:p>
+      <w:pPr>
+        <w:pStyle w:val="ListParagraph"/>
+        <w:numPr>
+          <w:ilvl w:val="1"/>
+          <w:numId w:val="42"/>
+        </w:numPr>
+        <w:rPr>
+          <w:sz w:val="24"/>
+          <w:szCs w:val="22"/>
+          <w:lang w:val="en-US"/>
+        </w:rPr>
+      </w:pPr>
+      <w:r>
+        <w:rPr>
+          <w:sz w:val="24"/>
+          <w:szCs w:val="22"/>
+          <w:lang w:val="en-US"/>
+        </w:rPr>
+        <w:t>Development team</w:t>
+      </w:r>
+    </w:p>
+    <w:p>
+      <w:pPr>
+        <w:pStyle w:val="ListParagraph"/>
+        <w:numPr>
+          <w:ilvl w:val="1"/>
+          <w:numId w:val="42"/>
+        </w:numPr>
+        <w:rPr>
+          <w:sz w:val="24"/>
+          <w:szCs w:val="22"/>
+          <w:lang w:val="en-US"/>
+        </w:rPr>
+      </w:pPr>
+      <w:r>
+        <w:rPr>
+          <w:sz w:val="24"/>
+          <w:szCs w:val="22"/>
+          <w:lang w:val="en-US"/>
+        </w:rPr>
+        <w:t>Manual Tester</w:t>
+      </w:r>
+    </w:p>
+    <w:p>
+      <w:pPr>
+        <w:pStyle w:val="ListParagraph"/>
+        <w:numPr>
+          <w:ilvl w:val="1"/>
+          <w:numId w:val="42"/>
+        </w:numPr>
+        <w:rPr>
+          <w:sz w:val="24"/>
+          <w:szCs w:val="22"/>
+          <w:lang w:val="en-US"/>
+        </w:rPr>
+      </w:pPr>
+      <w:r>
+        <w:rPr>
+          <w:sz w:val="24"/>
+          <w:szCs w:val="22"/>
+          <w:lang w:val="en-US"/>
+        </w:rPr>
+        <w:t>Automation Tester</w:t>
+      </w:r>
+    </w:p>
+    <w:p>
+      <w:pPr>
+        <w:pStyle w:val="ListParagraph"/>
+        <w:numPr>
+          <w:ilvl w:val="0"/>
+          <w:numId w:val="42"/>
+        </w:numPr>
+        <w:rPr>
+          <w:sz w:val="24"/>
+          <w:szCs w:val="22"/>
+          <w:lang w:val="en-US"/>
+        </w:rPr>
+      </w:pPr>
+      <w:r>
+        <w:rPr>
+          <w:sz w:val="24"/>
+          <w:szCs w:val="22"/>
+          <w:lang w:val="en-US"/>
+        </w:rPr>
+        <w:t xml:space="preserve">Automation tester will execute this feature file and they will get </w:t>
+      </w:r>
+      <w:r>
+        <w:rPr>
+          <w:b/>
+          <w:bCs/>
+          <w:sz w:val="24"/>
+          <w:szCs w:val="22"/>
+          <w:lang w:val="en-US"/>
+        </w:rPr>
+        <w:t>Glue Code / Step Definition (2</w:t>
+      </w:r>
+      <w:r>
+        <w:rPr>
+          <w:b/>
+          <w:bCs/>
+          <w:sz w:val="24"/>
+          <w:szCs w:val="22"/>
+          <w:vertAlign w:val="superscript"/>
+          <w:lang w:val="en-US"/>
+        </w:rPr>
+        <w:t>nd</w:t>
+      </w:r>
+      <w:r>
+        <w:rPr>
+          <w:b/>
+          <w:bCs/>
+          <w:sz w:val="24"/>
+          <w:szCs w:val="22"/>
+          <w:lang w:val="en-US"/>
+        </w:rPr>
+        <w:t xml:space="preserve"> Component of BDD)</w:t>
+      </w:r>
+    </w:p>
+    <w:p>
+      <w:pPr>
+        <w:pStyle w:val="ListParagraph"/>
+        <w:numPr>
+          <w:ilvl w:val="1"/>
+          <w:numId w:val="42"/>
+        </w:numPr>
+        <w:rPr>
+          <w:sz w:val="24"/>
+          <w:szCs w:val="22"/>
+          <w:lang w:val="en-US"/>
+        </w:rPr>
+      </w:pPr>
+      <w:r>
+        <w:rPr>
+          <w:sz w:val="24"/>
+          <w:szCs w:val="22"/>
+          <w:lang w:val="en-US"/>
+        </w:rPr>
+        <w:t>Glue code – Skeleton for automation script</w:t>
+      </w:r>
+    </w:p>
+    <w:p>
+      <w:pPr>
+        <w:pStyle w:val="ListParagraph"/>
+        <w:numPr>
+          <w:ilvl w:val="0"/>
+          <w:numId w:val="42"/>
+        </w:numPr>
+        <w:rPr>
+          <w:sz w:val="24"/>
+          <w:szCs w:val="22"/>
+          <w:lang w:val="en-US"/>
+        </w:rPr>
+      </w:pPr>
+      <w:r>
+        <w:rPr>
+          <w:b/>
+          <w:bCs/>
+          <w:sz w:val="24"/>
+          <w:szCs w:val="22"/>
+          <w:lang w:val="en-US"/>
+        </w:rPr>
+        <w:t>Runner class (3</w:t>
+      </w:r>
+      <w:r>
+        <w:rPr>
+          <w:b/>
+          <w:bCs/>
+          <w:sz w:val="24"/>
+          <w:szCs w:val="22"/>
+          <w:vertAlign w:val="superscript"/>
+          <w:lang w:val="en-US"/>
+        </w:rPr>
+        <w:t>rd</w:t>
+      </w:r>
+      <w:r>
+        <w:rPr>
+          <w:b/>
+          <w:bCs/>
+          <w:sz w:val="24"/>
+          <w:szCs w:val="22"/>
+          <w:lang w:val="en-US"/>
+        </w:rPr>
+        <w:t xml:space="preserve"> Component of BDD) </w:t>
+      </w:r>
+      <w:r>
+        <w:rPr>
+          <w:sz w:val="24"/>
+          <w:szCs w:val="22"/>
+          <w:lang w:val="en-US"/>
+        </w:rPr>
+        <w:t xml:space="preserve">used to execute the automation script </w:t>
+      </w:r>
+    </w:p>
+    <w:p>
+      <w:pPr>
+        <w:rPr>
+          <w:sz w:val="24"/>
+          <w:szCs w:val="22"/>
+          <w:lang w:val="en-US"/>
+        </w:rPr>
+      </w:pPr>
+    </w:p>
+    <w:p>
+      <w:pPr>
+        <w:rPr>
+          <w:b/>
+          <w:bCs/>
+          <w:sz w:val="24"/>
+          <w:szCs w:val="22"/>
+          <w:lang w:val="en-US"/>
+        </w:rPr>
+      </w:pPr>
+      <w:r>
+        <w:rPr>
+          <w:b/>
+          <w:bCs/>
+          <w:sz w:val="24"/>
+          <w:szCs w:val="22"/>
+          <w:lang w:val="en-US"/>
+        </w:rPr>
+        <w:t xml:space="preserve">BDD can be implemented via Cucumber </w:t>
+      </w:r>
+    </w:p>
+    <w:p>
+      <w:pPr>
+        <w:pBdr>
+          <w:bottom w:val="single" w:sz="6" w:space="1" w:color="auto"/>
+        </w:pBdr>
+        <w:rPr>
+          <w:sz w:val="24"/>
+          <w:szCs w:val="22"/>
+          <w:lang w:val="en-US"/>
+        </w:rPr>
+      </w:pPr>
+    </w:p>
+    <w:p>
+      <w:pPr>
+        <w:rPr>
+          <w:sz w:val="24"/>
+          <w:szCs w:val="22"/>
+          <w:lang w:val="en-US"/>
+        </w:rPr>
+      </w:pPr>
+    </w:p>
+    <w:p>
+      <w:pPr>
+        <w:rPr>
+          <w:b/>
+          <w:bCs/>
+          <w:sz w:val="24"/>
+          <w:szCs w:val="22"/>
+          <w:lang w:val="en-US"/>
+        </w:rPr>
+      </w:pPr>
+      <w:r>
+        <w:rPr>
+          <w:b/>
+          <w:bCs/>
+          <w:sz w:val="24"/>
+          <w:szCs w:val="22"/>
+          <w:lang w:val="en-US"/>
+        </w:rPr>
+        <w:t>Feature File</w:t>
+      </w:r>
+    </w:p>
+    <w:p>
+      <w:pPr>
+        <w:pStyle w:val="ListParagraph"/>
+        <w:numPr>
+          <w:ilvl w:val="0"/>
+          <w:numId w:val="43"/>
+        </w:numPr>
+        <w:rPr>
+          <w:sz w:val="24"/>
+          <w:szCs w:val="22"/>
+          <w:lang w:val="en-US"/>
+        </w:rPr>
+      </w:pPr>
+      <w:r>
+        <w:rPr>
+          <w:sz w:val="24"/>
+          <w:szCs w:val="22"/>
+          <w:lang w:val="en-US"/>
+        </w:rPr>
+        <w:t>Collection of Test Scenarios</w:t>
+      </w:r>
+    </w:p>
+    <w:p>
+      <w:pPr>
+        <w:pStyle w:val="ListParagraph"/>
+        <w:numPr>
+          <w:ilvl w:val="0"/>
+          <w:numId w:val="43"/>
+        </w:numPr>
+        <w:rPr>
+          <w:sz w:val="24"/>
+          <w:szCs w:val="22"/>
+          <w:lang w:val="en-US"/>
+        </w:rPr>
+      </w:pPr>
+      <w:r>
+        <w:rPr>
+          <w:sz w:val="24"/>
+          <w:szCs w:val="22"/>
+          <w:lang w:val="en-US"/>
+        </w:rPr>
+        <w:t>Created using Gherkin</w:t>
+      </w:r>
+    </w:p>
+    <w:p>
+      <w:pPr>
+        <w:pStyle w:val="ListParagraph"/>
+        <w:numPr>
+          <w:ilvl w:val="0"/>
+          <w:numId w:val="43"/>
+        </w:numPr>
+        <w:rPr>
+          <w:sz w:val="24"/>
+          <w:szCs w:val="22"/>
+          <w:lang w:val="en-US"/>
+        </w:rPr>
+      </w:pPr>
+      <w:r>
+        <w:rPr>
+          <w:sz w:val="24"/>
+          <w:szCs w:val="22"/>
+          <w:lang w:val="en-US"/>
+        </w:rPr>
+        <w:t>Created using keyword</w:t>
+      </w:r>
+    </w:p>
+    <w:p>
+      <w:pPr>
+        <w:pStyle w:val="ListParagraph"/>
+        <w:numPr>
+          <w:ilvl w:val="1"/>
+          <w:numId w:val="43"/>
+        </w:numPr>
+        <w:rPr>
+          <w:sz w:val="24"/>
+          <w:szCs w:val="22"/>
+          <w:lang w:val="en-US"/>
+        </w:rPr>
+      </w:pPr>
+      <w:r>
+        <w:rPr>
+          <w:sz w:val="24"/>
+          <w:szCs w:val="22"/>
+          <w:lang w:val="en-US"/>
+        </w:rPr>
+        <w:t xml:space="preserve">Feature: </w:t>
+      </w:r>
+      <w:r>
+        <w:rPr>
+          <w:sz w:val="24"/>
+          <w:szCs w:val="22"/>
+          <w:lang w:val="en-US"/>
+        </w:rPr>
+        <w:sym w:font="Wingdings" w:char="F0E0"/>
+      </w:r>
+      <w:r>
+        <w:rPr>
+          <w:sz w:val="24"/>
+          <w:szCs w:val="22"/>
+          <w:lang w:val="en-US"/>
+        </w:rPr>
+        <w:t xml:space="preserve"> </w:t>
+      </w:r>
+      <w:r>
+        <w:rPr>
+          <w:sz w:val="24"/>
+          <w:szCs w:val="22"/>
+          <w:lang w:val="en-US"/>
+        </w:rPr>
+        <w:t>Represents requirement</w:t>
+      </w:r>
+    </w:p>
+    <w:p>
+      <w:pPr>
+        <w:pStyle w:val="ListParagraph"/>
+        <w:numPr>
+          <w:ilvl w:val="1"/>
+          <w:numId w:val="43"/>
+        </w:numPr>
+        <w:rPr>
+          <w:sz w:val="24"/>
+          <w:szCs w:val="22"/>
+          <w:lang w:val="en-US"/>
+        </w:rPr>
+      </w:pPr>
+      <w:r>
+        <w:rPr>
+          <w:sz w:val="24"/>
+          <w:szCs w:val="22"/>
+          <w:lang w:val="en-US"/>
+        </w:rPr>
+        <w:t xml:space="preserve">Scenario: </w:t>
+      </w:r>
+      <w:r>
+        <w:rPr>
+          <w:sz w:val="24"/>
+          <w:szCs w:val="22"/>
+          <w:lang w:val="en-US"/>
+        </w:rPr>
+        <w:sym w:font="Wingdings" w:char="F0E0"/>
+      </w:r>
+      <w:r>
+        <w:rPr>
+          <w:sz w:val="24"/>
+          <w:szCs w:val="22"/>
+          <w:lang w:val="en-US"/>
+        </w:rPr>
+        <w:t xml:space="preserve"> Represents Test case objective (Test Condition)</w:t>
+      </w:r>
+    </w:p>
+    <w:p>
+      <w:pPr>
+        <w:pStyle w:val="ListParagraph"/>
+        <w:numPr>
+          <w:ilvl w:val="1"/>
+          <w:numId w:val="43"/>
+        </w:numPr>
+        <w:rPr>
+          <w:sz w:val="24"/>
+          <w:szCs w:val="22"/>
+          <w:lang w:val="en-US"/>
+        </w:rPr>
+      </w:pPr>
+      <w:r>
+        <w:rPr>
+          <w:sz w:val="24"/>
+          <w:szCs w:val="22"/>
+          <w:lang w:val="en-US"/>
+        </w:rPr>
+        <w:t xml:space="preserve">Given </w:t>
+      </w:r>
+      <w:r>
+        <w:rPr>
+          <w:sz w:val="24"/>
+          <w:szCs w:val="22"/>
+          <w:lang w:val="en-US"/>
+        </w:rPr>
+        <w:sym w:font="Wingdings" w:char="F0E0"/>
+      </w:r>
+      <w:r>
+        <w:rPr>
+          <w:sz w:val="24"/>
+          <w:szCs w:val="22"/>
+          <w:lang w:val="en-US"/>
+        </w:rPr>
+        <w:t xml:space="preserve"> Represents Pre-Requisite</w:t>
+      </w:r>
+    </w:p>
+    <w:p>
+      <w:pPr>
+        <w:pStyle w:val="ListParagraph"/>
+        <w:numPr>
+          <w:ilvl w:val="1"/>
+          <w:numId w:val="43"/>
+        </w:numPr>
+        <w:rPr>
+          <w:sz w:val="24"/>
+          <w:szCs w:val="22"/>
+          <w:lang w:val="en-US"/>
+        </w:rPr>
+      </w:pPr>
+      <w:r>
+        <w:rPr>
+          <w:sz w:val="24"/>
+          <w:szCs w:val="22"/>
+          <w:lang w:val="en-US"/>
+        </w:rPr>
+        <w:t xml:space="preserve">When </w:t>
+      </w:r>
+      <w:r>
+        <w:rPr>
+          <w:sz w:val="24"/>
+          <w:szCs w:val="22"/>
+          <w:lang w:val="en-US"/>
+        </w:rPr>
+        <w:sym w:font="Wingdings" w:char="F0E0"/>
+      </w:r>
+      <w:r>
+        <w:rPr>
+          <w:sz w:val="24"/>
+          <w:szCs w:val="22"/>
+          <w:lang w:val="en-US"/>
+        </w:rPr>
+        <w:t xml:space="preserve"> Represents Steps (Separate When for each step)</w:t>
+      </w:r>
+    </w:p>
+    <w:p>
+      <w:pPr>
+        <w:pStyle w:val="ListParagraph"/>
+        <w:numPr>
+          <w:ilvl w:val="1"/>
+          <w:numId w:val="43"/>
+        </w:numPr>
+        <w:rPr>
+          <w:sz w:val="24"/>
+          <w:szCs w:val="22"/>
+          <w:lang w:val="en-US"/>
+        </w:rPr>
+      </w:pPr>
+      <w:r>
+        <w:rPr>
+          <w:sz w:val="24"/>
+          <w:szCs w:val="22"/>
+          <w:lang w:val="en-US"/>
+        </w:rPr>
+        <w:t xml:space="preserve">And </w:t>
+      </w:r>
+      <w:r>
+        <w:rPr>
+          <w:sz w:val="24"/>
+          <w:szCs w:val="22"/>
+          <w:lang w:val="en-US"/>
+        </w:rPr>
+        <w:sym w:font="Wingdings" w:char="F0E0"/>
+      </w:r>
+      <w:r>
+        <w:rPr>
+          <w:sz w:val="24"/>
+          <w:szCs w:val="22"/>
+          <w:lang w:val="en-US"/>
+        </w:rPr>
+        <w:t xml:space="preserve"> Used to combine multiple When statements</w:t>
+      </w:r>
+      <w:r>
+        <w:rPr>
+          <w:sz w:val="24"/>
+          <w:szCs w:val="22"/>
+          <w:lang w:val="en-US"/>
+        </w:rPr>
+        <w:t xml:space="preserve"> (And get replaced with When)</w:t>
+      </w:r>
+    </w:p>
+    <w:p>
+      <w:pPr>
+        <w:pStyle w:val="ListParagraph"/>
+        <w:numPr>
+          <w:ilvl w:val="1"/>
+          <w:numId w:val="43"/>
+        </w:numPr>
+        <w:rPr>
+          <w:sz w:val="24"/>
+          <w:szCs w:val="22"/>
+          <w:lang w:val="en-US"/>
+        </w:rPr>
+      </w:pPr>
+      <w:r>
+        <w:rPr>
+          <w:sz w:val="24"/>
+          <w:szCs w:val="22"/>
+          <w:lang w:val="en-US"/>
+        </w:rPr>
+        <w:t xml:space="preserve">Then </w:t>
+      </w:r>
+      <w:r>
+        <w:rPr>
+          <w:sz w:val="24"/>
+          <w:szCs w:val="22"/>
+          <w:lang w:val="en-US"/>
+        </w:rPr>
+        <w:sym w:font="Wingdings" w:char="F0E0"/>
+      </w:r>
+      <w:r>
+        <w:rPr>
+          <w:sz w:val="24"/>
+          <w:szCs w:val="22"/>
+          <w:lang w:val="en-US"/>
+        </w:rPr>
+        <w:t xml:space="preserve"> Represents Expected Result</w:t>
+      </w:r>
+    </w:p>
+    <w:p>
+      <w:pPr>
+        <w:pStyle w:val="ListParagraph"/>
+        <w:numPr>
+          <w:ilvl w:val="1"/>
+          <w:numId w:val="43"/>
+        </w:numPr>
+        <w:rPr>
+          <w:sz w:val="24"/>
+          <w:szCs w:val="22"/>
+          <w:lang w:val="en-US"/>
+        </w:rPr>
+      </w:pPr>
+      <w:r>
+        <w:rPr>
+          <w:sz w:val="24"/>
+          <w:szCs w:val="22"/>
+          <w:lang w:val="en-US"/>
+        </w:rPr>
+        <w:t xml:space="preserve">Background: </w:t>
+      </w:r>
+      <w:r>
+        <w:rPr>
+          <w:sz w:val="24"/>
+          <w:szCs w:val="22"/>
+          <w:lang w:val="en-US"/>
+        </w:rPr>
+        <w:sym w:font="Wingdings" w:char="F0E0"/>
+      </w:r>
+      <w:r>
+        <w:rPr>
+          <w:sz w:val="24"/>
+          <w:szCs w:val="22"/>
+          <w:lang w:val="en-US"/>
+        </w:rPr>
+        <w:t xml:space="preserve"> Used to avoid multiple </w:t>
+      </w:r>
+      <w:proofErr w:type="gramStart"/>
+      <w:r>
+        <w:rPr>
+          <w:sz w:val="24"/>
+          <w:szCs w:val="22"/>
+          <w:lang w:val="en-US"/>
+        </w:rPr>
+        <w:t>Given</w:t>
+      </w:r>
+      <w:proofErr w:type="gramEnd"/>
+      <w:r>
+        <w:rPr>
+          <w:sz w:val="24"/>
+          <w:szCs w:val="22"/>
+          <w:lang w:val="en-US"/>
+        </w:rPr>
+        <w:t xml:space="preserve"> statements for multiple scenarios.</w:t>
+      </w:r>
+    </w:p>
+    <w:p>
+      <w:pPr>
+        <w:pStyle w:val="ListParagraph"/>
+        <w:numPr>
+          <w:ilvl w:val="1"/>
+          <w:numId w:val="43"/>
+        </w:numPr>
+        <w:rPr>
+          <w:sz w:val="24"/>
+          <w:szCs w:val="22"/>
+          <w:lang w:val="en-US"/>
+        </w:rPr>
+      </w:pPr>
+      <w:r>
+        <w:rPr>
+          <w:sz w:val="24"/>
+          <w:szCs w:val="22"/>
+          <w:lang w:val="en-US"/>
+        </w:rPr>
+        <w:t xml:space="preserve">Examples: </w:t>
+      </w:r>
+      <w:r>
+        <w:rPr>
+          <w:sz w:val="24"/>
+          <w:szCs w:val="22"/>
+          <w:lang w:val="en-US"/>
+        </w:rPr>
+        <w:sym w:font="Wingdings" w:char="F0E0"/>
+      </w:r>
+      <w:r>
+        <w:rPr>
+          <w:sz w:val="24"/>
+          <w:szCs w:val="22"/>
+          <w:lang w:val="en-US"/>
+        </w:rPr>
+        <w:t xml:space="preserve"> Used in the Data Driven Testing</w:t>
+      </w:r>
+    </w:p>
+    <w:p>
+      <w:pPr>
+        <w:pStyle w:val="ListParagraph"/>
+        <w:numPr>
+          <w:ilvl w:val="1"/>
+          <w:numId w:val="43"/>
+        </w:numPr>
+        <w:rPr>
+          <w:sz w:val="24"/>
+          <w:szCs w:val="22"/>
+          <w:lang w:val="en-US"/>
+        </w:rPr>
+      </w:pPr>
+      <w:r>
+        <w:rPr>
+          <w:sz w:val="24"/>
+          <w:szCs w:val="22"/>
+          <w:lang w:val="en-US"/>
+        </w:rPr>
+        <w:t xml:space="preserve">Scenario Outline: </w:t>
+      </w:r>
+      <w:r>
+        <w:rPr>
+          <w:sz w:val="24"/>
+          <w:szCs w:val="22"/>
+          <w:lang w:val="en-US"/>
+        </w:rPr>
+        <w:sym w:font="Wingdings" w:char="F0E0"/>
+      </w:r>
+      <w:r>
+        <w:rPr>
+          <w:sz w:val="24"/>
+          <w:szCs w:val="22"/>
+          <w:lang w:val="en-US"/>
+        </w:rPr>
+        <w:t xml:space="preserve"> </w:t>
+      </w:r>
+      <w:r>
+        <w:rPr>
+          <w:sz w:val="24"/>
+          <w:szCs w:val="22"/>
+          <w:lang w:val="en-US"/>
+        </w:rPr>
+        <w:t>Used while Data Driven Testing</w:t>
+      </w:r>
+    </w:p>
+    <w:p>
+      <w:pPr>
+        <w:pBdr>
+          <w:bottom w:val="single" w:sz="6" w:space="1" w:color="auto"/>
+        </w:pBdr>
+        <w:rPr>
+          <w:sz w:val="24"/>
+          <w:szCs w:val="22"/>
+          <w:lang w:val="en-US"/>
+        </w:rPr>
+      </w:pPr>
+    </w:p>
+    <w:p>
+      <w:pPr>
+        <w:rPr>
+          <w:sz w:val="24"/>
+          <w:szCs w:val="22"/>
+          <w:lang w:val="en-US"/>
+        </w:rPr>
+      </w:pPr>
+    </w:p>
+    <w:p>
+      <w:pPr>
+        <w:rPr>
+          <w:b/>
+          <w:bCs/>
+          <w:sz w:val="24"/>
+          <w:szCs w:val="22"/>
+          <w:lang w:val="en-US"/>
+        </w:rPr>
+      </w:pPr>
+      <w:r>
+        <w:rPr>
+          <w:b/>
+          <w:bCs/>
+          <w:sz w:val="24"/>
+          <w:szCs w:val="22"/>
+          <w:lang w:val="en-US"/>
+        </w:rPr>
+        <w:br w:type="page"/>
+      </w:r>
+    </w:p>
+    <w:p>
+      <w:pPr>
+        <w:rPr>
+          <w:sz w:val="24"/>
+          <w:szCs w:val="22"/>
+          <w:lang w:val="en-US"/>
+        </w:rPr>
+      </w:pPr>
+      <w:r>
+        <w:rPr>
+          <w:b/>
+          <w:bCs/>
+          <w:sz w:val="24"/>
+          <w:szCs w:val="22"/>
+          <w:lang w:val="en-US"/>
+        </w:rPr>
+        <w:lastRenderedPageBreak/>
+        <w:t xml:space="preserve">Requirement: </w:t>
+      </w:r>
+      <w:r>
+        <w:rPr>
+          <w:sz w:val="24"/>
+          <w:szCs w:val="22"/>
+          <w:lang w:val="en-US"/>
+        </w:rPr>
+        <w:t>Validate Title of Google</w:t>
+      </w:r>
+    </w:p>
+    <w:p>
+      <w:pPr>
+        <w:pStyle w:val="ListParagraph"/>
+        <w:numPr>
+          <w:ilvl w:val="0"/>
+          <w:numId w:val="44"/>
+        </w:numPr>
+        <w:rPr>
+          <w:sz w:val="24"/>
+          <w:szCs w:val="22"/>
+          <w:lang w:val="en-US"/>
+        </w:rPr>
+      </w:pPr>
+      <w:r>
+        <w:rPr>
+          <w:sz w:val="24"/>
+          <w:szCs w:val="22"/>
+          <w:lang w:val="en-US"/>
+        </w:rPr>
+        <w:t>Open Google Home Page</w:t>
+      </w:r>
+    </w:p>
+    <w:p>
+      <w:pPr>
+        <w:pStyle w:val="ListParagraph"/>
+        <w:numPr>
+          <w:ilvl w:val="0"/>
+          <w:numId w:val="44"/>
+        </w:numPr>
+        <w:rPr>
+          <w:sz w:val="24"/>
+          <w:szCs w:val="22"/>
+          <w:lang w:val="en-US"/>
+        </w:rPr>
+      </w:pPr>
+      <w:r>
+        <w:rPr>
+          <w:sz w:val="24"/>
+          <w:szCs w:val="22"/>
+          <w:lang w:val="en-US"/>
+        </w:rPr>
+        <w:t>Read the title</w:t>
+      </w:r>
+    </w:p>
+    <w:p>
+      <w:pPr>
+        <w:pStyle w:val="ListParagraph"/>
+        <w:numPr>
+          <w:ilvl w:val="0"/>
+          <w:numId w:val="44"/>
+        </w:numPr>
+        <w:rPr>
+          <w:sz w:val="24"/>
+          <w:szCs w:val="22"/>
+          <w:lang w:val="en-US"/>
+        </w:rPr>
+      </w:pPr>
+      <w:r>
+        <w:rPr>
+          <w:sz w:val="24"/>
+          <w:szCs w:val="22"/>
+          <w:lang w:val="en-US"/>
+        </w:rPr>
+        <w:t>Title should be Google</w:t>
+      </w:r>
+    </w:p>
+    <w:p>
+      <w:pPr>
+        <w:rPr>
+          <w:b/>
+          <w:bCs/>
+          <w:sz w:val="24"/>
+          <w:szCs w:val="22"/>
+          <w:lang w:val="en-US"/>
+        </w:rPr>
+      </w:pPr>
+      <w:r>
+        <w:rPr>
+          <w:b/>
+          <w:bCs/>
+          <w:sz w:val="24"/>
+          <w:szCs w:val="22"/>
+          <w:lang w:val="en-US"/>
+        </w:rPr>
+        <w:t>Feature File</w:t>
+      </w:r>
+    </w:p>
+    <w:p>
+      <w:pPr>
+        <w:rPr>
+          <w:sz w:val="24"/>
+          <w:szCs w:val="22"/>
+          <w:lang w:val="en-US"/>
+        </w:rPr>
+      </w:pPr>
+      <w:r>
+        <w:rPr>
+          <w:sz w:val="24"/>
+          <w:szCs w:val="22"/>
+          <w:lang w:val="en-US"/>
+        </w:rPr>
+        <w:t>Feature: Validate Google Home page</w:t>
+      </w:r>
+    </w:p>
+    <w:p>
+      <w:pPr>
+        <w:rPr>
+          <w:sz w:val="24"/>
+          <w:szCs w:val="22"/>
+          <w:lang w:val="en-US"/>
+        </w:rPr>
+      </w:pPr>
+      <w:r>
+        <w:rPr>
+          <w:sz w:val="24"/>
+          <w:szCs w:val="22"/>
+          <w:lang w:val="en-US"/>
+        </w:rPr>
+        <w:t>Scenario: To validate title of Google home page</w:t>
+      </w:r>
+    </w:p>
+    <w:p>
+      <w:pPr>
+        <w:rPr>
+          <w:sz w:val="24"/>
+          <w:szCs w:val="22"/>
+          <w:lang w:val="en-US"/>
+        </w:rPr>
+      </w:pPr>
+      <w:r>
+        <w:rPr>
+          <w:sz w:val="24"/>
+          <w:szCs w:val="22"/>
+          <w:lang w:val="en-US"/>
+        </w:rPr>
+        <w:t xml:space="preserve">Given </w:t>
+      </w:r>
+      <w:r>
+        <w:rPr>
+          <w:sz w:val="24"/>
+          <w:szCs w:val="22"/>
+          <w:lang w:val="en-US"/>
+        </w:rPr>
+        <w:t>Launch google home page</w:t>
+      </w:r>
+    </w:p>
+    <w:p>
+      <w:pPr>
+        <w:rPr>
+          <w:sz w:val="24"/>
+          <w:szCs w:val="22"/>
+          <w:lang w:val="en-US"/>
+        </w:rPr>
+      </w:pPr>
+      <w:r>
+        <w:rPr>
+          <w:sz w:val="24"/>
+          <w:szCs w:val="22"/>
+          <w:lang w:val="en-US"/>
+        </w:rPr>
+        <w:t xml:space="preserve">When </w:t>
+      </w:r>
+      <w:proofErr w:type="gramStart"/>
+      <w:r>
+        <w:rPr>
+          <w:sz w:val="24"/>
+          <w:szCs w:val="22"/>
+          <w:lang w:val="en-US"/>
+        </w:rPr>
+        <w:t>Capture</w:t>
+      </w:r>
+      <w:proofErr w:type="gramEnd"/>
+      <w:r>
+        <w:rPr>
+          <w:sz w:val="24"/>
+          <w:szCs w:val="22"/>
+          <w:lang w:val="en-US"/>
+        </w:rPr>
+        <w:t xml:space="preserve"> the title </w:t>
+      </w:r>
+    </w:p>
+    <w:p>
+      <w:pPr>
+        <w:rPr>
+          <w:sz w:val="24"/>
+          <w:szCs w:val="22"/>
+          <w:lang w:val="en-US"/>
+        </w:rPr>
+      </w:pPr>
+      <w:r>
+        <w:rPr>
+          <w:sz w:val="24"/>
+          <w:szCs w:val="22"/>
+          <w:lang w:val="en-US"/>
+        </w:rPr>
+        <w:t>Then Title should be Google</w:t>
+      </w:r>
+    </w:p>
+    <w:p>
+      <w:pPr>
+        <w:pBdr>
+          <w:bottom w:val="single" w:sz="6" w:space="1" w:color="auto"/>
+        </w:pBdr>
+        <w:rPr>
+          <w:sz w:val="24"/>
+          <w:szCs w:val="22"/>
+          <w:lang w:val="en-US"/>
+        </w:rPr>
+      </w:pPr>
+    </w:p>
+    <w:p>
+      <w:pPr>
+        <w:rPr>
+          <w:sz w:val="24"/>
+          <w:szCs w:val="22"/>
+          <w:lang w:val="en-US"/>
+        </w:rPr>
+      </w:pPr>
+      <w:r>
+        <w:rPr>
+          <w:b/>
+          <w:bCs/>
+          <w:sz w:val="24"/>
+          <w:szCs w:val="22"/>
+          <w:lang w:val="en-US"/>
+        </w:rPr>
+        <w:t xml:space="preserve">Requirement: </w:t>
+      </w:r>
+      <w:r>
+        <w:rPr>
+          <w:sz w:val="24"/>
+          <w:szCs w:val="22"/>
+          <w:lang w:val="en-US"/>
+        </w:rPr>
+        <w:t>Search Functionality on Google</w:t>
+      </w:r>
+    </w:p>
+    <w:p>
+      <w:pPr>
+        <w:pStyle w:val="ListParagraph"/>
+        <w:numPr>
+          <w:ilvl w:val="0"/>
+          <w:numId w:val="45"/>
+        </w:numPr>
+        <w:rPr>
+          <w:sz w:val="24"/>
+          <w:szCs w:val="22"/>
+          <w:lang w:val="en-US"/>
+        </w:rPr>
+      </w:pPr>
+      <w:r>
+        <w:rPr>
+          <w:sz w:val="24"/>
+          <w:szCs w:val="22"/>
+          <w:lang w:val="en-US"/>
+        </w:rPr>
+        <w:t>Open Google</w:t>
+      </w:r>
+    </w:p>
+    <w:p>
+      <w:pPr>
+        <w:pStyle w:val="ListParagraph"/>
+        <w:numPr>
+          <w:ilvl w:val="0"/>
+          <w:numId w:val="45"/>
+        </w:numPr>
+        <w:rPr>
+          <w:sz w:val="24"/>
+          <w:szCs w:val="22"/>
+          <w:lang w:val="en-US"/>
+        </w:rPr>
+      </w:pPr>
+      <w:r>
+        <w:rPr>
+          <w:sz w:val="24"/>
+          <w:szCs w:val="22"/>
+          <w:lang w:val="en-US"/>
+        </w:rPr>
+        <w:t>Click on Search box</w:t>
+      </w:r>
+    </w:p>
+    <w:p>
+      <w:pPr>
+        <w:pStyle w:val="ListParagraph"/>
+        <w:numPr>
+          <w:ilvl w:val="0"/>
+          <w:numId w:val="45"/>
+        </w:numPr>
+        <w:rPr>
+          <w:sz w:val="24"/>
+          <w:szCs w:val="22"/>
+          <w:lang w:val="en-US"/>
+        </w:rPr>
+      </w:pPr>
+      <w:r>
+        <w:rPr>
+          <w:sz w:val="24"/>
+          <w:szCs w:val="22"/>
+          <w:lang w:val="en-US"/>
+        </w:rPr>
+        <w:t>Enter text to be search</w:t>
+      </w:r>
+    </w:p>
+    <w:p>
+      <w:pPr>
+        <w:pStyle w:val="ListParagraph"/>
+        <w:numPr>
+          <w:ilvl w:val="0"/>
+          <w:numId w:val="45"/>
+        </w:numPr>
+        <w:rPr>
+          <w:sz w:val="24"/>
+          <w:szCs w:val="22"/>
+          <w:lang w:val="en-US"/>
+        </w:rPr>
+      </w:pPr>
+      <w:r>
+        <w:rPr>
+          <w:sz w:val="24"/>
+          <w:szCs w:val="22"/>
+          <w:lang w:val="en-US"/>
+        </w:rPr>
+        <w:t>Hit Enter</w:t>
+      </w:r>
+    </w:p>
+    <w:p>
+      <w:pPr>
+        <w:pStyle w:val="ListParagraph"/>
+        <w:numPr>
+          <w:ilvl w:val="0"/>
+          <w:numId w:val="45"/>
+        </w:numPr>
+        <w:rPr>
+          <w:sz w:val="24"/>
+          <w:szCs w:val="22"/>
+          <w:lang w:val="en-US"/>
+        </w:rPr>
+      </w:pPr>
+      <w:r>
+        <w:rPr>
+          <w:sz w:val="24"/>
+          <w:szCs w:val="22"/>
+          <w:lang w:val="en-US"/>
+        </w:rPr>
+        <w:t>A valid search result should display</w:t>
+      </w:r>
+    </w:p>
+    <w:p>
+      <w:pPr>
+        <w:rPr>
+          <w:b/>
+          <w:bCs/>
+          <w:sz w:val="24"/>
+          <w:szCs w:val="22"/>
+          <w:lang w:val="en-US"/>
+        </w:rPr>
+      </w:pPr>
+      <w:r>
+        <w:rPr>
+          <w:b/>
+          <w:bCs/>
+          <w:sz w:val="24"/>
+          <w:szCs w:val="22"/>
+          <w:lang w:val="en-US"/>
+        </w:rPr>
+        <w:t>Feature File</w:t>
+      </w:r>
+    </w:p>
+    <w:p>
+      <w:pPr>
+        <w:rPr>
+          <w:sz w:val="24"/>
+          <w:szCs w:val="22"/>
+          <w:lang w:val="en-US"/>
+        </w:rPr>
+      </w:pPr>
+      <w:r>
+        <w:rPr>
+          <w:sz w:val="24"/>
+          <w:szCs w:val="22"/>
+          <w:lang w:val="en-US"/>
+        </w:rPr>
+        <w:t>Feature: Search Functionality on Google</w:t>
+      </w:r>
+    </w:p>
+    <w:p>
+      <w:pPr>
+        <w:rPr>
+          <w:sz w:val="24"/>
+          <w:szCs w:val="22"/>
+          <w:lang w:val="en-US"/>
+        </w:rPr>
+      </w:pPr>
+      <w:r>
+        <w:rPr>
+          <w:sz w:val="24"/>
+          <w:szCs w:val="22"/>
+          <w:lang w:val="en-US"/>
+        </w:rPr>
+        <w:t>Scenario: To validate search functionality on Google</w:t>
+      </w:r>
+    </w:p>
+    <w:p>
+      <w:pPr>
+        <w:rPr>
+          <w:sz w:val="24"/>
+          <w:szCs w:val="22"/>
+          <w:lang w:val="en-US"/>
+        </w:rPr>
+      </w:pPr>
+      <w:r>
+        <w:rPr>
+          <w:sz w:val="24"/>
+          <w:szCs w:val="22"/>
+          <w:lang w:val="en-US"/>
+        </w:rPr>
+        <w:t>Given Open Google</w:t>
+      </w:r>
+    </w:p>
+    <w:p>
+      <w:pPr>
+        <w:rPr>
+          <w:sz w:val="24"/>
+          <w:szCs w:val="22"/>
+          <w:lang w:val="en-US"/>
+        </w:rPr>
+      </w:pPr>
+      <w:r>
+        <w:rPr>
+          <w:sz w:val="24"/>
+          <w:szCs w:val="22"/>
+          <w:lang w:val="en-US"/>
+        </w:rPr>
+        <w:t xml:space="preserve">When </w:t>
+      </w:r>
+      <w:proofErr w:type="gramStart"/>
+      <w:r>
+        <w:rPr>
+          <w:sz w:val="24"/>
+          <w:szCs w:val="22"/>
+          <w:lang w:val="en-US"/>
+        </w:rPr>
+        <w:t>Enter</w:t>
+      </w:r>
+      <w:proofErr w:type="gramEnd"/>
+      <w:r>
+        <w:rPr>
+          <w:sz w:val="24"/>
+          <w:szCs w:val="22"/>
+          <w:lang w:val="en-US"/>
+        </w:rPr>
+        <w:t xml:space="preserve"> text to search in search box</w:t>
+      </w:r>
+    </w:p>
+    <w:p>
+      <w:pPr>
+        <w:rPr>
+          <w:sz w:val="24"/>
+          <w:szCs w:val="22"/>
+          <w:lang w:val="en-US"/>
+        </w:rPr>
+      </w:pPr>
+      <w:r>
+        <w:rPr>
+          <w:sz w:val="24"/>
+          <w:szCs w:val="22"/>
+          <w:lang w:val="en-US"/>
+        </w:rPr>
+        <w:t>And Hit Enter key</w:t>
+      </w:r>
+    </w:p>
+    <w:p>
+      <w:pPr>
+        <w:rPr>
+          <w:sz w:val="24"/>
+          <w:szCs w:val="22"/>
+          <w:lang w:val="en-US"/>
+        </w:rPr>
+      </w:pPr>
+      <w:r>
+        <w:rPr>
+          <w:sz w:val="24"/>
+          <w:szCs w:val="22"/>
+          <w:lang w:val="en-US"/>
+        </w:rPr>
+        <w:t xml:space="preserve">Then </w:t>
+      </w:r>
+      <w:proofErr w:type="gramStart"/>
+      <w:r>
+        <w:rPr>
+          <w:sz w:val="24"/>
+          <w:szCs w:val="22"/>
+          <w:lang w:val="en-US"/>
+        </w:rPr>
+        <w:t>A</w:t>
+      </w:r>
+      <w:proofErr w:type="gramEnd"/>
+      <w:r>
+        <w:rPr>
+          <w:sz w:val="24"/>
+          <w:szCs w:val="22"/>
+          <w:lang w:val="en-US"/>
+        </w:rPr>
+        <w:t xml:space="preserve"> valid search result should display</w:t>
+      </w:r>
+    </w:p>
+    <w:p>
+      <w:pPr>
+        <w:rPr>
+          <w:sz w:val="24"/>
+          <w:szCs w:val="22"/>
+          <w:lang w:val="en-US"/>
+        </w:rPr>
+      </w:pPr>
+    </w:p>
+    <w:p>
+      <w:pPr>
+        <w:rPr>
+          <w:sz w:val="24"/>
+          <w:szCs w:val="22"/>
+          <w:lang w:val="en-US"/>
+        </w:rPr>
+      </w:pPr>
+    </w:p>
+    <w:p>
+      <w:pPr>
+        <w:rPr>
+          <w:b/>
+          <w:bCs/>
+          <w:sz w:val="24"/>
+          <w:szCs w:val="22"/>
+          <w:lang w:val="en-US"/>
+        </w:rPr>
+      </w:pPr>
+      <w:r>
+        <w:rPr>
+          <w:b/>
+          <w:bCs/>
+          <w:sz w:val="24"/>
+          <w:szCs w:val="22"/>
+          <w:lang w:val="en-US"/>
+        </w:rPr>
+        <w:t>Tags in Cucumber</w:t>
+      </w:r>
+    </w:p>
+    <w:p>
+      <w:pPr>
+        <w:pStyle w:val="ListParagraph"/>
+        <w:numPr>
+          <w:ilvl w:val="0"/>
+          <w:numId w:val="46"/>
+        </w:numPr>
+        <w:rPr>
+          <w:sz w:val="24"/>
+          <w:szCs w:val="22"/>
+          <w:lang w:val="en-US"/>
+        </w:rPr>
+      </w:pPr>
+      <w:r>
+        <w:rPr>
+          <w:sz w:val="24"/>
+          <w:szCs w:val="22"/>
+          <w:lang w:val="en-US"/>
+        </w:rPr>
+        <w:t>Tags are used for executing or skipping single / multiple scenarios.</w:t>
+      </w:r>
+    </w:p>
+    <w:p>
+      <w:pPr>
+        <w:pStyle w:val="ListParagraph"/>
+        <w:numPr>
+          <w:ilvl w:val="0"/>
+          <w:numId w:val="46"/>
+        </w:numPr>
+        <w:rPr>
+          <w:sz w:val="24"/>
+          <w:szCs w:val="22"/>
+          <w:lang w:val="en-US"/>
+        </w:rPr>
+      </w:pPr>
+      <w:r>
+        <w:rPr>
+          <w:sz w:val="24"/>
+          <w:szCs w:val="22"/>
+          <w:lang w:val="en-US"/>
+        </w:rPr>
+        <w:t>Tags are specified in feature file</w:t>
+      </w:r>
+    </w:p>
+    <w:p>
+      <w:pPr>
+        <w:pStyle w:val="ListParagraph"/>
+        <w:numPr>
+          <w:ilvl w:val="0"/>
+          <w:numId w:val="46"/>
+        </w:numPr>
+        <w:rPr>
+          <w:sz w:val="24"/>
+          <w:szCs w:val="22"/>
+          <w:lang w:val="en-US"/>
+        </w:rPr>
+      </w:pPr>
+      <w:r>
+        <w:rPr>
+          <w:sz w:val="24"/>
+          <w:szCs w:val="22"/>
+          <w:lang w:val="en-US"/>
+        </w:rPr>
+        <w:t>But the execution criteria needs to defined in Runner class</w:t>
+      </w:r>
+    </w:p>
+    <w:p>
+      <w:pPr>
+        <w:pStyle w:val="ListParagraph"/>
+        <w:numPr>
+          <w:ilvl w:val="0"/>
+          <w:numId w:val="46"/>
+        </w:numPr>
+        <w:rPr>
+          <w:sz w:val="24"/>
+          <w:szCs w:val="22"/>
+          <w:lang w:val="en-US"/>
+        </w:rPr>
+      </w:pPr>
+      <w:r>
+        <w:rPr>
+          <w:sz w:val="24"/>
+          <w:szCs w:val="22"/>
+          <w:lang w:val="en-US"/>
+        </w:rPr>
+        <w:t>Every tag starts with @</w:t>
+      </w:r>
       <w:bookmarkStart w:id="0" w:name="_GoBack"/>
       <w:bookmarkEnd w:id="0"/>
-    </w:p>
-    <w:p>
-      <w:pPr>
-        <w:rPr>
-          <w:sz w:val="24"/>
-          <w:szCs w:val="22"/>
-          <w:lang w:val="en-US"/>
-        </w:rPr>
-      </w:pPr>
-    </w:p>
-    <w:p>
-      <w:pPr>
-        <w:rPr>
-          <w:sz w:val="24"/>
-          <w:szCs w:val="22"/>
-          <w:lang w:val="en-US"/>
-        </w:rPr>
-      </w:pPr>
     </w:p>
     <w:sectPr>
       <w:pgSz w:w="11906" w:h="16838"/>
@@ -13350,6 +15188,232 @@
     </w:lvl>
   </w:abstractNum>
   <w:abstractNum w:abstractNumId="17">
+    <w:nsid w:val="304B7454"/>
+    <w:multiLevelType w:val="hybridMultilevel"/>
+    <w:tmpl w:val="3962CA28"/>
+    <w:lvl w:ilvl="0" w:tplc="40090001">
+      <w:start w:val="1"/>
+      <w:numFmt w:val="bullet"/>
+      <w:lvlText w:val=""/>
+      <w:lvlJc w:val="left"/>
+      <w:pPr>
+        <w:ind w:left="720" w:hanging="360"/>
+      </w:pPr>
+      <w:rPr>
+        <w:rFonts w:ascii="Symbol" w:hAnsi="Symbol" w:hint="default"/>
+      </w:rPr>
+    </w:lvl>
+    <w:lvl w:ilvl="1" w:tplc="40090003">
+      <w:start w:val="1"/>
+      <w:numFmt w:val="bullet"/>
+      <w:lvlText w:val="o"/>
+      <w:lvlJc w:val="left"/>
+      <w:pPr>
+        <w:ind w:left="1440" w:hanging="360"/>
+      </w:pPr>
+      <w:rPr>
+        <w:rFonts w:ascii="Courier New" w:hAnsi="Courier New" w:cs="Courier New" w:hint="default"/>
+      </w:rPr>
+    </w:lvl>
+    <w:lvl w:ilvl="2" w:tplc="40090005" w:tentative="1">
+      <w:start w:val="1"/>
+      <w:numFmt w:val="bullet"/>
+      <w:lvlText w:val=""/>
+      <w:lvlJc w:val="left"/>
+      <w:pPr>
+        <w:ind w:left="2160" w:hanging="360"/>
+      </w:pPr>
+      <w:rPr>
+        <w:rFonts w:ascii="Wingdings" w:hAnsi="Wingdings" w:hint="default"/>
+      </w:rPr>
+    </w:lvl>
+    <w:lvl w:ilvl="3" w:tplc="40090001" w:tentative="1">
+      <w:start w:val="1"/>
+      <w:numFmt w:val="bullet"/>
+      <w:lvlText w:val=""/>
+      <w:lvlJc w:val="left"/>
+      <w:pPr>
+        <w:ind w:left="2880" w:hanging="360"/>
+      </w:pPr>
+      <w:rPr>
+        <w:rFonts w:ascii="Symbol" w:hAnsi="Symbol" w:hint="default"/>
+      </w:rPr>
+    </w:lvl>
+    <w:lvl w:ilvl="4" w:tplc="40090003" w:tentative="1">
+      <w:start w:val="1"/>
+      <w:numFmt w:val="bullet"/>
+      <w:lvlText w:val="o"/>
+      <w:lvlJc w:val="left"/>
+      <w:pPr>
+        <w:ind w:left="3600" w:hanging="360"/>
+      </w:pPr>
+      <w:rPr>
+        <w:rFonts w:ascii="Courier New" w:hAnsi="Courier New" w:cs="Courier New" w:hint="default"/>
+      </w:rPr>
+    </w:lvl>
+    <w:lvl w:ilvl="5" w:tplc="40090005" w:tentative="1">
+      <w:start w:val="1"/>
+      <w:numFmt w:val="bullet"/>
+      <w:lvlText w:val=""/>
+      <w:lvlJc w:val="left"/>
+      <w:pPr>
+        <w:ind w:left="4320" w:hanging="360"/>
+      </w:pPr>
+      <w:rPr>
+        <w:rFonts w:ascii="Wingdings" w:hAnsi="Wingdings" w:hint="default"/>
+      </w:rPr>
+    </w:lvl>
+    <w:lvl w:ilvl="6" w:tplc="40090001" w:tentative="1">
+      <w:start w:val="1"/>
+      <w:numFmt w:val="bullet"/>
+      <w:lvlText w:val=""/>
+      <w:lvlJc w:val="left"/>
+      <w:pPr>
+        <w:ind w:left="5040" w:hanging="360"/>
+      </w:pPr>
+      <w:rPr>
+        <w:rFonts w:ascii="Symbol" w:hAnsi="Symbol" w:hint="default"/>
+      </w:rPr>
+    </w:lvl>
+    <w:lvl w:ilvl="7" w:tplc="40090003" w:tentative="1">
+      <w:start w:val="1"/>
+      <w:numFmt w:val="bullet"/>
+      <w:lvlText w:val="o"/>
+      <w:lvlJc w:val="left"/>
+      <w:pPr>
+        <w:ind w:left="5760" w:hanging="360"/>
+      </w:pPr>
+      <w:rPr>
+        <w:rFonts w:ascii="Courier New" w:hAnsi="Courier New" w:cs="Courier New" w:hint="default"/>
+      </w:rPr>
+    </w:lvl>
+    <w:lvl w:ilvl="8" w:tplc="40090005" w:tentative="1">
+      <w:start w:val="1"/>
+      <w:numFmt w:val="bullet"/>
+      <w:lvlText w:val=""/>
+      <w:lvlJc w:val="left"/>
+      <w:pPr>
+        <w:ind w:left="6480" w:hanging="360"/>
+      </w:pPr>
+      <w:rPr>
+        <w:rFonts w:ascii="Wingdings" w:hAnsi="Wingdings" w:hint="default"/>
+      </w:rPr>
+    </w:lvl>
+  </w:abstractNum>
+  <w:abstractNum w:abstractNumId="18">
+    <w:nsid w:val="32A06B8A"/>
+    <w:multiLevelType w:val="hybridMultilevel"/>
+    <w:tmpl w:val="92CC3150"/>
+    <w:lvl w:ilvl="0" w:tplc="40090001">
+      <w:start w:val="1"/>
+      <w:numFmt w:val="bullet"/>
+      <w:lvlText w:val=""/>
+      <w:lvlJc w:val="left"/>
+      <w:pPr>
+        <w:ind w:left="720" w:hanging="360"/>
+      </w:pPr>
+      <w:rPr>
+        <w:rFonts w:ascii="Symbol" w:hAnsi="Symbol" w:hint="default"/>
+      </w:rPr>
+    </w:lvl>
+    <w:lvl w:ilvl="1" w:tplc="40090003" w:tentative="1">
+      <w:start w:val="1"/>
+      <w:numFmt w:val="bullet"/>
+      <w:lvlText w:val="o"/>
+      <w:lvlJc w:val="left"/>
+      <w:pPr>
+        <w:ind w:left="1440" w:hanging="360"/>
+      </w:pPr>
+      <w:rPr>
+        <w:rFonts w:ascii="Courier New" w:hAnsi="Courier New" w:cs="Courier New" w:hint="default"/>
+      </w:rPr>
+    </w:lvl>
+    <w:lvl w:ilvl="2" w:tplc="40090005" w:tentative="1">
+      <w:start w:val="1"/>
+      <w:numFmt w:val="bullet"/>
+      <w:lvlText w:val=""/>
+      <w:lvlJc w:val="left"/>
+      <w:pPr>
+        <w:ind w:left="2160" w:hanging="360"/>
+      </w:pPr>
+      <w:rPr>
+        <w:rFonts w:ascii="Wingdings" w:hAnsi="Wingdings" w:hint="default"/>
+      </w:rPr>
+    </w:lvl>
+    <w:lvl w:ilvl="3" w:tplc="40090001" w:tentative="1">
+      <w:start w:val="1"/>
+      <w:numFmt w:val="bullet"/>
+      <w:lvlText w:val=""/>
+      <w:lvlJc w:val="left"/>
+      <w:pPr>
+        <w:ind w:left="2880" w:hanging="360"/>
+      </w:pPr>
+      <w:rPr>
+        <w:rFonts w:ascii="Symbol" w:hAnsi="Symbol" w:hint="default"/>
+      </w:rPr>
+    </w:lvl>
+    <w:lvl w:ilvl="4" w:tplc="40090003" w:tentative="1">
+      <w:start w:val="1"/>
+      <w:numFmt w:val="bullet"/>
+      <w:lvlText w:val="o"/>
+      <w:lvlJc w:val="left"/>
+      <w:pPr>
+        <w:ind w:left="3600" w:hanging="360"/>
+      </w:pPr>
+      <w:rPr>
+        <w:rFonts w:ascii="Courier New" w:hAnsi="Courier New" w:cs="Courier New" w:hint="default"/>
+      </w:rPr>
+    </w:lvl>
+    <w:lvl w:ilvl="5" w:tplc="40090005" w:tentative="1">
+      <w:start w:val="1"/>
+      <w:numFmt w:val="bullet"/>
+      <w:lvlText w:val=""/>
+      <w:lvlJc w:val="left"/>
+      <w:pPr>
+        <w:ind w:left="4320" w:hanging="360"/>
+      </w:pPr>
+      <w:rPr>
+        <w:rFonts w:ascii="Wingdings" w:hAnsi="Wingdings" w:hint="default"/>
+      </w:rPr>
+    </w:lvl>
+    <w:lvl w:ilvl="6" w:tplc="40090001" w:tentative="1">
+      <w:start w:val="1"/>
+      <w:numFmt w:val="bullet"/>
+      <w:lvlText w:val=""/>
+      <w:lvlJc w:val="left"/>
+      <w:pPr>
+        <w:ind w:left="5040" w:hanging="360"/>
+      </w:pPr>
+      <w:rPr>
+        <w:rFonts w:ascii="Symbol" w:hAnsi="Symbol" w:hint="default"/>
+      </w:rPr>
+    </w:lvl>
+    <w:lvl w:ilvl="7" w:tplc="40090003" w:tentative="1">
+      <w:start w:val="1"/>
+      <w:numFmt w:val="bullet"/>
+      <w:lvlText w:val="o"/>
+      <w:lvlJc w:val="left"/>
+      <w:pPr>
+        <w:ind w:left="5760" w:hanging="360"/>
+      </w:pPr>
+      <w:rPr>
+        <w:rFonts w:ascii="Courier New" w:hAnsi="Courier New" w:cs="Courier New" w:hint="default"/>
+      </w:rPr>
+    </w:lvl>
+    <w:lvl w:ilvl="8" w:tplc="40090005" w:tentative="1">
+      <w:start w:val="1"/>
+      <w:numFmt w:val="bullet"/>
+      <w:lvlText w:val=""/>
+      <w:lvlJc w:val="left"/>
+      <w:pPr>
+        <w:ind w:left="6480" w:hanging="360"/>
+      </w:pPr>
+      <w:rPr>
+        <w:rFonts w:ascii="Wingdings" w:hAnsi="Wingdings" w:hint="default"/>
+      </w:rPr>
+    </w:lvl>
+  </w:abstractNum>
+  <w:abstractNum w:abstractNumId="19">
     <w:nsid w:val="32FE0416"/>
     <w:multiLevelType w:val="hybridMultilevel"/>
     <w:tmpl w:val="16BC674C"/>
@@ -13438,7 +15502,7 @@
       </w:pPr>
     </w:lvl>
   </w:abstractNum>
-  <w:abstractNum w:abstractNumId="18">
+  <w:abstractNum w:abstractNumId="20">
     <w:nsid w:val="37062EB4"/>
     <w:multiLevelType w:val="hybridMultilevel"/>
     <w:tmpl w:val="8528B142"/>
@@ -13527,7 +15591,7 @@
       </w:pPr>
     </w:lvl>
   </w:abstractNum>
-  <w:abstractNum w:abstractNumId="19">
+  <w:abstractNum w:abstractNumId="21">
     <w:nsid w:val="3A7611DD"/>
     <w:multiLevelType w:val="hybridMultilevel"/>
     <w:tmpl w:val="69D469B0"/>
@@ -13616,7 +15680,96 @@
       </w:pPr>
     </w:lvl>
   </w:abstractNum>
-  <w:abstractNum w:abstractNumId="20">
+  <w:abstractNum w:abstractNumId="22">
+    <w:nsid w:val="3B334D9F"/>
+    <w:multiLevelType w:val="hybridMultilevel"/>
+    <w:tmpl w:val="5C9AFEE2"/>
+    <w:lvl w:ilvl="0" w:tplc="4009000F">
+      <w:start w:val="1"/>
+      <w:numFmt w:val="decimal"/>
+      <w:lvlText w:val="%1."/>
+      <w:lvlJc w:val="left"/>
+      <w:pPr>
+        <w:ind w:left="720" w:hanging="360"/>
+      </w:pPr>
+      <w:rPr>
+        <w:rFonts w:hint="default"/>
+      </w:rPr>
+    </w:lvl>
+    <w:lvl w:ilvl="1" w:tplc="40090019" w:tentative="1">
+      <w:start w:val="1"/>
+      <w:numFmt w:val="lowerLetter"/>
+      <w:lvlText w:val="%2."/>
+      <w:lvlJc w:val="left"/>
+      <w:pPr>
+        <w:ind w:left="1440" w:hanging="360"/>
+      </w:pPr>
+    </w:lvl>
+    <w:lvl w:ilvl="2" w:tplc="4009001B" w:tentative="1">
+      <w:start w:val="1"/>
+      <w:numFmt w:val="lowerRoman"/>
+      <w:lvlText w:val="%3."/>
+      <w:lvlJc w:val="right"/>
+      <w:pPr>
+        <w:ind w:left="2160" w:hanging="180"/>
+      </w:pPr>
+    </w:lvl>
+    <w:lvl w:ilvl="3" w:tplc="4009000F" w:tentative="1">
+      <w:start w:val="1"/>
+      <w:numFmt w:val="decimal"/>
+      <w:lvlText w:val="%4."/>
+      <w:lvlJc w:val="left"/>
+      <w:pPr>
+        <w:ind w:left="2880" w:hanging="360"/>
+      </w:pPr>
+    </w:lvl>
+    <w:lvl w:ilvl="4" w:tplc="40090019" w:tentative="1">
+      <w:start w:val="1"/>
+      <w:numFmt w:val="lowerLetter"/>
+      <w:lvlText w:val="%5."/>
+      <w:lvlJc w:val="left"/>
+      <w:pPr>
+        <w:ind w:left="3600" w:hanging="360"/>
+      </w:pPr>
+    </w:lvl>
+    <w:lvl w:ilvl="5" w:tplc="4009001B" w:tentative="1">
+      <w:start w:val="1"/>
+      <w:numFmt w:val="lowerRoman"/>
+      <w:lvlText w:val="%6."/>
+      <w:lvlJc w:val="right"/>
+      <w:pPr>
+        <w:ind w:left="4320" w:hanging="180"/>
+      </w:pPr>
+    </w:lvl>
+    <w:lvl w:ilvl="6" w:tplc="4009000F" w:tentative="1">
+      <w:start w:val="1"/>
+      <w:numFmt w:val="decimal"/>
+      <w:lvlText w:val="%7."/>
+      <w:lvlJc w:val="left"/>
+      <w:pPr>
+        <w:ind w:left="5040" w:hanging="360"/>
+      </w:pPr>
+    </w:lvl>
+    <w:lvl w:ilvl="7" w:tplc="40090019" w:tentative="1">
+      <w:start w:val="1"/>
+      <w:numFmt w:val="lowerLetter"/>
+      <w:lvlText w:val="%8."/>
+      <w:lvlJc w:val="left"/>
+      <w:pPr>
+        <w:ind w:left="5760" w:hanging="360"/>
+      </w:pPr>
+    </w:lvl>
+    <w:lvl w:ilvl="8" w:tplc="4009001B" w:tentative="1">
+      <w:start w:val="1"/>
+      <w:numFmt w:val="lowerRoman"/>
+      <w:lvlText w:val="%9."/>
+      <w:lvlJc w:val="right"/>
+      <w:pPr>
+        <w:ind w:left="6480" w:hanging="180"/>
+      </w:pPr>
+    </w:lvl>
+  </w:abstractNum>
+  <w:abstractNum w:abstractNumId="23">
     <w:nsid w:val="3B892462"/>
     <w:multiLevelType w:val="hybridMultilevel"/>
     <w:tmpl w:val="CB1C6C4E"/>
@@ -13705,7 +15858,7 @@
       </w:pPr>
     </w:lvl>
   </w:abstractNum>
-  <w:abstractNum w:abstractNumId="21">
+  <w:abstractNum w:abstractNumId="24">
     <w:nsid w:val="40361D0B"/>
     <w:multiLevelType w:val="hybridMultilevel"/>
     <w:tmpl w:val="4A54C56E"/>
@@ -13794,7 +15947,7 @@
       </w:pPr>
     </w:lvl>
   </w:abstractNum>
-  <w:abstractNum w:abstractNumId="22">
+  <w:abstractNum w:abstractNumId="25">
     <w:nsid w:val="40C03745"/>
     <w:multiLevelType w:val="hybridMultilevel"/>
     <w:tmpl w:val="401AA9E2"/>
@@ -13907,7 +16060,96 @@
       </w:rPr>
     </w:lvl>
   </w:abstractNum>
-  <w:abstractNum w:abstractNumId="23">
+  <w:abstractNum w:abstractNumId="26">
+    <w:nsid w:val="42394E2B"/>
+    <w:multiLevelType w:val="hybridMultilevel"/>
+    <w:tmpl w:val="412A7490"/>
+    <w:lvl w:ilvl="0" w:tplc="4009000F">
+      <w:start w:val="1"/>
+      <w:numFmt w:val="decimal"/>
+      <w:lvlText w:val="%1."/>
+      <w:lvlJc w:val="left"/>
+      <w:pPr>
+        <w:ind w:left="720" w:hanging="360"/>
+      </w:pPr>
+      <w:rPr>
+        <w:rFonts w:hint="default"/>
+      </w:rPr>
+    </w:lvl>
+    <w:lvl w:ilvl="1" w:tplc="40090019">
+      <w:start w:val="1"/>
+      <w:numFmt w:val="lowerLetter"/>
+      <w:lvlText w:val="%2."/>
+      <w:lvlJc w:val="left"/>
+      <w:pPr>
+        <w:ind w:left="1440" w:hanging="360"/>
+      </w:pPr>
+    </w:lvl>
+    <w:lvl w:ilvl="2" w:tplc="4009001B" w:tentative="1">
+      <w:start w:val="1"/>
+      <w:numFmt w:val="lowerRoman"/>
+      <w:lvlText w:val="%3."/>
+      <w:lvlJc w:val="right"/>
+      <w:pPr>
+        <w:ind w:left="2160" w:hanging="180"/>
+      </w:pPr>
+    </w:lvl>
+    <w:lvl w:ilvl="3" w:tplc="4009000F" w:tentative="1">
+      <w:start w:val="1"/>
+      <w:numFmt w:val="decimal"/>
+      <w:lvlText w:val="%4."/>
+      <w:lvlJc w:val="left"/>
+      <w:pPr>
+        <w:ind w:left="2880" w:hanging="360"/>
+      </w:pPr>
+    </w:lvl>
+    <w:lvl w:ilvl="4" w:tplc="40090019" w:tentative="1">
+      <w:start w:val="1"/>
+      <w:numFmt w:val="lowerLetter"/>
+      <w:lvlText w:val="%5."/>
+      <w:lvlJc w:val="left"/>
+      <w:pPr>
+        <w:ind w:left="3600" w:hanging="360"/>
+      </w:pPr>
+    </w:lvl>
+    <w:lvl w:ilvl="5" w:tplc="4009001B" w:tentative="1">
+      <w:start w:val="1"/>
+      <w:numFmt w:val="lowerRoman"/>
+      <w:lvlText w:val="%6."/>
+      <w:lvlJc w:val="right"/>
+      <w:pPr>
+        <w:ind w:left="4320" w:hanging="180"/>
+      </w:pPr>
+    </w:lvl>
+    <w:lvl w:ilvl="6" w:tplc="4009000F" w:tentative="1">
+      <w:start w:val="1"/>
+      <w:numFmt w:val="decimal"/>
+      <w:lvlText w:val="%7."/>
+      <w:lvlJc w:val="left"/>
+      <w:pPr>
+        <w:ind w:left="5040" w:hanging="360"/>
+      </w:pPr>
+    </w:lvl>
+    <w:lvl w:ilvl="7" w:tplc="40090019" w:tentative="1">
+      <w:start w:val="1"/>
+      <w:numFmt w:val="lowerLetter"/>
+      <w:lvlText w:val="%8."/>
+      <w:lvlJc w:val="left"/>
+      <w:pPr>
+        <w:ind w:left="5760" w:hanging="360"/>
+      </w:pPr>
+    </w:lvl>
+    <w:lvl w:ilvl="8" w:tplc="4009001B" w:tentative="1">
+      <w:start w:val="1"/>
+      <w:numFmt w:val="lowerRoman"/>
+      <w:lvlText w:val="%9."/>
+      <w:lvlJc w:val="right"/>
+      <w:pPr>
+        <w:ind w:left="6480" w:hanging="180"/>
+      </w:pPr>
+    </w:lvl>
+  </w:abstractNum>
+  <w:abstractNum w:abstractNumId="27">
     <w:nsid w:val="4B45536D"/>
     <w:multiLevelType w:val="hybridMultilevel"/>
     <w:tmpl w:val="0B3449C8"/>
@@ -13996,7 +16238,7 @@
       </w:pPr>
     </w:lvl>
   </w:abstractNum>
-  <w:abstractNum w:abstractNumId="24">
+  <w:abstractNum w:abstractNumId="28">
     <w:nsid w:val="4D236C02"/>
     <w:multiLevelType w:val="hybridMultilevel"/>
     <w:tmpl w:val="CBFADF28"/>
@@ -14109,7 +16351,7 @@
       </w:rPr>
     </w:lvl>
   </w:abstractNum>
-  <w:abstractNum w:abstractNumId="25">
+  <w:abstractNum w:abstractNumId="29">
     <w:nsid w:val="4FC02C6C"/>
     <w:multiLevelType w:val="hybridMultilevel"/>
     <w:tmpl w:val="05D2B08E"/>
@@ -14198,7 +16440,96 @@
       </w:pPr>
     </w:lvl>
   </w:abstractNum>
-  <w:abstractNum w:abstractNumId="26">
+  <w:abstractNum w:abstractNumId="30">
+    <w:nsid w:val="509939C1"/>
+    <w:multiLevelType w:val="hybridMultilevel"/>
+    <w:tmpl w:val="BD90E928"/>
+    <w:lvl w:ilvl="0" w:tplc="4009000F">
+      <w:start w:val="1"/>
+      <w:numFmt w:val="decimal"/>
+      <w:lvlText w:val="%1."/>
+      <w:lvlJc w:val="left"/>
+      <w:pPr>
+        <w:ind w:left="720" w:hanging="360"/>
+      </w:pPr>
+      <w:rPr>
+        <w:rFonts w:hint="default"/>
+      </w:rPr>
+    </w:lvl>
+    <w:lvl w:ilvl="1" w:tplc="40090019" w:tentative="1">
+      <w:start w:val="1"/>
+      <w:numFmt w:val="lowerLetter"/>
+      <w:lvlText w:val="%2."/>
+      <w:lvlJc w:val="left"/>
+      <w:pPr>
+        <w:ind w:left="1440" w:hanging="360"/>
+      </w:pPr>
+    </w:lvl>
+    <w:lvl w:ilvl="2" w:tplc="4009001B" w:tentative="1">
+      <w:start w:val="1"/>
+      <w:numFmt w:val="lowerRoman"/>
+      <w:lvlText w:val="%3."/>
+      <w:lvlJc w:val="right"/>
+      <w:pPr>
+        <w:ind w:left="2160" w:hanging="180"/>
+      </w:pPr>
+    </w:lvl>
+    <w:lvl w:ilvl="3" w:tplc="4009000F" w:tentative="1">
+      <w:start w:val="1"/>
+      <w:numFmt w:val="decimal"/>
+      <w:lvlText w:val="%4."/>
+      <w:lvlJc w:val="left"/>
+      <w:pPr>
+        <w:ind w:left="2880" w:hanging="360"/>
+      </w:pPr>
+    </w:lvl>
+    <w:lvl w:ilvl="4" w:tplc="40090019" w:tentative="1">
+      <w:start w:val="1"/>
+      <w:numFmt w:val="lowerLetter"/>
+      <w:lvlText w:val="%5."/>
+      <w:lvlJc w:val="left"/>
+      <w:pPr>
+        <w:ind w:left="3600" w:hanging="360"/>
+      </w:pPr>
+    </w:lvl>
+    <w:lvl w:ilvl="5" w:tplc="4009001B" w:tentative="1">
+      <w:start w:val="1"/>
+      <w:numFmt w:val="lowerRoman"/>
+      <w:lvlText w:val="%6."/>
+      <w:lvlJc w:val="right"/>
+      <w:pPr>
+        <w:ind w:left="4320" w:hanging="180"/>
+      </w:pPr>
+    </w:lvl>
+    <w:lvl w:ilvl="6" w:tplc="4009000F" w:tentative="1">
+      <w:start w:val="1"/>
+      <w:numFmt w:val="decimal"/>
+      <w:lvlText w:val="%7."/>
+      <w:lvlJc w:val="left"/>
+      <w:pPr>
+        <w:ind w:left="5040" w:hanging="360"/>
+      </w:pPr>
+    </w:lvl>
+    <w:lvl w:ilvl="7" w:tplc="40090019" w:tentative="1">
+      <w:start w:val="1"/>
+      <w:numFmt w:val="lowerLetter"/>
+      <w:lvlText w:val="%8."/>
+      <w:lvlJc w:val="left"/>
+      <w:pPr>
+        <w:ind w:left="5760" w:hanging="360"/>
+      </w:pPr>
+    </w:lvl>
+    <w:lvl w:ilvl="8" w:tplc="4009001B" w:tentative="1">
+      <w:start w:val="1"/>
+      <w:numFmt w:val="lowerRoman"/>
+      <w:lvlText w:val="%9."/>
+      <w:lvlJc w:val="right"/>
+      <w:pPr>
+        <w:ind w:left="6480" w:hanging="180"/>
+      </w:pPr>
+    </w:lvl>
+  </w:abstractNum>
+  <w:abstractNum w:abstractNumId="31">
     <w:nsid w:val="52B52268"/>
     <w:multiLevelType w:val="hybridMultilevel"/>
     <w:tmpl w:val="331AF78C"/>
@@ -14311,7 +16642,7 @@
       </w:rPr>
     </w:lvl>
   </w:abstractNum>
-  <w:abstractNum w:abstractNumId="27">
+  <w:abstractNum w:abstractNumId="32">
     <w:nsid w:val="55D92B24"/>
     <w:multiLevelType w:val="hybridMultilevel"/>
     <w:tmpl w:val="9BCED27C"/>
@@ -14424,7 +16755,7 @@
       </w:rPr>
     </w:lvl>
   </w:abstractNum>
-  <w:abstractNum w:abstractNumId="28">
+  <w:abstractNum w:abstractNumId="33">
     <w:nsid w:val="57564656"/>
     <w:multiLevelType w:val="hybridMultilevel"/>
     <w:tmpl w:val="3E1C27F6"/>
@@ -14537,7 +16868,7 @@
       </w:rPr>
     </w:lvl>
   </w:abstractNum>
-  <w:abstractNum w:abstractNumId="29">
+  <w:abstractNum w:abstractNumId="34">
     <w:nsid w:val="61A962B8"/>
     <w:multiLevelType w:val="hybridMultilevel"/>
     <w:tmpl w:val="5EDC7138"/>
@@ -14626,7 +16957,7 @@
       </w:pPr>
     </w:lvl>
   </w:abstractNum>
-  <w:abstractNum w:abstractNumId="30">
+  <w:abstractNum w:abstractNumId="35">
     <w:nsid w:val="69867F0D"/>
     <w:multiLevelType w:val="hybridMultilevel"/>
     <w:tmpl w:val="EAF8E468"/>
@@ -14715,7 +17046,7 @@
       </w:pPr>
     </w:lvl>
   </w:abstractNum>
-  <w:abstractNum w:abstractNumId="31">
+  <w:abstractNum w:abstractNumId="36">
     <w:nsid w:val="6E5A4342"/>
     <w:multiLevelType w:val="hybridMultilevel"/>
     <w:tmpl w:val="414440E6"/>
@@ -14804,7 +17135,7 @@
       </w:pPr>
     </w:lvl>
   </w:abstractNum>
-  <w:abstractNum w:abstractNumId="32">
+  <w:abstractNum w:abstractNumId="37">
     <w:nsid w:val="6F0A1BD2"/>
     <w:multiLevelType w:val="hybridMultilevel"/>
     <w:tmpl w:val="EF7884CC"/>
@@ -14917,7 +17248,7 @@
       </w:rPr>
     </w:lvl>
   </w:abstractNum>
-  <w:abstractNum w:abstractNumId="33">
+  <w:abstractNum w:abstractNumId="38">
     <w:nsid w:val="6FC368C3"/>
     <w:multiLevelType w:val="hybridMultilevel"/>
     <w:tmpl w:val="F892BAB0"/>
@@ -15006,7 +17337,120 @@
       </w:pPr>
     </w:lvl>
   </w:abstractNum>
-  <w:abstractNum w:abstractNumId="34">
+  <w:abstractNum w:abstractNumId="39">
+    <w:nsid w:val="716E4BD9"/>
+    <w:multiLevelType w:val="hybridMultilevel"/>
+    <w:tmpl w:val="2916BD50"/>
+    <w:lvl w:ilvl="0" w:tplc="40090001">
+      <w:start w:val="1"/>
+      <w:numFmt w:val="bullet"/>
+      <w:lvlText w:val=""/>
+      <w:lvlJc w:val="left"/>
+      <w:pPr>
+        <w:ind w:left="720" w:hanging="360"/>
+      </w:pPr>
+      <w:rPr>
+        <w:rFonts w:ascii="Symbol" w:hAnsi="Symbol" w:hint="default"/>
+      </w:rPr>
+    </w:lvl>
+    <w:lvl w:ilvl="1" w:tplc="40090003">
+      <w:start w:val="1"/>
+      <w:numFmt w:val="bullet"/>
+      <w:lvlText w:val="o"/>
+      <w:lvlJc w:val="left"/>
+      <w:pPr>
+        <w:ind w:left="1440" w:hanging="360"/>
+      </w:pPr>
+      <w:rPr>
+        <w:rFonts w:ascii="Courier New" w:hAnsi="Courier New" w:cs="Courier New" w:hint="default"/>
+      </w:rPr>
+    </w:lvl>
+    <w:lvl w:ilvl="2" w:tplc="40090005" w:tentative="1">
+      <w:start w:val="1"/>
+      <w:numFmt w:val="bullet"/>
+      <w:lvlText w:val=""/>
+      <w:lvlJc w:val="left"/>
+      <w:pPr>
+        <w:ind w:left="2160" w:hanging="360"/>
+      </w:pPr>
+      <w:rPr>
+        <w:rFonts w:ascii="Wingdings" w:hAnsi="Wingdings" w:hint="default"/>
+      </w:rPr>
+    </w:lvl>
+    <w:lvl w:ilvl="3" w:tplc="40090001" w:tentative="1">
+      <w:start w:val="1"/>
+      <w:numFmt w:val="bullet"/>
+      <w:lvlText w:val=""/>
+      <w:lvlJc w:val="left"/>
+      <w:pPr>
+        <w:ind w:left="2880" w:hanging="360"/>
+      </w:pPr>
+      <w:rPr>
+        <w:rFonts w:ascii="Symbol" w:hAnsi="Symbol" w:hint="default"/>
+      </w:rPr>
+    </w:lvl>
+    <w:lvl w:ilvl="4" w:tplc="40090003" w:tentative="1">
+      <w:start w:val="1"/>
+      <w:numFmt w:val="bullet"/>
+      <w:lvlText w:val="o"/>
+      <w:lvlJc w:val="left"/>
+      <w:pPr>
+        <w:ind w:left="3600" w:hanging="360"/>
+      </w:pPr>
+      <w:rPr>
+        <w:rFonts w:ascii="Courier New" w:hAnsi="Courier New" w:cs="Courier New" w:hint="default"/>
+      </w:rPr>
+    </w:lvl>
+    <w:lvl w:ilvl="5" w:tplc="40090005" w:tentative="1">
+      <w:start w:val="1"/>
+      <w:numFmt w:val="bullet"/>
+      <w:lvlText w:val=""/>
+      <w:lvlJc w:val="left"/>
+      <w:pPr>
+        <w:ind w:left="4320" w:hanging="360"/>
+      </w:pPr>
+      <w:rPr>
+        <w:rFonts w:ascii="Wingdings" w:hAnsi="Wingdings" w:hint="default"/>
+      </w:rPr>
+    </w:lvl>
+    <w:lvl w:ilvl="6" w:tplc="40090001" w:tentative="1">
+      <w:start w:val="1"/>
+      <w:numFmt w:val="bullet"/>
+      <w:lvlText w:val=""/>
+      <w:lvlJc w:val="left"/>
+      <w:pPr>
+        <w:ind w:left="5040" w:hanging="360"/>
+      </w:pPr>
+      <w:rPr>
+        <w:rFonts w:ascii="Symbol" w:hAnsi="Symbol" w:hint="default"/>
+      </w:rPr>
+    </w:lvl>
+    <w:lvl w:ilvl="7" w:tplc="40090003" w:tentative="1">
+      <w:start w:val="1"/>
+      <w:numFmt w:val="bullet"/>
+      <w:lvlText w:val="o"/>
+      <w:lvlJc w:val="left"/>
+      <w:pPr>
+        <w:ind w:left="5760" w:hanging="360"/>
+      </w:pPr>
+      <w:rPr>
+        <w:rFonts w:ascii="Courier New" w:hAnsi="Courier New" w:cs="Courier New" w:hint="default"/>
+      </w:rPr>
+    </w:lvl>
+    <w:lvl w:ilvl="8" w:tplc="40090005" w:tentative="1">
+      <w:start w:val="1"/>
+      <w:numFmt w:val="bullet"/>
+      <w:lvlText w:val=""/>
+      <w:lvlJc w:val="left"/>
+      <w:pPr>
+        <w:ind w:left="6480" w:hanging="360"/>
+      </w:pPr>
+      <w:rPr>
+        <w:rFonts w:ascii="Wingdings" w:hAnsi="Wingdings" w:hint="default"/>
+      </w:rPr>
+    </w:lvl>
+  </w:abstractNum>
+  <w:abstractNum w:abstractNumId="40">
     <w:nsid w:val="729D49A6"/>
     <w:multiLevelType w:val="hybridMultilevel"/>
     <w:tmpl w:val="212E6380"/>
@@ -15095,7 +17539,7 @@
       </w:pPr>
     </w:lvl>
   </w:abstractNum>
-  <w:abstractNum w:abstractNumId="35">
+  <w:abstractNum w:abstractNumId="41">
     <w:nsid w:val="72E5107C"/>
     <w:multiLevelType w:val="hybridMultilevel"/>
     <w:tmpl w:val="30BE3018"/>
@@ -15184,7 +17628,7 @@
       </w:pPr>
     </w:lvl>
   </w:abstractNum>
-  <w:abstractNum w:abstractNumId="36">
+  <w:abstractNum w:abstractNumId="42">
     <w:nsid w:val="7B1473D2"/>
     <w:multiLevelType w:val="hybridMultilevel"/>
     <w:tmpl w:val="78F6F478"/>
@@ -15273,7 +17717,7 @@
       </w:pPr>
     </w:lvl>
   </w:abstractNum>
-  <w:abstractNum w:abstractNumId="37">
+  <w:abstractNum w:abstractNumId="43">
     <w:nsid w:val="7C1B7A62"/>
     <w:multiLevelType w:val="hybridMultilevel"/>
     <w:tmpl w:val="A1EEB68C"/>
@@ -15386,7 +17830,7 @@
       </w:rPr>
     </w:lvl>
   </w:abstractNum>
-  <w:abstractNum w:abstractNumId="38">
+  <w:abstractNum w:abstractNumId="44">
     <w:nsid w:val="7E0C5E33"/>
     <w:multiLevelType w:val="hybridMultilevel"/>
     <w:tmpl w:val="17A20342"/>
@@ -15475,7 +17919,7 @@
       </w:pPr>
     </w:lvl>
   </w:abstractNum>
-  <w:abstractNum w:abstractNumId="39">
+  <w:abstractNum w:abstractNumId="45">
     <w:nsid w:val="7EEF6783"/>
     <w:multiLevelType w:val="hybridMultilevel"/>
     <w:tmpl w:val="2292AFAC"/>
@@ -15571,22 +18015,22 @@
     <w:abstractNumId w:val="9"/>
   </w:num>
   <w:num w:numId="3">
-    <w:abstractNumId w:val="37"/>
+    <w:abstractNumId w:val="43"/>
   </w:num>
   <w:num w:numId="4">
-    <w:abstractNumId w:val="27"/>
+    <w:abstractNumId w:val="32"/>
   </w:num>
   <w:num w:numId="5">
-    <w:abstractNumId w:val="18"/>
+    <w:abstractNumId w:val="20"/>
   </w:num>
   <w:num w:numId="6">
     <w:abstractNumId w:val="10"/>
   </w:num>
   <w:num w:numId="7">
-    <w:abstractNumId w:val="24"/>
+    <w:abstractNumId w:val="28"/>
   </w:num>
   <w:num w:numId="8">
-    <w:abstractNumId w:val="28"/>
+    <w:abstractNumId w:val="33"/>
   </w:num>
   <w:num w:numId="9">
     <w:abstractNumId w:val="15"/>
@@ -15604,55 +18048,55 @@
     <w:abstractNumId w:val="2"/>
   </w:num>
   <w:num w:numId="14">
-    <w:abstractNumId w:val="23"/>
+    <w:abstractNumId w:val="27"/>
   </w:num>
   <w:num w:numId="15">
-    <w:abstractNumId w:val="39"/>
+    <w:abstractNumId w:val="45"/>
   </w:num>
   <w:num w:numId="16">
     <w:abstractNumId w:val="16"/>
   </w:num>
   <w:num w:numId="17">
-    <w:abstractNumId w:val="32"/>
+    <w:abstractNumId w:val="37"/>
   </w:num>
   <w:num w:numId="18">
     <w:abstractNumId w:val="1"/>
   </w:num>
   <w:num w:numId="19">
-    <w:abstractNumId w:val="38"/>
+    <w:abstractNumId w:val="44"/>
   </w:num>
   <w:num w:numId="20">
-    <w:abstractNumId w:val="29"/>
+    <w:abstractNumId w:val="34"/>
   </w:num>
   <w:num w:numId="21">
-    <w:abstractNumId w:val="26"/>
+    <w:abstractNumId w:val="31"/>
   </w:num>
   <w:num w:numId="22">
     <w:abstractNumId w:val="3"/>
   </w:num>
   <w:num w:numId="23">
-    <w:abstractNumId w:val="34"/>
+    <w:abstractNumId w:val="40"/>
   </w:num>
   <w:num w:numId="24">
-    <w:abstractNumId w:val="25"/>
+    <w:abstractNumId w:val="29"/>
   </w:num>
   <w:num w:numId="25">
-    <w:abstractNumId w:val="31"/>
+    <w:abstractNumId w:val="36"/>
   </w:num>
   <w:num w:numId="26">
-    <w:abstractNumId w:val="17"/>
+    <w:abstractNumId w:val="19"/>
   </w:num>
   <w:num w:numId="27">
     <w:abstractNumId w:val="14"/>
   </w:num>
   <w:num w:numId="28">
-    <w:abstractNumId w:val="35"/>
+    <w:abstractNumId w:val="41"/>
   </w:num>
   <w:num w:numId="29">
-    <w:abstractNumId w:val="20"/>
+    <w:abstractNumId w:val="23"/>
   </w:num>
   <w:num w:numId="30">
-    <w:abstractNumId w:val="30"/>
+    <w:abstractNumId w:val="35"/>
   </w:num>
   <w:num w:numId="31">
     <w:abstractNumId w:val="0"/>
@@ -15661,16 +18105,16 @@
     <w:abstractNumId w:val="12"/>
   </w:num>
   <w:num w:numId="33">
-    <w:abstractNumId w:val="21"/>
+    <w:abstractNumId w:val="24"/>
   </w:num>
   <w:num w:numId="34">
-    <w:abstractNumId w:val="33"/>
+    <w:abstractNumId w:val="38"/>
   </w:num>
   <w:num w:numId="35">
-    <w:abstractNumId w:val="22"/>
+    <w:abstractNumId w:val="25"/>
   </w:num>
   <w:num w:numId="36">
-    <w:abstractNumId w:val="19"/>
+    <w:abstractNumId w:val="21"/>
   </w:num>
   <w:num w:numId="37">
     <w:abstractNumId w:val="4"/>
@@ -15682,7 +18126,25 @@
     <w:abstractNumId w:val="5"/>
   </w:num>
   <w:num w:numId="40">
-    <w:abstractNumId w:val="36"/>
+    <w:abstractNumId w:val="42"/>
+  </w:num>
+  <w:num w:numId="41">
+    <w:abstractNumId w:val="26"/>
+  </w:num>
+  <w:num w:numId="42">
+    <w:abstractNumId w:val="17"/>
+  </w:num>
+  <w:num w:numId="43">
+    <w:abstractNumId w:val="39"/>
+  </w:num>
+  <w:num w:numId="44">
+    <w:abstractNumId w:val="22"/>
+  </w:num>
+  <w:num w:numId="45">
+    <w:abstractNumId w:val="30"/>
+  </w:num>
+  <w:num w:numId="46">
+    <w:abstractNumId w:val="18"/>
   </w:num>
 </w:numbering>
 </file>
@@ -16412,7 +18874,7 @@
 </file>
 
 <file path=customXml/itemProps1.xml><?xml version="1.0" encoding="utf-8"?>
-<ds:datastoreItem xmlns:ds="http://schemas.openxmlformats.org/officeDocument/2006/customXml" ds:itemID="{8C2E6312-982C-4857-BE9C-57E958E0ECCA}">
+<ds:datastoreItem xmlns:ds="http://schemas.openxmlformats.org/officeDocument/2006/customXml" ds:itemID="{75B1D210-D66F-4CD1-A42C-6EE717FB43A7}">
   <ds:schemaRefs>
     <ds:schemaRef ds:uri="http://schemas.openxmlformats.org/officeDocument/2006/bibliography"/>
   </ds:schemaRefs>

</xml_diff>

<commit_message>
Date: 08 Jan 2026
</commit_message>
<xml_diff>
--- a/Notes_Selenium_14.docx
+++ b/Notes_Selenium_14.docx
@@ -621,23 +621,13 @@
           <w:lang w:val="en-US"/>
         </w:rPr>
       </w:pPr>
-      <w:proofErr w:type="spellStart"/>
-      <w:r>
-        <w:rPr>
-          <w:sz w:val="24"/>
-          <w:szCs w:val="22"/>
-          <w:lang w:val="en-US"/>
-        </w:rPr>
-        <w:t>Thread.sleep</w:t>
-      </w:r>
-      <w:proofErr w:type="spellEnd"/>
-      <w:r>
-        <w:rPr>
-          <w:sz w:val="24"/>
-          <w:szCs w:val="22"/>
-          <w:lang w:val="en-US"/>
-        </w:rPr>
-        <w:t>()</w:t>
+      <w:r>
+        <w:rPr>
+          <w:sz w:val="24"/>
+          <w:szCs w:val="22"/>
+          <w:lang w:val="en-US"/>
+        </w:rPr>
+        <w:t>Thread.sleep()</w:t>
       </w:r>
     </w:p>
     <w:p>
@@ -2166,25 +2156,7 @@
           <w:szCs w:val="22"/>
           <w:lang w:val="en-US"/>
         </w:rPr>
-        <w:t xml:space="preserve"> Correctness, Completeness, </w:t>
-      </w:r>
-      <w:proofErr w:type="gramStart"/>
-      <w:r>
-        <w:rPr>
-          <w:sz w:val="24"/>
-          <w:szCs w:val="22"/>
-          <w:lang w:val="en-US"/>
-        </w:rPr>
-        <w:t>Security</w:t>
-      </w:r>
-      <w:proofErr w:type="gramEnd"/>
-      <w:r>
-        <w:rPr>
-          <w:sz w:val="24"/>
-          <w:szCs w:val="22"/>
-          <w:lang w:val="en-US"/>
-        </w:rPr>
-        <w:t xml:space="preserve"> &amp; Quality of developed software application.</w:t>
+        <w:t xml:space="preserve"> Correctness, Completeness, Security &amp; Quality of developed software application.</w:t>
       </w:r>
     </w:p>
     <w:p>
@@ -3610,7 +3582,6 @@
           <w:lang w:val="en-US"/>
         </w:rPr>
       </w:pPr>
-      <w:proofErr w:type="spellStart"/>
       <w:r>
         <w:rPr>
           <w:sz w:val="24"/>
@@ -3619,7 +3590,6 @@
         </w:rPr>
         <w:t>YourName_SeleniumDemos</w:t>
       </w:r>
-      <w:proofErr w:type="spellEnd"/>
     </w:p>
     <w:p>
       <w:pPr>
@@ -3662,18 +3632,8 @@
           <w:szCs w:val="22"/>
           <w:lang w:val="en-US"/>
         </w:rPr>
-        <w:t xml:space="preserve">Open </w:t>
-      </w:r>
-      <w:proofErr w:type="spellStart"/>
-      <w:r>
-        <w:rPr>
-          <w:sz w:val="24"/>
-          <w:szCs w:val="22"/>
-          <w:lang w:val="en-US"/>
-        </w:rPr>
-        <w:t>selenium.dev</w:t>
-      </w:r>
-      <w:proofErr w:type="spellEnd"/>
+        <w:t>Open selenium.dev</w:t>
+      </w:r>
     </w:p>
     <w:p>
       <w:pPr>
@@ -3943,25 +3903,7 @@
           <w:szCs w:val="22"/>
           <w:lang w:val="en-US"/>
         </w:rPr>
-        <w:t>Give the name for project (</w:t>
-      </w:r>
-      <w:proofErr w:type="spellStart"/>
-      <w:r>
-        <w:rPr>
-          <w:sz w:val="24"/>
-          <w:szCs w:val="22"/>
-          <w:lang w:val="en-US"/>
-        </w:rPr>
-        <w:t>MyAutomationProject</w:t>
-      </w:r>
-      <w:proofErr w:type="spellEnd"/>
-      <w:r>
-        <w:rPr>
-          <w:sz w:val="24"/>
-          <w:szCs w:val="22"/>
-          <w:lang w:val="en-US"/>
-        </w:rPr>
-        <w:t>)</w:t>
+        <w:t>Give the name for project (MyAutomationProject)</w:t>
       </w:r>
     </w:p>
     <w:p>
@@ -4100,25 +4042,7 @@
           <w:szCs w:val="22"/>
           <w:lang w:val="en-US"/>
         </w:rPr>
-        <w:t>Give the name (</w:t>
-      </w:r>
-      <w:proofErr w:type="spellStart"/>
-      <w:r>
-        <w:rPr>
-          <w:sz w:val="24"/>
-          <w:szCs w:val="22"/>
-          <w:lang w:val="en-US"/>
-        </w:rPr>
-        <w:t>com.WebDriverDemos</w:t>
-      </w:r>
-      <w:proofErr w:type="spellEnd"/>
-      <w:r>
-        <w:rPr>
-          <w:sz w:val="24"/>
-          <w:szCs w:val="22"/>
-          <w:lang w:val="en-US"/>
-        </w:rPr>
-        <w:t>)</w:t>
+        <w:t>Give the name (com.WebDriverDemos)</w:t>
       </w:r>
     </w:p>
     <w:p>
@@ -4455,23 +4379,13 @@
           <w:lang w:val="en-US"/>
         </w:rPr>
       </w:pPr>
-      <w:proofErr w:type="gramStart"/>
-      <w:r>
-        <w:rPr>
-          <w:sz w:val="24"/>
-          <w:szCs w:val="22"/>
-          <w:lang w:val="en-US"/>
-        </w:rPr>
-        <w:t>get(</w:t>
-      </w:r>
-      <w:proofErr w:type="gramEnd"/>
-      <w:r>
-        <w:rPr>
-          <w:sz w:val="24"/>
-          <w:szCs w:val="22"/>
-          <w:lang w:val="en-US"/>
-        </w:rPr>
-        <w:t xml:space="preserve">) </w:t>
+      <w:r>
+        <w:rPr>
+          <w:sz w:val="24"/>
+          <w:szCs w:val="22"/>
+          <w:lang w:val="en-US"/>
+        </w:rPr>
+        <w:t xml:space="preserve">get() </w:t>
       </w:r>
       <w:r>
         <w:rPr>
@@ -4503,23 +4417,13 @@
           <w:lang w:val="en-US"/>
         </w:rPr>
       </w:pPr>
-      <w:proofErr w:type="spellStart"/>
-      <w:r>
-        <w:rPr>
-          <w:sz w:val="24"/>
-          <w:szCs w:val="22"/>
-          <w:lang w:val="en-US"/>
-        </w:rPr>
-        <w:t>driver.manage</w:t>
-      </w:r>
-      <w:proofErr w:type="spellEnd"/>
-      <w:r>
-        <w:rPr>
-          <w:sz w:val="24"/>
-          <w:szCs w:val="22"/>
-          <w:lang w:val="en-US"/>
-        </w:rPr>
-        <w:t xml:space="preserve">().window().maximize() </w:t>
+      <w:r>
+        <w:rPr>
+          <w:sz w:val="24"/>
+          <w:szCs w:val="22"/>
+          <w:lang w:val="en-US"/>
+        </w:rPr>
+        <w:t xml:space="preserve">driver.manage().window().maximize() </w:t>
       </w:r>
       <w:r>
         <w:rPr>
@@ -4551,23 +4455,13 @@
           <w:lang w:val="en-US"/>
         </w:rPr>
       </w:pPr>
-      <w:proofErr w:type="gramStart"/>
-      <w:r>
-        <w:rPr>
-          <w:sz w:val="24"/>
-          <w:szCs w:val="22"/>
-          <w:lang w:val="en-US"/>
-        </w:rPr>
-        <w:t>close(</w:t>
-      </w:r>
-      <w:proofErr w:type="gramEnd"/>
-      <w:r>
-        <w:rPr>
-          <w:sz w:val="24"/>
-          <w:szCs w:val="22"/>
-          <w:lang w:val="en-US"/>
-        </w:rPr>
-        <w:t xml:space="preserve">) </w:t>
+      <w:r>
+        <w:rPr>
+          <w:sz w:val="24"/>
+          <w:szCs w:val="22"/>
+          <w:lang w:val="en-US"/>
+        </w:rPr>
+        <w:t xml:space="preserve">close() </w:t>
       </w:r>
       <w:r>
         <w:rPr>
@@ -4599,23 +4493,13 @@
           <w:lang w:val="en-US"/>
         </w:rPr>
       </w:pPr>
-      <w:proofErr w:type="gramStart"/>
-      <w:r>
-        <w:rPr>
-          <w:sz w:val="24"/>
-          <w:szCs w:val="22"/>
-          <w:lang w:val="en-US"/>
-        </w:rPr>
-        <w:t>getTitle(</w:t>
-      </w:r>
-      <w:proofErr w:type="gramEnd"/>
-      <w:r>
-        <w:rPr>
-          <w:sz w:val="24"/>
-          <w:szCs w:val="22"/>
-          <w:lang w:val="en-US"/>
-        </w:rPr>
-        <w:t xml:space="preserve">) </w:t>
+      <w:r>
+        <w:rPr>
+          <w:sz w:val="24"/>
+          <w:szCs w:val="22"/>
+          <w:lang w:val="en-US"/>
+        </w:rPr>
+        <w:t xml:space="preserve">getTitle() </w:t>
       </w:r>
       <w:r>
         <w:rPr>
@@ -4655,23 +4539,13 @@
           <w:lang w:val="en-US"/>
         </w:rPr>
       </w:pPr>
-      <w:proofErr w:type="gramStart"/>
-      <w:r>
-        <w:rPr>
-          <w:sz w:val="24"/>
-          <w:szCs w:val="22"/>
-          <w:lang w:val="en-US"/>
-        </w:rPr>
-        <w:t>getCurrentUrl(</w:t>
-      </w:r>
-      <w:proofErr w:type="gramEnd"/>
-      <w:r>
-        <w:rPr>
-          <w:sz w:val="24"/>
-          <w:szCs w:val="22"/>
-          <w:lang w:val="en-US"/>
-        </w:rPr>
-        <w:t xml:space="preserve">) </w:t>
+      <w:r>
+        <w:rPr>
+          <w:sz w:val="24"/>
+          <w:szCs w:val="22"/>
+          <w:lang w:val="en-US"/>
+        </w:rPr>
+        <w:t xml:space="preserve">getCurrentUrl() </w:t>
       </w:r>
       <w:r>
         <w:rPr>
@@ -4703,23 +4577,13 @@
           <w:lang w:val="en-US"/>
         </w:rPr>
       </w:pPr>
-      <w:proofErr w:type="gramStart"/>
-      <w:r>
-        <w:rPr>
-          <w:sz w:val="24"/>
-          <w:szCs w:val="22"/>
-          <w:lang w:val="en-US"/>
-        </w:rPr>
-        <w:t>getPageSource(</w:t>
-      </w:r>
-      <w:proofErr w:type="gramEnd"/>
-      <w:r>
-        <w:rPr>
-          <w:sz w:val="24"/>
-          <w:szCs w:val="22"/>
-          <w:lang w:val="en-US"/>
-        </w:rPr>
-        <w:t xml:space="preserve">) </w:t>
+      <w:r>
+        <w:rPr>
+          <w:sz w:val="24"/>
+          <w:szCs w:val="22"/>
+          <w:lang w:val="en-US"/>
+        </w:rPr>
+        <w:t xml:space="preserve">getPageSource() </w:t>
       </w:r>
       <w:r>
         <w:rPr>
@@ -4751,23 +4615,13 @@
           <w:lang w:val="en-US"/>
         </w:rPr>
       </w:pPr>
-      <w:proofErr w:type="gramStart"/>
-      <w:r>
-        <w:rPr>
-          <w:sz w:val="24"/>
-          <w:szCs w:val="22"/>
-          <w:lang w:val="en-US"/>
-        </w:rPr>
-        <w:t>findElement(</w:t>
-      </w:r>
-      <w:proofErr w:type="gramEnd"/>
-      <w:r>
-        <w:rPr>
-          <w:sz w:val="24"/>
-          <w:szCs w:val="22"/>
-          <w:lang w:val="en-US"/>
-        </w:rPr>
-        <w:t xml:space="preserve">) </w:t>
+      <w:r>
+        <w:rPr>
+          <w:sz w:val="24"/>
+          <w:szCs w:val="22"/>
+          <w:lang w:val="en-US"/>
+        </w:rPr>
+        <w:t xml:space="preserve">findElement() </w:t>
       </w:r>
       <w:r>
         <w:rPr>
@@ -4851,23 +4705,13 @@
           <w:lang w:val="en-US"/>
         </w:rPr>
       </w:pPr>
-      <w:proofErr w:type="gramStart"/>
-      <w:r>
-        <w:rPr>
-          <w:sz w:val="24"/>
-          <w:szCs w:val="22"/>
-          <w:lang w:val="en-US"/>
-        </w:rPr>
-        <w:t>findElements(</w:t>
-      </w:r>
-      <w:proofErr w:type="gramEnd"/>
-      <w:r>
-        <w:rPr>
-          <w:sz w:val="24"/>
-          <w:szCs w:val="22"/>
-          <w:lang w:val="en-US"/>
-        </w:rPr>
-        <w:t xml:space="preserve">) </w:t>
+      <w:r>
+        <w:rPr>
+          <w:sz w:val="24"/>
+          <w:szCs w:val="22"/>
+          <w:lang w:val="en-US"/>
+        </w:rPr>
+        <w:t xml:space="preserve">findElements() </w:t>
       </w:r>
       <w:r>
         <w:rPr>
@@ -4925,23 +4769,13 @@
           <w:lang w:val="en-US"/>
         </w:rPr>
       </w:pPr>
-      <w:proofErr w:type="gramStart"/>
-      <w:r>
-        <w:rPr>
-          <w:sz w:val="24"/>
-          <w:szCs w:val="22"/>
-          <w:lang w:val="en-US"/>
-        </w:rPr>
-        <w:t>getWindowHandles(</w:t>
-      </w:r>
-      <w:proofErr w:type="gramEnd"/>
-      <w:r>
-        <w:rPr>
-          <w:sz w:val="24"/>
-          <w:szCs w:val="22"/>
-          <w:lang w:val="en-US"/>
-        </w:rPr>
-        <w:t xml:space="preserve">) </w:t>
+      <w:r>
+        <w:rPr>
+          <w:sz w:val="24"/>
+          <w:szCs w:val="22"/>
+          <w:lang w:val="en-US"/>
+        </w:rPr>
+        <w:t xml:space="preserve">getWindowHandles() </w:t>
       </w:r>
       <w:r>
         <w:rPr>
@@ -4981,23 +4815,13 @@
           <w:lang w:val="en-US"/>
         </w:rPr>
       </w:pPr>
-      <w:proofErr w:type="gramStart"/>
-      <w:r>
-        <w:rPr>
-          <w:sz w:val="24"/>
-          <w:szCs w:val="22"/>
-          <w:lang w:val="en-US"/>
-        </w:rPr>
-        <w:t>quit(</w:t>
-      </w:r>
-      <w:proofErr w:type="gramEnd"/>
-      <w:r>
-        <w:rPr>
-          <w:sz w:val="24"/>
-          <w:szCs w:val="22"/>
-          <w:lang w:val="en-US"/>
-        </w:rPr>
-        <w:t xml:space="preserve">) </w:t>
+      <w:r>
+        <w:rPr>
+          <w:sz w:val="24"/>
+          <w:szCs w:val="22"/>
+          <w:lang w:val="en-US"/>
+        </w:rPr>
+        <w:t xml:space="preserve">quit() </w:t>
       </w:r>
       <w:r>
         <w:rPr>
@@ -5331,23 +5155,13 @@
         </w:rPr>
         <w:t xml:space="preserve"> </w:t>
       </w:r>
-      <w:proofErr w:type="spellStart"/>
-      <w:r>
-        <w:rPr>
-          <w:sz w:val="24"/>
-          <w:szCs w:val="22"/>
-          <w:lang w:val="en-US"/>
-        </w:rPr>
-        <w:t>driver.get</w:t>
-      </w:r>
-      <w:proofErr w:type="spellEnd"/>
-      <w:r>
-        <w:rPr>
-          <w:sz w:val="24"/>
-          <w:szCs w:val="22"/>
-          <w:lang w:val="en-US"/>
-        </w:rPr>
-        <w:t>() implicitly waits for 30 seconds, but if any one of the page is not getting loaded within these 30 seconds then you will get TimeoutException.</w:t>
+      <w:r>
+        <w:rPr>
+          <w:sz w:val="24"/>
+          <w:szCs w:val="22"/>
+          <w:lang w:val="en-US"/>
+        </w:rPr>
+        <w:t>driver.get() implicitly waits for 30 seconds, but if any one of the page is not getting loaded within these 30 seconds then you will get TimeoutException.</w:t>
       </w:r>
     </w:p>
     <w:p>
@@ -5850,23 +5664,13 @@
           <w:lang w:val="en-US"/>
         </w:rPr>
       </w:pPr>
-      <w:proofErr w:type="gramStart"/>
-      <w:r>
-        <w:rPr>
-          <w:sz w:val="24"/>
-          <w:szCs w:val="22"/>
-          <w:lang w:val="en-US"/>
-        </w:rPr>
-        <w:t>sendKeys(</w:t>
-      </w:r>
-      <w:proofErr w:type="gramEnd"/>
-      <w:r>
-        <w:rPr>
-          <w:sz w:val="24"/>
-          <w:szCs w:val="22"/>
-          <w:lang w:val="en-US"/>
-        </w:rPr>
-        <w:t xml:space="preserve">) </w:t>
+      <w:r>
+        <w:rPr>
+          <w:sz w:val="24"/>
+          <w:szCs w:val="22"/>
+          <w:lang w:val="en-US"/>
+        </w:rPr>
+        <w:t xml:space="preserve">sendKeys() </w:t>
       </w:r>
       <w:r>
         <w:rPr>
@@ -5906,23 +5710,13 @@
           <w:lang w:val="en-US"/>
         </w:rPr>
       </w:pPr>
-      <w:proofErr w:type="gramStart"/>
-      <w:r>
-        <w:rPr>
-          <w:sz w:val="24"/>
-          <w:szCs w:val="22"/>
-          <w:lang w:val="en-US"/>
-        </w:rPr>
-        <w:t>click(</w:t>
-      </w:r>
-      <w:proofErr w:type="gramEnd"/>
-      <w:r>
-        <w:rPr>
-          <w:sz w:val="24"/>
-          <w:szCs w:val="22"/>
-          <w:lang w:val="en-US"/>
-        </w:rPr>
-        <w:t xml:space="preserve">) </w:t>
+      <w:r>
+        <w:rPr>
+          <w:sz w:val="24"/>
+          <w:szCs w:val="22"/>
+          <w:lang w:val="en-US"/>
+        </w:rPr>
+        <w:t xml:space="preserve">click() </w:t>
       </w:r>
       <w:r>
         <w:rPr>
@@ -5954,23 +5748,13 @@
           <w:lang w:val="en-US"/>
         </w:rPr>
       </w:pPr>
-      <w:proofErr w:type="gramStart"/>
-      <w:r>
-        <w:rPr>
-          <w:sz w:val="24"/>
-          <w:szCs w:val="22"/>
-          <w:lang w:val="en-US"/>
-        </w:rPr>
-        <w:t>getText(</w:t>
-      </w:r>
-      <w:proofErr w:type="gramEnd"/>
-      <w:r>
-        <w:rPr>
-          <w:sz w:val="24"/>
-          <w:szCs w:val="22"/>
-          <w:lang w:val="en-US"/>
-        </w:rPr>
-        <w:t xml:space="preserve">) </w:t>
+      <w:r>
+        <w:rPr>
+          <w:sz w:val="24"/>
+          <w:szCs w:val="22"/>
+          <w:lang w:val="en-US"/>
+        </w:rPr>
+        <w:t xml:space="preserve">getText() </w:t>
       </w:r>
       <w:r>
         <w:rPr>
@@ -6002,23 +5786,13 @@
           <w:lang w:val="en-US"/>
         </w:rPr>
       </w:pPr>
-      <w:proofErr w:type="gramStart"/>
-      <w:r>
-        <w:rPr>
-          <w:sz w:val="24"/>
-          <w:szCs w:val="22"/>
-          <w:lang w:val="en-US"/>
-        </w:rPr>
-        <w:t>isSelected(</w:t>
-      </w:r>
-      <w:proofErr w:type="gramEnd"/>
-      <w:r>
-        <w:rPr>
-          <w:sz w:val="24"/>
-          <w:szCs w:val="22"/>
-          <w:lang w:val="en-US"/>
-        </w:rPr>
-        <w:t xml:space="preserve">) </w:t>
+      <w:r>
+        <w:rPr>
+          <w:sz w:val="24"/>
+          <w:szCs w:val="22"/>
+          <w:lang w:val="en-US"/>
+        </w:rPr>
+        <w:t xml:space="preserve">isSelected() </w:t>
       </w:r>
       <w:r>
         <w:rPr>
@@ -6096,23 +5870,13 @@
           <w:lang w:val="en-US"/>
         </w:rPr>
       </w:pPr>
-      <w:proofErr w:type="gramStart"/>
-      <w:r>
-        <w:rPr>
-          <w:sz w:val="24"/>
-          <w:szCs w:val="22"/>
-          <w:lang w:val="en-US"/>
-        </w:rPr>
-        <w:t>isDisplayed(</w:t>
-      </w:r>
-      <w:proofErr w:type="gramEnd"/>
-      <w:r>
-        <w:rPr>
-          <w:sz w:val="24"/>
-          <w:szCs w:val="22"/>
-          <w:lang w:val="en-US"/>
-        </w:rPr>
-        <w:t xml:space="preserve">) </w:t>
+      <w:r>
+        <w:rPr>
+          <w:sz w:val="24"/>
+          <w:szCs w:val="22"/>
+          <w:lang w:val="en-US"/>
+        </w:rPr>
+        <w:t xml:space="preserve">isDisplayed() </w:t>
       </w:r>
       <w:r>
         <w:rPr>
@@ -6288,25 +6052,7 @@
           <w:szCs w:val="22"/>
           <w:lang w:val="en-US"/>
         </w:rPr>
-        <w:t>data-</w:t>
-      </w:r>
-      <w:proofErr w:type="spellStart"/>
-      <w:r>
-        <w:rPr>
-          <w:sz w:val="24"/>
-          <w:szCs w:val="22"/>
-          <w:lang w:val="en-US"/>
-        </w:rPr>
-        <w:t>testid</w:t>
-      </w:r>
-      <w:proofErr w:type="spellEnd"/>
-      <w:r>
-        <w:rPr>
-          <w:sz w:val="24"/>
-          <w:szCs w:val="22"/>
-          <w:lang w:val="en-US"/>
-        </w:rPr>
-        <w:t>="royal-email"]</w:t>
+        <w:t>data-testid="royal-email"]</w:t>
       </w:r>
     </w:p>
     <w:p>
@@ -7129,23 +6875,13 @@
           <w:lang w:val="en-US"/>
         </w:rPr>
       </w:pPr>
-      <w:proofErr w:type="gramStart"/>
-      <w:r>
-        <w:rPr>
-          <w:sz w:val="24"/>
-          <w:szCs w:val="22"/>
-          <w:lang w:val="en-US"/>
-        </w:rPr>
-        <w:t>getOptions(</w:t>
-      </w:r>
-      <w:proofErr w:type="gramEnd"/>
-      <w:r>
-        <w:rPr>
-          <w:sz w:val="24"/>
-          <w:szCs w:val="22"/>
-          <w:lang w:val="en-US"/>
-        </w:rPr>
-        <w:t xml:space="preserve">) </w:t>
+      <w:r>
+        <w:rPr>
+          <w:sz w:val="24"/>
+          <w:szCs w:val="22"/>
+          <w:lang w:val="en-US"/>
+        </w:rPr>
+        <w:t xml:space="preserve">getOptions() </w:t>
       </w:r>
       <w:r>
         <w:rPr>
@@ -7177,23 +6913,13 @@
           <w:lang w:val="en-US"/>
         </w:rPr>
       </w:pPr>
-      <w:proofErr w:type="gramStart"/>
-      <w:r>
-        <w:rPr>
-          <w:sz w:val="24"/>
-          <w:szCs w:val="22"/>
-          <w:lang w:val="en-US"/>
-        </w:rPr>
-        <w:t>selectByVisibleText(</w:t>
-      </w:r>
-      <w:proofErr w:type="gramEnd"/>
-      <w:r>
-        <w:rPr>
-          <w:sz w:val="24"/>
-          <w:szCs w:val="22"/>
-          <w:lang w:val="en-US"/>
-        </w:rPr>
-        <w:t xml:space="preserve">) </w:t>
+      <w:r>
+        <w:rPr>
+          <w:sz w:val="24"/>
+          <w:szCs w:val="22"/>
+          <w:lang w:val="en-US"/>
+        </w:rPr>
+        <w:t xml:space="preserve">selectByVisibleText() </w:t>
       </w:r>
       <w:r>
         <w:rPr>
@@ -7263,23 +6989,13 @@
           <w:lang w:val="en-US"/>
         </w:rPr>
       </w:pPr>
-      <w:proofErr w:type="gramStart"/>
-      <w:r>
-        <w:rPr>
-          <w:sz w:val="24"/>
-          <w:szCs w:val="22"/>
-          <w:lang w:val="en-US"/>
-        </w:rPr>
-        <w:t>selectByValue(</w:t>
-      </w:r>
-      <w:proofErr w:type="gramEnd"/>
-      <w:r>
-        <w:rPr>
-          <w:sz w:val="24"/>
-          <w:szCs w:val="22"/>
-          <w:lang w:val="en-US"/>
-        </w:rPr>
-        <w:t xml:space="preserve">) </w:t>
+      <w:r>
+        <w:rPr>
+          <w:sz w:val="24"/>
+          <w:szCs w:val="22"/>
+          <w:lang w:val="en-US"/>
+        </w:rPr>
+        <w:t xml:space="preserve">selectByValue() </w:t>
       </w:r>
       <w:r>
         <w:rPr>
@@ -7319,23 +7035,13 @@
           <w:lang w:val="en-US"/>
         </w:rPr>
       </w:pPr>
-      <w:proofErr w:type="gramStart"/>
-      <w:r>
-        <w:rPr>
-          <w:sz w:val="24"/>
-          <w:szCs w:val="22"/>
-          <w:lang w:val="en-US"/>
-        </w:rPr>
-        <w:t>selectByIndex(</w:t>
-      </w:r>
-      <w:proofErr w:type="gramEnd"/>
-      <w:r>
-        <w:rPr>
-          <w:sz w:val="24"/>
-          <w:szCs w:val="22"/>
-          <w:lang w:val="en-US"/>
-        </w:rPr>
-        <w:t xml:space="preserve">) </w:t>
+      <w:r>
+        <w:rPr>
+          <w:sz w:val="24"/>
+          <w:szCs w:val="22"/>
+          <w:lang w:val="en-US"/>
+        </w:rPr>
+        <w:t xml:space="preserve">selectByIndex() </w:t>
       </w:r>
       <w:r>
         <w:rPr>
@@ -7351,25 +7057,7 @@
           <w:szCs w:val="22"/>
           <w:lang w:val="en-US"/>
         </w:rPr>
-        <w:t xml:space="preserve"> Selects the option by using its zero based index no. index no is +</w:t>
-      </w:r>
-      <w:proofErr w:type="spellStart"/>
-      <w:r>
-        <w:rPr>
-          <w:sz w:val="24"/>
-          <w:szCs w:val="22"/>
-          <w:lang w:val="en-US"/>
-        </w:rPr>
-        <w:t>ve</w:t>
-      </w:r>
-      <w:proofErr w:type="spellEnd"/>
-      <w:r>
-        <w:rPr>
-          <w:sz w:val="24"/>
-          <w:szCs w:val="22"/>
-          <w:lang w:val="en-US"/>
-        </w:rPr>
-        <w:t xml:space="preserve"> integer number.</w:t>
+        <w:t xml:space="preserve"> Selects the option by using its zero based index no. index no is +ve integer number.</w:t>
       </w:r>
     </w:p>
     <w:p>
@@ -7385,23 +7073,13 @@
           <w:lang w:val="en-US"/>
         </w:rPr>
       </w:pPr>
-      <w:proofErr w:type="gramStart"/>
-      <w:r>
-        <w:rPr>
-          <w:sz w:val="24"/>
-          <w:szCs w:val="22"/>
-          <w:lang w:val="en-US"/>
-        </w:rPr>
-        <w:t>getAllSelectedOptions(</w:t>
-      </w:r>
-      <w:proofErr w:type="gramEnd"/>
-      <w:r>
-        <w:rPr>
-          <w:sz w:val="24"/>
-          <w:szCs w:val="22"/>
-          <w:lang w:val="en-US"/>
-        </w:rPr>
-        <w:t xml:space="preserve">) </w:t>
+      <w:r>
+        <w:rPr>
+          <w:sz w:val="24"/>
+          <w:szCs w:val="22"/>
+          <w:lang w:val="en-US"/>
+        </w:rPr>
+        <w:t xml:space="preserve">getAllSelectedOptions() </w:t>
       </w:r>
       <w:r>
         <w:rPr>
@@ -7433,23 +7111,13 @@
           <w:lang w:val="en-US"/>
         </w:rPr>
       </w:pPr>
-      <w:proofErr w:type="gramStart"/>
-      <w:r>
-        <w:rPr>
-          <w:sz w:val="24"/>
-          <w:szCs w:val="22"/>
-          <w:lang w:val="en-US"/>
-        </w:rPr>
-        <w:t>isMultiple(</w:t>
-      </w:r>
-      <w:proofErr w:type="gramEnd"/>
-      <w:r>
-        <w:rPr>
-          <w:sz w:val="24"/>
-          <w:szCs w:val="22"/>
-          <w:lang w:val="en-US"/>
-        </w:rPr>
-        <w:t xml:space="preserve">) </w:t>
+      <w:r>
+        <w:rPr>
+          <w:sz w:val="24"/>
+          <w:szCs w:val="22"/>
+          <w:lang w:val="en-US"/>
+        </w:rPr>
+        <w:t xml:space="preserve">isMultiple() </w:t>
       </w:r>
       <w:r>
         <w:rPr>
@@ -7664,33 +7332,13 @@
           <w:lang w:val="en-US"/>
         </w:rPr>
       </w:pPr>
-      <w:proofErr w:type="spellStart"/>
-      <w:proofErr w:type="gramStart"/>
-      <w:r>
-        <w:rPr>
-          <w:sz w:val="24"/>
-          <w:szCs w:val="22"/>
-          <w:lang w:val="en-US"/>
-        </w:rPr>
-        <w:t>Thread.sleep</w:t>
-      </w:r>
-      <w:proofErr w:type="spellEnd"/>
-      <w:r>
-        <w:rPr>
-          <w:sz w:val="24"/>
-          <w:szCs w:val="22"/>
-          <w:lang w:val="en-US"/>
-        </w:rPr>
-        <w:t>(</w:t>
-      </w:r>
-      <w:proofErr w:type="gramEnd"/>
-      <w:r>
-        <w:rPr>
-          <w:sz w:val="24"/>
-          <w:szCs w:val="22"/>
-          <w:lang w:val="en-US"/>
-        </w:rPr>
-        <w:t>)</w:t>
+      <w:r>
+        <w:rPr>
+          <w:sz w:val="24"/>
+          <w:szCs w:val="22"/>
+          <w:lang w:val="en-US"/>
+        </w:rPr>
+        <w:t>Thread.sleep()</w:t>
       </w:r>
       <w:r>
         <w:rPr>
@@ -8057,24 +7705,7 @@
           <w:lang w:val="en-US"/>
         </w:rPr>
         <w:br/>
-      </w:r>
-      <w:proofErr w:type="spellStart"/>
-      <w:r>
-        <w:rPr>
-          <w:sz w:val="24"/>
-          <w:szCs w:val="22"/>
-          <w:lang w:val="en-US"/>
-        </w:rPr>
-        <w:t>i</w:t>
-      </w:r>
-      <w:proofErr w:type="spellEnd"/>
-      <w:r>
-        <w:rPr>
-          <w:sz w:val="24"/>
-          <w:szCs w:val="22"/>
-          <w:lang w:val="en-US"/>
-        </w:rPr>
-        <w:t xml:space="preserve"> – ignoring </w:t>
+        <w:t xml:space="preserve">i – ignoring </w:t>
       </w:r>
       <w:r>
         <w:rPr>
@@ -8190,33 +7821,15 @@
           <w:szCs w:val="22"/>
           <w:lang w:val="en-US"/>
         </w:rPr>
-        <w:t>Display all table header (&lt;</w:t>
-      </w:r>
-      <w:proofErr w:type="spellStart"/>
-      <w:r>
-        <w:rPr>
-          <w:sz w:val="24"/>
-          <w:szCs w:val="22"/>
-          <w:lang w:val="en-US"/>
-        </w:rPr>
-        <w:t>t</w:t>
-      </w:r>
-      <w:r>
-        <w:rPr>
-          <w:sz w:val="24"/>
-          <w:szCs w:val="22"/>
-          <w:lang w:val="en-US"/>
-        </w:rPr>
-        <w:t>h</w:t>
-      </w:r>
-      <w:proofErr w:type="spellEnd"/>
-      <w:r>
-        <w:rPr>
-          <w:sz w:val="24"/>
-          <w:szCs w:val="22"/>
-          <w:lang w:val="en-US"/>
-        </w:rPr>
-        <w:t>&gt;)</w:t>
+        <w:t>Display all table header (&lt;t</w:t>
+      </w:r>
+      <w:r>
+        <w:rPr>
+          <w:sz w:val="24"/>
+          <w:szCs w:val="22"/>
+          <w:lang w:val="en-US"/>
+        </w:rPr>
+        <w:t>h&gt;)</w:t>
       </w:r>
     </w:p>
     <w:p>
@@ -8238,25 +7851,7 @@
           <w:szCs w:val="22"/>
           <w:lang w:val="en-US"/>
         </w:rPr>
-        <w:t>Display total number of rows (&lt;</w:t>
-      </w:r>
-      <w:proofErr w:type="spellStart"/>
-      <w:r>
-        <w:rPr>
-          <w:sz w:val="24"/>
-          <w:szCs w:val="22"/>
-          <w:lang w:val="en-US"/>
-        </w:rPr>
-        <w:t>tr</w:t>
-      </w:r>
-      <w:proofErr w:type="spellEnd"/>
-      <w:r>
-        <w:rPr>
-          <w:sz w:val="24"/>
-          <w:szCs w:val="22"/>
-          <w:lang w:val="en-US"/>
-        </w:rPr>
-        <w:t>&gt;)</w:t>
+        <w:t>Display total number of rows (&lt;tr&gt;)</w:t>
       </w:r>
     </w:p>
     <w:p>
@@ -8407,25 +8002,7 @@
           <w:szCs w:val="22"/>
           <w:lang w:val="en-US"/>
         </w:rPr>
-        <w:t>Entering some data in the text boxes (</w:t>
-      </w:r>
-      <w:proofErr w:type="gramStart"/>
-      <w:r>
-        <w:rPr>
-          <w:sz w:val="24"/>
-          <w:szCs w:val="22"/>
-          <w:lang w:val="en-US"/>
-        </w:rPr>
-        <w:t>sendKeys(</w:t>
-      </w:r>
-      <w:proofErr w:type="gramEnd"/>
-      <w:r>
-        <w:rPr>
-          <w:sz w:val="24"/>
-          <w:szCs w:val="22"/>
-          <w:lang w:val="en-US"/>
-        </w:rPr>
-        <w:t>)).</w:t>
+        <w:t>Entering some data in the text boxes (sendKeys()).</w:t>
       </w:r>
     </w:p>
     <w:p>
@@ -8753,23 +8330,13 @@
           <w:lang w:val="en-US"/>
         </w:rPr>
       </w:pPr>
-      <w:proofErr w:type="spellStart"/>
-      <w:r>
-        <w:rPr>
-          <w:sz w:val="24"/>
-          <w:szCs w:val="22"/>
-          <w:lang w:val="en-US"/>
-        </w:rPr>
-        <w:t>driver.switchTo</w:t>
-      </w:r>
-      <w:proofErr w:type="spellEnd"/>
-      <w:r>
-        <w:rPr>
-          <w:sz w:val="24"/>
-          <w:szCs w:val="22"/>
-          <w:lang w:val="en-US"/>
-        </w:rPr>
-        <w:t xml:space="preserve">().alert() </w:t>
+      <w:r>
+        <w:rPr>
+          <w:sz w:val="24"/>
+          <w:szCs w:val="22"/>
+          <w:lang w:val="en-US"/>
+        </w:rPr>
+        <w:t xml:space="preserve">driver.switchTo().alert() </w:t>
       </w:r>
       <w:r>
         <w:rPr>
@@ -8801,23 +8368,13 @@
           <w:lang w:val="en-US"/>
         </w:rPr>
       </w:pPr>
-      <w:proofErr w:type="gramStart"/>
-      <w:r>
-        <w:rPr>
-          <w:sz w:val="24"/>
-          <w:szCs w:val="22"/>
-          <w:lang w:val="en-US"/>
-        </w:rPr>
-        <w:t>getText(</w:t>
-      </w:r>
-      <w:proofErr w:type="gramEnd"/>
-      <w:r>
-        <w:rPr>
-          <w:sz w:val="24"/>
-          <w:szCs w:val="22"/>
-          <w:lang w:val="en-US"/>
-        </w:rPr>
-        <w:t xml:space="preserve">) </w:t>
+      <w:r>
+        <w:rPr>
+          <w:sz w:val="24"/>
+          <w:szCs w:val="22"/>
+          <w:lang w:val="en-US"/>
+        </w:rPr>
+        <w:t xml:space="preserve">getText() </w:t>
       </w:r>
       <w:r>
         <w:rPr>
@@ -9153,23 +8710,13 @@
           <w:lang w:val="en-US"/>
         </w:rPr>
       </w:pPr>
-      <w:proofErr w:type="gramStart"/>
-      <w:r>
-        <w:rPr>
-          <w:sz w:val="24"/>
-          <w:szCs w:val="22"/>
-          <w:lang w:val="en-US"/>
-        </w:rPr>
-        <w:t>moveToElement(</w:t>
-      </w:r>
-      <w:proofErr w:type="gramEnd"/>
-      <w:r>
-        <w:rPr>
-          <w:sz w:val="24"/>
-          <w:szCs w:val="22"/>
-          <w:lang w:val="en-US"/>
-        </w:rPr>
-        <w:t xml:space="preserve">) </w:t>
+      <w:r>
+        <w:rPr>
+          <w:sz w:val="24"/>
+          <w:szCs w:val="22"/>
+          <w:lang w:val="en-US"/>
+        </w:rPr>
+        <w:t xml:space="preserve">moveToElement() </w:t>
       </w:r>
       <w:r>
         <w:rPr>
@@ -9201,23 +8748,13 @@
           <w:lang w:val="en-US"/>
         </w:rPr>
       </w:pPr>
-      <w:proofErr w:type="gramStart"/>
-      <w:r>
-        <w:rPr>
-          <w:sz w:val="24"/>
-          <w:szCs w:val="22"/>
-          <w:lang w:val="en-US"/>
-        </w:rPr>
-        <w:t>perform(</w:t>
-      </w:r>
-      <w:proofErr w:type="gramEnd"/>
-      <w:r>
-        <w:rPr>
-          <w:sz w:val="24"/>
-          <w:szCs w:val="22"/>
-          <w:lang w:val="en-US"/>
-        </w:rPr>
-        <w:t xml:space="preserve">) </w:t>
+      <w:r>
+        <w:rPr>
+          <w:sz w:val="24"/>
+          <w:szCs w:val="22"/>
+          <w:lang w:val="en-US"/>
+        </w:rPr>
+        <w:t xml:space="preserve">perform() </w:t>
       </w:r>
       <w:r>
         <w:rPr>
@@ -9249,23 +8786,13 @@
           <w:lang w:val="en-US"/>
         </w:rPr>
       </w:pPr>
-      <w:proofErr w:type="gramStart"/>
-      <w:r>
-        <w:rPr>
-          <w:sz w:val="24"/>
-          <w:szCs w:val="22"/>
-          <w:lang w:val="en-US"/>
-        </w:rPr>
-        <w:t>contextClick(</w:t>
-      </w:r>
-      <w:proofErr w:type="gramEnd"/>
-      <w:r>
-        <w:rPr>
-          <w:sz w:val="24"/>
-          <w:szCs w:val="22"/>
-          <w:lang w:val="en-US"/>
-        </w:rPr>
-        <w:t xml:space="preserve">) </w:t>
+      <w:r>
+        <w:rPr>
+          <w:sz w:val="24"/>
+          <w:szCs w:val="22"/>
+          <w:lang w:val="en-US"/>
+        </w:rPr>
+        <w:t xml:space="preserve">contextClick() </w:t>
       </w:r>
       <w:r>
         <w:rPr>
@@ -9297,23 +8824,13 @@
           <w:lang w:val="en-US"/>
         </w:rPr>
       </w:pPr>
-      <w:proofErr w:type="gramStart"/>
-      <w:r>
-        <w:rPr>
-          <w:sz w:val="24"/>
-          <w:szCs w:val="22"/>
-          <w:lang w:val="en-US"/>
-        </w:rPr>
-        <w:t>doubleClick(</w:t>
-      </w:r>
-      <w:proofErr w:type="gramEnd"/>
-      <w:r>
-        <w:rPr>
-          <w:sz w:val="24"/>
-          <w:szCs w:val="22"/>
-          <w:lang w:val="en-US"/>
-        </w:rPr>
-        <w:t xml:space="preserve">) </w:t>
+      <w:r>
+        <w:rPr>
+          <w:sz w:val="24"/>
+          <w:szCs w:val="22"/>
+          <w:lang w:val="en-US"/>
+        </w:rPr>
+        <w:t xml:space="preserve">doubleClick() </w:t>
       </w:r>
       <w:r>
         <w:rPr>
@@ -9395,25 +8912,7 @@
           <w:szCs w:val="22"/>
           <w:lang w:val="en-US"/>
         </w:rPr>
-        <w:t xml:space="preserve">It is testing framework which will make automation testing more </w:t>
-      </w:r>
-      <w:proofErr w:type="gramStart"/>
-      <w:r>
-        <w:rPr>
-          <w:sz w:val="24"/>
-          <w:szCs w:val="22"/>
-          <w:lang w:val="en-US"/>
-        </w:rPr>
-        <w:t>easy</w:t>
-      </w:r>
-      <w:proofErr w:type="gramEnd"/>
-      <w:r>
-        <w:rPr>
-          <w:sz w:val="24"/>
-          <w:szCs w:val="22"/>
-          <w:lang w:val="en-US"/>
-        </w:rPr>
-        <w:t>.</w:t>
+        <w:t>It is testing framework which will make automation testing more easy.</w:t>
       </w:r>
     </w:p>
     <w:p>
@@ -10201,7 +9700,6 @@
         </w:rPr>
         <w:t xml:space="preserve"> This is the method that will get executed </w:t>
       </w:r>
-      <w:proofErr w:type="gramStart"/>
       <w:r>
         <w:rPr>
           <w:b/>
@@ -10210,18 +9708,7 @@
           <w:szCs w:val="22"/>
           <w:lang w:val="en-US"/>
         </w:rPr>
-        <w:t>Only</w:t>
-      </w:r>
-      <w:proofErr w:type="gramEnd"/>
-      <w:r>
-        <w:rPr>
-          <w:b/>
-          <w:bCs/>
-          <w:sz w:val="24"/>
-          <w:szCs w:val="22"/>
-          <w:lang w:val="en-US"/>
-        </w:rPr>
-        <w:t xml:space="preserve"> once After executing last test case.</w:t>
+        <w:t>Only once After executing last test case.</w:t>
       </w:r>
     </w:p>
     <w:p>
@@ -11263,10 +10750,157 @@
           <w:szCs w:val="22"/>
           <w:lang w:val="en-US"/>
         </w:rPr>
-        <w:t xml:space="preserve"> (Without </w:t>
-      </w:r>
-      <w:proofErr w:type="spellStart"/>
-      <w:r>
+        <w:t xml:space="preserve"> (Without ArcheType)</w:t>
+      </w:r>
+    </w:p>
+    <w:p>
+      <w:pPr>
+        <w:pStyle w:val="ListParagraph"/>
+        <w:numPr>
+          <w:ilvl w:val="0"/>
+          <w:numId w:val="38"/>
+        </w:numPr>
+        <w:rPr>
+          <w:sz w:val="24"/>
+          <w:szCs w:val="22"/>
+          <w:lang w:val="en-US"/>
+        </w:rPr>
+      </w:pPr>
+      <w:r>
+        <w:rPr>
+          <w:sz w:val="24"/>
+          <w:szCs w:val="22"/>
+          <w:lang w:val="en-US"/>
+        </w:rPr>
+        <w:t xml:space="preserve">File </w:t>
+      </w:r>
+      <w:r>
+        <w:rPr>
+          <w:sz w:val="24"/>
+          <w:szCs w:val="22"/>
+          <w:lang w:val="en-US"/>
+        </w:rPr>
+        <w:sym w:font="Wingdings" w:char="F0E0"/>
+      </w:r>
+      <w:r>
+        <w:rPr>
+          <w:sz w:val="24"/>
+          <w:szCs w:val="22"/>
+          <w:lang w:val="en-US"/>
+        </w:rPr>
+        <w:t xml:space="preserve"> New </w:t>
+      </w:r>
+      <w:r>
+        <w:rPr>
+          <w:sz w:val="24"/>
+          <w:szCs w:val="22"/>
+          <w:lang w:val="en-US"/>
+        </w:rPr>
+        <w:sym w:font="Wingdings" w:char="F0E0"/>
+      </w:r>
+      <w:r>
+        <w:rPr>
+          <w:sz w:val="24"/>
+          <w:szCs w:val="22"/>
+          <w:lang w:val="en-US"/>
+        </w:rPr>
+        <w:t xml:space="preserve"> Maven Project</w:t>
+      </w:r>
+    </w:p>
+    <w:p>
+      <w:pPr>
+        <w:pStyle w:val="ListParagraph"/>
+        <w:numPr>
+          <w:ilvl w:val="0"/>
+          <w:numId w:val="38"/>
+        </w:numPr>
+        <w:rPr>
+          <w:sz w:val="24"/>
+          <w:szCs w:val="22"/>
+          <w:lang w:val="en-US"/>
+        </w:rPr>
+      </w:pPr>
+      <w:r>
+        <w:rPr>
+          <w:sz w:val="24"/>
+          <w:szCs w:val="22"/>
+          <w:lang w:val="en-US"/>
+        </w:rPr>
+        <w:t>Select 1</w:t>
+      </w:r>
+      <w:r>
+        <w:rPr>
+          <w:sz w:val="24"/>
+          <w:szCs w:val="22"/>
+          <w:vertAlign w:val="superscript"/>
+          <w:lang w:val="en-US"/>
+        </w:rPr>
+        <w:t>st</w:t>
+      </w:r>
+      <w:r>
+        <w:rPr>
+          <w:sz w:val="24"/>
+          <w:szCs w:val="22"/>
+          <w:lang w:val="en-US"/>
+        </w:rPr>
+        <w:t xml:space="preserve"> checkbox</w:t>
+      </w:r>
+    </w:p>
+    <w:p>
+      <w:pPr>
+        <w:pStyle w:val="ListParagraph"/>
+        <w:numPr>
+          <w:ilvl w:val="0"/>
+          <w:numId w:val="38"/>
+        </w:numPr>
+        <w:rPr>
+          <w:sz w:val="24"/>
+          <w:szCs w:val="22"/>
+          <w:lang w:val="en-US"/>
+        </w:rPr>
+      </w:pPr>
+      <w:r>
+        <w:rPr>
+          <w:sz w:val="24"/>
+          <w:szCs w:val="22"/>
+          <w:lang w:val="en-US"/>
+        </w:rPr>
+        <w:t>Enter Group Id &amp; Artifact Id</w:t>
+      </w:r>
+    </w:p>
+    <w:p>
+      <w:pPr>
+        <w:pStyle w:val="ListParagraph"/>
+        <w:numPr>
+          <w:ilvl w:val="0"/>
+          <w:numId w:val="38"/>
+        </w:numPr>
+        <w:rPr>
+          <w:sz w:val="24"/>
+          <w:szCs w:val="22"/>
+          <w:lang w:val="en-US"/>
+        </w:rPr>
+      </w:pPr>
+      <w:r>
+        <w:rPr>
+          <w:sz w:val="24"/>
+          <w:szCs w:val="22"/>
+          <w:lang w:val="en-US"/>
+        </w:rPr>
+        <w:t>Click on Finish</w:t>
+      </w:r>
+    </w:p>
+    <w:p>
+      <w:pPr>
+        <w:rPr>
+          <w:sz w:val="24"/>
+          <w:szCs w:val="22"/>
+          <w:lang w:val="en-US"/>
+        </w:rPr>
+      </w:pPr>
+    </w:p>
+    <w:p>
+      <w:pPr>
         <w:rPr>
           <w:b/>
           <w:bCs/>
@@ -11274,9 +10908,7 @@
           <w:szCs w:val="22"/>
           <w:lang w:val="en-US"/>
         </w:rPr>
-        <w:t>ArcheType</w:t>
-      </w:r>
-      <w:proofErr w:type="spellEnd"/>
+      </w:pPr>
       <w:r>
         <w:rPr>
           <w:b/>
@@ -11285,15 +10917,15 @@
           <w:szCs w:val="22"/>
           <w:lang w:val="en-US"/>
         </w:rPr>
-        <w:t>)</w:t>
-      </w:r>
-    </w:p>
-    <w:p>
-      <w:pPr>
-        <w:pStyle w:val="ListParagraph"/>
-        <w:numPr>
-          <w:ilvl w:val="0"/>
-          <w:numId w:val="38"/>
+        <w:t>Creating Maven Project (With Archetype)</w:t>
+      </w:r>
+    </w:p>
+    <w:p>
+      <w:pPr>
+        <w:pStyle w:val="ListParagraph"/>
+        <w:numPr>
+          <w:ilvl w:val="0"/>
+          <w:numId w:val="40"/>
         </w:numPr>
         <w:rPr>
           <w:sz w:val="24"/>
@@ -11347,21 +10979,21 @@
         <w:pStyle w:val="ListParagraph"/>
         <w:numPr>
           <w:ilvl w:val="0"/>
-          <w:numId w:val="38"/>
-        </w:numPr>
-        <w:rPr>
-          <w:sz w:val="24"/>
-          <w:szCs w:val="22"/>
-          <w:lang w:val="en-US"/>
-        </w:rPr>
-      </w:pPr>
-      <w:r>
-        <w:rPr>
-          <w:sz w:val="24"/>
-          <w:szCs w:val="22"/>
-          <w:lang w:val="en-US"/>
-        </w:rPr>
-        <w:t>Select 1</w:t>
+          <w:numId w:val="40"/>
+        </w:numPr>
+        <w:rPr>
+          <w:sz w:val="24"/>
+          <w:szCs w:val="22"/>
+          <w:lang w:val="en-US"/>
+        </w:rPr>
+      </w:pPr>
+      <w:r>
+        <w:rPr>
+          <w:sz w:val="24"/>
+          <w:szCs w:val="22"/>
+          <w:lang w:val="en-US"/>
+        </w:rPr>
+        <w:t>Select 3</w:t>
       </w:r>
       <w:r>
         <w:rPr>
@@ -11370,89 +11002,15 @@
           <w:vertAlign w:val="superscript"/>
           <w:lang w:val="en-US"/>
         </w:rPr>
-        <w:t>st</w:t>
-      </w:r>
-      <w:r>
-        <w:rPr>
-          <w:sz w:val="24"/>
-          <w:szCs w:val="22"/>
-          <w:lang w:val="en-US"/>
-        </w:rPr>
-        <w:t xml:space="preserve"> checkbox</w:t>
-      </w:r>
-    </w:p>
-    <w:p>
-      <w:pPr>
-        <w:pStyle w:val="ListParagraph"/>
-        <w:numPr>
-          <w:ilvl w:val="0"/>
-          <w:numId w:val="38"/>
-        </w:numPr>
-        <w:rPr>
-          <w:sz w:val="24"/>
-          <w:szCs w:val="22"/>
-          <w:lang w:val="en-US"/>
-        </w:rPr>
-      </w:pPr>
-      <w:r>
-        <w:rPr>
-          <w:sz w:val="24"/>
-          <w:szCs w:val="22"/>
-          <w:lang w:val="en-US"/>
-        </w:rPr>
-        <w:t>Enter Group Id &amp; Artifact Id</w:t>
-      </w:r>
-    </w:p>
-    <w:p>
-      <w:pPr>
-        <w:pStyle w:val="ListParagraph"/>
-        <w:numPr>
-          <w:ilvl w:val="0"/>
-          <w:numId w:val="38"/>
-        </w:numPr>
-        <w:rPr>
-          <w:sz w:val="24"/>
-          <w:szCs w:val="22"/>
-          <w:lang w:val="en-US"/>
-        </w:rPr>
-      </w:pPr>
-      <w:r>
-        <w:rPr>
-          <w:sz w:val="24"/>
-          <w:szCs w:val="22"/>
-          <w:lang w:val="en-US"/>
-        </w:rPr>
-        <w:t>Click on Finish</w:t>
-      </w:r>
-    </w:p>
-    <w:p>
-      <w:pPr>
-        <w:rPr>
-          <w:sz w:val="24"/>
-          <w:szCs w:val="22"/>
-          <w:lang w:val="en-US"/>
-        </w:rPr>
-      </w:pPr>
-    </w:p>
-    <w:p>
-      <w:pPr>
-        <w:rPr>
-          <w:b/>
-          <w:bCs/>
-          <w:sz w:val="24"/>
-          <w:szCs w:val="22"/>
-          <w:lang w:val="en-US"/>
-        </w:rPr>
-      </w:pPr>
-      <w:r>
-        <w:rPr>
-          <w:b/>
-          <w:bCs/>
-          <w:sz w:val="24"/>
-          <w:szCs w:val="22"/>
-          <w:lang w:val="en-US"/>
-        </w:rPr>
-        <w:t>Creating Maven Project (With Archetype)</w:t>
+        <w:t>rd</w:t>
+      </w:r>
+      <w:r>
+        <w:rPr>
+          <w:sz w:val="24"/>
+          <w:szCs w:val="22"/>
+          <w:lang w:val="en-US"/>
+        </w:rPr>
+        <w:t xml:space="preserve"> Checkbox (Add project to Working set)</w:t>
       </w:r>
     </w:p>
     <w:p>
@@ -11474,39 +11032,7 @@
           <w:szCs w:val="22"/>
           <w:lang w:val="en-US"/>
         </w:rPr>
-        <w:t xml:space="preserve">File </w:t>
-      </w:r>
-      <w:r>
-        <w:rPr>
-          <w:sz w:val="24"/>
-          <w:szCs w:val="22"/>
-          <w:lang w:val="en-US"/>
-        </w:rPr>
-        <w:sym w:font="Wingdings" w:char="F0E0"/>
-      </w:r>
-      <w:r>
-        <w:rPr>
-          <w:sz w:val="24"/>
-          <w:szCs w:val="22"/>
-          <w:lang w:val="en-US"/>
-        </w:rPr>
-        <w:t xml:space="preserve"> New </w:t>
-      </w:r>
-      <w:r>
-        <w:rPr>
-          <w:sz w:val="24"/>
-          <w:szCs w:val="22"/>
-          <w:lang w:val="en-US"/>
-        </w:rPr>
-        <w:sym w:font="Wingdings" w:char="F0E0"/>
-      </w:r>
-      <w:r>
-        <w:rPr>
-          <w:sz w:val="24"/>
-          <w:szCs w:val="22"/>
-          <w:lang w:val="en-US"/>
-        </w:rPr>
-        <w:t xml:space="preserve"> Maven Project</w:t>
+        <w:t>Click on Next</w:t>
       </w:r>
     </w:p>
     <w:p>
@@ -11528,79 +11054,8 @@
           <w:szCs w:val="22"/>
           <w:lang w:val="en-US"/>
         </w:rPr>
-        <w:t>Select 3</w:t>
-      </w:r>
-      <w:r>
-        <w:rPr>
-          <w:sz w:val="24"/>
-          <w:szCs w:val="22"/>
-          <w:vertAlign w:val="superscript"/>
-          <w:lang w:val="en-US"/>
-        </w:rPr>
-        <w:t>rd</w:t>
-      </w:r>
-      <w:r>
-        <w:rPr>
-          <w:sz w:val="24"/>
-          <w:szCs w:val="22"/>
-          <w:lang w:val="en-US"/>
-        </w:rPr>
-        <w:t xml:space="preserve"> Checkbox (Add project to Working set)</w:t>
-      </w:r>
-    </w:p>
-    <w:p>
-      <w:pPr>
-        <w:pStyle w:val="ListParagraph"/>
-        <w:numPr>
-          <w:ilvl w:val="0"/>
-          <w:numId w:val="40"/>
-        </w:numPr>
-        <w:rPr>
-          <w:sz w:val="24"/>
-          <w:szCs w:val="22"/>
-          <w:lang w:val="en-US"/>
-        </w:rPr>
-      </w:pPr>
-      <w:r>
-        <w:rPr>
-          <w:sz w:val="24"/>
-          <w:szCs w:val="22"/>
-          <w:lang w:val="en-US"/>
-        </w:rPr>
-        <w:t>Click on Next</w:t>
-      </w:r>
-    </w:p>
-    <w:p>
-      <w:pPr>
-        <w:pStyle w:val="ListParagraph"/>
-        <w:numPr>
-          <w:ilvl w:val="0"/>
-          <w:numId w:val="40"/>
-        </w:numPr>
-        <w:rPr>
-          <w:sz w:val="24"/>
-          <w:szCs w:val="22"/>
-          <w:lang w:val="en-US"/>
-        </w:rPr>
-      </w:pPr>
-      <w:r>
-        <w:rPr>
-          <w:sz w:val="24"/>
-          <w:szCs w:val="22"/>
-          <w:lang w:val="en-US"/>
-        </w:rPr>
-        <w:t>Search the archetype as Maven-archetype-</w:t>
-      </w:r>
-      <w:proofErr w:type="spellStart"/>
-      <w:r>
-        <w:rPr>
-          <w:sz w:val="24"/>
-          <w:szCs w:val="22"/>
-          <w:lang w:val="en-US"/>
-        </w:rPr>
-        <w:t>quickstart</w:t>
-      </w:r>
-      <w:proofErr w:type="spellEnd"/>
+        <w:t>Search the archetype as Maven-archetype-quickstart</w:t>
+      </w:r>
     </w:p>
     <w:p>
       <w:pPr>
@@ -11957,25 +11412,7 @@
           <w:szCs w:val="22"/>
           <w:lang w:val="en-US"/>
         </w:rPr>
-        <w:t xml:space="preserve">BA, QA team, </w:t>
-      </w:r>
-      <w:proofErr w:type="spellStart"/>
-      <w:r>
-        <w:rPr>
-          <w:sz w:val="24"/>
-          <w:szCs w:val="22"/>
-          <w:lang w:val="en-US"/>
-        </w:rPr>
-        <w:t>Dev</w:t>
-      </w:r>
-      <w:proofErr w:type="spellEnd"/>
-      <w:r>
-        <w:rPr>
-          <w:sz w:val="24"/>
-          <w:szCs w:val="22"/>
-          <w:lang w:val="en-US"/>
-        </w:rPr>
-        <w:t xml:space="preserve"> team will gather the requirements from client.</w:t>
+        <w:t>BA, QA team, Dev team will gather the requirements from client.</w:t>
       </w:r>
     </w:p>
     <w:p>
@@ -12708,25 +12145,7 @@
           <w:szCs w:val="22"/>
           <w:lang w:val="en-US"/>
         </w:rPr>
-        <w:t xml:space="preserve"> Used to avoid multiple </w:t>
-      </w:r>
-      <w:proofErr w:type="gramStart"/>
-      <w:r>
-        <w:rPr>
-          <w:sz w:val="24"/>
-          <w:szCs w:val="22"/>
-          <w:lang w:val="en-US"/>
-        </w:rPr>
-        <w:t>Given</w:t>
-      </w:r>
-      <w:proofErr w:type="gramEnd"/>
-      <w:r>
-        <w:rPr>
-          <w:sz w:val="24"/>
-          <w:szCs w:val="22"/>
-          <w:lang w:val="en-US"/>
-        </w:rPr>
-        <w:t xml:space="preserve"> statements for multiple scenarios.</w:t>
+        <w:t xml:space="preserve"> Used to avoid multiple Given statements for multiple scenarios.</w:t>
       </w:r>
     </w:p>
     <w:p>
@@ -13043,25 +12462,7 @@
           <w:szCs w:val="22"/>
           <w:lang w:val="en-US"/>
         </w:rPr>
-        <w:t xml:space="preserve">When </w:t>
-      </w:r>
-      <w:proofErr w:type="gramStart"/>
-      <w:r>
-        <w:rPr>
-          <w:sz w:val="24"/>
-          <w:szCs w:val="22"/>
-          <w:lang w:val="en-US"/>
-        </w:rPr>
-        <w:t>Capture</w:t>
-      </w:r>
-      <w:proofErr w:type="gramEnd"/>
-      <w:r>
-        <w:rPr>
-          <w:sz w:val="24"/>
-          <w:szCs w:val="22"/>
-          <w:lang w:val="en-US"/>
-        </w:rPr>
-        <w:t xml:space="preserve"> the title </w:t>
+        <w:t xml:space="preserve">When Capture the title </w:t>
       </w:r>
     </w:p>
     <w:p>
@@ -13316,25 +12717,7 @@
           <w:szCs w:val="22"/>
           <w:lang w:val="en-US"/>
         </w:rPr>
-        <w:t xml:space="preserve">When </w:t>
-      </w:r>
-      <w:proofErr w:type="gramStart"/>
-      <w:r>
-        <w:rPr>
-          <w:sz w:val="24"/>
-          <w:szCs w:val="22"/>
-          <w:lang w:val="en-US"/>
-        </w:rPr>
-        <w:t>Enter</w:t>
-      </w:r>
-      <w:proofErr w:type="gramEnd"/>
-      <w:r>
-        <w:rPr>
-          <w:sz w:val="24"/>
-          <w:szCs w:val="22"/>
-          <w:lang w:val="en-US"/>
-        </w:rPr>
-        <w:t xml:space="preserve"> text to search in search box</w:t>
+        <w:t>When Enter text to search in search box</w:t>
       </w:r>
     </w:p>
     <w:p>
@@ -13368,25 +12751,7 @@
           <w:szCs w:val="22"/>
           <w:lang w:val="en-US"/>
         </w:rPr>
-        <w:t xml:space="preserve">Then </w:t>
-      </w:r>
-      <w:proofErr w:type="gramStart"/>
-      <w:r>
-        <w:rPr>
-          <w:sz w:val="24"/>
-          <w:szCs w:val="22"/>
-          <w:lang w:val="en-US"/>
-        </w:rPr>
-        <w:t>A</w:t>
-      </w:r>
-      <w:proofErr w:type="gramEnd"/>
-      <w:r>
-        <w:rPr>
-          <w:sz w:val="24"/>
-          <w:szCs w:val="22"/>
-          <w:lang w:val="en-US"/>
-        </w:rPr>
-        <w:t xml:space="preserve"> valid search result should display</w:t>
+        <w:t>Then A valid search result should display</w:t>
       </w:r>
     </w:p>
     <w:p>
@@ -13515,8 +12880,228 @@
         </w:rPr>
         <w:t>Every tag starts with @</w:t>
       </w:r>
+    </w:p>
+    <w:p>
+      <w:pPr>
+        <w:rPr>
+          <w:sz w:val="24"/>
+          <w:szCs w:val="22"/>
+          <w:lang w:val="en-US"/>
+        </w:rPr>
+      </w:pPr>
+    </w:p>
+    <w:p>
+      <w:pPr>
+        <w:rPr>
+          <w:b/>
+          <w:bCs/>
+          <w:sz w:val="24"/>
+          <w:szCs w:val="22"/>
+          <w:lang w:val="en-US"/>
+        </w:rPr>
+      </w:pPr>
+      <w:r>
+        <w:rPr>
+          <w:b/>
+          <w:bCs/>
+          <w:sz w:val="24"/>
+          <w:szCs w:val="22"/>
+          <w:lang w:val="en-US"/>
+        </w:rPr>
+        <w:lastRenderedPageBreak/>
+        <w:t>Hooks in Cucumber</w:t>
+      </w:r>
+    </w:p>
+    <w:p>
+      <w:pPr>
+        <w:pStyle w:val="ListParagraph"/>
+        <w:numPr>
+          <w:ilvl w:val="0"/>
+          <w:numId w:val="47"/>
+        </w:numPr>
+        <w:rPr>
+          <w:sz w:val="24"/>
+          <w:szCs w:val="22"/>
+          <w:lang w:val="en-US"/>
+        </w:rPr>
+      </w:pPr>
+      <w:r>
+        <w:rPr>
+          <w:sz w:val="24"/>
+          <w:szCs w:val="22"/>
+          <w:lang w:val="en-US"/>
+        </w:rPr>
+        <w:t>Special methods that get executed before and after every scenario.</w:t>
+      </w:r>
+    </w:p>
+    <w:p>
+      <w:pPr>
+        <w:pStyle w:val="ListParagraph"/>
+        <w:numPr>
+          <w:ilvl w:val="0"/>
+          <w:numId w:val="47"/>
+        </w:numPr>
+        <w:rPr>
+          <w:sz w:val="24"/>
+          <w:szCs w:val="22"/>
+          <w:lang w:val="en-US"/>
+        </w:rPr>
+      </w:pPr>
+      <w:r>
+        <w:rPr>
+          <w:sz w:val="24"/>
+          <w:szCs w:val="22"/>
+          <w:lang w:val="en-US"/>
+        </w:rPr>
+        <w:t>Hooks are never the part of Feature file or Runner class</w:t>
+      </w:r>
+    </w:p>
+    <w:p>
+      <w:pPr>
+        <w:pStyle w:val="ListParagraph"/>
+        <w:numPr>
+          <w:ilvl w:val="0"/>
+          <w:numId w:val="47"/>
+        </w:numPr>
+        <w:rPr>
+          <w:sz w:val="24"/>
+          <w:szCs w:val="22"/>
+          <w:lang w:val="en-US"/>
+        </w:rPr>
+      </w:pPr>
+      <w:r>
+        <w:rPr>
+          <w:sz w:val="24"/>
+          <w:szCs w:val="22"/>
+          <w:lang w:val="en-US"/>
+        </w:rPr>
+        <w:t>Cucumber supports 2 hooks</w:t>
+      </w:r>
+    </w:p>
+    <w:p>
+      <w:pPr>
+        <w:pStyle w:val="ListParagraph"/>
+        <w:numPr>
+          <w:ilvl w:val="1"/>
+          <w:numId w:val="47"/>
+        </w:numPr>
+        <w:rPr>
+          <w:sz w:val="24"/>
+          <w:szCs w:val="22"/>
+          <w:lang w:val="en-US"/>
+        </w:rPr>
+      </w:pPr>
+      <w:r>
+        <w:rPr>
+          <w:sz w:val="24"/>
+          <w:szCs w:val="22"/>
+          <w:lang w:val="en-US"/>
+        </w:rPr>
+        <w:t xml:space="preserve">@Before </w:t>
+      </w:r>
+      <w:r>
+        <w:rPr>
+          <w:sz w:val="24"/>
+          <w:szCs w:val="22"/>
+          <w:lang w:val="en-US"/>
+        </w:rPr>
+        <w:sym w:font="Wingdings" w:char="F0E0"/>
+      </w:r>
+      <w:r>
+        <w:rPr>
+          <w:sz w:val="24"/>
+          <w:szCs w:val="22"/>
+          <w:lang w:val="en-US"/>
+        </w:rPr>
+        <w:t xml:space="preserve"> Executes </w:t>
+      </w:r>
+      <w:r>
+        <w:rPr>
+          <w:b/>
+          <w:bCs/>
+          <w:sz w:val="24"/>
+          <w:szCs w:val="22"/>
+          <w:lang w:val="en-US"/>
+        </w:rPr>
+        <w:t>before every scenario</w:t>
+      </w:r>
+    </w:p>
+    <w:p>
+      <w:pPr>
+        <w:pStyle w:val="ListParagraph"/>
+        <w:numPr>
+          <w:ilvl w:val="1"/>
+          <w:numId w:val="47"/>
+        </w:numPr>
+        <w:rPr>
+          <w:sz w:val="24"/>
+          <w:szCs w:val="22"/>
+          <w:lang w:val="en-US"/>
+        </w:rPr>
+      </w:pPr>
+      <w:r>
+        <w:rPr>
+          <w:sz w:val="24"/>
+          <w:szCs w:val="22"/>
+          <w:lang w:val="en-US"/>
+        </w:rPr>
+        <w:t xml:space="preserve">@After </w:t>
+      </w:r>
+      <w:r>
+        <w:rPr>
+          <w:sz w:val="24"/>
+          <w:szCs w:val="22"/>
+          <w:lang w:val="en-US"/>
+        </w:rPr>
+        <w:sym w:font="Wingdings" w:char="F0E0"/>
+      </w:r>
+      <w:r>
+        <w:rPr>
+          <w:sz w:val="24"/>
+          <w:szCs w:val="22"/>
+          <w:lang w:val="en-US"/>
+        </w:rPr>
+        <w:t xml:space="preserve"> Executed</w:t>
+      </w:r>
+      <w:r>
+        <w:rPr>
+          <w:b/>
+          <w:bCs/>
+          <w:sz w:val="24"/>
+          <w:szCs w:val="22"/>
+          <w:lang w:val="en-US"/>
+        </w:rPr>
+        <w:t xml:space="preserve"> after every scenario</w:t>
+      </w:r>
+    </w:p>
+    <w:p>
+      <w:pPr>
+        <w:rPr>
+          <w:sz w:val="24"/>
+          <w:szCs w:val="22"/>
+          <w:lang w:val="en-US"/>
+        </w:rPr>
+      </w:pPr>
+    </w:p>
+    <w:p>
+      <w:pPr>
+        <w:rPr>
+          <w:sz w:val="24"/>
+          <w:szCs w:val="22"/>
+          <w:lang w:val="en-US"/>
+        </w:rPr>
+      </w:pPr>
       <w:bookmarkStart w:id="0" w:name="_GoBack"/>
       <w:bookmarkEnd w:id="0"/>
+    </w:p>
+    <w:p>
+      <w:pPr>
+        <w:rPr>
+          <w:sz w:val="24"/>
+          <w:szCs w:val="22"/>
+          <w:lang w:val="en-US"/>
+        </w:rPr>
+      </w:pPr>
     </w:p>
     <w:sectPr>
       <w:pgSz w:w="11906" w:h="16838"/>
@@ -16150,6 +15735,119 @@
     </w:lvl>
   </w:abstractNum>
   <w:abstractNum w:abstractNumId="27">
+    <w:nsid w:val="469C10FF"/>
+    <w:multiLevelType w:val="hybridMultilevel"/>
+    <w:tmpl w:val="768449CA"/>
+    <w:lvl w:ilvl="0" w:tplc="40090001">
+      <w:start w:val="1"/>
+      <w:numFmt w:val="bullet"/>
+      <w:lvlText w:val=""/>
+      <w:lvlJc w:val="left"/>
+      <w:pPr>
+        <w:ind w:left="720" w:hanging="360"/>
+      </w:pPr>
+      <w:rPr>
+        <w:rFonts w:ascii="Symbol" w:hAnsi="Symbol" w:hint="default"/>
+      </w:rPr>
+    </w:lvl>
+    <w:lvl w:ilvl="1" w:tplc="40090003">
+      <w:start w:val="1"/>
+      <w:numFmt w:val="bullet"/>
+      <w:lvlText w:val="o"/>
+      <w:lvlJc w:val="left"/>
+      <w:pPr>
+        <w:ind w:left="1440" w:hanging="360"/>
+      </w:pPr>
+      <w:rPr>
+        <w:rFonts w:ascii="Courier New" w:hAnsi="Courier New" w:cs="Courier New" w:hint="default"/>
+      </w:rPr>
+    </w:lvl>
+    <w:lvl w:ilvl="2" w:tplc="40090005" w:tentative="1">
+      <w:start w:val="1"/>
+      <w:numFmt w:val="bullet"/>
+      <w:lvlText w:val=""/>
+      <w:lvlJc w:val="left"/>
+      <w:pPr>
+        <w:ind w:left="2160" w:hanging="360"/>
+      </w:pPr>
+      <w:rPr>
+        <w:rFonts w:ascii="Wingdings" w:hAnsi="Wingdings" w:hint="default"/>
+      </w:rPr>
+    </w:lvl>
+    <w:lvl w:ilvl="3" w:tplc="40090001" w:tentative="1">
+      <w:start w:val="1"/>
+      <w:numFmt w:val="bullet"/>
+      <w:lvlText w:val=""/>
+      <w:lvlJc w:val="left"/>
+      <w:pPr>
+        <w:ind w:left="2880" w:hanging="360"/>
+      </w:pPr>
+      <w:rPr>
+        <w:rFonts w:ascii="Symbol" w:hAnsi="Symbol" w:hint="default"/>
+      </w:rPr>
+    </w:lvl>
+    <w:lvl w:ilvl="4" w:tplc="40090003" w:tentative="1">
+      <w:start w:val="1"/>
+      <w:numFmt w:val="bullet"/>
+      <w:lvlText w:val="o"/>
+      <w:lvlJc w:val="left"/>
+      <w:pPr>
+        <w:ind w:left="3600" w:hanging="360"/>
+      </w:pPr>
+      <w:rPr>
+        <w:rFonts w:ascii="Courier New" w:hAnsi="Courier New" w:cs="Courier New" w:hint="default"/>
+      </w:rPr>
+    </w:lvl>
+    <w:lvl w:ilvl="5" w:tplc="40090005" w:tentative="1">
+      <w:start w:val="1"/>
+      <w:numFmt w:val="bullet"/>
+      <w:lvlText w:val=""/>
+      <w:lvlJc w:val="left"/>
+      <w:pPr>
+        <w:ind w:left="4320" w:hanging="360"/>
+      </w:pPr>
+      <w:rPr>
+        <w:rFonts w:ascii="Wingdings" w:hAnsi="Wingdings" w:hint="default"/>
+      </w:rPr>
+    </w:lvl>
+    <w:lvl w:ilvl="6" w:tplc="40090001" w:tentative="1">
+      <w:start w:val="1"/>
+      <w:numFmt w:val="bullet"/>
+      <w:lvlText w:val=""/>
+      <w:lvlJc w:val="left"/>
+      <w:pPr>
+        <w:ind w:left="5040" w:hanging="360"/>
+      </w:pPr>
+      <w:rPr>
+        <w:rFonts w:ascii="Symbol" w:hAnsi="Symbol" w:hint="default"/>
+      </w:rPr>
+    </w:lvl>
+    <w:lvl w:ilvl="7" w:tplc="40090003" w:tentative="1">
+      <w:start w:val="1"/>
+      <w:numFmt w:val="bullet"/>
+      <w:lvlText w:val="o"/>
+      <w:lvlJc w:val="left"/>
+      <w:pPr>
+        <w:ind w:left="5760" w:hanging="360"/>
+      </w:pPr>
+      <w:rPr>
+        <w:rFonts w:ascii="Courier New" w:hAnsi="Courier New" w:cs="Courier New" w:hint="default"/>
+      </w:rPr>
+    </w:lvl>
+    <w:lvl w:ilvl="8" w:tplc="40090005" w:tentative="1">
+      <w:start w:val="1"/>
+      <w:numFmt w:val="bullet"/>
+      <w:lvlText w:val=""/>
+      <w:lvlJc w:val="left"/>
+      <w:pPr>
+        <w:ind w:left="6480" w:hanging="360"/>
+      </w:pPr>
+      <w:rPr>
+        <w:rFonts w:ascii="Wingdings" w:hAnsi="Wingdings" w:hint="default"/>
+      </w:rPr>
+    </w:lvl>
+  </w:abstractNum>
+  <w:abstractNum w:abstractNumId="28">
     <w:nsid w:val="4B45536D"/>
     <w:multiLevelType w:val="hybridMultilevel"/>
     <w:tmpl w:val="0B3449C8"/>
@@ -16238,7 +15936,7 @@
       </w:pPr>
     </w:lvl>
   </w:abstractNum>
-  <w:abstractNum w:abstractNumId="28">
+  <w:abstractNum w:abstractNumId="29">
     <w:nsid w:val="4D236C02"/>
     <w:multiLevelType w:val="hybridMultilevel"/>
     <w:tmpl w:val="CBFADF28"/>
@@ -16351,7 +16049,7 @@
       </w:rPr>
     </w:lvl>
   </w:abstractNum>
-  <w:abstractNum w:abstractNumId="29">
+  <w:abstractNum w:abstractNumId="30">
     <w:nsid w:val="4FC02C6C"/>
     <w:multiLevelType w:val="hybridMultilevel"/>
     <w:tmpl w:val="05D2B08E"/>
@@ -16440,7 +16138,7 @@
       </w:pPr>
     </w:lvl>
   </w:abstractNum>
-  <w:abstractNum w:abstractNumId="30">
+  <w:abstractNum w:abstractNumId="31">
     <w:nsid w:val="509939C1"/>
     <w:multiLevelType w:val="hybridMultilevel"/>
     <w:tmpl w:val="BD90E928"/>
@@ -16529,7 +16227,7 @@
       </w:pPr>
     </w:lvl>
   </w:abstractNum>
-  <w:abstractNum w:abstractNumId="31">
+  <w:abstractNum w:abstractNumId="32">
     <w:nsid w:val="52B52268"/>
     <w:multiLevelType w:val="hybridMultilevel"/>
     <w:tmpl w:val="331AF78C"/>
@@ -16642,7 +16340,7 @@
       </w:rPr>
     </w:lvl>
   </w:abstractNum>
-  <w:abstractNum w:abstractNumId="32">
+  <w:abstractNum w:abstractNumId="33">
     <w:nsid w:val="55D92B24"/>
     <w:multiLevelType w:val="hybridMultilevel"/>
     <w:tmpl w:val="9BCED27C"/>
@@ -16755,7 +16453,7 @@
       </w:rPr>
     </w:lvl>
   </w:abstractNum>
-  <w:abstractNum w:abstractNumId="33">
+  <w:abstractNum w:abstractNumId="34">
     <w:nsid w:val="57564656"/>
     <w:multiLevelType w:val="hybridMultilevel"/>
     <w:tmpl w:val="3E1C27F6"/>
@@ -16868,7 +16566,7 @@
       </w:rPr>
     </w:lvl>
   </w:abstractNum>
-  <w:abstractNum w:abstractNumId="34">
+  <w:abstractNum w:abstractNumId="35">
     <w:nsid w:val="61A962B8"/>
     <w:multiLevelType w:val="hybridMultilevel"/>
     <w:tmpl w:val="5EDC7138"/>
@@ -16957,7 +16655,7 @@
       </w:pPr>
     </w:lvl>
   </w:abstractNum>
-  <w:abstractNum w:abstractNumId="35">
+  <w:abstractNum w:abstractNumId="36">
     <w:nsid w:val="69867F0D"/>
     <w:multiLevelType w:val="hybridMultilevel"/>
     <w:tmpl w:val="EAF8E468"/>
@@ -17046,7 +16744,7 @@
       </w:pPr>
     </w:lvl>
   </w:abstractNum>
-  <w:abstractNum w:abstractNumId="36">
+  <w:abstractNum w:abstractNumId="37">
     <w:nsid w:val="6E5A4342"/>
     <w:multiLevelType w:val="hybridMultilevel"/>
     <w:tmpl w:val="414440E6"/>
@@ -17135,7 +16833,7 @@
       </w:pPr>
     </w:lvl>
   </w:abstractNum>
-  <w:abstractNum w:abstractNumId="37">
+  <w:abstractNum w:abstractNumId="38">
     <w:nsid w:val="6F0A1BD2"/>
     <w:multiLevelType w:val="hybridMultilevel"/>
     <w:tmpl w:val="EF7884CC"/>
@@ -17248,7 +16946,7 @@
       </w:rPr>
     </w:lvl>
   </w:abstractNum>
-  <w:abstractNum w:abstractNumId="38">
+  <w:abstractNum w:abstractNumId="39">
     <w:nsid w:val="6FC368C3"/>
     <w:multiLevelType w:val="hybridMultilevel"/>
     <w:tmpl w:val="F892BAB0"/>
@@ -17337,7 +17035,7 @@
       </w:pPr>
     </w:lvl>
   </w:abstractNum>
-  <w:abstractNum w:abstractNumId="39">
+  <w:abstractNum w:abstractNumId="40">
     <w:nsid w:val="716E4BD9"/>
     <w:multiLevelType w:val="hybridMultilevel"/>
     <w:tmpl w:val="2916BD50"/>
@@ -17450,7 +17148,7 @@
       </w:rPr>
     </w:lvl>
   </w:abstractNum>
-  <w:abstractNum w:abstractNumId="40">
+  <w:abstractNum w:abstractNumId="41">
     <w:nsid w:val="729D49A6"/>
     <w:multiLevelType w:val="hybridMultilevel"/>
     <w:tmpl w:val="212E6380"/>
@@ -17539,7 +17237,7 @@
       </w:pPr>
     </w:lvl>
   </w:abstractNum>
-  <w:abstractNum w:abstractNumId="41">
+  <w:abstractNum w:abstractNumId="42">
     <w:nsid w:val="72E5107C"/>
     <w:multiLevelType w:val="hybridMultilevel"/>
     <w:tmpl w:val="30BE3018"/>
@@ -17628,7 +17326,7 @@
       </w:pPr>
     </w:lvl>
   </w:abstractNum>
-  <w:abstractNum w:abstractNumId="42">
+  <w:abstractNum w:abstractNumId="43">
     <w:nsid w:val="7B1473D2"/>
     <w:multiLevelType w:val="hybridMultilevel"/>
     <w:tmpl w:val="78F6F478"/>
@@ -17717,7 +17415,7 @@
       </w:pPr>
     </w:lvl>
   </w:abstractNum>
-  <w:abstractNum w:abstractNumId="43">
+  <w:abstractNum w:abstractNumId="44">
     <w:nsid w:val="7C1B7A62"/>
     <w:multiLevelType w:val="hybridMultilevel"/>
     <w:tmpl w:val="A1EEB68C"/>
@@ -17830,7 +17528,7 @@
       </w:rPr>
     </w:lvl>
   </w:abstractNum>
-  <w:abstractNum w:abstractNumId="44">
+  <w:abstractNum w:abstractNumId="45">
     <w:nsid w:val="7E0C5E33"/>
     <w:multiLevelType w:val="hybridMultilevel"/>
     <w:tmpl w:val="17A20342"/>
@@ -17919,7 +17617,7 @@
       </w:pPr>
     </w:lvl>
   </w:abstractNum>
-  <w:abstractNum w:abstractNumId="45">
+  <w:abstractNum w:abstractNumId="46">
     <w:nsid w:val="7EEF6783"/>
     <w:multiLevelType w:val="hybridMultilevel"/>
     <w:tmpl w:val="2292AFAC"/>
@@ -18015,10 +17713,10 @@
     <w:abstractNumId w:val="9"/>
   </w:num>
   <w:num w:numId="3">
-    <w:abstractNumId w:val="43"/>
+    <w:abstractNumId w:val="44"/>
   </w:num>
   <w:num w:numId="4">
-    <w:abstractNumId w:val="32"/>
+    <w:abstractNumId w:val="33"/>
   </w:num>
   <w:num w:numId="5">
     <w:abstractNumId w:val="20"/>
@@ -18027,10 +17725,10 @@
     <w:abstractNumId w:val="10"/>
   </w:num>
   <w:num w:numId="7">
-    <w:abstractNumId w:val="28"/>
+    <w:abstractNumId w:val="29"/>
   </w:num>
   <w:num w:numId="8">
-    <w:abstractNumId w:val="33"/>
+    <w:abstractNumId w:val="34"/>
   </w:num>
   <w:num w:numId="9">
     <w:abstractNumId w:val="15"/>
@@ -18048,40 +17746,40 @@
     <w:abstractNumId w:val="2"/>
   </w:num>
   <w:num w:numId="14">
-    <w:abstractNumId w:val="27"/>
+    <w:abstractNumId w:val="28"/>
   </w:num>
   <w:num w:numId="15">
-    <w:abstractNumId w:val="45"/>
+    <w:abstractNumId w:val="46"/>
   </w:num>
   <w:num w:numId="16">
     <w:abstractNumId w:val="16"/>
   </w:num>
   <w:num w:numId="17">
-    <w:abstractNumId w:val="37"/>
+    <w:abstractNumId w:val="38"/>
   </w:num>
   <w:num w:numId="18">
     <w:abstractNumId w:val="1"/>
   </w:num>
   <w:num w:numId="19">
-    <w:abstractNumId w:val="44"/>
+    <w:abstractNumId w:val="45"/>
   </w:num>
   <w:num w:numId="20">
-    <w:abstractNumId w:val="34"/>
+    <w:abstractNumId w:val="35"/>
   </w:num>
   <w:num w:numId="21">
-    <w:abstractNumId w:val="31"/>
+    <w:abstractNumId w:val="32"/>
   </w:num>
   <w:num w:numId="22">
     <w:abstractNumId w:val="3"/>
   </w:num>
   <w:num w:numId="23">
-    <w:abstractNumId w:val="40"/>
+    <w:abstractNumId w:val="41"/>
   </w:num>
   <w:num w:numId="24">
-    <w:abstractNumId w:val="29"/>
+    <w:abstractNumId w:val="30"/>
   </w:num>
   <w:num w:numId="25">
-    <w:abstractNumId w:val="36"/>
+    <w:abstractNumId w:val="37"/>
   </w:num>
   <w:num w:numId="26">
     <w:abstractNumId w:val="19"/>
@@ -18090,13 +17788,13 @@
     <w:abstractNumId w:val="14"/>
   </w:num>
   <w:num w:numId="28">
-    <w:abstractNumId w:val="41"/>
+    <w:abstractNumId w:val="42"/>
   </w:num>
   <w:num w:numId="29">
     <w:abstractNumId w:val="23"/>
   </w:num>
   <w:num w:numId="30">
-    <w:abstractNumId w:val="35"/>
+    <w:abstractNumId w:val="36"/>
   </w:num>
   <w:num w:numId="31">
     <w:abstractNumId w:val="0"/>
@@ -18108,7 +17806,7 @@
     <w:abstractNumId w:val="24"/>
   </w:num>
   <w:num w:numId="34">
-    <w:abstractNumId w:val="38"/>
+    <w:abstractNumId w:val="39"/>
   </w:num>
   <w:num w:numId="35">
     <w:abstractNumId w:val="25"/>
@@ -18126,7 +17824,7 @@
     <w:abstractNumId w:val="5"/>
   </w:num>
   <w:num w:numId="40">
-    <w:abstractNumId w:val="42"/>
+    <w:abstractNumId w:val="43"/>
   </w:num>
   <w:num w:numId="41">
     <w:abstractNumId w:val="26"/>
@@ -18135,16 +17833,19 @@
     <w:abstractNumId w:val="17"/>
   </w:num>
   <w:num w:numId="43">
-    <w:abstractNumId w:val="39"/>
+    <w:abstractNumId w:val="40"/>
   </w:num>
   <w:num w:numId="44">
     <w:abstractNumId w:val="22"/>
   </w:num>
   <w:num w:numId="45">
-    <w:abstractNumId w:val="30"/>
+    <w:abstractNumId w:val="31"/>
   </w:num>
   <w:num w:numId="46">
     <w:abstractNumId w:val="18"/>
+  </w:num>
+  <w:num w:numId="47">
+    <w:abstractNumId w:val="27"/>
   </w:num>
 </w:numbering>
 </file>
@@ -18874,7 +18575,7 @@
 </file>
 
 <file path=customXml/itemProps1.xml><?xml version="1.0" encoding="utf-8"?>
-<ds:datastoreItem xmlns:ds="http://schemas.openxmlformats.org/officeDocument/2006/customXml" ds:itemID="{75B1D210-D66F-4CD1-A42C-6EE717FB43A7}">
+<ds:datastoreItem xmlns:ds="http://schemas.openxmlformats.org/officeDocument/2006/customXml" ds:itemID="{2531F87C-70AB-44DB-932F-E1943EC63C92}">
   <ds:schemaRefs>
     <ds:schemaRef ds:uri="http://schemas.openxmlformats.org/officeDocument/2006/bibliography"/>
   </ds:schemaRefs>

</xml_diff>